<commit_message>
Release 0.9.0 with real vehicle crews, reserved airdrops and death deployment transitions
</commit_message>
<xml_diff>
--- a/docs/DEVELOPMENT_REPORT.docx
+++ b/docs/DEVELOPMENT_REPORT.docx
@@ -7,93 +7,1293 @@
         <w:pStyle w:val="Title"/>
       </w:pPr>
       <w:r>
-        <w:t>PROJECT IRONFRONT</w:t>
-      </w:r>
-    </w:p>
-    <w:p>
-      <w:pPr>
-        <w:pStyle w:val="Heading1"/>
-      </w:pPr>
-      <w:r>
-        <w:t>0.8.0 开发与完整 QA 报告</w:t>
+        <w:t>IRONFRONT 0.9.0 开发报告</w:t>
       </w:r>
     </w:p>
     <w:p>
       <w:r>
-        <w:t>2026 年 10 月 8 日 | 操作、载具、部署、兵种、配乐、UI 和模型迭代</w:t>
-      </w:r>
-    </w:p>
-    <w:p>
-      <w:pPr>
-        <w:pStyle w:val="Heading2"/>
-      </w:pPr>
-      <w:r>
-        <w:t>基线、目标与版本</w:t>
+        <w:t>本轮把用户指出的八项问题落实到当前源码：真实枪口射击、明显受击反馈、实际AI驾驶员、召唤车辆空投和玩家专属保留、死亡升空部署，以及音乐连续过渡。代码延续原项目，不用新演示替换现有征服和小队战争系统。</w:t>
       </w:r>
     </w:p>
     <w:p>
       <w:r>
-        <w:t>继续使用 IRONFRONT 的 TypeScript / Three.js 模块结构。v0.5 原有 Conquest、AI 小队、三类大战场事件与自动战局延续；0.6 已吸收 Option A 的拖动观察备用、出生朝目标、退出清理、分辨率缩放和枪械输入修复。本轮不是只写方案，而是实际修改逻辑、输入、渲染、界面和音频。</w:t>
-      </w:r>
-    </w:p>
-    <w:p>
-      <w:r>
-        <w:t>开始与发布前核对远端 Main：基线提交 1d04a588。用户本机现存 IRONFRONT_v0.6.0_QA 的 src 与该提交逐文件一致。新增功能按用户规则升级次版本；待交付 0.7 功能加上后续音乐/UI/枪械模型需求，最终统一发布 0.8.0。直接提交 Main，不创建杂乱分支。</w:t>
-      </w:r>
-    </w:p>
-    <w:p>
-      <w:pPr>
-        <w:pStyle w:val="Heading2"/>
-      </w:pPr>
-      <w:r>
-        <w:t>交付内容</w:t>
+        <w:t>任务对象为本机与 GitHub YunfanShi/IRONFRONT 的 Main。开始时远端与本机提交均为290ab1a9，版本0.8.0；本机已交付目录与仓库26个源码及版本文件一致。按新增模块的版本规则升级中间位至0.9.0，交付仍直接更新Main。</w:t>
       </w:r>
     </w:p>
     <w:tbl>
       <w:tblPr>
         <w:tblStyle w:val="TableGrid"/>
         <w:tblW w:type="auto" w:w="0"/>
-        <w:tblLayout w:type="fixed"/>
         <w:tblLook w:firstColumn="1" w:firstRow="1" w:lastColumn="0" w:lastRow="0" w:noHBand="0" w:noVBand="1" w:val="04A0"/>
       </w:tblPr>
       <w:tblGrid>
-        <w:gridCol w:w="2016"/>
-        <w:gridCol w:w="7819"/>
+        <w:gridCol w:w="4917"/>
+        <w:gridCol w:w="4917"/>
       </w:tblGrid>
       <w:tr>
-        <w:trPr>
-          <w:cantSplit/>
-        </w:trPr>
         <w:tc>
           <w:tcPr>
-            <w:tcW w:type="dxa" w:w="2016"/>
-            <w:shd w:fill="E8EDE9"/>
+            <w:tcW w:type="dxa" w:w="4917"/>
           </w:tcPr>
           <w:p>
             <w:pPr>
-              <w:spacing w:before="60" w:after="60" w:line="240" w:lineRule="auto"/>
+              <w:spacing w:after="80"/>
             </w:pPr>
             <w:r>
               <w:rPr>
-                <w:b/>
                 <w:sz w:val="18"/>
               </w:rPr>
-              <w:t>模块</w:t>
+              <w:t>用户问题</w:t>
             </w:r>
           </w:p>
         </w:tc>
         <w:tc>
           <w:tcPr>
-            <w:tcW w:type="dxa" w:w="7819"/>
-            <w:shd w:fill="E8EDE9"/>
+            <w:tcW w:type="dxa" w:w="4917"/>
           </w:tcPr>
           <w:p>
             <w:pPr>
-              <w:spacing w:before="60" w:after="60" w:line="240" w:lineRule="auto"/>
+              <w:spacing w:after="80"/>
             </w:pPr>
             <w:r>
               <w:rPr>
-                <w:b/>
+                <w:sz w:val="18"/>
+              </w:rPr>
+              <w:t>本轮结果</w:t>
+            </w:r>
+          </w:p>
+        </w:tc>
+      </w:tr>
+      <w:tr>
+        <w:tc>
+          <w:tcPr>
+            <w:tcW w:type="dxa" w:w="4917"/>
+          </w:tcPr>
+          <w:p>
+            <w:pPr>
+              <w:spacing w:after="80"/>
+            </w:pPr>
+            <w:r>
+              <w:rPr>
+                <w:sz w:val="18"/>
+              </w:rPr>
+              <w:t>声音假</w:t>
+            </w:r>
+          </w:p>
+        </w:tc>
+        <w:tc>
+          <w:tcPr>
+            <w:tcW w:type="dxa" w:w="4917"/>
+          </w:tcPr>
+          <w:p>
+            <w:pPr>
+              <w:spacing w:after="80"/>
+            </w:pPr>
+            <w:r>
+              <w:rPr>
+                <w:sz w:val="18"/>
+              </w:rPr>
+              <w:t>七种枪14个CC0单发录音，29个缓存音效，爆炸替换与限峰</w:t>
+            </w:r>
+          </w:p>
+        </w:tc>
+      </w:tr>
+      <w:tr>
+        <w:tc>
+          <w:tcPr>
+            <w:tcW w:type="dxa" w:w="4917"/>
+          </w:tcPr>
+          <w:p>
+            <w:pPr>
+              <w:spacing w:after="80"/>
+            </w:pPr>
+            <w:r>
+              <w:rPr>
+                <w:sz w:val="18"/>
+              </w:rPr>
+              <w:t>受击不明显</w:t>
+            </w:r>
+          </w:p>
+        </w:tc>
+        <w:tc>
+          <w:tcPr>
+            <w:tcW w:type="dxa" w:w="4917"/>
+          </w:tcPr>
+          <w:p>
+            <w:pPr>
+              <w:spacing w:after="80"/>
+            </w:pPr>
+            <w:r>
+              <w:rPr>
+                <w:sz w:val="18"/>
+              </w:rPr>
+              <w:t>即时红边、方向与数字、短促镜头冲击、持续低血量暗角</w:t>
+            </w:r>
+          </w:p>
+        </w:tc>
+      </w:tr>
+      <w:tr>
+        <w:tc>
+          <w:tcPr>
+            <w:tcW w:type="dxa" w:w="4917"/>
+          </w:tcPr>
+          <w:p>
+            <w:pPr>
+              <w:spacing w:after="80"/>
+            </w:pPr>
+            <w:r>
+              <w:rPr>
+                <w:sz w:val="18"/>
+              </w:rPr>
+              <w:t>子弹来源错误</w:t>
+            </w:r>
+          </w:p>
+        </w:tc>
+        <w:tc>
+          <w:tcPr>
+            <w:tcW w:type="dxa" w:w="4917"/>
+          </w:tcPr>
+          <w:p>
+            <w:pPr>
+              <w:spacing w:after="80"/>
+            </w:pPr>
+            <w:r>
+              <w:rPr>
+                <w:sz w:val="18"/>
+              </w:rPr>
+              <w:t>模型枪口世界坐标、近墙阻挡、炮管末端实体弹体</w:t>
+            </w:r>
+          </w:p>
+        </w:tc>
+      </w:tr>
+      <w:tr>
+        <w:tc>
+          <w:tcPr>
+            <w:tcW w:type="dxa" w:w="4917"/>
+          </w:tcPr>
+          <w:p>
+            <w:pPr>
+              <w:spacing w:after="80"/>
+            </w:pPr>
+            <w:r>
+              <w:rPr>
+                <w:sz w:val="18"/>
+              </w:rPr>
+              <w:t>召唤车辆被开走</w:t>
+            </w:r>
+          </w:p>
+        </w:tc>
+        <w:tc>
+          <w:tcPr>
+            <w:tcW w:type="dxa" w:w="4917"/>
+          </w:tcPr>
+          <w:p>
+            <w:pPr>
+              <w:spacing w:after="80"/>
+            </w:pPr>
+            <w:r>
+              <w:rPr>
+                <w:sz w:val="18"/>
+              </w:rPr>
+              <w:t>车辆对调用玩家保留，AI不能登车</w:t>
+            </w:r>
+          </w:p>
+        </w:tc>
+      </w:tr>
+      <w:tr>
+        <w:tc>
+          <w:tcPr>
+            <w:tcW w:type="dxa" w:w="4917"/>
+          </w:tcPr>
+          <w:p>
+            <w:pPr>
+              <w:spacing w:after="80"/>
+            </w:pPr>
+            <w:r>
+              <w:rPr>
+                <w:sz w:val="18"/>
+              </w:rPr>
+              <w:t>车无驾驶员自己移动</w:t>
+            </w:r>
+          </w:p>
+        </w:tc>
+        <w:tc>
+          <w:tcPr>
+            <w:tcW w:type="dxa" w:w="4917"/>
+          </w:tcPr>
+          <w:p>
+            <w:pPr>
+              <w:spacing w:after="80"/>
+            </w:pPr>
+            <w:r>
+              <w:rPr>
+                <w:sz w:val="18"/>
+              </w:rPr>
+              <w:t>真实单位占位，玩家接管后驾驶员安全下车</w:t>
+            </w:r>
+          </w:p>
+        </w:tc>
+      </w:tr>
+      <w:tr>
+        <w:tc>
+          <w:tcPr>
+            <w:tcW w:type="dxa" w:w="4917"/>
+          </w:tcPr>
+          <w:p>
+            <w:pPr>
+              <w:spacing w:after="80"/>
+            </w:pPr>
+            <w:r>
+              <w:rPr>
+                <w:sz w:val="18"/>
+              </w:rPr>
+              <w:t>车辆召唤方式</w:t>
+            </w:r>
+          </w:p>
+        </w:tc>
+        <w:tc>
+          <w:tcPr>
+            <w:tcW w:type="dxa" w:w="4917"/>
+          </w:tcPr>
+          <w:p>
+            <w:pPr>
+              <w:spacing w:after="80"/>
+            </w:pPr>
+            <w:r>
+              <w:rPr>
+                <w:sz w:val="18"/>
+              </w:rPr>
+              <w:t>附近安全落点8秒降落伞空投</w:t>
+            </w:r>
+          </w:p>
+        </w:tc>
+      </w:tr>
+      <w:tr>
+        <w:tc>
+          <w:tcPr>
+            <w:tcW w:type="dxa" w:w="4917"/>
+          </w:tcPr>
+          <w:p>
+            <w:pPr>
+              <w:spacing w:after="80"/>
+            </w:pPr>
+            <w:r>
+              <w:rPr>
+                <w:sz w:val="18"/>
+              </w:rPr>
+              <w:t>死亡瞬间菜单</w:t>
+            </w:r>
+          </w:p>
+        </w:tc>
+        <w:tc>
+          <w:tcPr>
+            <w:tcW w:type="dxa" w:w="4917"/>
+          </w:tcPr>
+          <w:p>
+            <w:pPr>
+              <w:spacing w:after="80"/>
+            </w:pPr>
+            <w:r>
+              <w:rPr>
+                <w:sz w:val="18"/>
+              </w:rPr>
+              <w:t>倒地与停留后升空，4.8秒进入部署地图</w:t>
+            </w:r>
+          </w:p>
+        </w:tc>
+      </w:tr>
+      <w:tr>
+        <w:tc>
+          <w:tcPr>
+            <w:tcW w:type="dxa" w:w="4917"/>
+          </w:tcPr>
+          <w:p>
+            <w:pPr>
+              <w:spacing w:after="80"/>
+            </w:pPr>
+            <w:r>
+              <w:rPr>
+                <w:sz w:val="18"/>
+              </w:rPr>
+              <w:t>死亡换歌突兀</w:t>
+            </w:r>
+          </w:p>
+        </w:tc>
+        <w:tc>
+          <w:tcPr>
+            <w:tcW w:type="dxa" w:w="4917"/>
+          </w:tcPr>
+          <w:p>
+            <w:pPr>
+              <w:spacing w:after="80"/>
+            </w:pPr>
+            <w:r>
+              <w:rPr>
+                <w:sz w:val="18"/>
+              </w:rPr>
+              <w:t>死亡延续战况曲，4秒等功率交叉淡化与平滑duck</w:t>
+            </w:r>
+          </w:p>
+        </w:tc>
+      </w:tr>
+    </w:tbl>
+    <w:p/>
+    <w:p>
+      <w:r>
+        <w:t>用户粘贴的机制大全和截图用作设计资料。本轮不宣称已实现资料中所有机制，也没有复制商业游戏模型、声音或贴图。</w:t>
+      </w:r>
+    </w:p>
+    <w:p>
+      <w:pPr>
+        <w:pStyle w:val="Heading1"/>
+        <w:pageBreakBefore/>
+      </w:pPr>
+      <w:r>
+        <w:t>真实录音与音频处理</w:t>
+      </w:r>
+    </w:p>
+    <w:p>
+      <w:r>
+        <w:t>实枪声音来自The Free Firearm Sound Library，作者Ben Jaszczak、Brian Nelson、Kevin Heras和Matthew Nanney，页面明确CC0。每种虚构枪使用两次不同单发取样：裁掉前置静音，保留枪声冲击与自然反射，转换为44.1kHz单声道PCM，峰值归一到0.88并淡出尾部。</w:t>
+      </w:r>
+    </w:p>
+    <w:tbl>
+      <w:tblPr>
+        <w:tblStyle w:val="TableGrid"/>
+        <w:tblW w:type="auto" w:w="0"/>
+        <w:tblLook w:firstColumn="1" w:firstRow="1" w:lastColumn="0" w:lastRow="0" w:noHBand="0" w:noVBand="1" w:val="04A0"/>
+      </w:tblPr>
+      <w:tblGrid>
+        <w:gridCol w:w="3278"/>
+        <w:gridCol w:w="3278"/>
+        <w:gridCol w:w="3278"/>
+      </w:tblGrid>
+      <w:tr>
+        <w:tc>
+          <w:tcPr>
+            <w:tcW w:type="dxa" w:w="3278"/>
+          </w:tcPr>
+          <w:p>
+            <w:pPr>
+              <w:spacing w:after="80"/>
+            </w:pPr>
+            <w:r>
+              <w:rPr>
+                <w:sz w:val="18"/>
+              </w:rPr>
+              <w:t>虚构枪类别</w:t>
+            </w:r>
+          </w:p>
+        </w:tc>
+        <w:tc>
+          <w:tcPr>
+            <w:tcW w:type="dxa" w:w="3278"/>
+          </w:tcPr>
+          <w:p>
+            <w:pPr>
+              <w:spacing w:after="80"/>
+            </w:pPr>
+            <w:r>
+              <w:rPr>
+                <w:sz w:val="18"/>
+              </w:rPr>
+              <w:t>录音来源</w:t>
+            </w:r>
+          </w:p>
+        </w:tc>
+        <w:tc>
+          <w:tcPr>
+            <w:tcW w:type="dxa" w:w="3278"/>
+          </w:tcPr>
+          <w:p>
+            <w:pPr>
+              <w:spacing w:after="80"/>
+            </w:pPr>
+            <w:r>
+              <w:rPr>
+                <w:sz w:val="18"/>
+              </w:rPr>
+              <w:t>变体</w:t>
+            </w:r>
+          </w:p>
+        </w:tc>
+      </w:tr>
+      <w:tr>
+        <w:tc>
+          <w:tcPr>
+            <w:tcW w:type="dxa" w:w="3278"/>
+          </w:tcPr>
+          <w:p>
+            <w:pPr>
+              <w:spacing w:after="80"/>
+            </w:pPr>
+            <w:r>
+              <w:rPr>
+                <w:sz w:val="18"/>
+              </w:rPr>
+              <w:t>卡宾枪</w:t>
+            </w:r>
+          </w:p>
+        </w:tc>
+        <w:tc>
+          <w:tcPr>
+            <w:tcW w:type="dxa" w:w="3278"/>
+          </w:tcPr>
+          <w:p>
+            <w:pPr>
+              <w:spacing w:after="80"/>
+            </w:pPr>
+            <w:r>
+              <w:rPr>
+                <w:sz w:val="18"/>
+              </w:rPr>
+              <w:t>AR 15</w:t>
+            </w:r>
+          </w:p>
+        </w:tc>
+        <w:tc>
+          <w:tcPr>
+            <w:tcW w:type="dxa" w:w="3278"/>
+          </w:tcPr>
+          <w:p>
+            <w:pPr>
+              <w:spacing w:after="80"/>
+            </w:pPr>
+            <w:r>
+              <w:rPr>
+                <w:sz w:val="18"/>
+              </w:rPr>
+              <w:t>2</w:t>
+            </w:r>
+          </w:p>
+        </w:tc>
+      </w:tr>
+      <w:tr>
+        <w:tc>
+          <w:tcPr>
+            <w:tcW w:type="dxa" w:w="3278"/>
+          </w:tcPr>
+          <w:p>
+            <w:pPr>
+              <w:spacing w:after="80"/>
+            </w:pPr>
+            <w:r>
+              <w:rPr>
+                <w:sz w:val="18"/>
+              </w:rPr>
+              <w:t>精确射手</w:t>
+            </w:r>
+          </w:p>
+        </w:tc>
+        <w:tc>
+          <w:tcPr>
+            <w:tcW w:type="dxa" w:w="3278"/>
+          </w:tcPr>
+          <w:p>
+            <w:pPr>
+              <w:spacing w:after="80"/>
+            </w:pPr>
+            <w:r>
+              <w:rPr>
+                <w:sz w:val="18"/>
+              </w:rPr>
+              <w:t>SKS</w:t>
+            </w:r>
+          </w:p>
+        </w:tc>
+        <w:tc>
+          <w:tcPr>
+            <w:tcW w:type="dxa" w:w="3278"/>
+          </w:tcPr>
+          <w:p>
+            <w:pPr>
+              <w:spacing w:after="80"/>
+            </w:pPr>
+            <w:r>
+              <w:rPr>
+                <w:sz w:val="18"/>
+              </w:rPr>
+              <w:t>2</w:t>
+            </w:r>
+          </w:p>
+        </w:tc>
+      </w:tr>
+      <w:tr>
+        <w:tc>
+          <w:tcPr>
+            <w:tcW w:type="dxa" w:w="3278"/>
+          </w:tcPr>
+          <w:p>
+            <w:pPr>
+              <w:spacing w:after="80"/>
+            </w:pPr>
+            <w:r>
+              <w:rPr>
+                <w:sz w:val="18"/>
+              </w:rPr>
+              <w:t>冲锋枪</w:t>
+            </w:r>
+          </w:p>
+        </w:tc>
+        <w:tc>
+          <w:tcPr>
+            <w:tcW w:type="dxa" w:w="3278"/>
+          </w:tcPr>
+          <w:p>
+            <w:pPr>
+              <w:spacing w:after="80"/>
+            </w:pPr>
+            <w:r>
+              <w:rPr>
+                <w:sz w:val="18"/>
+              </w:rPr>
+              <w:t>Carl Gustav M45</w:t>
+            </w:r>
+          </w:p>
+        </w:tc>
+        <w:tc>
+          <w:tcPr>
+            <w:tcW w:type="dxa" w:w="3278"/>
+          </w:tcPr>
+          <w:p>
+            <w:pPr>
+              <w:spacing w:after="80"/>
+            </w:pPr>
+            <w:r>
+              <w:rPr>
+                <w:sz w:val="18"/>
+              </w:rPr>
+              <w:t>2</w:t>
+            </w:r>
+          </w:p>
+        </w:tc>
+      </w:tr>
+      <w:tr>
+        <w:tc>
+          <w:tcPr>
+            <w:tcW w:type="dxa" w:w="3278"/>
+          </w:tcPr>
+          <w:p>
+            <w:pPr>
+              <w:spacing w:after="80"/>
+            </w:pPr>
+            <w:r>
+              <w:rPr>
+                <w:sz w:val="18"/>
+              </w:rPr>
+              <w:t>轻机枪</w:t>
+            </w:r>
+          </w:p>
+        </w:tc>
+        <w:tc>
+          <w:tcPr>
+            <w:tcW w:type="dxa" w:w="3278"/>
+          </w:tcPr>
+          <w:p>
+            <w:pPr>
+              <w:spacing w:after="80"/>
+            </w:pPr>
+            <w:r>
+              <w:rPr>
+                <w:sz w:val="18"/>
+              </w:rPr>
+              <w:t>PPSh 单发</w:t>
+            </w:r>
+          </w:p>
+        </w:tc>
+        <w:tc>
+          <w:tcPr>
+            <w:tcW w:type="dxa" w:w="3278"/>
+          </w:tcPr>
+          <w:p>
+            <w:pPr>
+              <w:spacing w:after="80"/>
+            </w:pPr>
+            <w:r>
+              <w:rPr>
+                <w:sz w:val="18"/>
+              </w:rPr>
+              <w:t>同一录音的两次独立单发</w:t>
+            </w:r>
+          </w:p>
+        </w:tc>
+      </w:tr>
+      <w:tr>
+        <w:tc>
+          <w:tcPr>
+            <w:tcW w:type="dxa" w:w="3278"/>
+          </w:tcPr>
+          <w:p>
+            <w:pPr>
+              <w:spacing w:after="80"/>
+            </w:pPr>
+            <w:r>
+              <w:rPr>
+                <w:sz w:val="18"/>
+              </w:rPr>
+              <w:t>战斗步枪</w:t>
+            </w:r>
+          </w:p>
+        </w:tc>
+        <w:tc>
+          <w:tcPr>
+            <w:tcW w:type="dxa" w:w="3278"/>
+          </w:tcPr>
+          <w:p>
+            <w:pPr>
+              <w:spacing w:after="80"/>
+            </w:pPr>
+            <w:r>
+              <w:rPr>
+                <w:sz w:val="18"/>
+              </w:rPr>
+              <w:t>AK 47 单发</w:t>
+            </w:r>
+          </w:p>
+        </w:tc>
+        <w:tc>
+          <w:tcPr>
+            <w:tcW w:type="dxa" w:w="3278"/>
+          </w:tcPr>
+          <w:p>
+            <w:pPr>
+              <w:spacing w:after="80"/>
+            </w:pPr>
+            <w:r>
+              <w:rPr>
+                <w:sz w:val="18"/>
+              </w:rPr>
+              <w:t>2</w:t>
+            </w:r>
+          </w:p>
+        </w:tc>
+      </w:tr>
+      <w:tr>
+        <w:tc>
+          <w:tcPr>
+            <w:tcW w:type="dxa" w:w="3278"/>
+          </w:tcPr>
+          <w:p>
+            <w:pPr>
+              <w:spacing w:after="80"/>
+            </w:pPr>
+            <w:r>
+              <w:rPr>
+                <w:sz w:val="18"/>
+              </w:rPr>
+              <w:t>狙击枪</w:t>
+            </w:r>
+          </w:p>
+        </w:tc>
+        <w:tc>
+          <w:tcPr>
+            <w:tcW w:type="dxa" w:w="3278"/>
+          </w:tcPr>
+          <w:p>
+            <w:pPr>
+              <w:spacing w:after="80"/>
+            </w:pPr>
+            <w:r>
+              <w:rPr>
+                <w:sz w:val="18"/>
+              </w:rPr>
+              <w:t>Tikka</w:t>
+            </w:r>
+          </w:p>
+        </w:tc>
+        <w:tc>
+          <w:tcPr>
+            <w:tcW w:type="dxa" w:w="3278"/>
+          </w:tcPr>
+          <w:p>
+            <w:pPr>
+              <w:spacing w:after="80"/>
+            </w:pPr>
+            <w:r>
+              <w:rPr>
+                <w:sz w:val="18"/>
+              </w:rPr>
+              <w:t>2</w:t>
+            </w:r>
+          </w:p>
+        </w:tc>
+      </w:tr>
+      <w:tr>
+        <w:tc>
+          <w:tcPr>
+            <w:tcW w:type="dxa" w:w="3278"/>
+          </w:tcPr>
+          <w:p>
+            <w:pPr>
+              <w:spacing w:after="80"/>
+            </w:pPr>
+            <w:r>
+              <w:rPr>
+                <w:sz w:val="18"/>
+              </w:rPr>
+              <w:t>手枪</w:t>
+            </w:r>
+          </w:p>
+        </w:tc>
+        <w:tc>
+          <w:tcPr>
+            <w:tcW w:type="dxa" w:w="3278"/>
+          </w:tcPr>
+          <w:p>
+            <w:pPr>
+              <w:spacing w:after="80"/>
+            </w:pPr>
+            <w:r>
+              <w:rPr>
+                <w:sz w:val="18"/>
+              </w:rPr>
+              <w:t>1911</w:t>
+            </w:r>
+          </w:p>
+        </w:tc>
+        <w:tc>
+          <w:tcPr>
+            <w:tcW w:type="dxa" w:w="3278"/>
+          </w:tcPr>
+          <w:p>
+            <w:pPr>
+              <w:spacing w:after="80"/>
+            </w:pPr>
+            <w:r>
+              <w:rPr>
+                <w:sz w:val="18"/>
+              </w:rPr>
+              <w:t>2</w:t>
+            </w:r>
+          </w:p>
+        </w:tc>
+      </w:tr>
+    </w:tbl>
+    <w:p/>
+    <w:p>
+      <w:r>
+        <w:t>录音库有自动连发素材。QA发现直接取一秒片段会让每个游戏shot事件播放多发枪声，造成类似火神炮的错觉。本轮改选单发；轻机枪在P_30P.wav中分别截取独立射击，避免与游戏射速重复叠加。完整取样时间、文件及SHA256在RECORDED_SFX_MANIFEST.json。</w:t>
+      </w:r>
+    </w:p>
+    <w:p>
+      <w:r>
+        <w:t>爆炸使用EZduzziteh发布的CC0设计音效，并不称为真实战场炮击录音。距离低通、左右声道定位与最多28个声音并发继续有效；新增音效动态压缩限峰，采样结束清理输出声道节点。发动机、炮口、部分脚步和风仍有程序化层，采样缺失时保留备用。</w:t>
+      </w:r>
+    </w:p>
+    <w:p>
+      <w:r>
+        <w:t>出处：opengameart.org/node/21826；opengameart.org/content/explosions-4。具体授权与加工记录在docs/licenses/Audio-Credits.md。29个WAV/OGG已在Chrome实际解码，技术验证不能替代耳机与扬声器人工听感验收。</w:t>
+      </w:r>
+    </w:p>
+    <w:p>
+      <w:pPr>
+        <w:pStyle w:val="Heading1"/>
+        <w:pageBreakBefore/>
+      </w:pPr>
+      <w:r>
+        <w:t>车辆驾驶员与空投状态</w:t>
+      </w:r>
+    </w:p>
+    <w:p>
+      <w:r>
+        <w:t>ArmoredVehicle现在保存occupants数组，Soldier保存vehicleId。驾驶位占用者必须是存活且确实在该车中的原有士兵；仅给driver赋值ai不会再启动空车。单位上车后不重复绘制车外步兵，不再作为车外射击目标，且随车辆位置更新。军队总人数保持原size两倍。</w:t>
+      </w:r>
+    </w:p>
+    <w:p>
+      <w:r>
+        <w:t>普通基地车辆允许AI接近并登驾驶位。8v8每队最多1个AI驾驶员，16v16最多2个，32v32及以上最多4个，避免小战局抽走过多步兵。驾驶员下车后恢复步兵行为，15秒内不立即重新抢车。</w:t>
+      </w:r>
+    </w:p>
+    <w:p>
+      <w:r>
+        <w:t>玩家E接管友军车辆时，系统先寻找无碰撞下车位置，再让原AI退出，然后把玩家放入驾驶位；若无安全位置则拒绝挤出。F1–F4改变玩家占用的实际座位。空驾驶位会停车，乘客或机枪位不能代替驾驶位开车。</w:t>
+      </w:r>
+    </w:p>
+    <w:tbl>
+      <w:tblPr>
+        <w:tblStyle w:val="TableGrid"/>
+        <w:tblW w:type="auto" w:w="0"/>
+        <w:tblLook w:firstColumn="1" w:firstRow="1" w:lastColumn="0" w:lastRow="0" w:noHBand="0" w:noVBand="1" w:val="04A0"/>
+      </w:tblPr>
+      <w:tblGrid>
+        <w:gridCol w:w="3278"/>
+        <w:gridCol w:w="3278"/>
+        <w:gridCol w:w="3278"/>
+      </w:tblGrid>
+      <w:tr>
+        <w:tc>
+          <w:tcPr>
+            <w:tcW w:type="dxa" w:w="3278"/>
+          </w:tcPr>
+          <w:p>
+            <w:pPr>
+              <w:spacing w:after="80"/>
+            </w:pPr>
+            <w:r>
+              <w:rPr>
+                <w:sz w:val="18"/>
+              </w:rPr>
+              <w:t>座位</w:t>
+            </w:r>
+          </w:p>
+        </w:tc>
+        <w:tc>
+          <w:tcPr>
+            <w:tcW w:type="dxa" w:w="3278"/>
+          </w:tcPr>
+          <w:p>
+            <w:pPr>
+              <w:spacing w:after="80"/>
+            </w:pPr>
+            <w:r>
+              <w:rPr>
+                <w:sz w:val="18"/>
+              </w:rPr>
+              <w:t>权限</w:t>
+            </w:r>
+          </w:p>
+        </w:tc>
+        <w:tc>
+          <w:tcPr>
+            <w:tcW w:type="dxa" w:w="3278"/>
+          </w:tcPr>
+          <w:p>
+            <w:pPr>
+              <w:spacing w:after="80"/>
+            </w:pPr>
+            <w:r>
+              <w:rPr>
+                <w:sz w:val="18"/>
+              </w:rPr>
+              <w:t>类型差异</w:t>
+            </w:r>
+          </w:p>
+        </w:tc>
+      </w:tr>
+      <w:tr>
+        <w:tc>
+          <w:tcPr>
+            <w:tcW w:type="dxa" w:w="3278"/>
+          </w:tcPr>
+          <w:p>
+            <w:pPr>
+              <w:spacing w:after="80"/>
+            </w:pPr>
+            <w:r>
+              <w:rPr>
+                <w:sz w:val="18"/>
+              </w:rPr>
+              <w:t>F1 驾驶</w:t>
+            </w:r>
+          </w:p>
+        </w:tc>
+        <w:tc>
+          <w:tcPr>
+            <w:tcW w:type="dxa" w:w="3278"/>
+          </w:tcPr>
+          <w:p>
+            <w:pPr>
+              <w:spacing w:after="80"/>
+            </w:pPr>
+            <w:r>
+              <w:rPr>
+                <w:sz w:val="18"/>
+              </w:rPr>
+              <w:t>驾驶及主武器</w:t>
+            </w:r>
+          </w:p>
+        </w:tc>
+        <w:tc>
+          <w:tcPr>
+            <w:tcW w:type="dxa" w:w="3278"/>
+          </w:tcPr>
+          <w:p>
+            <w:pPr>
+              <w:spacing w:after="80"/>
+            </w:pPr>
+            <w:r>
+              <w:rPr>
+                <w:sz w:val="18"/>
+              </w:rPr>
+              <w:t>IFV/坦克为实体炮弹；运输车驾驶无武器</w:t>
+            </w:r>
+          </w:p>
+        </w:tc>
+      </w:tr>
+      <w:tr>
+        <w:tc>
+          <w:tcPr>
+            <w:tcW w:type="dxa" w:w="3278"/>
+          </w:tcPr>
+          <w:p>
+            <w:pPr>
+              <w:spacing w:after="80"/>
+            </w:pPr>
+            <w:r>
+              <w:rPr>
+                <w:sz w:val="18"/>
+              </w:rPr>
+              <w:t>F2 机枪</w:t>
+            </w:r>
+          </w:p>
+        </w:tc>
+        <w:tc>
+          <w:tcPr>
+            <w:tcW w:type="dxa" w:w="3278"/>
+          </w:tcPr>
+          <w:p>
+            <w:pPr>
+              <w:spacing w:after="80"/>
+            </w:pPr>
+            <w:r>
+              <w:rPr>
+                <w:sz w:val="18"/>
+              </w:rPr>
+              <w:t>独立机枪瞄准与射击</w:t>
+            </w:r>
+          </w:p>
+        </w:tc>
+        <w:tc>
+          <w:tcPr>
+            <w:tcW w:type="dxa" w:w="3278"/>
+          </w:tcPr>
+          <w:p>
+            <w:pPr>
+              <w:spacing w:after="80"/>
+            </w:pPr>
+            <w:r>
+              <w:rPr>
+                <w:sz w:val="18"/>
+              </w:rPr>
+              <w:t>不具备驾驶权限</w:t>
+            </w:r>
+          </w:p>
+        </w:tc>
+      </w:tr>
+      <w:tr>
+        <w:tc>
+          <w:tcPr>
+            <w:tcW w:type="dxa" w:w="3278"/>
+          </w:tcPr>
+          <w:p>
+            <w:pPr>
+              <w:spacing w:after="80"/>
+            </w:pPr>
+            <w:r>
+              <w:rPr>
+                <w:sz w:val="18"/>
+              </w:rPr>
+              <w:t>F3 F4 成员</w:t>
+            </w:r>
+          </w:p>
+        </w:tc>
+        <w:tc>
+          <w:tcPr>
+            <w:tcW w:type="dxa" w:w="3278"/>
+          </w:tcPr>
+          <w:p>
+            <w:pPr>
+              <w:spacing w:after="80"/>
+            </w:pPr>
+            <w:r>
+              <w:rPr>
+                <w:sz w:val="18"/>
+              </w:rPr>
+              <w:t>搭乘</w:t>
+            </w:r>
+          </w:p>
+        </w:tc>
+        <w:tc>
+          <w:tcPr>
+            <w:tcW w:type="dxa" w:w="3278"/>
+          </w:tcPr>
+          <w:p>
+            <w:pPr>
+              <w:spacing w:after="80"/>
+            </w:pPr>
+            <w:r>
+              <w:rPr>
+                <w:sz w:val="18"/>
+              </w:rPr>
+              <w:t>侦察车只有两个座位</w:t>
+            </w:r>
+          </w:p>
+        </w:tc>
+      </w:tr>
+    </w:tbl>
+    <w:p/>
+    <w:p>
+      <w:r>
+        <w:t>Q征用车辆在玩家附近扫描安全落点，扣费后进入airborne，8秒内显示降落伞并下降；空中不能登车。落地区被其他动态车辆占据时等待清空。落地后可以E驾驶，reservedFor持续为本地玩家保留，退出车辆也不会解除保留，不被AI开走。最多3辆活跃征用车；击毁不免费重生，普通基地车沿用分类重生。</w:t>
+      </w:r>
+    </w:p>
+    <w:p>
+      <w:r>
+        <w:t>当前仅实现AI驾驶员。没有AI独立机枪手、乘客上下车协同，也没有完整装甲分区、跳弹或穿甲模型。</w:t>
+      </w:r>
+    </w:p>
+    <w:p>
+      <w:pPr>
+        <w:pStyle w:val="Heading1"/>
+        <w:pageBreakBefore/>
+      </w:pPr>
+      <w:r>
+        <w:t>枪口 受击 死亡与音乐</w:t>
+      </w:r>
+    </w:p>
+    <w:p>
+      <w:r>
+        <w:t>WeaponView把不同枪模型的枪口端点转换到世界坐标。Battle.shootPlayer使用该点作为实际射线起点，并朝摄像机准星瞄准位置收敛；眼睛到枪口及射线前方实体墙能遮挡射击。shot事件带muzzle和end，示踪线采用这些三维位置，不从人物中心绘制。</w:t>
+      </w:r>
+    </w:p>
+    <w:p>
+      <w:r>
+        <w:t>载具炮弹从与可见炮管匹配的末端发射；炮管仰角跟随射击方向。IFV与坦克弹体继续真实飞行、重力下落并触发碰撞爆炸。机枪为即时射线，步兵示踪仍是短暂光线，并非全部武器都做逐帧弹体。</w:t>
+      </w:r>
+    </w:p>
+    <w:p>
+      <w:r>
+        <w:t>playerHit立即触发短促红色边缘/画面冲击和方向数字，叠加受伤pitch/roll后逐渐恢复；低血量持续显示暗角。QA修复了后续侧倾赋值覆盖受击与死亡roll的问题。</w:t>
+      </w:r>
+    </w:p>
+    <w:tbl>
+      <w:tblPr>
+        <w:tblStyle w:val="TableGrid"/>
+        <w:tblW w:type="auto" w:w="0"/>
+        <w:tblLook w:firstColumn="1" w:firstRow="1" w:lastColumn="0" w:lastRow="0" w:noHBand="0" w:noVBand="1" w:val="04A0"/>
+      </w:tblPr>
+      <w:tblGrid>
+        <w:gridCol w:w="4917"/>
+        <w:gridCol w:w="4917"/>
+      </w:tblGrid>
+      <w:tr>
+        <w:tc>
+          <w:tcPr>
+            <w:tcW w:type="dxa" w:w="4917"/>
+          </w:tcPr>
+          <w:p>
+            <w:pPr>
+              <w:spacing w:after="80"/>
+            </w:pPr>
+            <w:r>
+              <w:rPr>
+                <w:sz w:val="18"/>
+              </w:rPr>
+              <w:t>时间</w:t>
+            </w:r>
+          </w:p>
+        </w:tc>
+        <w:tc>
+          <w:tcPr>
+            <w:tcW w:type="dxa" w:w="4917"/>
+          </w:tcPr>
+          <w:p>
+            <w:pPr>
+              <w:spacing w:after="80"/>
+            </w:pPr>
+            <w:r>
+              <w:rPr>
+                <w:sz w:val="18"/>
+              </w:rPr>
+              <w:t>死亡表现</w:t>
+            </w:r>
+          </w:p>
+        </w:tc>
+      </w:tr>
+      <w:tr>
+        <w:tc>
+          <w:tcPr>
+            <w:tcW w:type="dxa" w:w="4917"/>
+          </w:tcPr>
+          <w:p>
+            <w:pPr>
+              <w:spacing w:after="80"/>
+            </w:pPr>
+            <w:r>
+              <w:rPr>
+                <w:sz w:val="18"/>
+              </w:rPr>
+              <w:t>0 至1.15秒</w:t>
+            </w:r>
+          </w:p>
+        </w:tc>
+        <w:tc>
+          <w:tcPr>
+            <w:tcW w:type="dxa" w:w="4917"/>
+          </w:tcPr>
+          <w:p>
+            <w:pPr>
+              <w:spacing w:after="80"/>
+            </w:pPr>
+            <w:r>
+              <w:rPr>
+                <w:sz w:val="18"/>
+              </w:rPr>
+              <w:t>视角下降并侧倾倒地，隐藏战斗HUD</w:t>
+            </w:r>
+          </w:p>
+        </w:tc>
+      </w:tr>
+      <w:tr>
+        <w:tc>
+          <w:tcPr>
+            <w:tcW w:type="dxa" w:w="4917"/>
+          </w:tcPr>
+          <w:p>
+            <w:pPr>
+              <w:spacing w:after="80"/>
+            </w:pPr>
+            <w:r>
+              <w:rPr>
+                <w:sz w:val="18"/>
+              </w:rPr>
+              <w:t>1.15 至2秒</w:t>
+            </w:r>
+          </w:p>
+        </w:tc>
+        <w:tc>
+          <w:tcPr>
+            <w:tcW w:type="dxa" w:w="4917"/>
+          </w:tcPr>
+          <w:p>
+            <w:pPr>
+              <w:spacing w:after="80"/>
+            </w:pPr>
+            <w:r>
+              <w:rPr>
+                <w:sz w:val="18"/>
+              </w:rPr>
+              <w:t>贴地停留，显示阵亡提示</w:t>
+            </w:r>
+          </w:p>
+        </w:tc>
+      </w:tr>
+      <w:tr>
+        <w:tc>
+          <w:tcPr>
+            <w:tcW w:type="dxa" w:w="4917"/>
+          </w:tcPr>
+          <w:p>
+            <w:pPr>
+              <w:spacing w:after="80"/>
+            </w:pPr>
+            <w:r>
+              <w:rPr>
+                <w:sz w:val="18"/>
+              </w:rPr>
+              <w:t>2 至4.8秒</w:t>
+            </w:r>
+          </w:p>
+        </w:tc>
+        <w:tc>
+          <w:tcPr>
+            <w:tcW w:type="dxa" w:w="4917"/>
+          </w:tcPr>
+          <w:p>
+            <w:pPr>
+              <w:spacing w:after="80"/>
+            </w:pPr>
+            <w:r>
+              <w:rPr>
+                <w:sz w:val="18"/>
+              </w:rPr>
+              <w:t>镜头向战场中心升高至约525米，朝向俯视</w:t>
+            </w:r>
+          </w:p>
+        </w:tc>
+      </w:tr>
+      <w:tr>
+        <w:tc>
+          <w:tcPr>
+            <w:tcW w:type="dxa" w:w="4917"/>
+          </w:tcPr>
+          <w:p>
+            <w:pPr>
+              <w:spacing w:after="80"/>
+            </w:pPr>
+            <w:r>
+              <w:rPr>
+                <w:sz w:val="18"/>
+              </w:rPr>
+              <w:t>4.8秒后</w:t>
+            </w:r>
+          </w:p>
+        </w:tc>
+        <w:tc>
+          <w:tcPr>
+            <w:tcW w:type="dxa" w:w="4917"/>
+          </w:tcPr>
+          <w:p>
+            <w:pPr>
+              <w:spacing w:after="80"/>
+            </w:pPr>
+            <w:r>
+              <w:rPr>
+                <w:sz w:val="18"/>
+              </w:rPr>
+              <w:t>淡入战术部署地图，仍检查交战小队与受攻击据点</w:t>
+            </w:r>
+          </w:p>
+        </w:tc>
+      </w:tr>
+    </w:tbl>
+    <w:p/>
+    <w:p>
+      <w:r>
+        <w:t>死亡阶段战局继续运行，控制不产生移动/开火。复活后恢复视角与HUD。地图添加真实建筑轮廓和地形配色。该流程为原型原创镜头，不宣称复刻战地6/三角洲的内部算法；也不包含等待医疗救援的玩家倒地玩法。</w:t>
+      </w:r>
+    </w:p>
+    <w:p>
+      <w:r>
+        <w:t>MusicDirector不再把respawn当成部署开场换歌；按真实战况延续cue。两槽采用4秒等功率交叉淡化，开火/爆炸duck与恢复平滑，主音量0仍立即静音。十一首用户音乐只放本机和私人完整ZIP。</w:t>
+      </w:r>
+    </w:p>
+    <w:p>
+      <w:pPr>
+        <w:pStyle w:val="Heading1"/>
+        <w:pageBreakBefore/>
+      </w:pPr>
+      <w:r>
+        <w:t>自动验证与观察边界</w:t>
+      </w:r>
+    </w:p>
+    <w:tbl>
+      <w:tblPr>
+        <w:tblStyle w:val="TableGrid"/>
+        <w:tblW w:type="auto" w:w="0"/>
+        <w:tblLook w:firstColumn="1" w:firstRow="1" w:lastColumn="0" w:lastRow="0" w:noHBand="0" w:noVBand="1" w:val="04A0"/>
+      </w:tblPr>
+      <w:tblGrid>
+        <w:gridCol w:w="4917"/>
+        <w:gridCol w:w="4917"/>
+      </w:tblGrid>
+      <w:tr>
+        <w:tc>
+          <w:tcPr>
+            <w:tcW w:type="dxa" w:w="4917"/>
+          </w:tcPr>
+          <w:p>
+            <w:pPr>
+              <w:spacing w:after="80"/>
+            </w:pPr>
+            <w:r>
+              <w:rPr>
+                <w:sz w:val="18"/>
+              </w:rPr>
+              <w:t>验证层</w:t>
+            </w:r>
+          </w:p>
+        </w:tc>
+        <w:tc>
+          <w:tcPr>
+            <w:tcW w:type="dxa" w:w="4917"/>
+          </w:tcPr>
+          <w:p>
+            <w:pPr>
+              <w:spacing w:after="80"/>
+            </w:pPr>
+            <w:r>
+              <w:rPr>
                 <w:sz w:val="18"/>
               </w:rPr>
               <w:t>结果</w:t>
@@ -102,1862 +1302,81 @@
         </w:tc>
       </w:tr>
       <w:tr>
-        <w:trPr>
-          <w:cantSplit/>
-        </w:trPr>
         <w:tc>
           <w:tcPr>
-            <w:tcW w:type="dxa" w:w="2016"/>
+            <w:tcW w:type="dxa" w:w="4917"/>
           </w:tcPr>
           <w:p>
             <w:pPr>
-              <w:spacing w:before="60" w:after="60" w:line="240" w:lineRule="auto"/>
+              <w:spacing w:after="80"/>
             </w:pPr>
             <w:r>
               <w:rPr>
                 <w:sz w:val="18"/>
               </w:rPr>
-              <w:t>操作与反馈</w:t>
+              <w:t>strict TypeScript</w:t>
             </w:r>
           </w:p>
         </w:tc>
         <w:tc>
           <w:tcPr>
-            <w:tcW w:type="dxa" w:w="7819"/>
+            <w:tcW w:type="dxa" w:w="4917"/>
           </w:tcPr>
           <w:p>
             <w:pPr>
-              <w:spacing w:before="60" w:after="60" w:line="240" w:lineRule="auto"/>
+              <w:spacing w:after="80"/>
             </w:pPr>
             <w:r>
               <w:rPr>
                 <w:sz w:val="18"/>
               </w:rPr>
-              <w:t>A/D横移、Shift滑铲、来源方向和掉血提示，保留鼠标备用操作</w:t>
+              <w:t>PASS</w:t>
             </w:r>
           </w:p>
         </w:tc>
       </w:tr>
       <w:tr>
-        <w:trPr>
-          <w:cantSplit/>
-        </w:trPr>
         <w:tc>
           <w:tcPr>
-            <w:tcW w:type="dxa" w:w="2016"/>
+            <w:tcW w:type="dxa" w:w="4917"/>
           </w:tcPr>
           <w:p>
             <w:pPr>
-              <w:spacing w:before="60" w:after="60" w:line="240" w:lineRule="auto"/>
+              <w:spacing w:after="80"/>
             </w:pPr>
             <w:r>
               <w:rPr>
                 <w:sz w:val="18"/>
               </w:rPr>
-              <w:t>载具与战斗</w:t>
+              <w:t>Vitest</w:t>
             </w:r>
           </w:p>
         </w:tc>
         <w:tc>
           <w:tcPr>
-            <w:tcW w:type="dxa" w:w="7819"/>
+            <w:tcW w:type="dxa" w:w="4917"/>
           </w:tcPr>
           <w:p>
             <w:pPr>
-              <w:spacing w:before="60" w:after="60" w:line="240" w:lineRule="auto"/>
+              <w:spacing w:after="80"/>
             </w:pPr>
             <w:r>
               <w:rPr>
                 <w:sz w:val="18"/>
               </w:rPr>
-              <w:t>四类基地车、四座权限、辅助驾驶、安全上下车、真实炮弹和火箭</w:t>
+              <w:t>46项全部通过</w:t>
             </w:r>
           </w:p>
         </w:tc>
       </w:tr>
       <w:tr>
-        <w:trPr>
-          <w:cantSplit/>
-        </w:trPr>
         <w:tc>
           <w:tcPr>
-            <w:tcW w:type="dxa" w:w="2016"/>
+            <w:tcW w:type="dxa" w:w="4917"/>
           </w:tcPr>
           <w:p>
             <w:pPr>
-              <w:spacing w:before="60" w:after="60" w:line="240" w:lineRule="auto"/>
-            </w:pPr>
-            <w:r>
-              <w:rPr>
-                <w:sz w:val="18"/>
-              </w:rPr>
-              <w:t>配装与复活</w:t>
-            </w:r>
-          </w:p>
-        </w:tc>
-        <w:tc>
-          <w:tcPr>
-            <w:tcW w:type="dxa" w:w="7819"/>
-          </w:tcPr>
-          <w:p>
-            <w:pPr>
-              <w:spacing w:before="60" w:after="60" w:line="240" w:lineRule="auto"/>
-            </w:pPr>
-            <w:r>
-              <w:rPr>
-                <w:sz w:val="18"/>
-              </w:rPr>
-              <w:t>四兵种、独立装备、完整准备卡片和战术部署地图</w:t>
-            </w:r>
-          </w:p>
-        </w:tc>
-      </w:tr>
-      <w:tr>
-        <w:trPr>
-          <w:cantSplit/>
-        </w:trPr>
-        <w:tc>
-          <w:tcPr>
-            <w:tcW w:type="dxa" w:w="2016"/>
-          </w:tcPr>
-          <w:p>
-            <w:pPr>
-              <w:spacing w:before="60" w:after="60" w:line="240" w:lineRule="auto"/>
-            </w:pPr>
-            <w:r>
-              <w:rPr>
-                <w:sz w:val="18"/>
-              </w:rPr>
-              <w:t>表现与音频</w:t>
-            </w:r>
-          </w:p>
-        </w:tc>
-        <w:tc>
-          <w:tcPr>
-            <w:tcW w:type="dxa" w:w="7819"/>
-          </w:tcPr>
-          <w:p>
-            <w:pPr>
-              <w:spacing w:before="60" w:after="60" w:line="240" w:lineRule="auto"/>
-            </w:pPr>
-            <w:r>
-              <w:rPr>
-                <w:sz w:val="18"/>
-              </w:rPr>
-              <w:t>七种枪独立结构、紧凑HUD、十一首情境配乐、22个音效</w:t>
-            </w:r>
-          </w:p>
-        </w:tc>
-      </w:tr>
-      <w:tr>
-        <w:trPr>
-          <w:cantSplit/>
-        </w:trPr>
-        <w:tc>
-          <w:tcPr>
-            <w:tcW w:type="dxa" w:w="2016"/>
-          </w:tcPr>
-          <w:p>
-            <w:pPr>
-              <w:spacing w:before="60" w:after="60" w:line="240" w:lineRule="auto"/>
-            </w:pPr>
-            <w:r>
-              <w:rPr>
-                <w:sz w:val="18"/>
-              </w:rPr>
-              <w:t>验证与仓库</w:t>
-            </w:r>
-          </w:p>
-        </w:tc>
-        <w:tc>
-          <w:tcPr>
-            <w:tcW w:type="dxa" w:w="7819"/>
-          </w:tcPr>
-          <w:p>
-            <w:pPr>
-              <w:spacing w:before="60" w:after="60" w:line="240" w:lineRule="auto"/>
-            </w:pPr>
-            <w:r>
-              <w:rPr>
-                <w:sz w:val="18"/>
-              </w:rPr>
-              <w:t>42项单元测试、10项Chrome回归、完整模拟/build、DOCX和两个分发范围</w:t>
-            </w:r>
-          </w:p>
-        </w:tc>
-      </w:tr>
-    </w:tbl>
-    <w:p>
-      <w:pPr>
-        <w:pStyle w:val="Heading2"/>
-      </w:pPr>
-      <w:r>
-        <w:t>质量边界</w:t>
-      </w:r>
-    </w:p>
-    <w:p>
-      <w:r>
-        <w:t>本次资产仍为程序化几何，不是战地级专业写实资产。新的地图、联网多人、AI独立同车乘员、完整穿甲跳弹未实现。已验证技术行为；长时间手感、扬声器/耳机听感和持续多硬件帧率仍需实玩反馈。</w:t>
-      </w:r>
-    </w:p>
-    <w:p>
-      <w:pPr>
-        <w:pStyle w:val="Heading1"/>
-        <w:pageBreakBefore/>
-      </w:pPr>
-      <w:r>
-        <w:t>01  操作修复、驾驶与真实弹道</w:t>
-      </w:r>
-    </w:p>
-    <w:p>
-      <w:pPr>
-        <w:pStyle w:val="Heading2"/>
-      </w:pPr>
-      <w:r>
-        <w:t>A/D 为什么看起来在旋转</w:t>
-      </w:r>
-    </w:p>
-    <w:p>
-      <w:r>
-        <w:t>根因是侧向倾斜每帧累加到 camera.rotation.z，持久移动后镜头持续转动。现在直接设置有限侧倾值，yaw只来自观察输入；浏览器以2秒D、1秒A检查左右投影、位移、yaw不变和roll小于0.03。Shift在移动速度达到6时点按启动0.7秒滑铲，2.2秒冷却；按住超过180ms冲刺。滑铲降低视点并沿初始运动方向减速。</w:t>
-      </w:r>
-    </w:p>
-    <w:p>
-      <w:pPr>
-        <w:pStyle w:val="Heading2"/>
-      </w:pPr>
-      <w:r>
-        <w:t>车辆类型与座位</w:t>
-      </w:r>
-    </w:p>
-    <w:tbl>
-      <w:tblPr>
-        <w:tblStyle w:val="TableGrid"/>
-        <w:tblW w:type="auto" w:w="0"/>
-        <w:tblLayout w:type="fixed"/>
-        <w:tblLook w:firstColumn="1" w:firstRow="1" w:lastColumn="0" w:lastRow="0" w:noHBand="0" w:noVBand="1" w:val="04A0"/>
-      </w:tblPr>
-      <w:tblGrid>
-        <w:gridCol w:w="1584"/>
-        <w:gridCol w:w="1728"/>
-        <w:gridCol w:w="6523"/>
-      </w:tblGrid>
-      <w:tr>
-        <w:trPr>
-          <w:cantSplit/>
-        </w:trPr>
-        <w:tc>
-          <w:tcPr>
-            <w:tcW w:type="dxa" w:w="1584"/>
-            <w:shd w:fill="E8EDE9"/>
-          </w:tcPr>
-          <w:p>
-            <w:pPr>
-              <w:spacing w:before="60" w:after="60" w:line="240" w:lineRule="auto"/>
-            </w:pPr>
-            <w:r>
-              <w:rPr>
-                <w:b/>
-                <w:sz w:val="18"/>
-              </w:rPr>
-              <w:t>车型</w:t>
-            </w:r>
-          </w:p>
-        </w:tc>
-        <w:tc>
-          <w:tcPr>
-            <w:tcW w:type="dxa" w:w="1728"/>
-            <w:shd w:fill="E8EDE9"/>
-          </w:tcPr>
-          <w:p>
-            <w:pPr>
-              <w:spacing w:before="60" w:after="60" w:line="240" w:lineRule="auto"/>
-            </w:pPr>
-            <w:r>
-              <w:rPr>
-                <w:b/>
-                <w:sz w:val="18"/>
-              </w:rPr>
-              <w:t>数值</w:t>
-            </w:r>
-          </w:p>
-        </w:tc>
-        <w:tc>
-          <w:tcPr>
-            <w:tcW w:type="dxa" w:w="6523"/>
-            <w:shd w:fill="E8EDE9"/>
-          </w:tcPr>
-          <w:p>
-            <w:pPr>
-              <w:spacing w:before="60" w:after="60" w:line="240" w:lineRule="auto"/>
-            </w:pPr>
-            <w:r>
-              <w:rPr>
-                <w:b/>
-                <w:sz w:val="18"/>
-              </w:rPr>
-              <w:t>权限与用途</w:t>
-            </w:r>
-          </w:p>
-        </w:tc>
-      </w:tr>
-      <w:tr>
-        <w:trPr>
-          <w:cantSplit/>
-        </w:trPr>
-        <w:tc>
-          <w:tcPr>
-            <w:tcW w:type="dxa" w:w="1584"/>
-          </w:tcPr>
-          <w:p>
-            <w:pPr>
-              <w:spacing w:before="60" w:after="60" w:line="240" w:lineRule="auto"/>
-            </w:pPr>
-            <w:r>
-              <w:rPr>
-                <w:sz w:val="18"/>
-              </w:rPr>
-              <w:t>U8运输车</w:t>
-            </w:r>
-          </w:p>
-        </w:tc>
-        <w:tc>
-          <w:tcPr>
-            <w:tcW w:type="dxa" w:w="1728"/>
-          </w:tcPr>
-          <w:p>
-            <w:pPr>
-              <w:spacing w:before="60" w:after="60" w:line="240" w:lineRule="auto"/>
-            </w:pPr>
-            <w:r>
-              <w:rPr>
-                <w:sz w:val="18"/>
-              </w:rPr>
-              <w:t>140HP / 25m/s</w:t>
-            </w:r>
-          </w:p>
-        </w:tc>
-        <w:tc>
-          <w:tcPr>
-            <w:tcW w:type="dxa" w:w="6523"/>
-          </w:tcPr>
-          <w:p>
-            <w:pPr>
-              <w:spacing w:before="60" w:after="60" w:line="240" w:lineRule="auto"/>
-            </w:pPr>
-            <w:r>
-              <w:rPr>
-                <w:sz w:val="18"/>
-              </w:rPr>
-              <w:t>四座；驾驶无武器，机枪位可射击，快速运输</w:t>
-            </w:r>
-          </w:p>
-        </w:tc>
-      </w:tr>
-      <w:tr>
-        <w:trPr>
-          <w:cantSplit/>
-        </w:trPr>
-        <w:tc>
-          <w:tcPr>
-            <w:tcW w:type="dxa" w:w="1584"/>
-          </w:tcPr>
-          <w:p>
-            <w:pPr>
-              <w:spacing w:before="60" w:after="60" w:line="240" w:lineRule="auto"/>
-            </w:pPr>
-            <w:r>
-              <w:rPr>
-                <w:sz w:val="18"/>
-              </w:rPr>
-              <w:t>R4侦察车</w:t>
-            </w:r>
-          </w:p>
-        </w:tc>
-        <w:tc>
-          <w:tcPr>
-            <w:tcW w:type="dxa" w:w="1728"/>
-          </w:tcPr>
-          <w:p>
-            <w:pPr>
-              <w:spacing w:before="60" w:after="60" w:line="240" w:lineRule="auto"/>
-            </w:pPr>
-            <w:r>
-              <w:rPr>
-                <w:sz w:val="18"/>
-              </w:rPr>
-              <w:t>180HP / 22m/s</w:t>
-            </w:r>
-          </w:p>
-        </w:tc>
-        <w:tc>
-          <w:tcPr>
-            <w:tcW w:type="dxa" w:w="6523"/>
-          </w:tcPr>
-          <w:p>
-            <w:pPr>
-              <w:spacing w:before="60" w:after="60" w:line="240" w:lineRule="auto"/>
-            </w:pPr>
-            <w:r>
-              <w:rPr>
-                <w:sz w:val="18"/>
-              </w:rPr>
-              <w:t>两座；驾驶轻武器，独立机枪位</w:t>
-            </w:r>
-          </w:p>
-        </w:tc>
-      </w:tr>
-      <w:tr>
-        <w:trPr>
-          <w:cantSplit/>
-        </w:trPr>
-        <w:tc>
-          <w:tcPr>
-            <w:tcW w:type="dxa" w:w="1584"/>
-          </w:tcPr>
-          <w:p>
-            <w:pPr>
-              <w:spacing w:before="60" w:after="60" w:line="240" w:lineRule="auto"/>
-            </w:pPr>
-            <w:r>
-              <w:rPr>
-                <w:sz w:val="18"/>
-              </w:rPr>
-              <w:t>V12步战车</w:t>
-            </w:r>
-          </w:p>
-        </w:tc>
-        <w:tc>
-          <w:tcPr>
-            <w:tcW w:type="dxa" w:w="1728"/>
-          </w:tcPr>
-          <w:p>
-            <w:pPr>
-              <w:spacing w:before="60" w:after="60" w:line="240" w:lineRule="auto"/>
-            </w:pPr>
-            <w:r>
-              <w:rPr>
-                <w:sz w:val="18"/>
-              </w:rPr>
-              <w:t>420HP / 13.2m/s</w:t>
-            </w:r>
-          </w:p>
-        </w:tc>
-        <w:tc>
-          <w:tcPr>
-            <w:tcW w:type="dxa" w:w="6523"/>
-          </w:tcPr>
-          <w:p>
-            <w:pPr>
-              <w:spacing w:before="60" w:after="60" w:line="240" w:lineRule="auto"/>
-            </w:pPr>
-            <w:r>
-              <w:rPr>
-                <w:sz w:val="18"/>
-              </w:rPr>
-              <w:t>四座；驾驶兼自动炮、机枪、两个成员位</w:t>
-            </w:r>
-          </w:p>
-        </w:tc>
-      </w:tr>
-      <w:tr>
-        <w:trPr>
-          <w:cantSplit/>
-        </w:trPr>
-        <w:tc>
-          <w:tcPr>
-            <w:tcW w:type="dxa" w:w="1584"/>
-          </w:tcPr>
-          <w:p>
-            <w:pPr>
-              <w:spacing w:before="60" w:after="60" w:line="240" w:lineRule="auto"/>
-            </w:pPr>
-            <w:r>
-              <w:rPr>
-                <w:sz w:val="18"/>
-              </w:rPr>
-              <w:t>T90主战坦克</w:t>
-            </w:r>
-          </w:p>
-        </w:tc>
-        <w:tc>
-          <w:tcPr>
-            <w:tcW w:type="dxa" w:w="1728"/>
-          </w:tcPr>
-          <w:p>
-            <w:pPr>
-              <w:spacing w:before="60" w:after="60" w:line="240" w:lineRule="auto"/>
-            </w:pPr>
-            <w:r>
-              <w:rPr>
-                <w:sz w:val="18"/>
-              </w:rPr>
-              <w:t>820HP / 10m/s</w:t>
-            </w:r>
-          </w:p>
-        </w:tc>
-        <w:tc>
-          <w:tcPr>
-            <w:tcW w:type="dxa" w:w="6523"/>
-          </w:tcPr>
-          <w:p>
-            <w:pPr>
-              <w:spacing w:before="60" w:after="60" w:line="240" w:lineRule="auto"/>
-            </w:pPr>
-            <w:r>
-              <w:rPr>
-                <w:sz w:val="18"/>
-              </w:rPr>
-              <w:t>四座；驾驶兼主炮、机枪、两个成员位</w:t>
-            </w:r>
-          </w:p>
-        </w:tc>
-      </w:tr>
-    </w:tbl>
-    <w:p>
-      <w:r>
-        <w:t>双方基地各四辆，原IFV IDs保留；蓝军默认停放后AI可使用。WASD按镜头方向辅助转向，方向键保留传统油门/转向，空格刹车；F1–F4切位，E上下车。入口扩大并要求可见，出口枚举16个候选位置检查墙体和其他车辆。车体半径碰撞、平滑加速/倒车和AI脱困延续。成员位没有驾驶或武器权限；没有AI在玩家切位后代驾。</w:t>
-      </w:r>
-    </w:p>
-    <w:p>
-      <w:pPr>
-        <w:pStyle w:val="Heading2"/>
-      </w:pPr>
-      <w:r>
-        <w:t>枪线与炮弹分离</w:t>
-      </w:r>
-    </w:p>
-    <w:p>
-      <w:r>
-        <w:t>机枪仍为射线；炮弹105m/s、重力9.8，火箭75m/s、重力2，均有飞行时间。以不超过0.8m的子步长检查地面、实体掩体、步兵和车辆；爆炸按距离衰减并检查视线，友军不受伤。弹体上限96，带亮点、尾烟、炮口反馈和落点爆炸。驾驶位炮塔与机枪yaw独立，第三人称射击校正镜头与炮口视差。</w:t>
-      </w:r>
-    </w:p>
-    <w:p>
-      <w:r>
-        <w:t>浏览器已验证主炮产生在飞弹体、机枪不生成主炮弹体、成员位不能驾驶/开火、安全下车；逻辑测试验证实际装甲受损和重生。</w:t>
-      </w:r>
-    </w:p>
-    <w:p>
-      <w:pPr>
-        <w:pStyle w:val="Heading1"/>
-        <w:pageBreakBefore/>
-      </w:pPr>
-      <w:r>
-        <w:t>02  准备界面、四兵种与地图复活</w:t>
-      </w:r>
-    </w:p>
-    <w:p>
-      <w:pPr>
-        <w:pStyle w:val="Heading2"/>
-      </w:pPr>
-      <w:r>
-        <w:t>完整战斗准备</w:t>
-      </w:r>
-    </w:p>
-    <w:p>
-      <w:r>
-        <w:t>主菜单与死亡地图使用兵种卡、六种主武器卡、独立轮廓预览、数值栏和主/副/装备/投掷物槽。配置自动保存；副武器支持P8或M89。配置部署时应用，存活战斗不能随意改配装补满弹药。弹匣与备弹独立，切枪取消换弹。</w:t>
-      </w:r>
-    </w:p>
-    <w:tbl>
-      <w:tblPr>
-        <w:tblStyle w:val="TableGrid"/>
-        <w:tblW w:type="auto" w:w="0"/>
-        <w:tblLayout w:type="fixed"/>
-        <w:tblLook w:firstColumn="1" w:firstRow="1" w:lastColumn="0" w:lastRow="0" w:noHBand="0" w:noVBand="1" w:val="04A0"/>
-      </w:tblPr>
-      <w:tblGrid>
-        <w:gridCol w:w="1584"/>
-        <w:gridCol w:w="1728"/>
-        <w:gridCol w:w="6523"/>
-      </w:tblGrid>
-      <w:tr>
-        <w:trPr>
-          <w:cantSplit/>
-        </w:trPr>
-        <w:tc>
-          <w:tcPr>
-            <w:tcW w:type="dxa" w:w="1584"/>
-            <w:shd w:fill="E8EDE9"/>
-          </w:tcPr>
-          <w:p>
-            <w:pPr>
-              <w:spacing w:before="60" w:after="60" w:line="240" w:lineRule="auto"/>
-            </w:pPr>
-            <w:r>
-              <w:rPr>
-                <w:b/>
-                <w:sz w:val="18"/>
-              </w:rPr>
-              <w:t>兵种</w:t>
-            </w:r>
-          </w:p>
-        </w:tc>
-        <w:tc>
-          <w:tcPr>
-            <w:tcW w:type="dxa" w:w="1728"/>
-            <w:shd w:fill="E8EDE9"/>
-          </w:tcPr>
-          <w:p>
-            <w:pPr>
-              <w:spacing w:before="60" w:after="60" w:line="240" w:lineRule="auto"/>
-            </w:pPr>
-            <w:r>
-              <w:rPr>
-                <w:b/>
-                <w:sz w:val="18"/>
-              </w:rPr>
-              <w:t>装备</w:t>
-            </w:r>
-          </w:p>
-        </w:tc>
-        <w:tc>
-          <w:tcPr>
-            <w:tcW w:type="dxa" w:w="6523"/>
-            <w:shd w:fill="E8EDE9"/>
-          </w:tcPr>
-          <w:p>
-            <w:pPr>
-              <w:spacing w:before="60" w:after="60" w:line="240" w:lineRule="auto"/>
-            </w:pPr>
-            <w:r>
-              <w:rPr>
-                <w:b/>
-                <w:sz w:val="18"/>
-              </w:rPr>
-              <w:t>实际效果</w:t>
-            </w:r>
-          </w:p>
-        </w:tc>
-      </w:tr>
-      <w:tr>
-        <w:trPr>
-          <w:cantSplit/>
-        </w:trPr>
-        <w:tc>
-          <w:tcPr>
-            <w:tcW w:type="dxa" w:w="1584"/>
-          </w:tcPr>
-          <w:p>
-            <w:pPr>
-              <w:spacing w:before="60" w:after="60" w:line="240" w:lineRule="auto"/>
-            </w:pPr>
-            <w:r>
-              <w:rPr>
-                <w:sz w:val="18"/>
-              </w:rPr>
-              <w:t>突击兵</w:t>
-            </w:r>
-          </w:p>
-        </w:tc>
-        <w:tc>
-          <w:tcPr>
-            <w:tcW w:type="dxa" w:w="1728"/>
-          </w:tcPr>
-          <w:p>
-            <w:pPr>
-              <w:spacing w:before="60" w:after="60" w:line="240" w:lineRule="auto"/>
-            </w:pPr>
-            <w:r>
-              <w:rPr>
-                <w:sz w:val="18"/>
-              </w:rPr>
-              <w:t>X 弹药</w:t>
-            </w:r>
-          </w:p>
-        </w:tc>
-        <w:tc>
-          <w:tcPr>
-            <w:tcW w:type="dxa" w:w="6523"/>
-          </w:tcPr>
-          <w:p>
-            <w:pPr>
-              <w:spacing w:before="60" w:after="60" w:line="240" w:lineRule="auto"/>
-            </w:pPr>
-            <w:r>
-              <w:rPr>
-                <w:sz w:val="18"/>
-              </w:rPr>
-              <w:t>仅补充缺少的备弹，不凭空补满当前弹匣</w:t>
-            </w:r>
-          </w:p>
-        </w:tc>
-      </w:tr>
-      <w:tr>
-        <w:trPr>
-          <w:cantSplit/>
-        </w:trPr>
-        <w:tc>
-          <w:tcPr>
-            <w:tcW w:type="dxa" w:w="1584"/>
-          </w:tcPr>
-          <w:p>
-            <w:pPr>
-              <w:spacing w:before="60" w:after="60" w:line="240" w:lineRule="auto"/>
-            </w:pPr>
-            <w:r>
-              <w:rPr>
-                <w:sz w:val="18"/>
-              </w:rPr>
-              <w:t>医疗兵</w:t>
-            </w:r>
-          </w:p>
-        </w:tc>
-        <w:tc>
-          <w:tcPr>
-            <w:tcW w:type="dxa" w:w="1728"/>
-          </w:tcPr>
-          <w:p>
-            <w:pPr>
-              <w:spacing w:before="60" w:after="60" w:line="240" w:lineRule="auto"/>
-            </w:pPr>
-            <w:r>
-              <w:rPr>
-                <w:sz w:val="18"/>
-              </w:rPr>
-              <w:t>X 医疗/救援</w:t>
-            </w:r>
-          </w:p>
-        </w:tc>
-        <w:tc>
-          <w:tcPr>
-            <w:tcW w:type="dxa" w:w="6523"/>
-          </w:tcPr>
-          <w:p>
-            <w:pPr>
-              <w:spacing w:before="60" w:after="60" w:line="240" w:lineRule="auto"/>
-            </w:pPr>
-            <w:r>
-              <w:rPr>
-                <w:sz w:val="18"/>
-              </w:rPr>
-              <w:t>优先救援6m内10秒内倒地且尚未复活的队友，50HP与35RP；否则治疗45HP</w:t>
-            </w:r>
-          </w:p>
-        </w:tc>
-      </w:tr>
-      <w:tr>
-        <w:trPr>
-          <w:cantSplit/>
-        </w:trPr>
-        <w:tc>
-          <w:tcPr>
-            <w:tcW w:type="dxa" w:w="1584"/>
-          </w:tcPr>
-          <w:p>
-            <w:pPr>
-              <w:spacing w:before="60" w:after="60" w:line="240" w:lineRule="auto"/>
-            </w:pPr>
-            <w:r>
-              <w:rPr>
-                <w:sz w:val="18"/>
-              </w:rPr>
-              <w:t>侦察兵</w:t>
-            </w:r>
-          </w:p>
-        </w:tc>
-        <w:tc>
-          <w:tcPr>
-            <w:tcW w:type="dxa" w:w="1728"/>
-          </w:tcPr>
-          <w:p>
-            <w:pPr>
-              <w:spacing w:before="60" w:after="60" w:line="240" w:lineRule="auto"/>
-            </w:pPr>
-            <w:r>
-              <w:rPr>
-                <w:sz w:val="18"/>
-              </w:rPr>
-              <w:t>X 信标</w:t>
-            </w:r>
-          </w:p>
-        </w:tc>
-        <w:tc>
-          <w:tcPr>
-            <w:tcW w:type="dxa" w:w="6523"/>
-          </w:tcPr>
-          <w:p>
-            <w:pPr>
-              <w:spacing w:before="60" w:after="60" w:line="240" w:lineRule="auto"/>
-            </w:pPr>
-            <w:r>
-              <w:rPr>
-                <w:sz w:val="18"/>
-              </w:rPr>
-              <w:t>180秒有效，一次性复活；受敌人威胁时禁用，成功部署才消耗</w:t>
-            </w:r>
-          </w:p>
-        </w:tc>
-      </w:tr>
-      <w:tr>
-        <w:trPr>
-          <w:cantSplit/>
-        </w:trPr>
-        <w:tc>
-          <w:tcPr>
-            <w:tcW w:type="dxa" w:w="1584"/>
-          </w:tcPr>
-          <w:p>
-            <w:pPr>
-              <w:spacing w:before="60" w:after="60" w:line="240" w:lineRule="auto"/>
-            </w:pPr>
-            <w:r>
-              <w:rPr>
-                <w:sz w:val="18"/>
-              </w:rPr>
-              <w:t>工程兵</w:t>
-            </w:r>
-          </w:p>
-        </w:tc>
-        <w:tc>
-          <w:tcPr>
-            <w:tcW w:type="dxa" w:w="1728"/>
-          </w:tcPr>
-          <w:p>
-            <w:pPr>
-              <w:spacing w:before="60" w:after="60" w:line="240" w:lineRule="auto"/>
-            </w:pPr>
-            <w:r>
-              <w:rPr>
-                <w:sz w:val="18"/>
-              </w:rPr>
-              <w:t>X维修 / Z火箭</w:t>
-            </w:r>
-          </w:p>
-        </w:tc>
-        <w:tc>
-          <w:tcPr>
-            <w:tcW w:type="dxa" w:w="6523"/>
-          </w:tcPr>
-          <w:p>
-            <w:pPr>
-              <w:spacing w:before="60" w:after="60" w:line="240" w:lineRule="auto"/>
-            </w:pPr>
-            <w:r>
-              <w:rPr>
-                <w:sz w:val="18"/>
-              </w:rPr>
-              <w:t>8m内可见己方载具修复130HP；两发真实火箭、230伤害、2.5秒间隔</w:t>
-            </w:r>
-          </w:p>
-        </w:tc>
-      </w:tr>
-    </w:tbl>
-    <w:p>
-      <w:r>
-        <w:t>每次部署两枚投掷物、两次装备；无效果不消耗。G破片或烟雾、X装备、Z火箭的键位、数量和冷却都在右下角显示。医疗复活不增加士兵总数或造成重复AI复活。</w:t>
-      </w:r>
-    </w:p>
-    <w:p>
-      <w:pPr>
-        <w:pStyle w:val="Heading2"/>
-      </w:pPr>
-      <w:r>
-        <w:t>死亡后的战术部署地图</w:t>
-      </w:r>
-    </w:p>
-    <w:p>
-      <w:r>
-        <w:t>死亡进入地图，选择主基地、己方据点、同小队三名成员或信标。队友正在ENGAGE、最近8秒受击/交战、压制或附近敌人时显示红色并锁定。敌军步兵65m判定（30m近邻不依赖LOS）、装甲100m视线威胁；据点争夺、最近枪火与敌炮预警也禁用。敌方据点和外小队ID不可部署。</w:t>
-      </w:r>
-    </w:p>
-    <w:p>
-      <w:r>
-        <w:t>地图按钮保留DOM身份以免刷新时误点击，锁定位置可选中查看原因，但部署按钮禁用。点击时服务器式核心逻辑再次判断最新状态与复活计时，并找无碰撞、有间距的附近出生位置。信标成功复活后移除。</w:t>
-      </w:r>
-    </w:p>
-    <w:p>
-      <w:pPr>
-        <w:pStyle w:val="Heading2"/>
-      </w:pPr>
-      <w:r>
-        <w:t>自动与浏览器验证</w:t>
-      </w:r>
-    </w:p>
-    <w:p>
-      <w:r>
-        <w:t>测试覆盖安全成员成功、交战/阵亡成员拒绝、据点被攻击锁定与敌军离开后解锁、外小队拒绝、信标不安全保留/安全消耗；浏览器实际地图点击复现红色锁定与安全小队复活。</w:t>
-      </w:r>
-    </w:p>
-    <w:p>
-      <w:pPr>
-        <w:pStyle w:val="Heading1"/>
-        <w:pageBreakBefore/>
-      </w:pPr>
-      <w:r>
-        <w:t>03  枪械、HUD、环境与敌军射击</w:t>
-      </w:r>
-    </w:p>
-    <w:p>
-      <w:pPr>
-        <w:pStyle w:val="Heading2"/>
-      </w:pPr>
-      <w:r>
-        <w:t>七种独立枪械模型</w:t>
-      </w:r>
-    </w:p>
-    <w:tbl>
-      <w:tblPr>
-        <w:tblStyle w:val="TableGrid"/>
-        <w:tblW w:type="auto" w:w="0"/>
-        <w:tblLayout w:type="fixed"/>
-        <w:tblLook w:firstColumn="1" w:firstRow="1" w:lastColumn="0" w:lastRow="0" w:noHBand="0" w:noVBand="1" w:val="04A0"/>
-      </w:tblPr>
-      <w:tblGrid>
-        <w:gridCol w:w="2016"/>
-        <w:gridCol w:w="7819"/>
-      </w:tblGrid>
-      <w:tr>
-        <w:trPr>
-          <w:cantSplit/>
-        </w:trPr>
-        <w:tc>
-          <w:tcPr>
-            <w:tcW w:type="dxa" w:w="2016"/>
-            <w:shd w:fill="E8EDE9"/>
-          </w:tcPr>
-          <w:p>
-            <w:pPr>
-              <w:spacing w:before="60" w:after="60" w:line="240" w:lineRule="auto"/>
-            </w:pPr>
-            <w:r>
-              <w:rPr>
-                <w:b/>
-                <w:sz w:val="18"/>
-              </w:rPr>
-              <w:t>枪型</w:t>
-            </w:r>
-          </w:p>
-        </w:tc>
-        <w:tc>
-          <w:tcPr>
-            <w:tcW w:type="dxa" w:w="7819"/>
-            <w:shd w:fill="E8EDE9"/>
-          </w:tcPr>
-          <w:p>
-            <w:pPr>
-              <w:spacing w:before="60" w:after="60" w:line="240" w:lineRule="auto"/>
-            </w:pPr>
-            <w:r>
-              <w:rPr>
-                <w:b/>
-                <w:sz w:val="18"/>
-              </w:rPr>
-              <w:t>结构差异</w:t>
-            </w:r>
-          </w:p>
-        </w:tc>
-      </w:tr>
-      <w:tr>
-        <w:trPr>
-          <w:cantSplit/>
-        </w:trPr>
-        <w:tc>
-          <w:tcPr>
-            <w:tcW w:type="dxa" w:w="2016"/>
-          </w:tcPr>
-          <w:p>
-            <w:pPr>
-              <w:spacing w:before="60" w:after="60" w:line="240" w:lineRule="auto"/>
-            </w:pPr>
-            <w:r>
-              <w:rPr>
-                <w:sz w:val="18"/>
-              </w:rPr>
-              <w:t>IF-27卡宾枪</w:t>
-            </w:r>
-          </w:p>
-        </w:tc>
-        <w:tc>
-          <w:tcPr>
-            <w:tcW w:type="dxa" w:w="7819"/>
-          </w:tcPr>
-          <w:p>
-            <w:pPr>
-              <w:spacing w:before="60" w:after="60" w:line="240" w:lineRule="auto"/>
-            </w:pPr>
-            <w:r>
-              <w:rPr>
-                <w:sz w:val="18"/>
-              </w:rPr>
-              <w:t>导轨机匣、伸缩枪托、分段弯弹匣、红点瞄具</w:t>
-            </w:r>
-          </w:p>
-        </w:tc>
-      </w:tr>
-      <w:tr>
-        <w:trPr>
-          <w:cantSplit/>
-        </w:trPr>
-        <w:tc>
-          <w:tcPr>
-            <w:tcW w:type="dxa" w:w="2016"/>
-          </w:tcPr>
-          <w:p>
-            <w:pPr>
-              <w:spacing w:before="60" w:after="60" w:line="240" w:lineRule="auto"/>
-            </w:pPr>
-            <w:r>
-              <w:rPr>
-                <w:sz w:val="18"/>
-              </w:rPr>
-              <w:t>M89精确射手</w:t>
-            </w:r>
-          </w:p>
-        </w:tc>
-        <w:tc>
-          <w:tcPr>
-            <w:tcW w:type="dxa" w:w="7819"/>
-          </w:tcPr>
-          <w:p>
-            <w:pPr>
-              <w:spacing w:before="60" w:after="60" w:line="240" w:lineRule="auto"/>
-            </w:pPr>
-            <w:r>
-              <w:rPr>
-                <w:sz w:val="18"/>
-              </w:rPr>
-              <w:t>较长护木与枪管、固定枪托、20式直弹匣轮廓、镜筒</w:t>
-            </w:r>
-          </w:p>
-        </w:tc>
-      </w:tr>
-      <w:tr>
-        <w:trPr>
-          <w:cantSplit/>
-        </w:trPr>
-        <w:tc>
-          <w:tcPr>
-            <w:tcW w:type="dxa" w:w="2016"/>
-          </w:tcPr>
-          <w:p>
-            <w:pPr>
-              <w:spacing w:before="60" w:after="60" w:line="240" w:lineRule="auto"/>
-            </w:pPr>
-            <w:r>
-              <w:rPr>
-                <w:sz w:val="18"/>
-              </w:rPr>
-              <w:t>VX-9冲锋枪</w:t>
-            </w:r>
-          </w:p>
-        </w:tc>
-        <w:tc>
-          <w:tcPr>
-            <w:tcW w:type="dxa" w:w="7819"/>
-          </w:tcPr>
-          <w:p>
-            <w:pPr>
-              <w:spacing w:before="60" w:after="60" w:line="240" w:lineRule="auto"/>
-            </w:pPr>
-            <w:r>
-              <w:rPr>
-                <w:sz w:val="18"/>
-              </w:rPr>
-              <w:t>紧凑机匣、短枪管、折叠枪托杆、细长弹匣</w:t>
-            </w:r>
-          </w:p>
-        </w:tc>
-      </w:tr>
-      <w:tr>
-        <w:trPr>
-          <w:cantSplit/>
-        </w:trPr>
-        <w:tc>
-          <w:tcPr>
-            <w:tcW w:type="dxa" w:w="2016"/>
-          </w:tcPr>
-          <w:p>
-            <w:pPr>
-              <w:spacing w:before="60" w:after="60" w:line="240" w:lineRule="auto"/>
-            </w:pPr>
-            <w:r>
-              <w:rPr>
-                <w:sz w:val="18"/>
-              </w:rPr>
-              <w:t>H60轻机枪</w:t>
-            </w:r>
-          </w:p>
-        </w:tc>
-        <w:tc>
-          <w:tcPr>
-            <w:tcW w:type="dxa" w:w="7819"/>
-          </w:tcPr>
-          <w:p>
-            <w:pPr>
-              <w:spacing w:before="60" w:after="60" w:line="240" w:lineRule="auto"/>
-            </w:pPr>
-            <w:r>
-              <w:rPr>
-                <w:sz w:val="18"/>
-              </w:rPr>
-              <w:t>宽机匣、供弹盖、弹箱/外露弹链、重枪管和两脚架</w:t>
-            </w:r>
-          </w:p>
-        </w:tc>
-      </w:tr>
-      <w:tr>
-        <w:trPr>
-          <w:cantSplit/>
-        </w:trPr>
-        <w:tc>
-          <w:tcPr>
-            <w:tcW w:type="dxa" w:w="2016"/>
-          </w:tcPr>
-          <w:p>
-            <w:pPr>
-              <w:spacing w:before="60" w:after="60" w:line="240" w:lineRule="auto"/>
-            </w:pPr>
-            <w:r>
-              <w:rPr>
-                <w:sz w:val="18"/>
-              </w:rPr>
-              <w:t>BR-44战斗步枪</w:t>
-            </w:r>
-          </w:p>
-        </w:tc>
-        <w:tc>
-          <w:tcPr>
-            <w:tcW w:type="dxa" w:w="7819"/>
-          </w:tcPr>
-          <w:p>
-            <w:pPr>
-              <w:spacing w:before="60" w:after="60" w:line="240" w:lineRule="auto"/>
-            </w:pPr>
-            <w:r>
-              <w:rPr>
-                <w:sz w:val="18"/>
-              </w:rPr>
-              <w:t>加厚机匣、宽弹匣、实心枪托与护木筋</w:t>
-            </w:r>
-          </w:p>
-        </w:tc>
-      </w:tr>
-      <w:tr>
-        <w:trPr>
-          <w:cantSplit/>
-        </w:trPr>
-        <w:tc>
-          <w:tcPr>
-            <w:tcW w:type="dxa" w:w="2016"/>
-          </w:tcPr>
-          <w:p>
-            <w:pPr>
-              <w:spacing w:before="60" w:after="60" w:line="240" w:lineRule="auto"/>
-            </w:pPr>
-            <w:r>
-              <w:rPr>
-                <w:sz w:val="18"/>
-              </w:rPr>
-              <w:t>S12狙击枪</w:t>
-            </w:r>
-          </w:p>
-        </w:tc>
-        <w:tc>
-          <w:tcPr>
-            <w:tcW w:type="dxa" w:w="7819"/>
-          </w:tcPr>
-          <w:p>
-            <w:pPr>
-              <w:spacing w:before="60" w:after="60" w:line="240" w:lineRule="auto"/>
-            </w:pPr>
-            <w:r>
-              <w:rPr>
-                <w:sz w:val="18"/>
-              </w:rPr>
-              <w:t>枪栓/拉机柄、长浮置枪管、小弹匣、镜筒和两脚架</w:t>
-            </w:r>
-          </w:p>
-        </w:tc>
-      </w:tr>
-      <w:tr>
-        <w:trPr>
-          <w:cantSplit/>
-        </w:trPr>
-        <w:tc>
-          <w:tcPr>
-            <w:tcW w:type="dxa" w:w="2016"/>
-          </w:tcPr>
-          <w:p>
-            <w:pPr>
-              <w:spacing w:before="60" w:after="60" w:line="240" w:lineRule="auto"/>
-            </w:pPr>
-            <w:r>
-              <w:rPr>
-                <w:sz w:val="18"/>
-              </w:rPr>
-              <w:t>P8手枪</w:t>
-            </w:r>
-          </w:p>
-        </w:tc>
-        <w:tc>
-          <w:tcPr>
-            <w:tcW w:type="dxa" w:w="7819"/>
-          </w:tcPr>
-          <w:p>
-            <w:pPr>
-              <w:spacing w:before="60" w:after="60" w:line="240" w:lineRule="auto"/>
-            </w:pPr>
-            <w:r>
-              <w:rPr>
-                <w:sz w:val="18"/>
-              </w:rPr>
-              <w:t>独立套筒/枪管/握把/护圈，没有步枪枪托和前握把</w:t>
-            </w:r>
-          </w:p>
-        </w:tc>
-      </w:tr>
-    </w:tbl>
-    <w:p>
-      <w:r>
-        <w:t>首人称袖子与手套改为圆柱/胶囊轮廓，手枪单手；各枪独立枪口位置和瞄具高度。保留阻尼ADS、3x/5x遮罩/分划、后坐力恢复、换弹、冲刺、切枪和投掷动作。单位和浏览器分别检查七种profile、关键零件及实际切换截图。武器仍为基础几何，不宣称专业写实。</w:t>
-      </w:r>
-    </w:p>
-    <w:p>
-      <w:pPr>
-        <w:pStyle w:val="Heading2"/>
-      </w:pPr>
-      <w:r>
-        <w:t>参考截图的界面调整</w:t>
-      </w:r>
-    </w:p>
-    <w:p>
-      <w:r>
-        <w:t>顶部紧凑票数、方向读数和据点，右上小字击杀信息；左下小地图/小队信息，右下弹药、生命和装备键数。弱化厚背景、斜切边、霓虹阴影，采用薄边与透明渐变；准备界面改为哑光灰绿卡片。世界近距离IFF仍要求距离、LOS与烟幕，不能隔墙暴露敌人。</w:t>
-      </w:r>
-    </w:p>
-    <w:p>
-      <w:pPr>
-        <w:pStyle w:val="Heading2"/>
-      </w:pPr>
-      <w:r>
-        <w:t>射击与场景</w:t>
-      </w:r>
-    </w:p>
-    <w:p>
-      <w:r>
-        <w:t>敌军保持难度反应时间、视觉/听觉拆分、目标移动提前量、距离衰减和压制误差；增加2–3发点射、0.85–1.6秒停顿，最多三个步兵并发集火玩家。受击显示来源楔形标记、实际掉血数值、边缘闪红和镜头反馈；枪线更亮、更持久。</w:t>
-      </w:r>
-    </w:p>
-    <w:p>
-      <w:r>
-        <w:t>保留实例化人物/植被/环境细节与车辆静态零件批处理；修复天空球在远端基地被远裁切面截断，天空跟随相机。地图建筑、道路、props、烟雾延续，尚无新地图。</w:t>
-      </w:r>
-    </w:p>
-    <w:p>
-      <w:pPr>
-        <w:pStyle w:val="Heading1"/>
-        <w:pageBreakBefore/>
-      </w:pPr>
-      <w:r>
-        <w:t>04  十一首配乐与完整音频层</w:t>
-      </w:r>
-    </w:p>
-    <w:p>
-      <w:pPr>
-        <w:pStyle w:val="Heading2"/>
-      </w:pPr>
-      <w:r>
-        <w:t>曲目分配与分发范围</w:t>
-      </w:r>
-    </w:p>
-    <w:tbl>
-      <w:tblPr>
-        <w:tblStyle w:val="TableGrid"/>
-        <w:tblW w:type="auto" w:w="0"/>
-        <w:tblLayout w:type="fixed"/>
-        <w:tblLook w:firstColumn="1" w:firstRow="1" w:lastColumn="0" w:lastRow="0" w:noHBand="0" w:noVBand="1" w:val="04A0"/>
-      </w:tblPr>
-      <w:tblGrid>
-        <w:gridCol w:w="2016"/>
-        <w:gridCol w:w="7819"/>
-      </w:tblGrid>
-      <w:tr>
-        <w:trPr>
-          <w:cantSplit/>
-        </w:trPr>
-        <w:tc>
-          <w:tcPr>
-            <w:tcW w:type="dxa" w:w="2016"/>
-            <w:shd w:fill="E8EDE9"/>
-          </w:tcPr>
-          <w:p>
-            <w:pPr>
-              <w:spacing w:before="60" w:after="60" w:line="240" w:lineRule="auto"/>
-            </w:pPr>
-            <w:r>
-              <w:rPr>
-                <w:b/>
-                <w:sz w:val="18"/>
-              </w:rPr>
-              <w:t>情境</w:t>
-            </w:r>
-          </w:p>
-        </w:tc>
-        <w:tc>
-          <w:tcPr>
-            <w:tcW w:type="dxa" w:w="7819"/>
-            <w:shd w:fill="E8EDE9"/>
-          </w:tcPr>
-          <w:p>
-            <w:pPr>
-              <w:spacing w:before="60" w:after="60" w:line="240" w:lineRule="auto"/>
-            </w:pPr>
-            <w:r>
-              <w:rPr>
-                <w:b/>
-                <w:sz w:val="18"/>
-              </w:rPr>
-              <w:t>音乐</w:t>
-            </w:r>
-          </w:p>
-        </w:tc>
-      </w:tr>
-      <w:tr>
-        <w:trPr>
-          <w:cantSplit/>
-        </w:trPr>
-        <w:tc>
-          <w:tcPr>
-            <w:tcW w:type="dxa" w:w="2016"/>
-          </w:tcPr>
-          <w:p>
-            <w:pPr>
-              <w:spacing w:before="60" w:after="60" w:line="240" w:lineRule="auto"/>
-            </w:pPr>
-            <w:r>
-              <w:rPr>
-                <w:sz w:val="18"/>
-              </w:rPr>
-              <w:t>菜单轮播1</w:t>
-            </w:r>
-          </w:p>
-        </w:tc>
-        <w:tc>
-          <w:tcPr>
-            <w:tcW w:type="dxa" w:w="7819"/>
-          </w:tcPr>
-          <w:p>
-            <w:pPr>
-              <w:spacing w:before="60" w:after="60" w:line="240" w:lineRule="auto"/>
-            </w:pPr>
-            <w:r>
-              <w:rPr>
-                <w:sz w:val="18"/>
-              </w:rPr>
-              <w:t>Main Theme</w:t>
-            </w:r>
-          </w:p>
-        </w:tc>
-      </w:tr>
-      <w:tr>
-        <w:trPr>
-          <w:cantSplit/>
-        </w:trPr>
-        <w:tc>
-          <w:tcPr>
-            <w:tcW w:type="dxa" w:w="2016"/>
-          </w:tcPr>
-          <w:p>
-            <w:pPr>
-              <w:spacing w:before="60" w:after="60" w:line="240" w:lineRule="auto"/>
-            </w:pPr>
-            <w:r>
-              <w:rPr>
-                <w:sz w:val="18"/>
-              </w:rPr>
-              <w:t>菜单轮播2</w:t>
-            </w:r>
-          </w:p>
-        </w:tc>
-        <w:tc>
-          <w:tcPr>
-            <w:tcW w:type="dxa" w:w="7819"/>
-          </w:tcPr>
-          <w:p>
-            <w:pPr>
-              <w:spacing w:before="60" w:after="60" w:line="240" w:lineRule="auto"/>
-            </w:pPr>
-            <w:r>
-              <w:rPr>
-                <w:sz w:val="18"/>
-              </w:rPr>
-              <w:t>Battlefield Classic Theme</w:t>
-            </w:r>
-          </w:p>
-        </w:tc>
-      </w:tr>
-      <w:tr>
-        <w:trPr>
-          <w:cantSplit/>
-        </w:trPr>
-        <w:tc>
-          <w:tcPr>
-            <w:tcW w:type="dxa" w:w="2016"/>
-          </w:tcPr>
-          <w:p>
-            <w:pPr>
-              <w:spacing w:before="60" w:after="60" w:line="240" w:lineRule="auto"/>
-            </w:pPr>
-            <w:r>
-              <w:rPr>
-                <w:sz w:val="18"/>
-              </w:rPr>
-              <w:t>部署/阵亡准备</w:t>
-            </w:r>
-          </w:p>
-        </w:tc>
-        <w:tc>
-          <w:tcPr>
-            <w:tcW w:type="dxa" w:w="7819"/>
-          </w:tcPr>
-          <w:p>
-            <w:pPr>
-              <w:spacing w:before="60" w:after="60" w:line="240" w:lineRule="auto"/>
-            </w:pPr>
-            <w:r>
-              <w:rPr>
-                <w:sz w:val="18"/>
-              </w:rPr>
-              <w:t>Suns and Stars</w:t>
-            </w:r>
-          </w:p>
-        </w:tc>
-      </w:tr>
-      <w:tr>
-        <w:trPr>
-          <w:cantSplit/>
-        </w:trPr>
-        <w:tc>
-          <w:tcPr>
-            <w:tcW w:type="dxa" w:w="2016"/>
-          </w:tcPr>
-          <w:p>
-            <w:pPr>
-              <w:spacing w:before="60" w:after="60" w:line="240" w:lineRule="auto"/>
-            </w:pPr>
-            <w:r>
-              <w:rPr>
-                <w:sz w:val="18"/>
-              </w:rPr>
-              <w:t>蓝军胜利</w:t>
-            </w:r>
-          </w:p>
-        </w:tc>
-        <w:tc>
-          <w:tcPr>
-            <w:tcW w:type="dxa" w:w="7819"/>
-          </w:tcPr>
-          <w:p>
-            <w:pPr>
-              <w:spacing w:before="60" w:after="60" w:line="240" w:lineRule="auto"/>
-            </w:pPr>
-            <w:r>
-              <w:rPr>
-                <w:sz w:val="18"/>
-              </w:rPr>
-              <w:t>Tropical Storm-Victory</w:t>
-            </w:r>
-          </w:p>
-        </w:tc>
-      </w:tr>
-      <w:tr>
-        <w:trPr>
-          <w:cantSplit/>
-        </w:trPr>
-        <w:tc>
-          <w:tcPr>
-            <w:tcW w:type="dxa" w:w="2016"/>
-          </w:tcPr>
-          <w:p>
-            <w:pPr>
-              <w:spacing w:before="60" w:after="60" w:line="240" w:lineRule="auto"/>
-            </w:pPr>
-            <w:r>
-              <w:rPr>
-                <w:sz w:val="18"/>
-              </w:rPr>
-              <w:t>蓝军失败</w:t>
-            </w:r>
-          </w:p>
-        </w:tc>
-        <w:tc>
-          <w:tcPr>
-            <w:tcW w:type="dxa" w:w="7819"/>
-          </w:tcPr>
-          <w:p>
-            <w:pPr>
-              <w:spacing w:before="60" w:after="60" w:line="240" w:lineRule="auto"/>
-            </w:pPr>
-            <w:r>
-              <w:rPr>
-                <w:sz w:val="18"/>
-              </w:rPr>
-              <w:t>The Aftermath</w:t>
-            </w:r>
-          </w:p>
-        </w:tc>
-      </w:tr>
-      <w:tr>
-        <w:trPr>
-          <w:cantSplit/>
-        </w:trPr>
-        <w:tc>
-          <w:tcPr>
-            <w:tcW w:type="dxa" w:w="2016"/>
-          </w:tcPr>
-          <w:p>
-            <w:pPr>
-              <w:spacing w:before="60" w:after="60" w:line="240" w:lineRule="auto"/>
-            </w:pPr>
-            <w:r>
-              <w:rPr>
-                <w:sz w:val="18"/>
-              </w:rPr>
-              <w:t>蓝军低票劣势</w:t>
-            </w:r>
-          </w:p>
-        </w:tc>
-        <w:tc>
-          <w:tcPr>
-            <w:tcW w:type="dxa" w:w="7819"/>
-          </w:tcPr>
-          <w:p>
-            <w:pPr>
-              <w:spacing w:before="60" w:after="60" w:line="240" w:lineRule="auto"/>
-            </w:pPr>
-            <w:r>
-              <w:rPr>
-                <w:sz w:val="18"/>
-              </w:rPr>
-              <w:t>Get Us Out Of Here</w:t>
-            </w:r>
-          </w:p>
-        </w:tc>
-      </w:tr>
-      <w:tr>
-        <w:trPr>
-          <w:cantSplit/>
-        </w:trPr>
-        <w:tc>
-          <w:tcPr>
-            <w:tcW w:type="dxa" w:w="2016"/>
-          </w:tcPr>
-          <w:p>
-            <w:pPr>
-              <w:spacing w:before="60" w:after="60" w:line="240" w:lineRule="auto"/>
-            </w:pPr>
-            <w:r>
-              <w:rPr>
-                <w:sz w:val="18"/>
-              </w:rPr>
-              <w:t>常规交战1</w:t>
-            </w:r>
-          </w:p>
-        </w:tc>
-        <w:tc>
-          <w:tcPr>
-            <w:tcW w:type="dxa" w:w="7819"/>
-          </w:tcPr>
-          <w:p>
-            <w:pPr>
-              <w:spacing w:before="60" w:after="60" w:line="240" w:lineRule="auto"/>
-            </w:pPr>
-            <w:r>
-              <w:rPr>
-                <w:sz w:val="18"/>
-              </w:rPr>
-              <w:t>Tropic Thunder</w:t>
-            </w:r>
-          </w:p>
-        </w:tc>
-      </w:tr>
-      <w:tr>
-        <w:trPr>
-          <w:cantSplit/>
-        </w:trPr>
-        <w:tc>
-          <w:tcPr>
-            <w:tcW w:type="dxa" w:w="2016"/>
-          </w:tcPr>
-          <w:p>
-            <w:pPr>
-              <w:spacing w:before="60" w:after="60" w:line="240" w:lineRule="auto"/>
-            </w:pPr>
-            <w:r>
-              <w:rPr>
-                <w:sz w:val="18"/>
-              </w:rPr>
-              <w:t>常规交战2</w:t>
-            </w:r>
-          </w:p>
-        </w:tc>
-        <w:tc>
-          <w:tcPr>
-            <w:tcW w:type="dxa" w:w="7819"/>
-          </w:tcPr>
-          <w:p>
-            <w:pPr>
-              <w:spacing w:before="60" w:after="60" w:line="240" w:lineRule="auto"/>
-            </w:pPr>
-            <w:r>
-              <w:rPr>
-                <w:sz w:val="18"/>
-              </w:rPr>
-              <w:t>Leave No Man Behind</w:t>
-            </w:r>
-          </w:p>
-        </w:tc>
-      </w:tr>
-      <w:tr>
-        <w:trPr>
-          <w:cantSplit/>
-        </w:trPr>
-        <w:tc>
-          <w:tcPr>
-            <w:tcW w:type="dxa" w:w="2016"/>
-          </w:tcPr>
-          <w:p>
-            <w:pPr>
-              <w:spacing w:before="60" w:after="60" w:line="240" w:lineRule="auto"/>
-            </w:pPr>
-            <w:r>
-              <w:rPr>
-                <w:sz w:val="18"/>
-              </w:rPr>
-              <w:t>炮火压制</w:t>
-            </w:r>
-          </w:p>
-        </w:tc>
-        <w:tc>
-          <w:tcPr>
-            <w:tcW w:type="dxa" w:w="7819"/>
-          </w:tcPr>
-          <w:p>
-            <w:pPr>
-              <w:spacing w:before="60" w:after="60" w:line="240" w:lineRule="auto"/>
-            </w:pPr>
-            <w:r>
-              <w:rPr>
-                <w:sz w:val="18"/>
-              </w:rPr>
-              <w:t>Steel Requiem</w:t>
-            </w:r>
-          </w:p>
-        </w:tc>
-      </w:tr>
-      <w:tr>
-        <w:trPr>
-          <w:cantSplit/>
-        </w:trPr>
-        <w:tc>
-          <w:tcPr>
-            <w:tcW w:type="dxa" w:w="2016"/>
-          </w:tcPr>
-          <w:p>
-            <w:pPr>
-              <w:spacing w:before="60" w:after="60" w:line="240" w:lineRule="auto"/>
-            </w:pPr>
-            <w:r>
-              <w:rPr>
-                <w:sz w:val="18"/>
-              </w:rPr>
-              <w:t>反攻/接近胜利</w:t>
-            </w:r>
-          </w:p>
-        </w:tc>
-        <w:tc>
-          <w:tcPr>
-            <w:tcW w:type="dxa" w:w="7819"/>
-          </w:tcPr>
-          <w:p>
-            <w:pPr>
-              <w:spacing w:before="60" w:after="60" w:line="240" w:lineRule="auto"/>
-            </w:pPr>
-            <w:r>
-              <w:rPr>
-                <w:sz w:val="18"/>
-              </w:rPr>
-              <w:t>Forged in Blood and Steel</w:t>
-            </w:r>
-          </w:p>
-        </w:tc>
-      </w:tr>
-      <w:tr>
-        <w:trPr>
-          <w:cantSplit/>
-        </w:trPr>
-        <w:tc>
-          <w:tcPr>
-            <w:tcW w:type="dxa" w:w="2016"/>
-          </w:tcPr>
-          <w:p>
-            <w:pPr>
-              <w:spacing w:before="60" w:after="60" w:line="240" w:lineRule="auto"/>
-            </w:pPr>
-            <w:r>
-              <w:rPr>
-                <w:sz w:val="18"/>
-              </w:rPr>
-              <w:t>装甲突击</w:t>
-            </w:r>
-          </w:p>
-        </w:tc>
-        <w:tc>
-          <w:tcPr>
-            <w:tcW w:type="dxa" w:w="7819"/>
-          </w:tcPr>
-          <w:p>
-            <w:pPr>
-              <w:spacing w:before="60" w:after="60" w:line="240" w:lineRule="auto"/>
-            </w:pPr>
-            <w:r>
-              <w:rPr>
-                <w:sz w:val="18"/>
-              </w:rPr>
-              <w:t>The Burden of Victory</w:t>
-            </w:r>
-          </w:p>
-        </w:tc>
-      </w:tr>
-    </w:tbl>
-    <w:p>
-      <w:r>
-        <w:t>按照用户明确选择，音轨只放本机和完整个人下载包。公开GitHub及公开源码ZIP不含这些MP3，保留来源/原文件名/时长映射和导入工具。不能从用户提供文件推断公开分发授权。</w:t>
-      </w:r>
-    </w:p>
-    <w:p>
-      <w:pPr>
-        <w:pStyle w:val="Heading2"/>
-      </w:pPr>
-      <w:r>
-        <w:t>播放、资源与混音</w:t>
-      </w:r>
-    </w:p>
-    <w:p>
-      <w:r>
-        <w:t>两个HTMLAudio槽流式播放，避免11首长音乐解码占据大量内存。2.5秒交叉淡化、最少6秒情境保持；胜负与返回菜单优先切换。首次用户点击解锁；开火/爆炸音乐降至46%，暂停音乐降至40%，隐藏页面静音。主、音乐、音效、环境四路滑杆保存本地设置。缺失音乐降级，保留音效和游戏。</w:t>
-      </w:r>
-    </w:p>
-    <w:p>
-      <w:r>
-        <w:t>22个小型音效：七种枪、主炮/爆炸、道路/碎石脚步、近失弹、受击、布料、落地、风声、两类机械换弹、四类界面声。WebAudio实际解码缓存，最多28个采样并发，事件距离衰减与声像。UI来自Kenney，机械换弹来自SpringySpringo，均记录CC0源页；其他声音为本项目生成。</w:t>
-      </w:r>
-    </w:p>
-    <w:p>
-      <w:r>
-        <w:t>浏览器确认22个解码、MP3真实进度、静音与设置保存、部署→危机→胜利、缺失404容错；没有人工长时间听感验证。QA中修复淡化循环误暂停正在加载槽的AbortError。</w:t>
-      </w:r>
-    </w:p>
-    <w:p>
-      <w:pPr>
-        <w:pStyle w:val="Heading1"/>
-        <w:pageBreakBefore/>
-      </w:pPr>
-      <w:r>
-        <w:t>05  实际 QA、模拟与性能</w:t>
-      </w:r>
-    </w:p>
-    <w:tbl>
-      <w:tblPr>
-        <w:tblStyle w:val="TableGrid"/>
-        <w:tblW w:type="auto" w:w="0"/>
-        <w:tblLayout w:type="fixed"/>
-        <w:tblLook w:firstColumn="1" w:firstRow="1" w:lastColumn="0" w:lastRow="0" w:noHBand="0" w:noVBand="1" w:val="04A0"/>
-      </w:tblPr>
-      <w:tblGrid>
-        <w:gridCol w:w="2016"/>
-        <w:gridCol w:w="7819"/>
-      </w:tblGrid>
-      <w:tr>
-        <w:trPr>
-          <w:cantSplit/>
-        </w:trPr>
-        <w:tc>
-          <w:tcPr>
-            <w:tcW w:type="dxa" w:w="2016"/>
-            <w:shd w:fill="E8EDE9"/>
-          </w:tcPr>
-          <w:p>
-            <w:pPr>
-              <w:spacing w:before="60" w:after="60" w:line="240" w:lineRule="auto"/>
-            </w:pPr>
-            <w:r>
-              <w:rPr>
-                <w:b/>
-                <w:sz w:val="18"/>
-              </w:rPr>
-              <w:t>检查</w:t>
-            </w:r>
-          </w:p>
-        </w:tc>
-        <w:tc>
-          <w:tcPr>
-            <w:tcW w:type="dxa" w:w="7819"/>
-            <w:shd w:fill="E8EDE9"/>
-          </w:tcPr>
-          <w:p>
-            <w:pPr>
-              <w:spacing w:before="60" w:after="60" w:line="240" w:lineRule="auto"/>
-            </w:pPr>
-            <w:r>
-              <w:rPr>
-                <w:b/>
-                <w:sz w:val="18"/>
-              </w:rPr>
-              <w:t>结果</w:t>
-            </w:r>
-          </w:p>
-        </w:tc>
-      </w:tr>
-      <w:tr>
-        <w:trPr>
-          <w:cantSplit/>
-        </w:trPr>
-        <w:tc>
-          <w:tcPr>
-            <w:tcW w:type="dxa" w:w="2016"/>
-          </w:tcPr>
-          <w:p>
-            <w:pPr>
-              <w:spacing w:before="60" w:after="60" w:line="240" w:lineRule="auto"/>
-            </w:pPr>
-            <w:r>
-              <w:rPr>
-                <w:sz w:val="18"/>
-              </w:rPr>
-              <w:t>TypeScript / 单元</w:t>
-            </w:r>
-          </w:p>
-        </w:tc>
-        <w:tc>
-          <w:tcPr>
-            <w:tcW w:type="dxa" w:w="7819"/>
-          </w:tcPr>
-          <w:p>
-            <w:pPr>
-              <w:spacing w:before="60" w:after="60" w:line="240" w:lineRule="auto"/>
-            </w:pPr>
-            <w:r>
-              <w:rPr>
-                <w:sz w:val="18"/>
-              </w:rPr>
-              <w:t>严格检查PASS，42/42测试PASS</w:t>
-            </w:r>
-          </w:p>
-        </w:tc>
-      </w:tr>
-      <w:tr>
-        <w:trPr>
-          <w:cantSplit/>
-        </w:trPr>
-        <w:tc>
-          <w:tcPr>
-            <w:tcW w:type="dxa" w:w="2016"/>
-          </w:tcPr>
-          <w:p>
-            <w:pPr>
-              <w:spacing w:before="60" w:after="60" w:line="240" w:lineRule="auto"/>
+              <w:spacing w:after="80"/>
             </w:pPr>
             <w:r>
               <w:rPr>
@@ -1969,183 +1388,148 @@
         </w:tc>
         <w:tc>
           <w:tcPr>
-            <w:tcW w:type="dxa" w:w="7819"/>
+            <w:tcW w:type="dxa" w:w="4917"/>
           </w:tcPr>
           <w:p>
             <w:pPr>
-              <w:spacing w:before="60" w:after="60" w:line="240" w:lineRule="auto"/>
+              <w:spacing w:after="80"/>
             </w:pPr>
             <w:r>
               <w:rPr>
                 <w:sz w:val="18"/>
               </w:rPr>
-              <w:t>8/16/32/64规模、隔墙听觉、小队、大事件、载具PASS</w:t>
+              <w:t>8/16/32/64战局及默认500票通过</w:t>
             </w:r>
           </w:p>
         </w:tc>
       </w:tr>
       <w:tr>
-        <w:trPr>
-          <w:cantSplit/>
-        </w:trPr>
         <w:tc>
           <w:tcPr>
-            <w:tcW w:type="dxa" w:w="2016"/>
+            <w:tcW w:type="dxa" w:w="4917"/>
           </w:tcPr>
           <w:p>
             <w:pPr>
-              <w:spacing w:before="60" w:after="60" w:line="240" w:lineRule="auto"/>
+              <w:spacing w:after="80"/>
             </w:pPr>
             <w:r>
               <w:rPr>
                 <w:sz w:val="18"/>
               </w:rPr>
-              <w:t>Vite生产构建</w:t>
+              <w:t>Vite build</w:t>
             </w:r>
           </w:p>
         </w:tc>
         <w:tc>
           <w:tcPr>
-            <w:tcW w:type="dxa" w:w="7819"/>
+            <w:tcW w:type="dxa" w:w="4917"/>
           </w:tcPr>
           <w:p>
             <w:pPr>
-              <w:spacing w:before="60" w:after="60" w:line="240" w:lineRule="auto"/>
+              <w:spacing w:after="80"/>
             </w:pPr>
             <w:r>
               <w:rPr>
                 <w:sz w:val="18"/>
               </w:rPr>
-              <w:t>PASS，Three.js500.74kB体积提示</w:t>
+              <w:t>PASS，Three.js chunk体积警告保留</w:t>
             </w:r>
           </w:p>
         </w:tc>
       </w:tr>
       <w:tr>
-        <w:trPr>
-          <w:cantSplit/>
-        </w:trPr>
         <w:tc>
           <w:tcPr>
-            <w:tcW w:type="dxa" w:w="2016"/>
+            <w:tcW w:type="dxa" w:w="4917"/>
           </w:tcPr>
           <w:p>
             <w:pPr>
-              <w:spacing w:before="60" w:after="60" w:line="240" w:lineRule="auto"/>
+              <w:spacing w:after="80"/>
             </w:pPr>
             <w:r>
               <w:rPr>
                 <w:sz w:val="18"/>
               </w:rPr>
-              <w:t>Chrome浏览器</w:t>
+              <w:t>Chrome Playwright</w:t>
             </w:r>
           </w:p>
         </w:tc>
         <w:tc>
           <w:tcPr>
-            <w:tcW w:type="dxa" w:w="7819"/>
+            <w:tcW w:type="dxa" w:w="4917"/>
           </w:tcPr>
           <w:p>
             <w:pPr>
-              <w:spacing w:before="60" w:after="60" w:line="240" w:lineRule="auto"/>
+              <w:spacing w:after="80"/>
             </w:pPr>
             <w:r>
               <w:rPr>
                 <w:sz w:val="18"/>
               </w:rPr>
-              <w:t>10/10 PASS；无未处理页面错误</w:t>
+              <w:t>13项全部通过</w:t>
             </w:r>
           </w:p>
         </w:tc>
       </w:tr>
       <w:tr>
-        <w:trPr>
-          <w:cantSplit/>
-        </w:trPr>
         <w:tc>
           <w:tcPr>
-            <w:tcW w:type="dxa" w:w="2016"/>
+            <w:tcW w:type="dxa" w:w="4917"/>
           </w:tcPr>
           <w:p>
             <w:pPr>
-              <w:spacing w:before="60" w:after="60" w:line="240" w:lineRule="auto"/>
+              <w:spacing w:after="80"/>
             </w:pPr>
             <w:r>
               <w:rPr>
                 <w:sz w:val="18"/>
               </w:rPr>
-              <w:t>模型/音频</w:t>
+              <w:t>音频</w:t>
             </w:r>
           </w:p>
         </w:tc>
         <w:tc>
           <w:tcPr>
-            <w:tcW w:type="dxa" w:w="7819"/>
+            <w:tcW w:type="dxa" w:w="4917"/>
           </w:tcPr>
           <w:p>
             <w:pPr>
-              <w:spacing w:before="60" w:after="60" w:line="240" w:lineRule="auto"/>
+              <w:spacing w:after="80"/>
             </w:pPr>
             <w:r>
               <w:rPr>
                 <w:sz w:val="18"/>
               </w:rPr>
-              <w:t>七种实际模型、22个解码、音乐进度/切换/静音/容错PASS</w:t>
+              <w:t>29采样解码，MP3进度、静音、结果cue及缺失资源通过</w:t>
             </w:r>
           </w:p>
         </w:tc>
       </w:tr>
     </w:tbl>
+    <w:p/>
     <w:p>
-      <w:pPr>
-        <w:pStyle w:val="Heading2"/>
-      </w:pPr>
       <w:r>
-        <w:t>Conquest 默认完整战局</w:t>
+        <w:t>默认征服32v32、500票、玩家不操作：514.5秒，红军胜，蓝0票、红255.41票。占点归属变化33次，阵亡338，复活335，步兵射击7648，载具射击1624。车辆击毁28、重生24；大事件5次、炮击落点4。三类大事件全出现，反攻侧翼/集中与装甲协同断言通过，导航失败0。</w:t>
       </w:r>
     </w:p>
     <w:p>
       <w:r>
-        <w:t>32v32，500票，玩家不操作；424.5秒，Blue320 : 0Red。归属变化5，阵亡355、复活345、步兵射击4519、载具射击1798、装甲摧毁/重生各6。大事件启动4次、炮击落点4次，ARTILLERY / COUNTER_OFFENSIVE / ARMORED_PUSH全部出现；反攻集中侧翼与装甲协同断言PASS，导航失败0。</w:t>
-      </w:r>
-    </w:p>
-    <w:p>
-      <w:pPr>
-        <w:pStyle w:val="Heading2"/>
-      </w:pPr>
-      <w:r>
-        <w:t>前线推进完整战局</w:t>
+        <w:t>前线推进32v32、500票、seed505：1162秒，蓝军打通5/5区域，归属变化10次，阵亡536，步兵射击18310，导航失败0。该单种子结果验证完整流程，不表示双方平衡已验收。</w:t>
       </w:r>
     </w:p>
     <w:p>
       <w:r>
-        <w:t>32v32，500票，种子505；1544.75秒，红军胜，蓝军完成2区，归属变化4次、阵亡560、步兵射击22989、导航失败0。蓝军按A–E顺序推进，每区补40票，上限初始票数；红军票数无限。这个结果证明实际推进和胜负结束，不证明已经平衡。</w:t>
-      </w:r>
-    </w:p>
-    <w:p>
-      <w:pPr>
-        <w:pStyle w:val="Heading2"/>
-      </w:pPr>
-      <w:r>
-        <w:t>浏览器短时性能采样</w:t>
+        <w:t>Chrome headless 32v32短时8点：29.98至30.01FPS，689次draw，DPR1。此前0.8同机采样也有约30/60帧波动。本轮不把这一短时结果解释为用户设备持续FPS承诺。</w:t>
       </w:r>
     </w:p>
     <w:p>
       <w:r>
-        <w:t>1440×1000，DPR1，Chrome WebKit WebGL，32v32短时8点：59.99–60.02FPS，683draws。同代码前一轮约30FPS，最终这一轮约60FPS；保留两轮差异，不将短时60FPS当作性能保证。没有持续实玩压力、多设备比较，也没有确定帧率差异归因。</w:t>
-      </w:r>
-    </w:p>
-    <w:p>
-      <w:pPr>
-        <w:pStyle w:val="Heading2"/>
-      </w:pPr>
-      <w:r>
-        <w:t>证据位置</w:t>
+        <w:t>新回归确认空车停驶、真实AI驾驶员、接管安全下车、空中拒绝登车、落地50秒后AI仍不抢专属车辆、军队人数不膨胀、实体炮弹坐标与炮管匹配。浏览器确认死亡先倒地后升空再地图、模型枪口事件、即时受击红边，并继承配装与安全部署测试。</w:t>
       </w:r>
     </w:p>
     <w:p>
       <w:r>
-        <w:t>QA_RESULTS.json为结构化结果；QA_REPORT.md说明范围和边界；docs/qa/check-080.txt、browser-080.txt及breakthrough-080.json为原始最终输出。docs/screenshots包含HUD、受击、载具、部署、配装、瞄准和七枪截图。最终DOCX逐页渲染查看，ZIP做完整性与SHA256。</w:t>
+        <w:t>原始输出保存在docs/qa/check-090.txt、browser-090.txt与breakthrough-090.json，汇总为QA_RESULTS.json。网络和现有依赖可用，本轮实际运行生产build，没有将未验证构建写成通过。</w:t>
       </w:r>
     </w:p>
     <w:p>
@@ -2154,78 +1538,317 @@
         <w:pageBreakBefore/>
       </w:pPr>
       <w:r>
-        <w:t>06  启动、交付与维护</w:t>
+        <w:t>实际画面与尚存限制</w:t>
+      </w:r>
+    </w:p>
+    <w:p>
+      <w:r>
+        <w:drawing>
+          <wp:inline xmlns:a="http://schemas.openxmlformats.org/drawingml/2006/main" xmlns:pic="http://schemas.openxmlformats.org/drawingml/2006/picture">
+            <wp:extent cx="5943600" cy="3343275"/>
+            <wp:docPr id="1" name="Picture 1"/>
+            <wp:cNvGraphicFramePr>
+              <a:graphicFrameLocks noChangeAspect="1"/>
+            </wp:cNvGraphicFramePr>
+            <a:graphic>
+              <a:graphicData uri="http://schemas.openxmlformats.org/drawingml/2006/picture">
+                <pic:pic>
+                  <pic:nvPicPr>
+                    <pic:cNvPr id="0" name="injury-090.png"/>
+                    <pic:cNvPicPr/>
+                  </pic:nvPicPr>
+                  <pic:blipFill>
+                    <a:blip r:embed="rId11"/>
+                    <a:stretch>
+                      <a:fillRect/>
+                    </a:stretch>
+                  </pic:blipFill>
+                  <pic:spPr>
+                    <a:xfrm>
+                      <a:off x="0" y="0"/>
+                      <a:ext cx="5943600" cy="3343275"/>
+                    </a:xfrm>
+                    <a:prstGeom prst="rect"/>
+                  </pic:spPr>
+                </pic:pic>
+              </a:graphicData>
+            </a:graphic>
+          </wp:inline>
+        </w:drawing>
+      </w:r>
+    </w:p>
+    <w:p>
+      <w:r>
+        <w:t>真实32HP受击截图 可见红边与方向数字</w:t>
+      </w:r>
+    </w:p>
+    <w:p>
+      <w:r>
+        <w:drawing>
+          <wp:inline xmlns:a="http://schemas.openxmlformats.org/drawingml/2006/main" xmlns:pic="http://schemas.openxmlformats.org/drawingml/2006/picture">
+            <wp:extent cx="5943600" cy="3343275"/>
+            <wp:docPr id="2" name="Picture 2"/>
+            <wp:cNvGraphicFramePr>
+              <a:graphicFrameLocks noChangeAspect="1"/>
+            </wp:cNvGraphicFramePr>
+            <a:graphic>
+              <a:graphicData uri="http://schemas.openxmlformats.org/drawingml/2006/picture">
+                <pic:pic>
+                  <pic:nvPicPr>
+                    <pic:cNvPr id="0" name="deployment-090.png"/>
+                    <pic:cNvPicPr/>
+                  </pic:nvPicPr>
+                  <pic:blipFill>
+                    <a:blip r:embed="rId12"/>
+                    <a:stretch>
+                      <a:fillRect/>
+                    </a:stretch>
+                  </pic:blipFill>
+                  <pic:spPr>
+                    <a:xfrm>
+                      <a:off x="0" y="0"/>
+                      <a:ext cx="5943600" cy="3343275"/>
+                    </a:xfrm>
+                    <a:prstGeom prst="rect"/>
+                  </pic:spPr>
+                </pic:pic>
+              </a:graphicData>
+            </a:graphic>
+          </wp:inline>
+        </w:drawing>
+      </w:r>
+    </w:p>
+    <w:p>
+      <w:r>
+        <w:t>死亡镜头升空后部署 地图保留安全与禁用标记</w:t>
+      </w:r>
+    </w:p>
+    <w:p>
+      <w:r>
+        <w:t>当前地图、人物与枪械仍为程序化几何，尚未达到用户提供参考图的写实资源质量。图中表现只证明实际原型功能，不作与商业游戏画质相当的承诺。</w:t>
       </w:r>
     </w:p>
     <w:p>
       <w:pPr>
-        <w:pStyle w:val="Heading2"/>
+        <w:pStyle w:val="Heading1"/>
+        <w:pageBreakBefore/>
       </w:pPr>
       <w:r>
-        <w:t>启动与复验</w:t>
+        <w:t>交付 使用与维护</w:t>
       </w:r>
     </w:p>
     <w:p>
       <w:r>
-        <w:t>需要Node20.19+或22.12+。源码包不携带跨平台node_modules。执行npm ci、npm run dev。dist应通过HTTP提供，不要双击file://。npm run check依次做类型、42项单测、核心完整逻辑和build；npm run test:browser使用Playwright。已有Chrome时IRONFRONT_CHROME_PATH指定完整路径。推进验证：npm run test:logic后node scripts/verify-breakthrough.cjs。</w:t>
+        <w:t>本轮详细说明写入docs/DEVELOPMENT_REPORT.docx，并上传Main。README、PROGRESS、CHANGELOG与QA_REPORT同时更新；新版本为0.9.0。公开源码包只含代码、CC0音效、构建文件和音乐导入清单；本机完整包额外含十一首用户MP3。</w:t>
       </w:r>
     </w:p>
+    <w:tbl>
+      <w:tblPr>
+        <w:tblStyle w:val="TableGrid"/>
+        <w:tblW w:type="auto" w:w="0"/>
+        <w:tblLook w:firstColumn="1" w:firstRow="1" w:lastColumn="0" w:lastRow="0" w:noHBand="0" w:noVBand="1" w:val="04A0"/>
+      </w:tblPr>
+      <w:tblGrid>
+        <w:gridCol w:w="4917"/>
+        <w:gridCol w:w="4917"/>
+      </w:tblGrid>
+      <w:tr>
+        <w:tc>
+          <w:tcPr>
+            <w:tcW w:type="dxa" w:w="4917"/>
+          </w:tcPr>
+          <w:p>
+            <w:pPr>
+              <w:spacing w:after="80"/>
+            </w:pPr>
+            <w:r>
+              <w:rPr>
+                <w:sz w:val="18"/>
+              </w:rPr>
+              <w:t>交付物</w:t>
+            </w:r>
+          </w:p>
+        </w:tc>
+        <w:tc>
+          <w:tcPr>
+            <w:tcW w:type="dxa" w:w="4917"/>
+          </w:tcPr>
+          <w:p>
+            <w:pPr>
+              <w:spacing w:after="80"/>
+            </w:pPr>
+            <w:r>
+              <w:rPr>
+                <w:sz w:val="18"/>
+              </w:rPr>
+              <w:t>用途</w:t>
+            </w:r>
+          </w:p>
+        </w:tc>
+      </w:tr>
+      <w:tr>
+        <w:tc>
+          <w:tcPr>
+            <w:tcW w:type="dxa" w:w="4917"/>
+          </w:tcPr>
+          <w:p>
+            <w:pPr>
+              <w:spacing w:after="80"/>
+            </w:pPr>
+            <w:r>
+              <w:rPr>
+                <w:sz w:val="18"/>
+              </w:rPr>
+              <w:t>IRONFRONT_v0.9.0_FULL_LOCAL.zip</w:t>
+            </w:r>
+          </w:p>
+        </w:tc>
+        <w:tc>
+          <w:tcPr>
+            <w:tcW w:type="dxa" w:w="4917"/>
+          </w:tcPr>
+          <w:p>
+            <w:pPr>
+              <w:spacing w:after="80"/>
+            </w:pPr>
+            <w:r>
+              <w:rPr>
+                <w:sz w:val="18"/>
+              </w:rPr>
+              <w:t>本机私人完整源码和dist，包含用户音乐</w:t>
+            </w:r>
+          </w:p>
+        </w:tc>
+      </w:tr>
+      <w:tr>
+        <w:tc>
+          <w:tcPr>
+            <w:tcW w:type="dxa" w:w="4917"/>
+          </w:tcPr>
+          <w:p>
+            <w:pPr>
+              <w:spacing w:after="80"/>
+            </w:pPr>
+            <w:r>
+              <w:rPr>
+                <w:sz w:val="18"/>
+              </w:rPr>
+              <w:t>IRONFRONT_v0.9.0_SOURCE.zip</w:t>
+            </w:r>
+          </w:p>
+        </w:tc>
+        <w:tc>
+          <w:tcPr>
+            <w:tcW w:type="dxa" w:w="4917"/>
+          </w:tcPr>
+          <w:p>
+            <w:pPr>
+              <w:spacing w:after="80"/>
+            </w:pPr>
+            <w:r>
+              <w:rPr>
+                <w:sz w:val="18"/>
+              </w:rPr>
+              <w:t>公开源码和dist，不含用户MP3</w:t>
+            </w:r>
+          </w:p>
+        </w:tc>
+      </w:tr>
+      <w:tr>
+        <w:tc>
+          <w:tcPr>
+            <w:tcW w:type="dxa" w:w="4917"/>
+          </w:tcPr>
+          <w:p>
+            <w:pPr>
+              <w:spacing w:after="80"/>
+            </w:pPr>
+            <w:r>
+              <w:rPr>
+                <w:sz w:val="18"/>
+              </w:rPr>
+              <w:t>IRONFRONT_v0.9.0_Development_Report.docx</w:t>
+            </w:r>
+          </w:p>
+        </w:tc>
+        <w:tc>
+          <w:tcPr>
+            <w:tcW w:type="dxa" w:w="4917"/>
+          </w:tcPr>
+          <w:p>
+            <w:pPr>
+              <w:spacing w:after="80"/>
+            </w:pPr>
+            <w:r>
+              <w:rPr>
+                <w:sz w:val="18"/>
+              </w:rPr>
+              <w:t>本轮详细开发说明</w:t>
+            </w:r>
+          </w:p>
+        </w:tc>
+      </w:tr>
+      <w:tr>
+        <w:tc>
+          <w:tcPr>
+            <w:tcW w:type="dxa" w:w="4917"/>
+          </w:tcPr>
+          <w:p>
+            <w:pPr>
+              <w:spacing w:after="80"/>
+            </w:pPr>
+            <w:r>
+              <w:rPr>
+                <w:sz w:val="18"/>
+              </w:rPr>
+              <w:t>QA_RESULTS.json 与 docs/qa</w:t>
+            </w:r>
+          </w:p>
+        </w:tc>
+        <w:tc>
+          <w:tcPr>
+            <w:tcW w:type="dxa" w:w="4917"/>
+          </w:tcPr>
+          <w:p>
+            <w:pPr>
+              <w:spacing w:after="80"/>
+            </w:pPr>
+            <w:r>
+              <w:rPr>
+                <w:sz w:val="18"/>
+              </w:rPr>
+              <w:t>机器结果和原始验证证据</w:t>
+            </w:r>
+          </w:p>
+        </w:tc>
+      </w:tr>
+    </w:tbl>
+    <w:p/>
     <w:p>
-      <w:pPr>
-        <w:pStyle w:val="Heading2"/>
-      </w:pPr>
       <w:r>
-        <w:t>音乐恢复与公开代码</w:t>
+        <w:t>启动：npm install，npm run dev，浏览器打开终端显示的本地地址。不要直接双击dist/index.html；生产包应通过HTTP服务。现有依赖可用时执行npm run check；完整浏览器检查执行npm run test:browser，并提供本机Chrome路径环境变量。</w:t>
       </w:r>
     </w:p>
     <w:p>
       <w:r>
-        <w:t>个人完整ZIP内含public/audio/music，dist同样保留本地音乐。GitHub与公开源码ZIP不含音轨；从用户文件恢复时执行python3 scripts/import-music.py /absolute/path/to/Musics_Battlefield，再npm run build。需要FFmpeg，原文件名见MUSIC_MANIFEST.json。音乐文件由.gitignore排除，不能把个人完整ZIP上传公开仓库。</w:t>
-      </w:r>
-    </w:p>
-    <w:p>
-      <w:pPr>
-        <w:pStyle w:val="Heading2"/>
-      </w:pPr>
-      <w:r>
-        <w:t>版本一致性与可追踪性</w:t>
+        <w:t>按键：WASD横移与移动，Shift点按滑铲/按住冲刺，右键ADS，左键开火，R换弹，1/2切枪，G投掷，X兵种工具，工程兵Z发射火箭，Q积分支援，E上下车，F1–F4座位，M地图，Tab计分，Esc暂停。</w:t>
       </w:r>
     </w:p>
     <w:p>
       <w:r>
-        <w:t>最终代码、README、PROGRESS、CHANGELOG、QA_REPORT、JSON、截图、详细DOCX及公开源码ZIP直接提交并推送Main。推送后检查HEAD等于origin/main及远端ls-remote，工作树无遗留源码改动。本机交付0.8目录保留0.6旧版；两个压缩包有明确音乐边界和校验和。</w:t>
-      </w:r>
-    </w:p>
-    <w:p>
-      <w:pPr>
-        <w:pStyle w:val="Heading2"/>
-      </w:pPr>
-      <w:r>
-        <w:t>未完成事项</w:t>
+        <w:t>参考来源见REFERENCES_090.md：EA说明支持对未交战队友部署，Battlefield V资料支持死亡后选择小队摄像机或部署概览；Delta Force官方地图用于视觉布局参考。Epic摄像机震动资料与GDC的HUD/声音沟通讨论用于反馈设计。具体镜头参数与界面实现为项目原创。</w:t>
       </w:r>
     </w:p>
     <w:p>
       <w:r>
-        <w:t>仍需要专业枪械/人物/植被美术与材质、长期人工操作/声音验收、持续性能优化、AI同车乘员、复杂装甲穿透、更多地图与联网架构。不能将界面/程序模型改进描述为达到参考截图的写实画质。前线推进当前种子红胜，需更多种子与人工玩法平衡。</w:t>
-      </w:r>
-    </w:p>
-    <w:p>
-      <w:pPr>
-        <w:pStyle w:val="Heading2"/>
-      </w:pPr>
-      <w:r>
-        <w:t>主要变更模块</w:t>
-      </w:r>
-    </w:p>
-    <w:p>
-      <w:r>
-        <w:t>Battle.ts负责部署、安全判定、兵种、弹道和AI；Vehicle.ts定义四车型；Weapons.ts定义枪械/兵种/配置；main.ts接输入与相机；UI.ts和style.css负责准备、部署与HUD；WeaponModels.ts负责独立几何；MusicDirector/MusicPlayer/AudioManager分离情境、流媒体播放和音效混音。</w:t>
+        <w:t>下一阶段尚待实际开发：写实资源、玩家可救援倒地、AI同车乘员协作、装甲分区及更多地图。此次交付不把这些未完成事项标记成通过。用户MP3不上传GitHub，继续遵循已确认的分发范围。</w:t>
       </w:r>
     </w:p>
     <w:sectPr>
-      <w:footerReference w:type="default" r:id="rId9"/>
+      <w:headerReference w:type="default" r:id="rId9"/>
+      <w:footerReference w:type="default" r:id="rId10"/>
       <w:pgSz w:w="11909" w:h="16834"/>
-      <w:pgMar w:top="1008" w:right="1037" w:bottom="936" w:left="1037" w:header="720" w:footer="720" w:gutter="0"/>
+      <w:pgMar w:top="979" w:right="1037" w:bottom="936" w:left="1037" w:header="720" w:footer="720" w:gutter="0"/>
       <w:cols w:space="720"/>
       <w:docGrid w:linePitch="360"/>
     </w:sectPr>
@@ -2241,11 +1864,25 @@
       <w:jc w:val="right"/>
     </w:pPr>
     <w:r>
-      <w:t xml:space="preserve">IRONFRONT 0.8.0  |  </w:t>
+      <w:t xml:space="preserve">2026 10 08  |  </w:t>
     </w:r>
     <w:fldSimple w:instr="PAGE"/>
   </w:p>
 </w:ftr>
+</file>
+
+<file path=word/header1.xml><?xml version="1.0" encoding="utf-8"?>
+<w:hdr xmlns:m="http://schemas.openxmlformats.org/officeDocument/2006/math" xmlns:mc="http://schemas.openxmlformats.org/markup-compatibility/2006" xmlns:mo="http://schemas.microsoft.com/office/mac/office/2008/main" xmlns:mv="urn:schemas-microsoft-com:mac:vml" xmlns:o="urn:schemas-microsoft-com:office:office" xmlns:r="http://schemas.openxmlformats.org/officeDocument/2006/relationships" xmlns:v="urn:schemas-microsoft-com:vml" xmlns:w10="urn:schemas-microsoft-com:office:word" xmlns:w14="http://schemas.microsoft.com/office/word/2010/wordml" xmlns:w="http://schemas.openxmlformats.org/wordprocessingml/2006/main" xmlns:wne="http://schemas.microsoft.com/office/word/2006/wordml" xmlns:wp14="http://schemas.microsoft.com/office/word/2010/wordprocessingDrawing" xmlns:wp="http://schemas.openxmlformats.org/drawingml/2006/wordprocessingDrawing" xmlns:wpc="http://schemas.microsoft.com/office/word/2010/wordprocessingCanvas" xmlns:wpg="http://schemas.microsoft.com/office/word/2010/wordprocessingGroup" xmlns:wpi="http://schemas.microsoft.com/office/word/2010/wordprocessingInk" xmlns:wps="http://schemas.microsoft.com/office/word/2010/wordprocessingShape" mc:Ignorable="w14 wp14">
+  <w:p>
+    <w:pPr/>
+    <w:r>
+      <w:rPr>
+        <w:sz w:val="16"/>
+      </w:rPr>
+      <w:t>PROJECT IRONFRONT 0.9.0   开发与验证报告</w:t>
+    </w:r>
+  </w:p>
+</w:hdr>
 </file>
 
 <file path=word/numbering.xml><?xml version="1.0" encoding="utf-8"?>
@@ -2612,7 +2249,7 @@
     <w:qFormat/>
     <w:rsid w:val="00FC693F"/>
     <w:pPr>
-      <w:spacing w:after="120" w:line="259" w:lineRule="auto"/>
+      <w:spacing w:after="140" w:line="269" w:lineRule="auto"/>
     </w:pPr>
     <w:rPr>
       <w:rFonts w:ascii="Arial Unicode MS" w:hAnsi="Arial Unicode MS" w:eastAsia="Arial Unicode MS"/>
@@ -2961,9 +2598,6 @@
     <w:qFormat/>
     <w:rsid w:val="00FC693F"/>
     <w:pPr>
-      <w:pBdr>
-        <w:bottom w:val="single" w:sz="8" w:space="4" w:color="4F81BD" w:themeColor="accent1"/>
-      </w:pBdr>
       <w:spacing w:after="300" w:line="240" w:lineRule="auto"/>
       <w:contextualSpacing/>
     </w:pPr>
@@ -3448,9 +3082,6 @@
     <w:qFormat/>
     <w:rsid w:val="00FC693F"/>
     <w:pPr>
-      <w:pBdr>
-        <w:bottom w:val="single" w:sz="4" w:space="4" w:color="4F81BD" w:themeColor="accent1"/>
-      </w:pBdr>
       <w:spacing w:before="200" w:after="280"/>
       <w:ind w:left="936" w:right="936"/>
     </w:pPr>

</xml_diff>

<commit_message>
Release 0.10.0: LAN rooms, four-person squads and combined arms improvements
</commit_message>
<xml_diff>
--- a/docs/DEVELOPMENT_REPORT.docx
+++ b/docs/DEVELOPMENT_REPORT.docx
@@ -7,17 +7,19 @@
         <w:pStyle w:val="Title"/>
       </w:pPr>
       <w:r>
-        <w:t>IRONFRONT 0.9.0 开发报告</w:t>
+        <w:t>IRONFRONT 0.10.0</w:t>
+        <w:br/>
+        <w:t>开发与完整 QA 报告</w:t>
       </w:r>
     </w:p>
     <w:p>
       <w:r>
-        <w:t>本轮把用户指出的八项问题落实到当前源码：真实枪口射击、明显受击反馈、实际AI驾驶员、召唤车辆空投和玩家专属保留、死亡升空部署，以及音乐连续过渡。代码延续原项目，不用新演示替换现有征服和小队战争系统。</w:t>
+        <w:t>本轮在现有 IRONFRONT 上继续开发，重点完成真实局域网房间、四人小队、双阵营部署、方块人物，以及载具连续驾驶、武器限角、独立装备模型与更清晰的战斗界面。保留征服、前线推进、AI 小队和大战场事件。</w:t>
       </w:r>
     </w:p>
     <w:p>
       <w:r>
-        <w:t>任务对象为本机与 GitHub YunfanShi/IRONFRONT 的 Main。开始时远端与本机提交均为290ab1a9，版本0.8.0；本机已交付目录与仓库26个源码及版本文件一致。按新增模块的版本规则升级中间位至0.9.0，交付仍直接更新Main。</w:t>
+        <w:t>开始时本机与 origin/main 均为 9aeb96a6d1ae4c60c01dcbe94e757b4ca41c4303、0.9.0。本机 iCloud 交付目录与基线仓库 28 个源码及版本文件逐字节一致。新增模块按用户规则升级为 0.10.0，直接更新 Main。</w:t>
       </w:r>
     </w:p>
     <w:tbl>
@@ -43,7 +45,7 @@
               <w:rPr>
                 <w:sz w:val="18"/>
               </w:rPr>
-              <w:t>用户问题</w:t>
+              <w:t>交付范围</w:t>
             </w:r>
           </w:p>
         </w:tc>
@@ -59,7 +61,7 @@
               <w:rPr>
                 <w:sz w:val="18"/>
               </w:rPr>
-              <w:t>本轮结果</w:t>
+              <w:t>实现及依据</w:t>
             </w:r>
           </w:p>
         </w:tc>
@@ -77,7 +79,7 @@
               <w:rPr>
                 <w:sz w:val="18"/>
               </w:rPr>
-              <w:t>声音假</w:t>
+              <w:t>联机</w:t>
             </w:r>
           </w:p>
         </w:tc>
@@ -93,7 +95,7 @@
               <w:rPr>
                 <w:sz w:val="18"/>
               </w:rPr>
-              <w:t>七种枪14个CC0单发录音，29个缓存音效，爆炸替换与限峰</w:t>
+              <w:t>房主 + 最多 7 名加入者；真实 WebSocket 与房主电脑上的权威服务器</w:t>
             </w:r>
           </w:p>
         </w:tc>
@@ -111,7 +113,7 @@
               <w:rPr>
                 <w:sz w:val="18"/>
               </w:rPr>
-              <w:t>受击不明显</w:t>
+              <w:t>小队与阵营</w:t>
             </w:r>
           </w:p>
         </w:tc>
@@ -127,7 +129,7 @@
               <w:rPr>
                 <w:sz w:val="18"/>
               </w:rPr>
-              <w:t>即时红边、方向与数字、短促镜头冲击、持续低血量暗角</w:t>
+              <w:t>四人上限，AI 填补；房主能配置双方、关闭 AI 实现 1v1</w:t>
             </w:r>
           </w:p>
         </w:tc>
@@ -145,7 +147,7 @@
               <w:rPr>
                 <w:sz w:val="18"/>
               </w:rPr>
-              <w:t>子弹来源错误</w:t>
+              <w:t>部署</w:t>
             </w:r>
           </w:p>
         </w:tc>
@@ -161,7 +163,7 @@
               <w:rPr>
                 <w:sz w:val="18"/>
               </w:rPr>
-              <w:t>模型枪口世界坐标、近墙阻挡、炮管末端实体弹体</w:t>
+              <w:t>双方基地、友军据点、小队与友军空载具座位；服务器再次检查状态</w:t>
             </w:r>
           </w:p>
         </w:tc>
@@ -179,7 +181,7 @@
               <w:rPr>
                 <w:sz w:val="18"/>
               </w:rPr>
-              <w:t>召唤车辆被开走</w:t>
+              <w:t>载具</w:t>
             </w:r>
           </w:p>
         </w:tc>
@@ -195,7 +197,7 @@
               <w:rPr>
                 <w:sz w:val="18"/>
               </w:rPr>
-              <w:t>车辆对调用玩家保留，AI不能登车</w:t>
+              <w:t>七种类型、默认双方各七辆；连续移动、炮塔速度和角度限制、第一人称与右键光学瞄具</w:t>
             </w:r>
           </w:p>
         </w:tc>
@@ -213,7 +215,7 @@
               <w:rPr>
                 <w:sz w:val="18"/>
               </w:rPr>
-              <w:t>车无驾驶员自己移动</w:t>
+              <w:t>人物与装备</w:t>
             </w:r>
           </w:p>
         </w:tc>
@@ -229,7 +231,7 @@
               <w:rPr>
                 <w:sz w:val="18"/>
               </w:rPr>
-              <w:t>真实单位占位，玩家接管后驾驶员安全下车</w:t>
+              <w:t>原创方块风格蓝红衣服，真人金色胸章；机枪、工具、手雷与火箭分别建模</w:t>
             </w:r>
           </w:p>
         </w:tc>
@@ -247,7 +249,7 @@
               <w:rPr>
                 <w:sz w:val="18"/>
               </w:rPr>
-              <w:t>车辆召唤方式</w:t>
+              <w:t>验证</w:t>
             </w:r>
           </w:p>
         </w:tc>
@@ -263,75 +265,7 @@
               <w:rPr>
                 <w:sz w:val="18"/>
               </w:rPr>
-              <w:t>附近安全落点8秒降落伞空投</w:t>
-            </w:r>
-          </w:p>
-        </w:tc>
-      </w:tr>
-      <w:tr>
-        <w:tc>
-          <w:tcPr>
-            <w:tcW w:type="dxa" w:w="4917"/>
-          </w:tcPr>
-          <w:p>
-            <w:pPr>
-              <w:spacing w:after="80"/>
-            </w:pPr>
-            <w:r>
-              <w:rPr>
-                <w:sz w:val="18"/>
-              </w:rPr>
-              <w:t>死亡瞬间菜单</w:t>
-            </w:r>
-          </w:p>
-        </w:tc>
-        <w:tc>
-          <w:tcPr>
-            <w:tcW w:type="dxa" w:w="4917"/>
-          </w:tcPr>
-          <w:p>
-            <w:pPr>
-              <w:spacing w:after="80"/>
-            </w:pPr>
-            <w:r>
-              <w:rPr>
-                <w:sz w:val="18"/>
-              </w:rPr>
-              <w:t>倒地与停留后升空，4.8秒进入部署地图</w:t>
-            </w:r>
-          </w:p>
-        </w:tc>
-      </w:tr>
-      <w:tr>
-        <w:tc>
-          <w:tcPr>
-            <w:tcW w:type="dxa" w:w="4917"/>
-          </w:tcPr>
-          <w:p>
-            <w:pPr>
-              <w:spacing w:after="80"/>
-            </w:pPr>
-            <w:r>
-              <w:rPr>
-                <w:sz w:val="18"/>
-              </w:rPr>
-              <w:t>死亡换歌突兀</w:t>
-            </w:r>
-          </w:p>
-        </w:tc>
-        <w:tc>
-          <w:tcPr>
-            <w:tcW w:type="dxa" w:w="4917"/>
-          </w:tcPr>
-          <w:p>
-            <w:pPr>
-              <w:spacing w:after="80"/>
-            </w:pPr>
-            <w:r>
-              <w:rPr>
-                <w:sz w:val="18"/>
-              </w:rPr>
-              <w:t>死亡延续战况曲，4秒等功率交叉淡化与平滑duck</w:t>
+              <w:t>60 项单位测试、17 项实际浏览器回归、真实客户端网络检查、生产构建通过</w:t>
             </w:r>
           </w:p>
         </w:tc>
@@ -340,7 +274,7 @@
     <w:p/>
     <w:p>
       <w:r>
-        <w:t>用户粘贴的机制大全和截图用作设计资料。本轮不宣称已实现资料中所有机制，也没有复制商业游戏模型、声音或贴图。</w:t>
+        <w:t>商业游戏截图仅参考布局与信息层级，人物和模型为项目原创几何。用户十一首音乐遵循已确认范围：只进入本机与私人完整 ZIP，公开 GitHub 与源码 ZIP 均不含这些 MP3。</w:t>
       </w:r>
     </w:p>
     <w:p>
@@ -349,711 +283,22 @@
         <w:pageBreakBefore/>
       </w:pPr>
       <w:r>
-        <w:t>真实录音与音频处理</w:t>
+        <w:t>车辆运动 武器与座位</w:t>
       </w:r>
     </w:p>
     <w:p>
       <w:r>
-        <w:t>实枪声音来自The Free Firearm Sound Library，作者Ben Jaszczak、Brian Nelson、Kevin Heras和Matthew Nanney，页面明确CC0。每种虚构枪使用两次不同单发取样：裁掉前置静音，保留枪声冲击与自然反射，转换为44.1kHz单声道PCM，峰值归一到0.88并淡出尾部。</w:t>
-      </w:r>
-    </w:p>
-    <w:tbl>
-      <w:tblPr>
-        <w:tblStyle w:val="TableGrid"/>
-        <w:tblW w:type="auto" w:w="0"/>
-        <w:tblLook w:firstColumn="1" w:firstRow="1" w:lastColumn="0" w:lastRow="0" w:noHBand="0" w:noVBand="1" w:val="04A0"/>
-      </w:tblPr>
-      <w:tblGrid>
-        <w:gridCol w:w="3278"/>
-        <w:gridCol w:w="3278"/>
-        <w:gridCol w:w="3278"/>
-      </w:tblGrid>
-      <w:tr>
-        <w:tc>
-          <w:tcPr>
-            <w:tcW w:type="dxa" w:w="3278"/>
-          </w:tcPr>
-          <w:p>
-            <w:pPr>
-              <w:spacing w:after="80"/>
-            </w:pPr>
-            <w:r>
-              <w:rPr>
-                <w:sz w:val="18"/>
-              </w:rPr>
-              <w:t>虚构枪类别</w:t>
-            </w:r>
-          </w:p>
-        </w:tc>
-        <w:tc>
-          <w:tcPr>
-            <w:tcW w:type="dxa" w:w="3278"/>
-          </w:tcPr>
-          <w:p>
-            <w:pPr>
-              <w:spacing w:after="80"/>
-            </w:pPr>
-            <w:r>
-              <w:rPr>
-                <w:sz w:val="18"/>
-              </w:rPr>
-              <w:t>录音来源</w:t>
-            </w:r>
-          </w:p>
-        </w:tc>
-        <w:tc>
-          <w:tcPr>
-            <w:tcW w:type="dxa" w:w="3278"/>
-          </w:tcPr>
-          <w:p>
-            <w:pPr>
-              <w:spacing w:after="80"/>
-            </w:pPr>
-            <w:r>
-              <w:rPr>
-                <w:sz w:val="18"/>
-              </w:rPr>
-              <w:t>变体</w:t>
-            </w:r>
-          </w:p>
-        </w:tc>
-      </w:tr>
-      <w:tr>
-        <w:tc>
-          <w:tcPr>
-            <w:tcW w:type="dxa" w:w="3278"/>
-          </w:tcPr>
-          <w:p>
-            <w:pPr>
-              <w:spacing w:after="80"/>
-            </w:pPr>
-            <w:r>
-              <w:rPr>
-                <w:sz w:val="18"/>
-              </w:rPr>
-              <w:t>卡宾枪</w:t>
-            </w:r>
-          </w:p>
-        </w:tc>
-        <w:tc>
-          <w:tcPr>
-            <w:tcW w:type="dxa" w:w="3278"/>
-          </w:tcPr>
-          <w:p>
-            <w:pPr>
-              <w:spacing w:after="80"/>
-            </w:pPr>
-            <w:r>
-              <w:rPr>
-                <w:sz w:val="18"/>
-              </w:rPr>
-              <w:t>AR 15</w:t>
-            </w:r>
-          </w:p>
-        </w:tc>
-        <w:tc>
-          <w:tcPr>
-            <w:tcW w:type="dxa" w:w="3278"/>
-          </w:tcPr>
-          <w:p>
-            <w:pPr>
-              <w:spacing w:after="80"/>
-            </w:pPr>
-            <w:r>
-              <w:rPr>
-                <w:sz w:val="18"/>
-              </w:rPr>
-              <w:t>2</w:t>
-            </w:r>
-          </w:p>
-        </w:tc>
-      </w:tr>
-      <w:tr>
-        <w:tc>
-          <w:tcPr>
-            <w:tcW w:type="dxa" w:w="3278"/>
-          </w:tcPr>
-          <w:p>
-            <w:pPr>
-              <w:spacing w:after="80"/>
-            </w:pPr>
-            <w:r>
-              <w:rPr>
-                <w:sz w:val="18"/>
-              </w:rPr>
-              <w:t>精确射手</w:t>
-            </w:r>
-          </w:p>
-        </w:tc>
-        <w:tc>
-          <w:tcPr>
-            <w:tcW w:type="dxa" w:w="3278"/>
-          </w:tcPr>
-          <w:p>
-            <w:pPr>
-              <w:spacing w:after="80"/>
-            </w:pPr>
-            <w:r>
-              <w:rPr>
-                <w:sz w:val="18"/>
-              </w:rPr>
-              <w:t>SKS</w:t>
-            </w:r>
-          </w:p>
-        </w:tc>
-        <w:tc>
-          <w:tcPr>
-            <w:tcW w:type="dxa" w:w="3278"/>
-          </w:tcPr>
-          <w:p>
-            <w:pPr>
-              <w:spacing w:after="80"/>
-            </w:pPr>
-            <w:r>
-              <w:rPr>
-                <w:sz w:val="18"/>
-              </w:rPr>
-              <w:t>2</w:t>
-            </w:r>
-          </w:p>
-        </w:tc>
-      </w:tr>
-      <w:tr>
-        <w:tc>
-          <w:tcPr>
-            <w:tcW w:type="dxa" w:w="3278"/>
-          </w:tcPr>
-          <w:p>
-            <w:pPr>
-              <w:spacing w:after="80"/>
-            </w:pPr>
-            <w:r>
-              <w:rPr>
-                <w:sz w:val="18"/>
-              </w:rPr>
-              <w:t>冲锋枪</w:t>
-            </w:r>
-          </w:p>
-        </w:tc>
-        <w:tc>
-          <w:tcPr>
-            <w:tcW w:type="dxa" w:w="3278"/>
-          </w:tcPr>
-          <w:p>
-            <w:pPr>
-              <w:spacing w:after="80"/>
-            </w:pPr>
-            <w:r>
-              <w:rPr>
-                <w:sz w:val="18"/>
-              </w:rPr>
-              <w:t>Carl Gustav M45</w:t>
-            </w:r>
-          </w:p>
-        </w:tc>
-        <w:tc>
-          <w:tcPr>
-            <w:tcW w:type="dxa" w:w="3278"/>
-          </w:tcPr>
-          <w:p>
-            <w:pPr>
-              <w:spacing w:after="80"/>
-            </w:pPr>
-            <w:r>
-              <w:rPr>
-                <w:sz w:val="18"/>
-              </w:rPr>
-              <w:t>2</w:t>
-            </w:r>
-          </w:p>
-        </w:tc>
-      </w:tr>
-      <w:tr>
-        <w:tc>
-          <w:tcPr>
-            <w:tcW w:type="dxa" w:w="3278"/>
-          </w:tcPr>
-          <w:p>
-            <w:pPr>
-              <w:spacing w:after="80"/>
-            </w:pPr>
-            <w:r>
-              <w:rPr>
-                <w:sz w:val="18"/>
-              </w:rPr>
-              <w:t>轻机枪</w:t>
-            </w:r>
-          </w:p>
-        </w:tc>
-        <w:tc>
-          <w:tcPr>
-            <w:tcW w:type="dxa" w:w="3278"/>
-          </w:tcPr>
-          <w:p>
-            <w:pPr>
-              <w:spacing w:after="80"/>
-            </w:pPr>
-            <w:r>
-              <w:rPr>
-                <w:sz w:val="18"/>
-              </w:rPr>
-              <w:t>PPSh 单发</w:t>
-            </w:r>
-          </w:p>
-        </w:tc>
-        <w:tc>
-          <w:tcPr>
-            <w:tcW w:type="dxa" w:w="3278"/>
-          </w:tcPr>
-          <w:p>
-            <w:pPr>
-              <w:spacing w:after="80"/>
-            </w:pPr>
-            <w:r>
-              <w:rPr>
-                <w:sz w:val="18"/>
-              </w:rPr>
-              <w:t>同一录音的两次独立单发</w:t>
-            </w:r>
-          </w:p>
-        </w:tc>
-      </w:tr>
-      <w:tr>
-        <w:tc>
-          <w:tcPr>
-            <w:tcW w:type="dxa" w:w="3278"/>
-          </w:tcPr>
-          <w:p>
-            <w:pPr>
-              <w:spacing w:after="80"/>
-            </w:pPr>
-            <w:r>
-              <w:rPr>
-                <w:sz w:val="18"/>
-              </w:rPr>
-              <w:t>战斗步枪</w:t>
-            </w:r>
-          </w:p>
-        </w:tc>
-        <w:tc>
-          <w:tcPr>
-            <w:tcW w:type="dxa" w:w="3278"/>
-          </w:tcPr>
-          <w:p>
-            <w:pPr>
-              <w:spacing w:after="80"/>
-            </w:pPr>
-            <w:r>
-              <w:rPr>
-                <w:sz w:val="18"/>
-              </w:rPr>
-              <w:t>AK 47 单发</w:t>
-            </w:r>
-          </w:p>
-        </w:tc>
-        <w:tc>
-          <w:tcPr>
-            <w:tcW w:type="dxa" w:w="3278"/>
-          </w:tcPr>
-          <w:p>
-            <w:pPr>
-              <w:spacing w:after="80"/>
-            </w:pPr>
-            <w:r>
-              <w:rPr>
-                <w:sz w:val="18"/>
-              </w:rPr>
-              <w:t>2</w:t>
-            </w:r>
-          </w:p>
-        </w:tc>
-      </w:tr>
-      <w:tr>
-        <w:tc>
-          <w:tcPr>
-            <w:tcW w:type="dxa" w:w="3278"/>
-          </w:tcPr>
-          <w:p>
-            <w:pPr>
-              <w:spacing w:after="80"/>
-            </w:pPr>
-            <w:r>
-              <w:rPr>
-                <w:sz w:val="18"/>
-              </w:rPr>
-              <w:t>狙击枪</w:t>
-            </w:r>
-          </w:p>
-        </w:tc>
-        <w:tc>
-          <w:tcPr>
-            <w:tcW w:type="dxa" w:w="3278"/>
-          </w:tcPr>
-          <w:p>
-            <w:pPr>
-              <w:spacing w:after="80"/>
-            </w:pPr>
-            <w:r>
-              <w:rPr>
-                <w:sz w:val="18"/>
-              </w:rPr>
-              <w:t>Tikka</w:t>
-            </w:r>
-          </w:p>
-        </w:tc>
-        <w:tc>
-          <w:tcPr>
-            <w:tcW w:type="dxa" w:w="3278"/>
-          </w:tcPr>
-          <w:p>
-            <w:pPr>
-              <w:spacing w:after="80"/>
-            </w:pPr>
-            <w:r>
-              <w:rPr>
-                <w:sz w:val="18"/>
-              </w:rPr>
-              <w:t>2</w:t>
-            </w:r>
-          </w:p>
-        </w:tc>
-      </w:tr>
-      <w:tr>
-        <w:tc>
-          <w:tcPr>
-            <w:tcW w:type="dxa" w:w="3278"/>
-          </w:tcPr>
-          <w:p>
-            <w:pPr>
-              <w:spacing w:after="80"/>
-            </w:pPr>
-            <w:r>
-              <w:rPr>
-                <w:sz w:val="18"/>
-              </w:rPr>
-              <w:t>手枪</w:t>
-            </w:r>
-          </w:p>
-        </w:tc>
-        <w:tc>
-          <w:tcPr>
-            <w:tcW w:type="dxa" w:w="3278"/>
-          </w:tcPr>
-          <w:p>
-            <w:pPr>
-              <w:spacing w:after="80"/>
-            </w:pPr>
-            <w:r>
-              <w:rPr>
-                <w:sz w:val="18"/>
-              </w:rPr>
-              <w:t>1911</w:t>
-            </w:r>
-          </w:p>
-        </w:tc>
-        <w:tc>
-          <w:tcPr>
-            <w:tcW w:type="dxa" w:w="3278"/>
-          </w:tcPr>
-          <w:p>
-            <w:pPr>
-              <w:spacing w:after="80"/>
-            </w:pPr>
-            <w:r>
-              <w:rPr>
-                <w:sz w:val="18"/>
-              </w:rPr>
-              <w:t>2</w:t>
-            </w:r>
-          </w:p>
-        </w:tc>
-      </w:tr>
-    </w:tbl>
-    <w:p/>
-    <w:p>
-      <w:r>
-        <w:t>录音库有自动连发素材。QA发现直接取一秒片段会让每个游戏shot事件播放多发枪声，造成类似火神炮的错觉。本轮改选单发；轻机枪在P_30P.wav中分别截取独立射击，避免与游戏射速重复叠加。完整取样时间、文件及SHA256在RECORDED_SFX_MANIFEST.json。</w:t>
+        <w:t>修复 AI 车辆瞬移的根因：战术决策约每 0.22 秒更新，但位置、速度与转向每个模拟步连续积分。不再以决策间隔直接跳位，也移除卡路脱困时突然改变车体方向的处理。联机远端车辆显示采用平滑追随权威位置。</w:t>
       </w:r>
     </w:p>
     <w:p>
       <w:r>
-        <w:t>爆炸使用EZduzziteh发布的CC0设计音效，并不称为真实战场炮击录音。距离低通、左右声道定位与最多28个声音并发继续有效；新增音效动态压缩限峰，采样结束清理输出声道节点。发动机、炮口、部分脚步和风仍有程序化层，采样缺失时保留备用。</w:t>
+        <w:t>驾驶位必须确实坐着存活的士兵才驱动车辆。空车停车，AI 使用原有单位登车，不凭空生成驾驶员。玩家可以 E 接管友军 AI 驾驶位，AI 在安全位置下车。召唤车辆继续降落伞空投并保留给调用者，AI 不会抢走。</w:t>
       </w:r>
     </w:p>
     <w:p>
       <w:r>
-        <w:t>出处：opengameart.org/node/21826；opengameart.org/content/explosions-4。具体授权与加工记录在docs/licenses/Audio-Credits.md。29个WAV/OGG已在Chrome实际解码，技术验证不能替代耳机与扬声器人工听感验收。</w:t>
-      </w:r>
-    </w:p>
-    <w:p>
-      <w:pPr>
-        <w:pStyle w:val="Heading1"/>
-        <w:pageBreakBefore/>
-      </w:pPr>
-      <w:r>
-        <w:t>车辆驾驶员与空投状态</w:t>
-      </w:r>
-    </w:p>
-    <w:p>
-      <w:r>
-        <w:t>ArmoredVehicle现在保存occupants数组，Soldier保存vehicleId。驾驶位占用者必须是存活且确实在该车中的原有士兵；仅给driver赋值ai不会再启动空车。单位上车后不重复绘制车外步兵，不再作为车外射击目标，且随车辆位置更新。军队总人数保持原size两倍。</w:t>
-      </w:r>
-    </w:p>
-    <w:p>
-      <w:r>
-        <w:t>普通基地车辆允许AI接近并登驾驶位。8v8每队最多1个AI驾驶员，16v16最多2个，32v32及以上最多4个，避免小战局抽走过多步兵。驾驶员下车后恢复步兵行为，15秒内不立即重新抢车。</w:t>
-      </w:r>
-    </w:p>
-    <w:p>
-      <w:r>
-        <w:t>玩家E接管友军车辆时，系统先寻找无碰撞下车位置，再让原AI退出，然后把玩家放入驾驶位；若无安全位置则拒绝挤出。F1–F4改变玩家占用的实际座位。空驾驶位会停车，乘客或机枪位不能代替驾驶位开车。</w:t>
-      </w:r>
-    </w:p>
-    <w:tbl>
-      <w:tblPr>
-        <w:tblStyle w:val="TableGrid"/>
-        <w:tblW w:type="auto" w:w="0"/>
-        <w:tblLook w:firstColumn="1" w:firstRow="1" w:lastColumn="0" w:lastRow="0" w:noHBand="0" w:noVBand="1" w:val="04A0"/>
-      </w:tblPr>
-      <w:tblGrid>
-        <w:gridCol w:w="3278"/>
-        <w:gridCol w:w="3278"/>
-        <w:gridCol w:w="3278"/>
-      </w:tblGrid>
-      <w:tr>
-        <w:tc>
-          <w:tcPr>
-            <w:tcW w:type="dxa" w:w="3278"/>
-          </w:tcPr>
-          <w:p>
-            <w:pPr>
-              <w:spacing w:after="80"/>
-            </w:pPr>
-            <w:r>
-              <w:rPr>
-                <w:sz w:val="18"/>
-              </w:rPr>
-              <w:t>座位</w:t>
-            </w:r>
-          </w:p>
-        </w:tc>
-        <w:tc>
-          <w:tcPr>
-            <w:tcW w:type="dxa" w:w="3278"/>
-          </w:tcPr>
-          <w:p>
-            <w:pPr>
-              <w:spacing w:after="80"/>
-            </w:pPr>
-            <w:r>
-              <w:rPr>
-                <w:sz w:val="18"/>
-              </w:rPr>
-              <w:t>权限</w:t>
-            </w:r>
-          </w:p>
-        </w:tc>
-        <w:tc>
-          <w:tcPr>
-            <w:tcW w:type="dxa" w:w="3278"/>
-          </w:tcPr>
-          <w:p>
-            <w:pPr>
-              <w:spacing w:after="80"/>
-            </w:pPr>
-            <w:r>
-              <w:rPr>
-                <w:sz w:val="18"/>
-              </w:rPr>
-              <w:t>类型差异</w:t>
-            </w:r>
-          </w:p>
-        </w:tc>
-      </w:tr>
-      <w:tr>
-        <w:tc>
-          <w:tcPr>
-            <w:tcW w:type="dxa" w:w="3278"/>
-          </w:tcPr>
-          <w:p>
-            <w:pPr>
-              <w:spacing w:after="80"/>
-            </w:pPr>
-            <w:r>
-              <w:rPr>
-                <w:sz w:val="18"/>
-              </w:rPr>
-              <w:t>F1 驾驶</w:t>
-            </w:r>
-          </w:p>
-        </w:tc>
-        <w:tc>
-          <w:tcPr>
-            <w:tcW w:type="dxa" w:w="3278"/>
-          </w:tcPr>
-          <w:p>
-            <w:pPr>
-              <w:spacing w:after="80"/>
-            </w:pPr>
-            <w:r>
-              <w:rPr>
-                <w:sz w:val="18"/>
-              </w:rPr>
-              <w:t>驾驶及主武器</w:t>
-            </w:r>
-          </w:p>
-        </w:tc>
-        <w:tc>
-          <w:tcPr>
-            <w:tcW w:type="dxa" w:w="3278"/>
-          </w:tcPr>
-          <w:p>
-            <w:pPr>
-              <w:spacing w:after="80"/>
-            </w:pPr>
-            <w:r>
-              <w:rPr>
-                <w:sz w:val="18"/>
-              </w:rPr>
-              <w:t>IFV/坦克为实体炮弹；运输车驾驶无武器</w:t>
-            </w:r>
-          </w:p>
-        </w:tc>
-      </w:tr>
-      <w:tr>
-        <w:tc>
-          <w:tcPr>
-            <w:tcW w:type="dxa" w:w="3278"/>
-          </w:tcPr>
-          <w:p>
-            <w:pPr>
-              <w:spacing w:after="80"/>
-            </w:pPr>
-            <w:r>
-              <w:rPr>
-                <w:sz w:val="18"/>
-              </w:rPr>
-              <w:t>F2 机枪</w:t>
-            </w:r>
-          </w:p>
-        </w:tc>
-        <w:tc>
-          <w:tcPr>
-            <w:tcW w:type="dxa" w:w="3278"/>
-          </w:tcPr>
-          <w:p>
-            <w:pPr>
-              <w:spacing w:after="80"/>
-            </w:pPr>
-            <w:r>
-              <w:rPr>
-                <w:sz w:val="18"/>
-              </w:rPr>
-              <w:t>独立机枪瞄准与射击</w:t>
-            </w:r>
-          </w:p>
-        </w:tc>
-        <w:tc>
-          <w:tcPr>
-            <w:tcW w:type="dxa" w:w="3278"/>
-          </w:tcPr>
-          <w:p>
-            <w:pPr>
-              <w:spacing w:after="80"/>
-            </w:pPr>
-            <w:r>
-              <w:rPr>
-                <w:sz w:val="18"/>
-              </w:rPr>
-              <w:t>不具备驾驶权限</w:t>
-            </w:r>
-          </w:p>
-        </w:tc>
-      </w:tr>
-      <w:tr>
-        <w:tc>
-          <w:tcPr>
-            <w:tcW w:type="dxa" w:w="3278"/>
-          </w:tcPr>
-          <w:p>
-            <w:pPr>
-              <w:spacing w:after="80"/>
-            </w:pPr>
-            <w:r>
-              <w:rPr>
-                <w:sz w:val="18"/>
-              </w:rPr>
-              <w:t>F3 F4 成员</w:t>
-            </w:r>
-          </w:p>
-        </w:tc>
-        <w:tc>
-          <w:tcPr>
-            <w:tcW w:type="dxa" w:w="3278"/>
-          </w:tcPr>
-          <w:p>
-            <w:pPr>
-              <w:spacing w:after="80"/>
-            </w:pPr>
-            <w:r>
-              <w:rPr>
-                <w:sz w:val="18"/>
-              </w:rPr>
-              <w:t>搭乘</w:t>
-            </w:r>
-          </w:p>
-        </w:tc>
-        <w:tc>
-          <w:tcPr>
-            <w:tcW w:type="dxa" w:w="3278"/>
-          </w:tcPr>
-          <w:p>
-            <w:pPr>
-              <w:spacing w:after="80"/>
-            </w:pPr>
-            <w:r>
-              <w:rPr>
-                <w:sz w:val="18"/>
-              </w:rPr>
-              <w:t>侦察车只有两个座位</w:t>
-            </w:r>
-          </w:p>
-        </w:tc>
-      </w:tr>
-    </w:tbl>
-    <w:p/>
-    <w:p>
-      <w:r>
-        <w:t>Q征用车辆在玩家附近扫描安全落点，扣费后进入airborne，8秒内显示降落伞并下降；空中不能登车。落地区被其他动态车辆占据时等待清空。落地后可以E驾驶，reservedFor持续为本地玩家保留，退出车辆也不会解除保留，不被AI开走。最多3辆活跃征用车；击毁不免费重生，普通基地车沿用分类重生。</w:t>
-      </w:r>
-    </w:p>
-    <w:p>
-      <w:r>
-        <w:t>当前仅实现AI驾驶员。没有AI独立机枪手、乘客上下车协同，也没有完整装甲分区、跳弹或穿甲模型。</w:t>
-      </w:r>
-    </w:p>
-    <w:p>
-      <w:pPr>
-        <w:pStyle w:val="Heading1"/>
-        <w:pageBreakBefore/>
-      </w:pPr>
-      <w:r>
-        <w:t>枪口 受击 死亡与音乐</w:t>
-      </w:r>
-    </w:p>
-    <w:p>
-      <w:r>
-        <w:t>WeaponView把不同枪模型的枪口端点转换到世界坐标。Battle.shootPlayer使用该点作为实际射线起点，并朝摄像机准星瞄准位置收敛；眼睛到枪口及射线前方实体墙能遮挡射击。shot事件带muzzle和end，示踪线采用这些三维位置，不从人物中心绘制。</w:t>
-      </w:r>
-    </w:p>
-    <w:p>
-      <w:r>
-        <w:t>载具炮弹从与可见炮管匹配的末端发射；炮管仰角跟随射击方向。IFV与坦克弹体继续真实飞行、重力下落并触发碰撞爆炸。机枪为即时射线，步兵示踪仍是短暂光线，并非全部武器都做逐帧弹体。</w:t>
-      </w:r>
-    </w:p>
-    <w:p>
-      <w:r>
-        <w:t>playerHit立即触发短促红色边缘/画面冲击和方向数字，叠加受伤pitch/roll后逐渐恢复；低血量持续显示暗角。QA修复了后续侧倾赋值覆盖受击与死亡roll的问题。</w:t>
+        <w:t>炮塔逐步追向瞄准方向，限制仰角并按武器配置限制水平范围。射击方向使用炮塔实际角度，而非直接使用玩家镜头方向，弹体从实际炮管端点产生。转到车后方时不能从车尾发射。机枪使用独立机枪模型及自身枪口。</w:t>
       </w:r>
     </w:p>
     <w:tbl>
@@ -1079,7 +324,7 @@
               <w:rPr>
                 <w:sz w:val="18"/>
               </w:rPr>
-              <w:t>时间</w:t>
+              <w:t>座位与操作</w:t>
             </w:r>
           </w:p>
         </w:tc>
@@ -1095,7 +340,7 @@
               <w:rPr>
                 <w:sz w:val="18"/>
               </w:rPr>
-              <w:t>死亡表现</w:t>
+              <w:t>权限</w:t>
             </w:r>
           </w:p>
         </w:tc>
@@ -1113,7 +358,7 @@
               <w:rPr>
                 <w:sz w:val="18"/>
               </w:rPr>
-              <w:t>0 至1.15秒</w:t>
+              <w:t>F1</w:t>
             </w:r>
           </w:p>
         </w:tc>
@@ -1129,7 +374,7 @@
               <w:rPr>
                 <w:sz w:val="18"/>
               </w:rPr>
-              <w:t>视角下降并侧倾倒地，隐藏战斗HUD</w:t>
+              <w:t>驾驶并操纵对应主武器；运输车驾驶位无主炮</w:t>
             </w:r>
           </w:p>
         </w:tc>
@@ -1147,7 +392,7 @@
               <w:rPr>
                 <w:sz w:val="18"/>
               </w:rPr>
-              <w:t>1.15 至2秒</w:t>
+              <w:t>F2</w:t>
             </w:r>
           </w:p>
         </w:tc>
@@ -1163,7 +408,7 @@
               <w:rPr>
                 <w:sz w:val="18"/>
               </w:rPr>
-              <w:t>贴地停留，显示阵亡提示</w:t>
+              <w:t>独立机枪位；驾驶权限仍只属于 F1</w:t>
             </w:r>
           </w:p>
         </w:tc>
@@ -1181,7 +426,7 @@
               <w:rPr>
                 <w:sz w:val="18"/>
               </w:rPr>
-              <w:t>2 至4.8秒</w:t>
+              <w:t>F3 / F4</w:t>
             </w:r>
           </w:p>
         </w:tc>
@@ -1197,7 +442,7 @@
               <w:rPr>
                 <w:sz w:val="18"/>
               </w:rPr>
-              <w:t>镜头向战场中心升高至约525米，朝向俯视</w:t>
+              <w:t>成员位；车型决定实际座位数</w:t>
             </w:r>
           </w:p>
         </w:tc>
@@ -1215,7 +460,7 @@
               <w:rPr>
                 <w:sz w:val="18"/>
               </w:rPr>
-              <w:t>4.8秒后</w:t>
+              <w:t>右键 / V</w:t>
             </w:r>
           </w:p>
         </w:tc>
@@ -1231,7 +476,41 @@
               <w:rPr>
                 <w:sz w:val="18"/>
               </w:rPr>
-              <w:t>淡入战术部署地图，仍检查交战小队与受攻击据点</w:t>
+              <w:t>载具光学瞄具 / 第一与第三人称切换</w:t>
+            </w:r>
+          </w:p>
+        </w:tc>
+      </w:tr>
+      <w:tr>
+        <w:tc>
+          <w:tcPr>
+            <w:tcW w:type="dxa" w:w="4917"/>
+          </w:tcPr>
+          <w:p>
+            <w:pPr>
+              <w:spacing w:after="80"/>
+            </w:pPr>
+            <w:r>
+              <w:rPr>
+                <w:sz w:val="18"/>
+              </w:rPr>
+              <w:t>车辆健康信息</w:t>
+            </w:r>
+          </w:p>
+        </w:tc>
+        <w:tc>
+          <w:tcPr>
+            <w:tcW w:type="dxa" w:w="4917"/>
+          </w:tcPr>
+          <w:p>
+            <w:pPr>
+              <w:spacing w:after="80"/>
+            </w:pPr>
+            <w:r>
+              <w:rPr>
+                <w:sz w:val="18"/>
+              </w:rPr>
+              <w:t>只在可见友军其他车辆上方显示，自己的车辆由 HUD 提供信息</w:t>
             </w:r>
           </w:p>
         </w:tc>
@@ -1240,12 +519,7 @@
     <w:p/>
     <w:p>
       <w:r>
-        <w:t>死亡阶段战局继续运行，控制不产生移动/开火。复活后恢复视角与HUD。地图添加真实建筑轮廓和地形配色。该流程为原型原创镜头，不宣称复刻战地6/三角洲的内部算法；也不包含等待医疗救援的玩家倒地玩法。</w:t>
-      </w:r>
-    </w:p>
-    <w:p>
-      <w:r>
-        <w:t>MusicDirector不再把respawn当成部署开场换歌；按真实战况延续cue。两槽采用4秒等功率交叉淡化，开火/爆炸duck与恢复平滑，主音量0仍立即静音。十一首用户音乐只放本机和私人完整ZIP。</w:t>
+        <w:t>载具受击新增方向提示与冲击反馈，低于约 45% 生命开始冒烟。显示经过视线检查，不能隔墙看到敌方或友方血条。AI 现在会占机枪位并射击，驾驶员与乘员仍计入原军队人数。</w:t>
       </w:r>
     </w:p>
     <w:p>
@@ -1254,7 +528,7 @@
         <w:pageBreakBefore/>
       </w:pPr>
       <w:r>
-        <w:t>自动验证与观察边界</w:t>
+        <w:t>空中 防空与独立装备</w:t>
       </w:r>
     </w:p>
     <w:tbl>
@@ -1280,7 +554,531 @@
               <w:rPr>
                 <w:sz w:val="18"/>
               </w:rPr>
-              <w:t>验证层</w:t>
+              <w:t>载具类型</w:t>
+            </w:r>
+          </w:p>
+        </w:tc>
+        <w:tc>
+          <w:tcPr>
+            <w:tcW w:type="dxa" w:w="4917"/>
+          </w:tcPr>
+          <w:p>
+            <w:pPr>
+              <w:spacing w:after="80"/>
+            </w:pPr>
+            <w:r>
+              <w:rPr>
+                <w:sz w:val="18"/>
+              </w:rPr>
+              <w:t>实际差异</w:t>
+            </w:r>
+          </w:p>
+        </w:tc>
+      </w:tr>
+      <w:tr>
+        <w:tc>
+          <w:tcPr>
+            <w:tcW w:type="dxa" w:w="4917"/>
+          </w:tcPr>
+          <w:p>
+            <w:pPr>
+              <w:spacing w:after="80"/>
+            </w:pPr>
+            <w:r>
+              <w:rPr>
+                <w:sz w:val="18"/>
+              </w:rPr>
+              <w:t>运输车 / 侦察车</w:t>
+            </w:r>
+          </w:p>
+        </w:tc>
+        <w:tc>
+          <w:tcPr>
+            <w:tcW w:type="dxa" w:w="4917"/>
+          </w:tcPr>
+          <w:p>
+            <w:pPr>
+              <w:spacing w:after="80"/>
+            </w:pPr>
+            <w:r>
+              <w:rPr>
+                <w:sz w:val="18"/>
+              </w:rPr>
+              <w:t>运输与轻型机枪；侦察车两席</w:t>
+            </w:r>
+          </w:p>
+        </w:tc>
+      </w:tr>
+      <w:tr>
+        <w:tc>
+          <w:tcPr>
+            <w:tcW w:type="dxa" w:w="4917"/>
+          </w:tcPr>
+          <w:p>
+            <w:pPr>
+              <w:spacing w:after="80"/>
+            </w:pPr>
+            <w:r>
+              <w:rPr>
+                <w:sz w:val="18"/>
+              </w:rPr>
+              <w:t>步战车 / 主战坦克</w:t>
+            </w:r>
+          </w:p>
+        </w:tc>
+        <w:tc>
+          <w:tcPr>
+            <w:tcW w:type="dxa" w:w="4917"/>
+          </w:tcPr>
+          <w:p>
+            <w:pPr>
+              <w:spacing w:after="80"/>
+            </w:pPr>
+            <w:r>
+              <w:rPr>
+                <w:sz w:val="18"/>
+              </w:rPr>
+              <w:t>不同生命、速度、主炮与真实飞行爆炸弹体</w:t>
+            </w:r>
+          </w:p>
+        </w:tc>
+      </w:tr>
+      <w:tr>
+        <w:tc>
+          <w:tcPr>
+            <w:tcW w:type="dxa" w:w="4917"/>
+          </w:tcPr>
+          <w:p>
+            <w:pPr>
+              <w:spacing w:after="80"/>
+            </w:pPr>
+            <w:r>
+              <w:rPr>
+                <w:sz w:val="18"/>
+              </w:rPr>
+              <w:t>防空车</w:t>
+            </w:r>
+          </w:p>
+        </w:tc>
+        <w:tc>
+          <w:tcPr>
+            <w:tcW w:type="dxa" w:w="4917"/>
+          </w:tcPr>
+          <w:p>
+            <w:pPr>
+              <w:spacing w:after="80"/>
+            </w:pPr>
+            <w:r>
+              <w:rPr>
+                <w:sz w:val="18"/>
+              </w:rPr>
+              <w:t>防空武器，针对敌方空中目标</w:t>
+            </w:r>
+          </w:p>
+        </w:tc>
+      </w:tr>
+      <w:tr>
+        <w:tc>
+          <w:tcPr>
+            <w:tcW w:type="dxa" w:w="4917"/>
+          </w:tcPr>
+          <w:p>
+            <w:pPr>
+              <w:spacing w:after="80"/>
+            </w:pPr>
+            <w:r>
+              <w:rPr>
+                <w:sz w:val="18"/>
+              </w:rPr>
+              <w:t>直升机 / 喷气机</w:t>
+            </w:r>
+          </w:p>
+        </w:tc>
+        <w:tc>
+          <w:tcPr>
+            <w:tcW w:type="dxa" w:w="4917"/>
+          </w:tcPr>
+          <w:p>
+            <w:pPr>
+              <w:spacing w:after="80"/>
+            </w:pPr>
+            <w:r>
+              <w:rPr>
+                <w:sz w:val="18"/>
+              </w:rPr>
+              <w:t>可驾驶空中车辆，Space 上升、Ctrl 下降；喷气机单席</w:t>
+            </w:r>
+          </w:p>
+        </w:tc>
+      </w:tr>
+    </w:tbl>
+    <w:p/>
+    <w:p>
+      <w:r>
+        <w:t>默认基地两阵营各停放上述七类载具，共 14 辆。征用菜单扩展为 11 项支援，增加空中与防空选项。地图显示友军车辆及可部署状态；敌军仍按感知规则显示。</w:t>
+      </w:r>
+    </w:p>
+    <w:p>
+      <w:r>
+        <w:t>工程兵增加手持防空武器，B 使用；目标需进入有效视锥、满足距离及敌方空中条件，导弹消耗数量并追踪真实目标。既有反装甲火箭保留。飞行采用易操作的简化模型，未实现气动失速、装甲分区或复杂热焰干扰。</w:t>
+      </w:r>
+    </w:p>
+    <w:p>
+      <w:r>
+        <w:t>EquipmentView 单独建立维修工具、医疗包、弹药箱、信标、破片手雷、烟雾弹、反装甲与防空发射器、座位机枪与载具座舱模型。装备不再套用手枪。3–6 选择装备后左键使用，原有 G/X/Z/B 快捷键保留。烟雾继续遮挡 AI 与玩家感知视线。</w:t>
+      </w:r>
+    </w:p>
+    <w:p>
+      <w:r>
+        <w:t>放宽 AI 上车规模并允许同车机枪手。驾驶员上限按队伍规模控制，避免小战局把步兵全部抽走。烟雾、飞行和新增装备不替换原来的据点与小队状态机。</w:t>
+      </w:r>
+    </w:p>
+    <w:p>
+      <w:pPr>
+        <w:pStyle w:val="Heading1"/>
+        <w:pageBreakBefore/>
+      </w:pPr>
+      <w:r>
+        <w:t>房间 权威同步与房主设置</w:t>
+      </w:r>
+    </w:p>
+    <w:p>
+      <w:r>
+        <w:t>服务器提供 HTTP 页面、房间创建接口和 WebSocket。运行 npm run lan 编译共享逻辑、构建页面并启动服务；其他电脑访问房主局域网 IP 的 8787 端口，输入房间码加入。主机同时可以用浏览器作为房主玩家。</w:t>
+      </w:r>
+    </w:p>
+    <w:tbl>
+      <w:tblPr>
+        <w:tblStyle w:val="TableGrid"/>
+        <w:tblW w:type="auto" w:w="0"/>
+        <w:tblLook w:firstColumn="1" w:firstRow="1" w:lastColumn="0" w:lastRow="0" w:noHBand="0" w:noVBand="1" w:val="04A0"/>
+      </w:tblPr>
+      <w:tblGrid>
+        <w:gridCol w:w="4917"/>
+        <w:gridCol w:w="4917"/>
+      </w:tblGrid>
+      <w:tr>
+        <w:tc>
+          <w:tcPr>
+            <w:tcW w:type="dxa" w:w="4917"/>
+          </w:tcPr>
+          <w:p>
+            <w:pPr>
+              <w:spacing w:after="80"/>
+            </w:pPr>
+            <w:r>
+              <w:rPr>
+                <w:sz w:val="18"/>
+              </w:rPr>
+              <w:t>开房前选项</w:t>
+            </w:r>
+          </w:p>
+        </w:tc>
+        <w:tc>
+          <w:tcPr>
+            <w:tcW w:type="dxa" w:w="4917"/>
+          </w:tcPr>
+          <w:p>
+            <w:pPr>
+              <w:spacing w:after="80"/>
+            </w:pPr>
+            <w:r>
+              <w:rPr>
+                <w:sz w:val="18"/>
+              </w:rPr>
+              <w:t>作用</w:t>
+            </w:r>
+          </w:p>
+        </w:tc>
+      </w:tr>
+      <w:tr>
+        <w:tc>
+          <w:tcPr>
+            <w:tcW w:type="dxa" w:w="4917"/>
+          </w:tcPr>
+          <w:p>
+            <w:pPr>
+              <w:spacing w:after="80"/>
+            </w:pPr>
+            <w:r>
+              <w:rPr>
+                <w:sz w:val="18"/>
+              </w:rPr>
+              <w:t>AI 开关与队伍规模</w:t>
+            </w:r>
+          </w:p>
+        </w:tc>
+        <w:tc>
+          <w:tcPr>
+            <w:tcW w:type="dxa" w:w="4917"/>
+          </w:tcPr>
+          <w:p>
+            <w:pPr>
+              <w:spacing w:after="80"/>
+            </w:pPr>
+            <w:r>
+              <w:rPr>
+                <w:sz w:val="18"/>
+              </w:rPr>
+              <w:t>允许原有大战场，也允许关闭 AI 的纯真人对战</w:t>
+            </w:r>
+          </w:p>
+        </w:tc>
+      </w:tr>
+      <w:tr>
+        <w:tc>
+          <w:tcPr>
+            <w:tcW w:type="dxa" w:w="4917"/>
+          </w:tcPr>
+          <w:p>
+            <w:pPr>
+              <w:spacing w:after="80"/>
+            </w:pPr>
+            <w:r>
+              <w:rPr>
+                <w:sz w:val="18"/>
+              </w:rPr>
+              <w:t>模式 票数 难度 击杀罚票</w:t>
+            </w:r>
+          </w:p>
+        </w:tc>
+        <w:tc>
+          <w:tcPr>
+            <w:tcW w:type="dxa" w:w="4917"/>
+          </w:tcPr>
+          <w:p>
+            <w:pPr>
+              <w:spacing w:after="80"/>
+            </w:pPr>
+            <w:r>
+              <w:rPr>
+                <w:sz w:val="18"/>
+              </w:rPr>
+              <w:t>传入真实 Battle 状态</w:t>
+            </w:r>
+          </w:p>
+        </w:tc>
+      </w:tr>
+      <w:tr>
+        <w:tc>
+          <w:tcPr>
+            <w:tcW w:type="dxa" w:w="4917"/>
+          </w:tcPr>
+          <w:p>
+            <w:pPr>
+              <w:spacing w:after="80"/>
+            </w:pPr>
+            <w:r>
+              <w:rPr>
+                <w:sz w:val="18"/>
+              </w:rPr>
+              <w:t>加入阵营策略</w:t>
+            </w:r>
+          </w:p>
+        </w:tc>
+        <w:tc>
+          <w:tcPr>
+            <w:tcW w:type="dxa" w:w="4917"/>
+          </w:tcPr>
+          <w:p>
+            <w:pPr>
+              <w:spacing w:after="80"/>
+            </w:pPr>
+            <w:r>
+              <w:rPr>
+                <w:sz w:val="18"/>
+              </w:rPr>
+              <w:t>己方、对方或交替分配</w:t>
+            </w:r>
+          </w:p>
+        </w:tc>
+      </w:tr>
+      <w:tr>
+        <w:tc>
+          <w:tcPr>
+            <w:tcW w:type="dxa" w:w="4917"/>
+          </w:tcPr>
+          <w:p>
+            <w:pPr>
+              <w:spacing w:after="80"/>
+            </w:pPr>
+            <w:r>
+              <w:rPr>
+                <w:sz w:val="18"/>
+              </w:rPr>
+              <w:t>房主阵营管理</w:t>
+            </w:r>
+          </w:p>
+        </w:tc>
+        <w:tc>
+          <w:tcPr>
+            <w:tcW w:type="dxa" w:w="4917"/>
+          </w:tcPr>
+          <w:p>
+            <w:pPr>
+              <w:spacing w:after="80"/>
+            </w:pPr>
+            <w:r>
+              <w:rPr>
+                <w:sz w:val="18"/>
+              </w:rPr>
+              <w:t>房主在暂停菜单调整加入者阵营；服务器验证房主身份</w:t>
+            </w:r>
+          </w:p>
+        </w:tc>
+      </w:tr>
+      <w:tr>
+        <w:tc>
+          <w:tcPr>
+            <w:tcW w:type="dxa" w:w="4917"/>
+          </w:tcPr>
+          <w:p>
+            <w:pPr>
+              <w:spacing w:after="80"/>
+            </w:pPr>
+            <w:r>
+              <w:rPr>
+                <w:sz w:val="18"/>
+              </w:rPr>
+              <w:t>人数上限</w:t>
+            </w:r>
+          </w:p>
+        </w:tc>
+        <w:tc>
+          <w:tcPr>
+            <w:tcW w:type="dxa" w:w="4917"/>
+          </w:tcPr>
+          <w:p>
+            <w:pPr>
+              <w:spacing w:after="80"/>
+            </w:pPr>
+            <w:r>
+              <w:rPr>
+                <w:sz w:val="18"/>
+              </w:rPr>
+              <w:t>包括房主最多八人，第九名实际拒绝</w:t>
+            </w:r>
+          </w:p>
+        </w:tc>
+      </w:tr>
+    </w:tbl>
+    <w:p/>
+    <w:p>
+      <w:r>
+        <w:t>房主令牌由服务器随机生成，仅房间创建者获得。非房主发送阵营变更请求无效。消息限制每帧大小与发送频率，控制输入校验数值和范围，超过 250 毫秒未收到新输入停止移动。</w:t>
+      </w:r>
+    </w:p>
+    <w:p>
+      <w:r>
+        <w:t>服务器 20Hz 运行共享模拟，客户端不独立推进另一场战争。每名真人拥有独立弹药、装备、复活与征用积分状态；射击、受击事件只给正确玩家。死亡和安全部署均由服务器复核。断线时 AI 开启则恢复 AI 接管，关闭 AI 则移除该真人单位。</w:t>
+      </w:r>
+    </w:p>
+    <w:p>
+      <w:r>
+        <w:t>此为局域网工具：没有公网匹配、自动发现、掉线重连、客户端预测或完整反作弊。房间内暂停只停止本人的操作，整个战局继续。当前 LAN 的跳跃与滑铲视觉表现也未达到单机完整程度。</w:t>
+      </w:r>
+    </w:p>
+    <w:p>
+      <w:pPr>
+        <w:pStyle w:val="Heading1"/>
+        <w:pageBreakBefore/>
+      </w:pPr>
+      <w:r>
+        <w:t>四人小队 双阵营与载具部署</w:t>
+      </w:r>
+    </w:p>
+    <w:p>
+      <w:r>
+        <w:t>小队最多四个成员，真人加入替换原队伍中可用 AI 单位，其余位置由 AI 填充。AI 关闭时只显示实际真人，不显示死亡的占位 AI。蓝方和红方均有对应基地、友军据点、队友、载具与装备作用阵营，允许房主移至对方实现 1v1。</w:t>
+      </w:r>
+    </w:p>
+    <w:p>
+      <w:r>
+        <w:t>小队部署只因实际近期射击/受伤、死亡或当前坐在车里而锁定，单纯进入警戒状态或附近有人不再直接禁止。部署界面显示状态，并在点击时重新验证，避免选择后目标开始交火却仍可复活。</w:t>
+      </w:r>
+    </w:p>
+    <w:p>
+      <w:r>
+        <w:t>己方据点即使正在被攻击也可选择，落点向外围约 42–82 米寻找可行位置；正常状态使用较近落点。系统检查地形、遮挡和危险状态，不直接把玩家放进敌军中心。基地与阵营判断不再固定为蓝方。</w:t>
+      </w:r>
+    </w:p>
+    <w:p>
+      <w:r>
+        <w:t>可部署到友军载具的实际空席：驾驶、副驾驶机枪或成员位；满员、击毁、空投未落地、近期交火的车不能部署。驾驶位若为另一玩家征用保留，也不能绕过保留规则。UI 按车辆与座位建立条目，服务器再次检查目标和空席，避免同时抢占。</w:t>
+      </w:r>
+    </w:p>
+    <w:p>
+      <w:r>
+        <w:t>暂停菜单增加脱离卡死：寻找最近可安全到达的友军据点或基地位置，20 秒冷却，不免费补血、补弹或返还票数。单机暂停后 Esc 返回战斗；Pointer Lock 的退出事件增加短暂保护，避免立即又暂停。</w:t>
+      </w:r>
+    </w:p>
+    <w:p>
+      <w:pPr>
+        <w:pStyle w:val="Heading1"/>
+        <w:pageBreakBefore/>
+      </w:pPr>
+      <w:r>
+        <w:t>方块人物 UI 音乐与积分</w:t>
+      </w:r>
+    </w:p>
+    <w:p>
+      <w:r>
+        <w:t>按用户最新要求，玩家与 AI 改为原创方块人物：立方头部、眼睛像素、方块躯干四肢、装备轮廓。蓝红衣服区分阵营，真人增加金色胸章。采用实例化绘制，运行时阵营变更能够更新颜色与标记；友军近距 IFF 仍受视线检查。</w:t>
+      </w:r>
+    </w:p>
+    <w:p>
+      <w:r>
+        <w:t>菜单使用实际 Three.js 操作者与武器预览；战斗 HUD 顶部票数和据点、左下地图和四人小队、右下弹药与装备、中央捕获百分比及积分提示。减少圆角亮面和装饰，避免装备栏与血量、票数与目标的叠压。</w:t>
+      </w:r>
+    </w:p>
+    <w:p>
+      <w:r>
+        <w:t>OST 混音增益提高到原来的 1.65 倍，新默认音乐音量为 0.76。只迁移旧默认值一次，保留用户主动设定与静音。战斗 duck、暂停 duck 和恢复继续平滑，不在死亡瞬间突然切换到开场曲；既有交叉淡化保留。</w:t>
+      </w:r>
+    </w:p>
+    <w:p>
+      <w:r>
+        <w:t>积分除击杀、助攻、占点、防守、载具击毁等已有机制外，补齐真实医疗、维修与小队部署奖励，联机奖励归属对应玩家。征用仍真实扣分、生成效果与车辆，不是菜单动画。</w:t>
+      </w:r>
+    </w:p>
+    <w:p>
+      <w:r>
+        <w:t>29 个采样音效在浏览器实际解码，十一首本地 MP3 播放进度与 cue 切换检查通过。技术测试不能替代耳机人工听感验收。CC0 音效可公开，用户音乐保持私人范围，来源与导入清单随公开源码保存。</w:t>
+      </w:r>
+    </w:p>
+    <w:p>
+      <w:pPr>
+        <w:pStyle w:val="Heading1"/>
+        <w:pageBreakBefore/>
+      </w:pPr>
+      <w:r>
+        <w:t>验证证据 与观察边界</w:t>
+      </w:r>
+    </w:p>
+    <w:tbl>
+      <w:tblPr>
+        <w:tblStyle w:val="TableGrid"/>
+        <w:tblW w:type="auto" w:w="0"/>
+        <w:tblLook w:firstColumn="1" w:firstRow="1" w:lastColumn="0" w:lastRow="0" w:noHBand="0" w:noVBand="1" w:val="04A0"/>
+      </w:tblPr>
+      <w:tblGrid>
+        <w:gridCol w:w="4917"/>
+        <w:gridCol w:w="4917"/>
+      </w:tblGrid>
+      <w:tr>
+        <w:tc>
+          <w:tcPr>
+            <w:tcW w:type="dxa" w:w="4917"/>
+          </w:tcPr>
+          <w:p>
+            <w:pPr>
+              <w:spacing w:after="80"/>
+            </w:pPr>
+            <w:r>
+              <w:rPr>
+                <w:sz w:val="18"/>
+              </w:rPr>
+              <w:t>检查</w:t>
             </w:r>
           </w:p>
         </w:tc>
@@ -1314,7 +1112,7 @@
               <w:rPr>
                 <w:sz w:val="18"/>
               </w:rPr>
-              <w:t>strict TypeScript</w:t>
+              <w:t>TypeScript / 生产构建</w:t>
             </w:r>
           </w:p>
         </w:tc>
@@ -1330,7 +1128,7 @@
               <w:rPr>
                 <w:sz w:val="18"/>
               </w:rPr>
-              <w:t>PASS</w:t>
+              <w:t>PASS；Three.js chunk 体积警告仍保留</w:t>
             </w:r>
           </w:p>
         </w:tc>
@@ -1364,75 +1162,7 @@
               <w:rPr>
                 <w:sz w:val="18"/>
               </w:rPr>
-              <w:t>46项全部通过</w:t>
-            </w:r>
-          </w:p>
-        </w:tc>
-      </w:tr>
-      <w:tr>
-        <w:tc>
-          <w:tcPr>
-            <w:tcW w:type="dxa" w:w="4917"/>
-          </w:tcPr>
-          <w:p>
-            <w:pPr>
-              <w:spacing w:after="80"/>
-            </w:pPr>
-            <w:r>
-              <w:rPr>
-                <w:sz w:val="18"/>
-              </w:rPr>
-              <w:t>独立核心逻辑</w:t>
-            </w:r>
-          </w:p>
-        </w:tc>
-        <w:tc>
-          <w:tcPr>
-            <w:tcW w:type="dxa" w:w="4917"/>
-          </w:tcPr>
-          <w:p>
-            <w:pPr>
-              <w:spacing w:after="80"/>
-            </w:pPr>
-            <w:r>
-              <w:rPr>
-                <w:sz w:val="18"/>
-              </w:rPr>
-              <w:t>8/16/32/64战局及默认500票通过</w:t>
-            </w:r>
-          </w:p>
-        </w:tc>
-      </w:tr>
-      <w:tr>
-        <w:tc>
-          <w:tcPr>
-            <w:tcW w:type="dxa" w:w="4917"/>
-          </w:tcPr>
-          <w:p>
-            <w:pPr>
-              <w:spacing w:after="80"/>
-            </w:pPr>
-            <w:r>
-              <w:rPr>
-                <w:sz w:val="18"/>
-              </w:rPr>
-              <w:t>Vite build</w:t>
-            </w:r>
-          </w:p>
-        </w:tc>
-        <w:tc>
-          <w:tcPr>
-            <w:tcW w:type="dxa" w:w="4917"/>
-          </w:tcPr>
-          <w:p>
-            <w:pPr>
-              <w:spacing w:after="80"/>
-            </w:pPr>
-            <w:r>
-              <w:rPr>
-                <w:sz w:val="18"/>
-              </w:rPr>
-              <w:t>PASS，Three.js chunk体积警告保留</w:t>
+              <w:t>6 个文件，60 / 60 通过</w:t>
             </w:r>
           </w:p>
         </w:tc>
@@ -1466,7 +1196,7 @@
               <w:rPr>
                 <w:sz w:val="18"/>
               </w:rPr>
-              <w:t>13项全部通过</w:t>
+              <w:t>17 / 17 通过，含两个浏览器联机与实际座位部署</w:t>
             </w:r>
           </w:p>
         </w:tc>
@@ -1484,7 +1214,7 @@
               <w:rPr>
                 <w:sz w:val="18"/>
               </w:rPr>
-              <w:t>音频</w:t>
+              <w:t>LAN 真实客户端</w:t>
             </w:r>
           </w:p>
         </w:tc>
@@ -1500,188 +1230,7 @@
               <w:rPr>
                 <w:sz w:val="18"/>
               </w:rPr>
-              <w:t>29采样解码，MP3进度、静音、结果cue及缺失资源通过</w:t>
-            </w:r>
-          </w:p>
-        </w:tc>
-      </w:tr>
-    </w:tbl>
-    <w:p/>
-    <w:p>
-      <w:r>
-        <w:t>默认征服32v32、500票、玩家不操作：514.5秒，红军胜，蓝0票、红255.41票。占点归属变化33次，阵亡338，复活335，步兵射击7648，载具射击1624。车辆击毁28、重生24；大事件5次、炮击落点4。三类大事件全出现，反攻侧翼/集中与装甲协同断言通过，导航失败0。</w:t>
-      </w:r>
-    </w:p>
-    <w:p>
-      <w:r>
-        <w:t>前线推进32v32、500票、seed505：1162秒，蓝军打通5/5区域，归属变化10次，阵亡536，步兵射击18310，导航失败0。该单种子结果验证完整流程，不表示双方平衡已验收。</w:t>
-      </w:r>
-    </w:p>
-    <w:p>
-      <w:r>
-        <w:t>Chrome headless 32v32短时8点：29.98至30.01FPS，689次draw，DPR1。此前0.8同机采样也有约30/60帧波动。本轮不把这一短时结果解释为用户设备持续FPS承诺。</w:t>
-      </w:r>
-    </w:p>
-    <w:p>
-      <w:r>
-        <w:t>新回归确认空车停驶、真实AI驾驶员、接管安全下车、空中拒绝登车、落地50秒后AI仍不抢专属车辆、军队人数不膨胀、实体炮弹坐标与炮管匹配。浏览器确认死亡先倒地后升空再地图、模型枪口事件、即时受击红边，并继承配装与安全部署测试。</w:t>
-      </w:r>
-    </w:p>
-    <w:p>
-      <w:r>
-        <w:t>原始输出保存在docs/qa/check-090.txt、browser-090.txt与breakthrough-090.json，汇总为QA_RESULTS.json。网络和现有依赖可用，本轮实际运行生产build，没有将未验证构建写成通过。</w:t>
-      </w:r>
-    </w:p>
-    <w:p>
-      <w:pPr>
-        <w:pStyle w:val="Heading1"/>
-        <w:pageBreakBefore/>
-      </w:pPr>
-      <w:r>
-        <w:t>实际画面与尚存限制</w:t>
-      </w:r>
-    </w:p>
-    <w:p>
-      <w:r>
-        <w:drawing>
-          <wp:inline xmlns:a="http://schemas.openxmlformats.org/drawingml/2006/main" xmlns:pic="http://schemas.openxmlformats.org/drawingml/2006/picture">
-            <wp:extent cx="5943600" cy="3343275"/>
-            <wp:docPr id="1" name="Picture 1"/>
-            <wp:cNvGraphicFramePr>
-              <a:graphicFrameLocks noChangeAspect="1"/>
-            </wp:cNvGraphicFramePr>
-            <a:graphic>
-              <a:graphicData uri="http://schemas.openxmlformats.org/drawingml/2006/picture">
-                <pic:pic>
-                  <pic:nvPicPr>
-                    <pic:cNvPr id="0" name="injury-090.png"/>
-                    <pic:cNvPicPr/>
-                  </pic:nvPicPr>
-                  <pic:blipFill>
-                    <a:blip r:embed="rId11"/>
-                    <a:stretch>
-                      <a:fillRect/>
-                    </a:stretch>
-                  </pic:blipFill>
-                  <pic:spPr>
-                    <a:xfrm>
-                      <a:off x="0" y="0"/>
-                      <a:ext cx="5943600" cy="3343275"/>
-                    </a:xfrm>
-                    <a:prstGeom prst="rect"/>
-                  </pic:spPr>
-                </pic:pic>
-              </a:graphicData>
-            </a:graphic>
-          </wp:inline>
-        </w:drawing>
-      </w:r>
-    </w:p>
-    <w:p>
-      <w:r>
-        <w:t>真实32HP受击截图 可见红边与方向数字</w:t>
-      </w:r>
-    </w:p>
-    <w:p>
-      <w:r>
-        <w:drawing>
-          <wp:inline xmlns:a="http://schemas.openxmlformats.org/drawingml/2006/main" xmlns:pic="http://schemas.openxmlformats.org/drawingml/2006/picture">
-            <wp:extent cx="5943600" cy="3343275"/>
-            <wp:docPr id="2" name="Picture 2"/>
-            <wp:cNvGraphicFramePr>
-              <a:graphicFrameLocks noChangeAspect="1"/>
-            </wp:cNvGraphicFramePr>
-            <a:graphic>
-              <a:graphicData uri="http://schemas.openxmlformats.org/drawingml/2006/picture">
-                <pic:pic>
-                  <pic:nvPicPr>
-                    <pic:cNvPr id="0" name="deployment-090.png"/>
-                    <pic:cNvPicPr/>
-                  </pic:nvPicPr>
-                  <pic:blipFill>
-                    <a:blip r:embed="rId12"/>
-                    <a:stretch>
-                      <a:fillRect/>
-                    </a:stretch>
-                  </pic:blipFill>
-                  <pic:spPr>
-                    <a:xfrm>
-                      <a:off x="0" y="0"/>
-                      <a:ext cx="5943600" cy="3343275"/>
-                    </a:xfrm>
-                    <a:prstGeom prst="rect"/>
-                  </pic:spPr>
-                </pic:pic>
-              </a:graphicData>
-            </a:graphic>
-          </wp:inline>
-        </w:drawing>
-      </w:r>
-    </w:p>
-    <w:p>
-      <w:r>
-        <w:t>死亡镜头升空后部署 地图保留安全与禁用标记</w:t>
-      </w:r>
-    </w:p>
-    <w:p>
-      <w:r>
-        <w:t>当前地图、人物与枪械仍为程序化几何，尚未达到用户提供参考图的写实资源质量。图中表现只证明实际原型功能，不作与商业游戏画质相当的承诺。</w:t>
-      </w:r>
-    </w:p>
-    <w:p>
-      <w:pPr>
-        <w:pStyle w:val="Heading1"/>
-        <w:pageBreakBefore/>
-      </w:pPr>
-      <w:r>
-        <w:t>交付 使用与维护</w:t>
-      </w:r>
-    </w:p>
-    <w:p>
-      <w:r>
-        <w:t>本轮详细说明写入docs/DEVELOPMENT_REPORT.docx，并上传Main。README、PROGRESS、CHANGELOG与QA_REPORT同时更新；新版本为0.9.0。公开源码包只含代码、CC0音效、构建文件和音乐导入清单；本机完整包额外含十一首用户MP3。</w:t>
-      </w:r>
-    </w:p>
-    <w:tbl>
-      <w:tblPr>
-        <w:tblStyle w:val="TableGrid"/>
-        <w:tblW w:type="auto" w:w="0"/>
-        <w:tblLook w:firstColumn="1" w:firstRow="1" w:lastColumn="0" w:lastRow="0" w:noHBand="0" w:noVBand="1" w:val="04A0"/>
-      </w:tblPr>
-      <w:tblGrid>
-        <w:gridCol w:w="4917"/>
-        <w:gridCol w:w="4917"/>
-      </w:tblGrid>
-      <w:tr>
-        <w:tc>
-          <w:tcPr>
-            <w:tcW w:type="dxa" w:w="4917"/>
-          </w:tcPr>
-          <w:p>
-            <w:pPr>
-              <w:spacing w:after="80"/>
-            </w:pPr>
-            <w:r>
-              <w:rPr>
-                <w:sz w:val="18"/>
-              </w:rPr>
-              <w:t>交付物</w:t>
-            </w:r>
-          </w:p>
-        </w:tc>
-        <w:tc>
-          <w:tcPr>
-            <w:tcW w:type="dxa" w:w="4917"/>
-          </w:tcPr>
-          <w:p>
-            <w:pPr>
-              <w:spacing w:after="80"/>
-            </w:pPr>
-            <w:r>
-              <w:rPr>
-                <w:sz w:val="18"/>
-              </w:rPr>
-              <w:t>用途</w:t>
+              <w:t>权威移动、独立弹药、超时停止、房主权限、AI-off 1v1、八人容量与断线通过</w:t>
             </w:r>
           </w:p>
         </w:tc>
@@ -1699,7 +1248,7 @@
               <w:rPr>
                 <w:sz w:val="18"/>
               </w:rPr>
-              <w:t>IRONFRONT_v0.9.0_FULL_LOCAL.zip</w:t>
+              <w:t>核心模拟</w:t>
             </w:r>
           </w:p>
         </w:tc>
@@ -1715,109 +1264,7 @@
               <w:rPr>
                 <w:sz w:val="18"/>
               </w:rPr>
-              <w:t>本机私人完整源码和dist，包含用户音乐</w:t>
-            </w:r>
-          </w:p>
-        </w:tc>
-      </w:tr>
-      <w:tr>
-        <w:tc>
-          <w:tcPr>
-            <w:tcW w:type="dxa" w:w="4917"/>
-          </w:tcPr>
-          <w:p>
-            <w:pPr>
-              <w:spacing w:after="80"/>
-            </w:pPr>
-            <w:r>
-              <w:rPr>
-                <w:sz w:val="18"/>
-              </w:rPr>
-              <w:t>IRONFRONT_v0.9.0_SOURCE.zip</w:t>
-            </w:r>
-          </w:p>
-        </w:tc>
-        <w:tc>
-          <w:tcPr>
-            <w:tcW w:type="dxa" w:w="4917"/>
-          </w:tcPr>
-          <w:p>
-            <w:pPr>
-              <w:spacing w:after="80"/>
-            </w:pPr>
-            <w:r>
-              <w:rPr>
-                <w:sz w:val="18"/>
-              </w:rPr>
-              <w:t>公开源码和dist，不含用户MP3</w:t>
-            </w:r>
-          </w:p>
-        </w:tc>
-      </w:tr>
-      <w:tr>
-        <w:tc>
-          <w:tcPr>
-            <w:tcW w:type="dxa" w:w="4917"/>
-          </w:tcPr>
-          <w:p>
-            <w:pPr>
-              <w:spacing w:after="80"/>
-            </w:pPr>
-            <w:r>
-              <w:rPr>
-                <w:sz w:val="18"/>
-              </w:rPr>
-              <w:t>IRONFRONT_v0.9.0_Development_Report.docx</w:t>
-            </w:r>
-          </w:p>
-        </w:tc>
-        <w:tc>
-          <w:tcPr>
-            <w:tcW w:type="dxa" w:w="4917"/>
-          </w:tcPr>
-          <w:p>
-            <w:pPr>
-              <w:spacing w:after="80"/>
-            </w:pPr>
-            <w:r>
-              <w:rPr>
-                <w:sz w:val="18"/>
-              </w:rPr>
-              <w:t>本轮详细开发说明</w:t>
-            </w:r>
-          </w:p>
-        </w:tc>
-      </w:tr>
-      <w:tr>
-        <w:tc>
-          <w:tcPr>
-            <w:tcW w:type="dxa" w:w="4917"/>
-          </w:tcPr>
-          <w:p>
-            <w:pPr>
-              <w:spacing w:after="80"/>
-            </w:pPr>
-            <w:r>
-              <w:rPr>
-                <w:sz w:val="18"/>
-              </w:rPr>
-              <w:t>QA_RESULTS.json 与 docs/qa</w:t>
-            </w:r>
-          </w:p>
-        </w:tc>
-        <w:tc>
-          <w:tcPr>
-            <w:tcW w:type="dxa" w:w="4917"/>
-          </w:tcPr>
-          <w:p>
-            <w:pPr>
-              <w:spacing w:after="80"/>
-            </w:pPr>
-            <w:r>
-              <w:rPr>
-                <w:sz w:val="18"/>
-              </w:rPr>
-              <w:t>机器结果和原始验证证据</w:t>
+              <w:t>8 / 16 / 32 / 64 规模、32v32 默认完整战局通过</w:t>
             </w:r>
           </w:p>
         </w:tc>
@@ -1826,29 +1273,135 @@
     <w:p/>
     <w:p>
       <w:r>
-        <w:t>启动：npm install，npm run dev，浏览器打开终端显示的本地地址。不要直接双击dist/index.html；生产包应通过HTTP服务。现有依赖可用时执行npm run check；完整浏览器检查执行npm run test:browser，并提供本机Chrome路径环境变量。</w:t>
+        <w:t>默认征服：32v32、500票、玩家闲置；275.75 模拟秒，红方胜，蓝 0 : 红 363.89。占点变化 21、阵亡 317、复活 309、步兵射击 1405、载具射击 3553、车辆击毁/重生 30/27。</w:t>
       </w:r>
     </w:p>
     <w:p>
       <w:r>
-        <w:t>按键：WASD横移与移动，Shift点按滑铲/按住冲刺，右键ADS，左键开火，R换弹，1/2切枪，G投掷，X兵种工具，工程兵Z发射火箭，Q积分支援，E上下车，F1–F4座位，M地图，Tab计分，Esc暂停。</w:t>
+        <w:t>大事件 3 次，炮击落点 4；炮击、反攻、装甲突击三类均出现，反攻侧翼与装甲协同断言通过。导航失败 0。</w:t>
       </w:r>
     </w:p>
     <w:p>
       <w:r>
-        <w:t>参考来源见REFERENCES_090.md：EA说明支持对未交战队友部署，Battlefield V资料支持死亡后选择小队摄像机或部署概览；Delta Force官方地图用于视觉布局参考。Epic摄像机震动资料与GDC的HUD/声音沟通讨论用于反馈设计。具体镜头参数与界面实现为项目原创。</w:t>
+        <w:t>前线推进 seed505：1559.125 模拟秒，红方防守胜，完成 3/5 区域、阵亡 769、射击 20507、导航失败 0。单种子结果验证流程，不证明战场平衡。</w:t>
       </w:r>
     </w:p>
     <w:p>
       <w:r>
-        <w:t>下一阶段尚待实际开发：写实资源、玩家可救援倒地、AI同车乘员协作、装甲分区及更多地图。此次交付不把这些未完成事项标记成通过。用户MP3不上传GitHub，继续遵循已确认的分发范围。</w:t>
+        <w:t>32v32 headless 短时八点采样：59.98–60.03 FPS，769 draw calls，DPR 1。没有完成八台实体电脑跨机压力测试或持续实玩 FPS 验收。</w:t>
+      </w:r>
+    </w:p>
+    <w:p>
+      <w:r>
+        <w:t>本轮 QA 实际纠正网络测试启动失败误返回成功、阵营硬编码、客户端弹药串用、房主权限与满房边界、旧部署断言、暂停事件重入、HUD 叠压与运行时方块阵营更新。最终原始输出见 docs/qa/check-010.txt、browser-010.txt、breakthrough-010.json 和 QA_RESULTS.json。</w:t>
+      </w:r>
+    </w:p>
+    <w:p>
+      <w:pPr>
+        <w:pStyle w:val="Heading1"/>
+        <w:pageBreakBefore/>
+      </w:pPr>
+      <w:r>
+        <w:t>实际截图与交付使用</w:t>
+      </w:r>
+    </w:p>
+    <w:p>
+      <w:r>
+        <w:drawing>
+          <wp:inline xmlns:a="http://schemas.openxmlformats.org/drawingml/2006/main" xmlns:pic="http://schemas.openxmlformats.org/drawingml/2006/picture">
+            <wp:extent cx="5029200" cy="2828925"/>
+            <wp:docPr id="1" name="Picture 1"/>
+            <wp:cNvGraphicFramePr>
+              <a:graphicFrameLocks noChangeAspect="1"/>
+            </wp:cNvGraphicFramePr>
+            <a:graphic>
+              <a:graphicData uri="http://schemas.openxmlformats.org/drawingml/2006/picture">
+                <pic:pic>
+                  <pic:nvPicPr>
+                    <pic:cNvPr id="0" name="block-factions-010.png"/>
+                    <pic:cNvPicPr/>
+                  </pic:nvPicPr>
+                  <pic:blipFill>
+                    <a:blip r:embed="rId11"/>
+                    <a:stretch>
+                      <a:fillRect/>
+                    </a:stretch>
+                  </pic:blipFill>
+                  <pic:spPr>
+                    <a:xfrm>
+                      <a:off x="0" y="0"/>
+                      <a:ext cx="5029200" cy="2828925"/>
+                    </a:xfrm>
+                    <a:prstGeom prst="rect"/>
+                  </pic:spPr>
+                </pic:pic>
+              </a:graphicData>
+            </a:graphic>
+          </wp:inline>
+        </w:drawing>
+      </w:r>
+    </w:p>
+    <w:p>
+      <w:r>
+        <w:t>浏览器实拍：蓝红方块外观与真人标记</w:t>
+      </w:r>
+    </w:p>
+    <w:p>
+      <w:r>
+        <w:drawing>
+          <wp:inline xmlns:a="http://schemas.openxmlformats.org/drawingml/2006/main" xmlns:pic="http://schemas.openxmlformats.org/drawingml/2006/picture">
+            <wp:extent cx="5029200" cy="2828925"/>
+            <wp:docPr id="2" name="Picture 2"/>
+            <wp:cNvGraphicFramePr>
+              <a:graphicFrameLocks noChangeAspect="1"/>
+            </wp:cNvGraphicFramePr>
+            <a:graphic>
+              <a:graphicData uri="http://schemas.openxmlformats.org/drawingml/2006/picture">
+                <pic:pic>
+                  <pic:nvPicPr>
+                    <pic:cNvPr id="0" name="host-factions-010.png"/>
+                    <pic:cNvPicPr/>
+                  </pic:nvPicPr>
+                  <pic:blipFill>
+                    <a:blip r:embed="rId12"/>
+                    <a:stretch>
+                      <a:fillRect/>
+                    </a:stretch>
+                  </pic:blipFill>
+                  <pic:spPr>
+                    <a:xfrm>
+                      <a:off x="0" y="0"/>
+                      <a:ext cx="5029200" cy="2828925"/>
+                    </a:xfrm>
+                    <a:prstGeom prst="rect"/>
+                  </pic:spPr>
+                </pic:pic>
+              </a:graphicData>
+            </a:graphic>
+          </wp:inline>
+        </w:drawing>
+      </w:r>
+    </w:p>
+    <w:p>
+      <w:r>
+        <w:t>浏览器实拍：房主阵营管理与小队信息</w:t>
+      </w:r>
+    </w:p>
+    <w:p>
+      <w:r>
+        <w:t>单机：npm install 后 npm run dev。局域网：npm run lan，浏览器访问房主 IP:8787；房主先创建并设定房间，其他人输入房间码。已有构建时可使用 npm run lan:serve。验证：npm run check；浏览器验证 npm run test:browser，按本机 Chrome 路径设置 IRONFRONT_CHROME_PATH。</w:t>
+      </w:r>
+    </w:p>
+    <w:p>
+      <w:r>
+        <w:t>交付：私人完整 ZIP 含源码、dist 与十一首音乐；公开源码 ZIP 不含用户 MP3。README、PROGRESS、CHANGELOG、QA_REPORT 与本 DOCX 更新到 Main。更多截图及详细控制表在仓库 docs 和 README。当前限制为简化飞行、原创程序化资源、LAN 原型及无新增地图；参考出处见 REFERENCES_010.md。</w:t>
       </w:r>
     </w:p>
     <w:sectPr>
       <w:headerReference w:type="default" r:id="rId9"/>
       <w:footerReference w:type="default" r:id="rId10"/>
       <w:pgSz w:w="11909" w:h="16834"/>
-      <w:pgMar w:top="979" w:right="1037" w:bottom="936" w:left="1037" w:header="720" w:footer="720" w:gutter="0"/>
+      <w:pgMar w:top="1008" w:right="1037" w:bottom="1008" w:left="1037" w:header="720" w:footer="720" w:gutter="0"/>
       <w:cols w:space="720"/>
       <w:docGrid w:linePitch="360"/>
     </w:sectPr>
@@ -1864,7 +1417,7 @@
       <w:jc w:val="right"/>
     </w:pPr>
     <w:r>
-      <w:t xml:space="preserve">2026 10 08  |  </w:t>
+      <w:t xml:space="preserve">2026-10-08 | </w:t>
     </w:r>
     <w:fldSimple w:instr="PAGE"/>
   </w:p>
@@ -1874,12 +1427,11 @@
 <file path=word/header1.xml><?xml version="1.0" encoding="utf-8"?>
 <w:hdr xmlns:m="http://schemas.openxmlformats.org/officeDocument/2006/math" xmlns:mc="http://schemas.openxmlformats.org/markup-compatibility/2006" xmlns:mo="http://schemas.microsoft.com/office/mac/office/2008/main" xmlns:mv="urn:schemas-microsoft-com:mac:vml" xmlns:o="urn:schemas-microsoft-com:office:office" xmlns:r="http://schemas.openxmlformats.org/officeDocument/2006/relationships" xmlns:v="urn:schemas-microsoft-com:vml" xmlns:w10="urn:schemas-microsoft-com:office:word" xmlns:w14="http://schemas.microsoft.com/office/word/2010/wordml" xmlns:w="http://schemas.openxmlformats.org/wordprocessingml/2006/main" xmlns:wne="http://schemas.microsoft.com/office/word/2006/wordml" xmlns:wp14="http://schemas.microsoft.com/office/word/2010/wordprocessingDrawing" xmlns:wp="http://schemas.openxmlformats.org/drawingml/2006/wordprocessingDrawing" xmlns:wpc="http://schemas.microsoft.com/office/word/2010/wordprocessingCanvas" xmlns:wpg="http://schemas.microsoft.com/office/word/2010/wordprocessingGroup" xmlns:wpi="http://schemas.microsoft.com/office/word/2010/wordprocessingInk" xmlns:wps="http://schemas.microsoft.com/office/word/2010/wordprocessingShape" mc:Ignorable="w14 wp14">
   <w:p>
-    <w:pPr/>
+    <w:pPr>
+      <w:pStyle w:val="Header"/>
+    </w:pPr>
     <w:r>
-      <w:rPr>
-        <w:sz w:val="16"/>
-      </w:rPr>
-      <w:t>PROJECT IRONFRONT 0.9.0   开发与验证报告</w:t>
+      <w:t>PROJECT IRONFRONT 0.10.0  ·  开发与验证报告</w:t>
     </w:r>
   </w:p>
 </w:hdr>
@@ -2249,7 +1801,7 @@
     <w:qFormat/>
     <w:rsid w:val="00FC693F"/>
     <w:pPr>
-      <w:spacing w:after="140" w:line="269" w:lineRule="auto"/>
+      <w:spacing w:after="160" w:line="269" w:lineRule="auto"/>
     </w:pPr>
     <w:rPr>
       <w:rFonts w:ascii="Arial Unicode MS" w:hAnsi="Arial Unicode MS" w:eastAsia="Arial Unicode MS"/>
@@ -2320,7 +1872,7 @@
       <w:b/>
       <w:bCs/>
       <w:color w:val="000000"/>
-      <w:sz w:val="38"/>
+      <w:sz w:val="36"/>
       <w:szCs w:val="28"/>
     </w:rPr>
   </w:style>
@@ -2606,7 +2158,7 @@
       <w:color w:val="000000"/>
       <w:spacing w:val="5"/>
       <w:kern w:val="28"/>
-      <w:sz w:val="50"/>
+      <w:sz w:val="48"/>
       <w:szCs w:val="52"/>
     </w:rPr>
   </w:style>

</xml_diff>

<commit_message>
Fix 0.10.1: use LAN port 7878 by default
</commit_message>
<xml_diff>
--- a/docs/DEVELOPMENT_REPORT.docx
+++ b/docs/DEVELOPMENT_REPORT.docx
@@ -744,7 +744,7 @@
     </w:p>
     <w:p>
       <w:r>
-        <w:t>服务器提供 HTTP 页面、房间创建接口和 WebSocket。运行 npm run lan 编译共享逻辑、构建页面并启动服务；其他电脑访问房主局域网 IP 的 8787 端口，输入房间码加入。主机同时可以用浏览器作为房主玩家。</w:t>
+        <w:t>服务器提供 HTTP 页面、房间创建接口和 WebSocket。运行 npm run lan 编译共享逻辑、构建页面并启动服务；其他电脑访问房主局域网 IP 的 7878 端口，输入房间码加入。主机同时可以用浏览器作为房主玩家。</w:t>
       </w:r>
     </w:p>
     <w:tbl>
@@ -1389,12 +1389,30 @@
     </w:p>
     <w:p>
       <w:r>
-        <w:t>单机：npm install 后 npm run dev。局域网：npm run lan，浏览器访问房主 IP:8787；房主先创建并设定房间，其他人输入房间码。已有构建时可使用 npm run lan:serve。验证：npm run check；浏览器验证 npm run test:browser，按本机 Chrome 路径设置 IRONFRONT_CHROME_PATH。</w:t>
+        <w:t>单机：npm install 后 npm run dev。局域网：npm run lan，浏览器访问房主 IP:7878；房主先创建并设定房间，其他人输入房间码。已有构建时可使用 npm run lan:serve。验证：npm run check；浏览器验证 npm run test:browser，按本机 Chrome 路径设置 IRONFRONT_CHROME_PATH。</w:t>
       </w:r>
     </w:p>
     <w:p>
       <w:r>
         <w:t>交付：私人完整 ZIP 含源码、dist 与十一首音乐；公开源码 ZIP 不含用户 MP3。README、PROGRESS、CHANGELOG、QA_REPORT 与本 DOCX 更新到 Main。更多截图及详细控制表在仓库 docs 和 README。当前限制为简化飞行、原创程序化资源、LAN 原型及无新增地图；参考出处见 REFERENCES_010.md。</w:t>
+      </w:r>
+    </w:p>
+    <w:p>
+      <w:pPr>
+        <w:pStyle w:val="Heading1"/>
+      </w:pPr>
+      <w:r>
+        <w:t>0.10.1 端口修复补充（2026-10-09）</w:t>
+      </w:r>
+    </w:p>
+    <w:p>
+      <w:r>
+        <w:t>按用户要求，默认 LAN 端口由 8787 改为 7878；服务器、客户端默认地址、UI 地址及错误提示、README 同步更新。补丁版本为 0.10.1。PORT 环境变量仍可覆盖，例如 PORT=7878 npm run lan。</w:t>
+      </w:r>
+    </w:p>
+    <w:p>
+      <w:r>
+        <w:t>验证：严格 TypeScript 与生产构建通过；实际启动服务器后 http://127.0.0.1:7878/api/status 返回版本 0.10.1。检查结束关闭服务。本补丁没有重跑上一版全部 60 项单位与 17 项浏览器测试。</w:t>
       </w:r>
     </w:p>
     <w:sectPr>

</xml_diff>

<commit_message>
Release 0.11.0: smooth LAN walking, connection settings and explicit solo entry
</commit_message>
<xml_diff>
--- a/docs/DEVELOPMENT_REPORT.docx
+++ b/docs/DEVELOPMENT_REPORT.docx
@@ -7,274 +7,34 @@
         <w:pStyle w:val="Title"/>
       </w:pPr>
       <w:r>
-        <w:t>IRONFRONT 0.10.0</w:t>
+        <w:t>IRONFRONT 0.11.0</w:t>
         <w:br/>
-        <w:t>开发与完整 QA 报告</w:t>
+        <w:t>连接设置与步兵移动修复</w:t>
       </w:r>
     </w:p>
     <w:p>
       <w:r>
-        <w:t>本轮在现有 IRONFRONT 上继续开发，重点完成真实局域网房间、四人小队、双阵营部署、方块人物，以及载具连续驾驶、武器限角、独立装备模型与更清晰的战斗界面。保留征服、前线推进、AI 小队和大战场事件。</w:t>
+        <w:t>本轮完成用户提出的三项实际修改：显示可分享的连接 IP、端口与房间码；恢复流畅步兵移动；清晰提供无需联机的单人游戏入口。继续现有项目，不替换征服、AI 小队或部署系统。</w:t>
       </w:r>
     </w:p>
     <w:p>
       <w:r>
-        <w:t>开始时本机与 origin/main 均为 9aeb96a6d1ae4c60c01dcbe94e757b4ca41c4303、0.9.0。本机 iCloud 交付目录与基线仓库 28 个源码及版本文件逐字节一致。新增模块按用户规则升级为 0.10.0，直接更新 Main。</w:t>
+        <w:t>开始时 Main 与本机均为 3e9b21ceb0c1068d2bb8625724edf27122c3b3ef、0.10.1，33 个源码和版本文件与 iCloud 交付目录一致。本轮新增连接信息和步兵预测模块，按规则升中间版本至 0.11.0，最终直接提交 Main。</w:t>
       </w:r>
     </w:p>
-    <w:tbl>
-      <w:tblPr>
-        <w:tblStyle w:val="TableGrid"/>
-        <w:tblW w:type="auto" w:w="0"/>
-        <w:tblLook w:firstColumn="1" w:firstRow="1" w:lastColumn="0" w:lastRow="0" w:noHBand="0" w:noVBand="1" w:val="04A0"/>
-      </w:tblPr>
-      <w:tblGrid>
-        <w:gridCol w:w="4917"/>
-        <w:gridCol w:w="4917"/>
-      </w:tblGrid>
-      <w:tr>
-        <w:tc>
-          <w:tcPr>
-            <w:tcW w:type="dxa" w:w="4917"/>
-          </w:tcPr>
-          <w:p>
-            <w:pPr>
-              <w:spacing w:after="80"/>
-            </w:pPr>
-            <w:r>
-              <w:rPr>
-                <w:sz w:val="18"/>
-              </w:rPr>
-              <w:t>交付范围</w:t>
-            </w:r>
-          </w:p>
-        </w:tc>
-        <w:tc>
-          <w:tcPr>
-            <w:tcW w:type="dxa" w:w="4917"/>
-          </w:tcPr>
-          <w:p>
-            <w:pPr>
-              <w:spacing w:after="80"/>
-            </w:pPr>
-            <w:r>
-              <w:rPr>
-                <w:sz w:val="18"/>
-              </w:rPr>
-              <w:t>实现及依据</w:t>
-            </w:r>
-          </w:p>
-        </w:tc>
-      </w:tr>
-      <w:tr>
-        <w:tc>
-          <w:tcPr>
-            <w:tcW w:type="dxa" w:w="4917"/>
-          </w:tcPr>
-          <w:p>
-            <w:pPr>
-              <w:spacing w:after="80"/>
-            </w:pPr>
-            <w:r>
-              <w:rPr>
-                <w:sz w:val="18"/>
-              </w:rPr>
-              <w:t>联机</w:t>
-            </w:r>
-          </w:p>
-        </w:tc>
-        <w:tc>
-          <w:tcPr>
-            <w:tcW w:type="dxa" w:w="4917"/>
-          </w:tcPr>
-          <w:p>
-            <w:pPr>
-              <w:spacing w:after="80"/>
-            </w:pPr>
-            <w:r>
-              <w:rPr>
-                <w:sz w:val="18"/>
-              </w:rPr>
-              <w:t>房主 + 最多 7 名加入者；真实 WebSocket 与房主电脑上的权威服务器</w:t>
-            </w:r>
-          </w:p>
-        </w:tc>
-      </w:tr>
-      <w:tr>
-        <w:tc>
-          <w:tcPr>
-            <w:tcW w:type="dxa" w:w="4917"/>
-          </w:tcPr>
-          <w:p>
-            <w:pPr>
-              <w:spacing w:after="80"/>
-            </w:pPr>
-            <w:r>
-              <w:rPr>
-                <w:sz w:val="18"/>
-              </w:rPr>
-              <w:t>小队与阵营</w:t>
-            </w:r>
-          </w:p>
-        </w:tc>
-        <w:tc>
-          <w:tcPr>
-            <w:tcW w:type="dxa" w:w="4917"/>
-          </w:tcPr>
-          <w:p>
-            <w:pPr>
-              <w:spacing w:after="80"/>
-            </w:pPr>
-            <w:r>
-              <w:rPr>
-                <w:sz w:val="18"/>
-              </w:rPr>
-              <w:t>四人上限，AI 填补；房主能配置双方、关闭 AI 实现 1v1</w:t>
-            </w:r>
-          </w:p>
-        </w:tc>
-      </w:tr>
-      <w:tr>
-        <w:tc>
-          <w:tcPr>
-            <w:tcW w:type="dxa" w:w="4917"/>
-          </w:tcPr>
-          <w:p>
-            <w:pPr>
-              <w:spacing w:after="80"/>
-            </w:pPr>
-            <w:r>
-              <w:rPr>
-                <w:sz w:val="18"/>
-              </w:rPr>
-              <w:t>部署</w:t>
-            </w:r>
-          </w:p>
-        </w:tc>
-        <w:tc>
-          <w:tcPr>
-            <w:tcW w:type="dxa" w:w="4917"/>
-          </w:tcPr>
-          <w:p>
-            <w:pPr>
-              <w:spacing w:after="80"/>
-            </w:pPr>
-            <w:r>
-              <w:rPr>
-                <w:sz w:val="18"/>
-              </w:rPr>
-              <w:t>双方基地、友军据点、小队与友军空载具座位；服务器再次检查状态</w:t>
-            </w:r>
-          </w:p>
-        </w:tc>
-      </w:tr>
-      <w:tr>
-        <w:tc>
-          <w:tcPr>
-            <w:tcW w:type="dxa" w:w="4917"/>
-          </w:tcPr>
-          <w:p>
-            <w:pPr>
-              <w:spacing w:after="80"/>
-            </w:pPr>
-            <w:r>
-              <w:rPr>
-                <w:sz w:val="18"/>
-              </w:rPr>
-              <w:t>载具</w:t>
-            </w:r>
-          </w:p>
-        </w:tc>
-        <w:tc>
-          <w:tcPr>
-            <w:tcW w:type="dxa" w:w="4917"/>
-          </w:tcPr>
-          <w:p>
-            <w:pPr>
-              <w:spacing w:after="80"/>
-            </w:pPr>
-            <w:r>
-              <w:rPr>
-                <w:sz w:val="18"/>
-              </w:rPr>
-              <w:t>七种类型、默认双方各七辆；连续移动、炮塔速度和角度限制、第一人称与右键光学瞄具</w:t>
-            </w:r>
-          </w:p>
-        </w:tc>
-      </w:tr>
-      <w:tr>
-        <w:tc>
-          <w:tcPr>
-            <w:tcW w:type="dxa" w:w="4917"/>
-          </w:tcPr>
-          <w:p>
-            <w:pPr>
-              <w:spacing w:after="80"/>
-            </w:pPr>
-            <w:r>
-              <w:rPr>
-                <w:sz w:val="18"/>
-              </w:rPr>
-              <w:t>人物与装备</w:t>
-            </w:r>
-          </w:p>
-        </w:tc>
-        <w:tc>
-          <w:tcPr>
-            <w:tcW w:type="dxa" w:w="4917"/>
-          </w:tcPr>
-          <w:p>
-            <w:pPr>
-              <w:spacing w:after="80"/>
-            </w:pPr>
-            <w:r>
-              <w:rPr>
-                <w:sz w:val="18"/>
-              </w:rPr>
-              <w:t>原创方块风格蓝红衣服，真人金色胸章；机枪、工具、手雷与火箭分别建模</w:t>
-            </w:r>
-          </w:p>
-        </w:tc>
-      </w:tr>
-      <w:tr>
-        <w:tc>
-          <w:tcPr>
-            <w:tcW w:type="dxa" w:w="4917"/>
-          </w:tcPr>
-          <w:p>
-            <w:pPr>
-              <w:spacing w:after="80"/>
-            </w:pPr>
-            <w:r>
-              <w:rPr>
-                <w:sz w:val="18"/>
-              </w:rPr>
-              <w:t>验证</w:t>
-            </w:r>
-          </w:p>
-        </w:tc>
-        <w:tc>
-          <w:tcPr>
-            <w:tcW w:type="dxa" w:w="4917"/>
-          </w:tcPr>
-          <w:p>
-            <w:pPr>
-              <w:spacing w:after="80"/>
-            </w:pPr>
-            <w:r>
-              <w:rPr>
-                <w:sz w:val="18"/>
-              </w:rPr>
-              <w:t>60 项单位测试、17 项实际浏览器回归、真实客户端网络检查、生产构建通过</w:t>
-            </w:r>
-          </w:p>
-        </w:tc>
-      </w:tr>
-    </w:tbl>
-    <w:p/>
     <w:p>
       <w:r>
-        <w:t>商业游戏截图仅参考布局与信息层级，人物和模型为项目原创几何。用户十一首音乐遵循已确认范围：只进入本机与私人完整 ZIP，公开 GitHub 与源码 ZIP 均不含这些 MP3。</w:t>
+        <w:t>问题根因：联机分支在 main.ts 提前返回，绕过原单机加减速、脚步、侧倾与跳跃流程。LanClient 每收到 20Hz 服务器快照就直接覆写玩家坐标，使摄像机只在快照到达时前进。服务器也直接以固定速度移动，缺少原流程加减速。</w:t>
+      </w:r>
+    </w:p>
+    <w:p>
+      <w:r>
+        <w:t>修复：联机发送输入后继续使用原步兵每帧移动路径。客户端通过相同碰撞函数预测移动；服务器保留位置与游戏规则的最终决定权，并使用对应加减速参数。小幅误差经每帧指数平滑修正，大于三米、复活、死亡、阵营或座位变化直接采用权威位置并清空本地移动惯性。</w:t>
+      </w:r>
+    </w:p>
+    <w:p>
+      <w:r>
+        <w:t>新增 4 项单位回归：小幅修正不突然跳位、逐帧校正收敛、真实传送立即接收并重置控制、死亡不能当作普通走路插值。所有原有测试仍执行。当前不包含完整网络输入重放和车辆预测。</w:t>
       </w:r>
     </w:p>
     <w:p>
@@ -283,243 +43,37 @@
         <w:pageBreakBefore/>
       </w:pPr>
       <w:r>
-        <w:t>车辆运动 武器与座位</w:t>
+        <w:t>设置与单人 联机使用</w:t>
       </w:r>
     </w:p>
     <w:p>
       <w:r>
-        <w:t>修复 AI 车辆瞬移的根因：战术决策约每 0.22 秒更新，但位置、速度与转向每个模拟步连续积分。不再以决策间隔直接跳位，也移除卡路脱困时突然改变车体方向的处理。联机远端车辆显示采用平滑追随权威位置。</w:t>
+        <w:t>主菜单突出显示“单人游戏 / SOLO”，直接启动本机 AI 战场。不创建房间，不加入 WebSocket，也不要求另一个玩家。使用 npm run lan 提供的网页时同样可以选择单人。旧的 LAN 开房、加入、房主配置入口保留为可选项。</w:t>
       </w:r>
     </w:p>
     <w:p>
       <w:r>
-        <w:t>驾驶位必须确实坐着存活的士兵才驱动车辆。空车停车，AI 使用原有单位登车，不凭空生成驾驶员。玩家可以 E 接管友军 AI 驾驶位，AI 在安全位置下车。召唤车辆继续降落伞空投并保留给调用者，AI 不会抢走。</w:t>
+        <w:t>联机后按 Esc，连接信息设置显示实际连接 IP:端口与六位房间码。房主还看到服务器本机非回环 IPv4 地址构成的可分享 URL。服务器从系统网卡读取地址，不把 0.0.0.0 当成朋友可访问地址。</w:t>
       </w:r>
     </w:p>
     <w:p>
       <w:r>
-        <w:t>炮塔逐步追向瞄准方向，限制仰角并按武器配置限制水平范围。射击方向使用炮塔实际角度，而非直接使用玩家镜头方向，弹体从实际炮管端点产生。转到车后方时不能从车尾发射。机枪使用独立机枪模型及自身枪口。</w:t>
+        <w:t>如果房主连接地址为 localhost，朋友访问栏仍提供实际网卡 IP。存在 VPN、Docker 或多个网卡时可能显示多个地址；应选择与朋友同一局域网的地址。房主创建房间后分享该 URL 与房间码。朋友只要浏览器，不用下载包或安装 Node。</w:t>
       </w:r>
     </w:p>
-    <w:tbl>
-      <w:tblPr>
-        <w:tblStyle w:val="TableGrid"/>
-        <w:tblW w:type="auto" w:w="0"/>
-        <w:tblLook w:firstColumn="1" w:firstRow="1" w:lastColumn="0" w:lastRow="0" w:noHBand="0" w:noVBand="1" w:val="04A0"/>
-      </w:tblPr>
-      <w:tblGrid>
-        <w:gridCol w:w="4917"/>
-        <w:gridCol w:w="4917"/>
-      </w:tblGrid>
-      <w:tr>
-        <w:tc>
-          <w:tcPr>
-            <w:tcW w:type="dxa" w:w="4917"/>
-          </w:tcPr>
-          <w:p>
-            <w:pPr>
-              <w:spacing w:after="80"/>
-            </w:pPr>
-            <w:r>
-              <w:rPr>
-                <w:sz w:val="18"/>
-              </w:rPr>
-              <w:t>座位与操作</w:t>
-            </w:r>
-          </w:p>
-        </w:tc>
-        <w:tc>
-          <w:tcPr>
-            <w:tcW w:type="dxa" w:w="4917"/>
-          </w:tcPr>
-          <w:p>
-            <w:pPr>
-              <w:spacing w:after="80"/>
-            </w:pPr>
-            <w:r>
-              <w:rPr>
-                <w:sz w:val="18"/>
-              </w:rPr>
-              <w:t>权限</w:t>
-            </w:r>
-          </w:p>
-        </w:tc>
-      </w:tr>
-      <w:tr>
-        <w:tc>
-          <w:tcPr>
-            <w:tcW w:type="dxa" w:w="4917"/>
-          </w:tcPr>
-          <w:p>
-            <w:pPr>
-              <w:spacing w:after="80"/>
-            </w:pPr>
-            <w:r>
-              <w:rPr>
-                <w:sz w:val="18"/>
-              </w:rPr>
-              <w:t>F1</w:t>
-            </w:r>
-          </w:p>
-        </w:tc>
-        <w:tc>
-          <w:tcPr>
-            <w:tcW w:type="dxa" w:w="4917"/>
-          </w:tcPr>
-          <w:p>
-            <w:pPr>
-              <w:spacing w:after="80"/>
-            </w:pPr>
-            <w:r>
-              <w:rPr>
-                <w:sz w:val="18"/>
-              </w:rPr>
-              <w:t>驾驶并操纵对应主武器；运输车驾驶位无主炮</w:t>
-            </w:r>
-          </w:p>
-        </w:tc>
-      </w:tr>
-      <w:tr>
-        <w:tc>
-          <w:tcPr>
-            <w:tcW w:type="dxa" w:w="4917"/>
-          </w:tcPr>
-          <w:p>
-            <w:pPr>
-              <w:spacing w:after="80"/>
-            </w:pPr>
-            <w:r>
-              <w:rPr>
-                <w:sz w:val="18"/>
-              </w:rPr>
-              <w:t>F2</w:t>
-            </w:r>
-          </w:p>
-        </w:tc>
-        <w:tc>
-          <w:tcPr>
-            <w:tcW w:type="dxa" w:w="4917"/>
-          </w:tcPr>
-          <w:p>
-            <w:pPr>
-              <w:spacing w:after="80"/>
-            </w:pPr>
-            <w:r>
-              <w:rPr>
-                <w:sz w:val="18"/>
-              </w:rPr>
-              <w:t>独立机枪位；驾驶权限仍只属于 F1</w:t>
-            </w:r>
-          </w:p>
-        </w:tc>
-      </w:tr>
-      <w:tr>
-        <w:tc>
-          <w:tcPr>
-            <w:tcW w:type="dxa" w:w="4917"/>
-          </w:tcPr>
-          <w:p>
-            <w:pPr>
-              <w:spacing w:after="80"/>
-            </w:pPr>
-            <w:r>
-              <w:rPr>
-                <w:sz w:val="18"/>
-              </w:rPr>
-              <w:t>F3 / F4</w:t>
-            </w:r>
-          </w:p>
-        </w:tc>
-        <w:tc>
-          <w:tcPr>
-            <w:tcW w:type="dxa" w:w="4917"/>
-          </w:tcPr>
-          <w:p>
-            <w:pPr>
-              <w:spacing w:after="80"/>
-            </w:pPr>
-            <w:r>
-              <w:rPr>
-                <w:sz w:val="18"/>
-              </w:rPr>
-              <w:t>成员位；车型决定实际座位数</w:t>
-            </w:r>
-          </w:p>
-        </w:tc>
-      </w:tr>
-      <w:tr>
-        <w:tc>
-          <w:tcPr>
-            <w:tcW w:type="dxa" w:w="4917"/>
-          </w:tcPr>
-          <w:p>
-            <w:pPr>
-              <w:spacing w:after="80"/>
-            </w:pPr>
-            <w:r>
-              <w:rPr>
-                <w:sz w:val="18"/>
-              </w:rPr>
-              <w:t>右键 / V</w:t>
-            </w:r>
-          </w:p>
-        </w:tc>
-        <w:tc>
-          <w:tcPr>
-            <w:tcW w:type="dxa" w:w="4917"/>
-          </w:tcPr>
-          <w:p>
-            <w:pPr>
-              <w:spacing w:after="80"/>
-            </w:pPr>
-            <w:r>
-              <w:rPr>
-                <w:sz w:val="18"/>
-              </w:rPr>
-              <w:t>载具光学瞄具 / 第一与第三人称切换</w:t>
-            </w:r>
-          </w:p>
-        </w:tc>
-      </w:tr>
-      <w:tr>
-        <w:tc>
-          <w:tcPr>
-            <w:tcW w:type="dxa" w:w="4917"/>
-          </w:tcPr>
-          <w:p>
-            <w:pPr>
-              <w:spacing w:after="80"/>
-            </w:pPr>
-            <w:r>
-              <w:rPr>
-                <w:sz w:val="18"/>
-              </w:rPr>
-              <w:t>车辆健康信息</w:t>
-            </w:r>
-          </w:p>
-        </w:tc>
-        <w:tc>
-          <w:tcPr>
-            <w:tcW w:type="dxa" w:w="4917"/>
-          </w:tcPr>
-          <w:p>
-            <w:pPr>
-              <w:spacing w:after="80"/>
-            </w:pPr>
-            <w:r>
-              <w:rPr>
-                <w:sz w:val="18"/>
-              </w:rPr>
-              <w:t>只在可见友军其他车辆上方显示，自己的车辆由 HUD 提供信息</w:t>
-            </w:r>
-          </w:p>
-        </w:tc>
-      </w:tr>
-    </w:tbl>
-    <w:p/>
     <w:p>
       <w:r>
-        <w:t>载具受击新增方向提示与冲击反馈，低于约 45% 生命开始冒烟。显示经过视线检查，不能隔墙看到敌方或友方血条。AI 现在会占机枪位并射击，驾驶员与乘员仍计入原军队人数。</w:t>
+        <w:t>安装依赖：npm ci。单机开发：npm run dev；单人按钮进入。网页与联机服务：npm run lan，默认 http://localhost:7878。PORT 环境变量可覆盖默认端口。主机必须保持服务进程运行。</w:t>
+      </w:r>
+    </w:p>
+    <w:p>
+      <w:r>
+        <w:t>单机 Esc 会暂停本机模拟；联机 Esc 只暂停自己的操作，其他人继续。暂停时发送停止输入，服务器防止旧移动操作一直持续。返回单人时关闭网络连接、清理房间标识。</w:t>
+      </w:r>
+    </w:p>
+    <w:p>
+      <w:r>
+        <w:t>状态边界：LAN 服务器仍权威处理伤害、弹药、征用点、队伍、复活与座位检查。客户端预测不是修改服务器坐标权限。联机镜头跳跃只负责本地表现，滑铲与完整竖直物理同步仍待后续迭代。</w:t>
       </w:r>
     </w:p>
     <w:p>
@@ -528,209 +82,37 @@
         <w:pageBreakBefore/>
       </w:pPr>
       <w:r>
-        <w:t>空中 防空与独立装备</w:t>
-      </w:r>
-    </w:p>
-    <w:tbl>
-      <w:tblPr>
-        <w:tblStyle w:val="TableGrid"/>
-        <w:tblW w:type="auto" w:w="0"/>
-        <w:tblLook w:firstColumn="1" w:firstRow="1" w:lastColumn="0" w:lastRow="0" w:noHBand="0" w:noVBand="1" w:val="04A0"/>
-      </w:tblPr>
-      <w:tblGrid>
-        <w:gridCol w:w="4917"/>
-        <w:gridCol w:w="4917"/>
-      </w:tblGrid>
-      <w:tr>
-        <w:tc>
-          <w:tcPr>
-            <w:tcW w:type="dxa" w:w="4917"/>
-          </w:tcPr>
-          <w:p>
-            <w:pPr>
-              <w:spacing w:after="80"/>
-            </w:pPr>
-            <w:r>
-              <w:rPr>
-                <w:sz w:val="18"/>
-              </w:rPr>
-              <w:t>载具类型</w:t>
-            </w:r>
-          </w:p>
-        </w:tc>
-        <w:tc>
-          <w:tcPr>
-            <w:tcW w:type="dxa" w:w="4917"/>
-          </w:tcPr>
-          <w:p>
-            <w:pPr>
-              <w:spacing w:after="80"/>
-            </w:pPr>
-            <w:r>
-              <w:rPr>
-                <w:sz w:val="18"/>
-              </w:rPr>
-              <w:t>实际差异</w:t>
-            </w:r>
-          </w:p>
-        </w:tc>
-      </w:tr>
-      <w:tr>
-        <w:tc>
-          <w:tcPr>
-            <w:tcW w:type="dxa" w:w="4917"/>
-          </w:tcPr>
-          <w:p>
-            <w:pPr>
-              <w:spacing w:after="80"/>
-            </w:pPr>
-            <w:r>
-              <w:rPr>
-                <w:sz w:val="18"/>
-              </w:rPr>
-              <w:t>运输车 / 侦察车</w:t>
-            </w:r>
-          </w:p>
-        </w:tc>
-        <w:tc>
-          <w:tcPr>
-            <w:tcW w:type="dxa" w:w="4917"/>
-          </w:tcPr>
-          <w:p>
-            <w:pPr>
-              <w:spacing w:after="80"/>
-            </w:pPr>
-            <w:r>
-              <w:rPr>
-                <w:sz w:val="18"/>
-              </w:rPr>
-              <w:t>运输与轻型机枪；侦察车两席</w:t>
-            </w:r>
-          </w:p>
-        </w:tc>
-      </w:tr>
-      <w:tr>
-        <w:tc>
-          <w:tcPr>
-            <w:tcW w:type="dxa" w:w="4917"/>
-          </w:tcPr>
-          <w:p>
-            <w:pPr>
-              <w:spacing w:after="80"/>
-            </w:pPr>
-            <w:r>
-              <w:rPr>
-                <w:sz w:val="18"/>
-              </w:rPr>
-              <w:t>步战车 / 主战坦克</w:t>
-            </w:r>
-          </w:p>
-        </w:tc>
-        <w:tc>
-          <w:tcPr>
-            <w:tcW w:type="dxa" w:w="4917"/>
-          </w:tcPr>
-          <w:p>
-            <w:pPr>
-              <w:spacing w:after="80"/>
-            </w:pPr>
-            <w:r>
-              <w:rPr>
-                <w:sz w:val="18"/>
-              </w:rPr>
-              <w:t>不同生命、速度、主炮与真实飞行爆炸弹体</w:t>
-            </w:r>
-          </w:p>
-        </w:tc>
-      </w:tr>
-      <w:tr>
-        <w:tc>
-          <w:tcPr>
-            <w:tcW w:type="dxa" w:w="4917"/>
-          </w:tcPr>
-          <w:p>
-            <w:pPr>
-              <w:spacing w:after="80"/>
-            </w:pPr>
-            <w:r>
-              <w:rPr>
-                <w:sz w:val="18"/>
-              </w:rPr>
-              <w:t>防空车</w:t>
-            </w:r>
-          </w:p>
-        </w:tc>
-        <w:tc>
-          <w:tcPr>
-            <w:tcW w:type="dxa" w:w="4917"/>
-          </w:tcPr>
-          <w:p>
-            <w:pPr>
-              <w:spacing w:after="80"/>
-            </w:pPr>
-            <w:r>
-              <w:rPr>
-                <w:sz w:val="18"/>
-              </w:rPr>
-              <w:t>防空武器，针对敌方空中目标</w:t>
-            </w:r>
-          </w:p>
-        </w:tc>
-      </w:tr>
-      <w:tr>
-        <w:tc>
-          <w:tcPr>
-            <w:tcW w:type="dxa" w:w="4917"/>
-          </w:tcPr>
-          <w:p>
-            <w:pPr>
-              <w:spacing w:after="80"/>
-            </w:pPr>
-            <w:r>
-              <w:rPr>
-                <w:sz w:val="18"/>
-              </w:rPr>
-              <w:t>直升机 / 喷气机</w:t>
-            </w:r>
-          </w:p>
-        </w:tc>
-        <w:tc>
-          <w:tcPr>
-            <w:tcW w:type="dxa" w:w="4917"/>
-          </w:tcPr>
-          <w:p>
-            <w:pPr>
-              <w:spacing w:after="80"/>
-            </w:pPr>
-            <w:r>
-              <w:rPr>
-                <w:sz w:val="18"/>
-              </w:rPr>
-              <w:t>可驾驶空中车辆，Space 上升、Ctrl 下降；喷气机单席</w:t>
-            </w:r>
-          </w:p>
-        </w:tc>
-      </w:tr>
-    </w:tbl>
-    <w:p/>
-    <w:p>
-      <w:r>
-        <w:t>默认基地两阵营各停放上述七类载具，共 14 辆。征用菜单扩展为 11 项支援，增加空中与防空选项。地图显示友军车辆及可部署状态；敌军仍按感知规则显示。</w:t>
+        <w:t>实际验证与性能边界</w:t>
       </w:r>
     </w:p>
     <w:p>
       <w:r>
-        <w:t>工程兵增加手持防空武器，B 使用；目标需进入有效视锥、满足距离及敌方空中条件，导弹消耗数量并追踪真实目标。既有反装甲火箭保留。飞行采用易操作的简化模型，未实现气动失速、装甲分区或复杂热焰干扰。</w:t>
+        <w:t>严格 TypeScript、64 项单位测试（7 文件）、8/16/32/64 战局、默认 32v32 完整战局、真实 LAN 客户端测试、生产构建全部通过。浏览器继承旧功能并新增单人入口和连接信息/移动连续性检查，共 19 项全部通过。</w:t>
       </w:r>
     </w:p>
     <w:p>
       <w:r>
-        <w:t>EquipmentView 单独建立维修工具、医疗包、弹药箱、信标、破片手雷、烟雾弹、反装甲与防空发射器、座位机枪与载具座舱模型。装备不再套用手枪。3–6 选择装备后左键使用，原有 G/X/Z/B 快捷键保留。烟雾继续遮挡 AI 与玩家感知视线。</w:t>
+        <w:t>联机走路实际浏览器样本：80 帧，停滞帧比例 0%，最大单帧位移 0.312 米。样本确认玩家不是只在 20Hz 快照时移动；不能据此保证所有真实网络延迟下都无抖动。</w:t>
       </w:r>
     </w:p>
     <w:p>
       <w:r>
-        <w:t>放宽 AI 上车规模并允许同车机枪手。驾驶员上限按队伍规模控制，避免小战局把步兵全部抽走。烟雾、飞行和新增装备不替换原来的据点与小队状态机。</w:t>
+        <w:t>默认征服：32v32、500票、玩家不操作，275.75模拟秒，红方胜，蓝0 : 红363.89。占点变化21，阵亡317，步兵射击1405，载具射击3553。三类大事件实际出现，反攻和装甲协同断言仍通过，导航失败0。</w:t>
+      </w:r>
+    </w:p>
+    <w:p>
+      <w:r>
+        <w:t>第一次浏览器运行强制了软件 SwiftShader，速度明显降低，死亡动画与空投测试因等待超时失败。停止后用本机正常 WebGL 重跑全部 19 项通过，未删掉断言或把失败写成 PASS。正常 headless 32v32 短时约 60 FPS，仅本机样本。</w:t>
+      </w:r>
+    </w:p>
+    <w:p>
+      <w:r>
+        <w:t>未完成跨电脑八人长期压力、Wi-Fi 丢包、复杂延迟和人工听感验收。Three.js 构建仍存在大于 500 kB 的 chunk 警告。真实录音与用户音乐混音机制保留；十一首商业音乐依旧不上传 GitHub。</w:t>
+      </w:r>
+    </w:p>
+    <w:p>
+      <w:r>
+        <w:t>原始证据保存 docs/qa/check-011.txt、browser-011.txt；机器结果 QA_RESULTS.json；连接设置截图 docs/screenshots/connection-settings-011.png。前一版前线推进结果为历史记录，本轮没有把未重跑的该独立检查当成新结果。</w:t>
       </w:r>
     </w:p>
     <w:p>
@@ -739,577 +121,14 @@
         <w:pageBreakBefore/>
       </w:pPr>
       <w:r>
-        <w:t>房间 权威同步与房主设置</w:t>
-      </w:r>
-    </w:p>
-    <w:p>
-      <w:r>
-        <w:t>服务器提供 HTTP 页面、房间创建接口和 WebSocket。运行 npm run lan 编译共享逻辑、构建页面并启动服务；其他电脑访问房主局域网 IP 的 7878 端口，输入房间码加入。主机同时可以用浏览器作为房主玩家。</w:t>
-      </w:r>
-    </w:p>
-    <w:tbl>
-      <w:tblPr>
-        <w:tblStyle w:val="TableGrid"/>
-        <w:tblW w:type="auto" w:w="0"/>
-        <w:tblLook w:firstColumn="1" w:firstRow="1" w:lastColumn="0" w:lastRow="0" w:noHBand="0" w:noVBand="1" w:val="04A0"/>
-      </w:tblPr>
-      <w:tblGrid>
-        <w:gridCol w:w="4917"/>
-        <w:gridCol w:w="4917"/>
-      </w:tblGrid>
-      <w:tr>
-        <w:tc>
-          <w:tcPr>
-            <w:tcW w:type="dxa" w:w="4917"/>
-          </w:tcPr>
-          <w:p>
-            <w:pPr>
-              <w:spacing w:after="80"/>
-            </w:pPr>
-            <w:r>
-              <w:rPr>
-                <w:sz w:val="18"/>
-              </w:rPr>
-              <w:t>开房前选项</w:t>
-            </w:r>
-          </w:p>
-        </w:tc>
-        <w:tc>
-          <w:tcPr>
-            <w:tcW w:type="dxa" w:w="4917"/>
-          </w:tcPr>
-          <w:p>
-            <w:pPr>
-              <w:spacing w:after="80"/>
-            </w:pPr>
-            <w:r>
-              <w:rPr>
-                <w:sz w:val="18"/>
-              </w:rPr>
-              <w:t>作用</w:t>
-            </w:r>
-          </w:p>
-        </w:tc>
-      </w:tr>
-      <w:tr>
-        <w:tc>
-          <w:tcPr>
-            <w:tcW w:type="dxa" w:w="4917"/>
-          </w:tcPr>
-          <w:p>
-            <w:pPr>
-              <w:spacing w:after="80"/>
-            </w:pPr>
-            <w:r>
-              <w:rPr>
-                <w:sz w:val="18"/>
-              </w:rPr>
-              <w:t>AI 开关与队伍规模</w:t>
-            </w:r>
-          </w:p>
-        </w:tc>
-        <w:tc>
-          <w:tcPr>
-            <w:tcW w:type="dxa" w:w="4917"/>
-          </w:tcPr>
-          <w:p>
-            <w:pPr>
-              <w:spacing w:after="80"/>
-            </w:pPr>
-            <w:r>
-              <w:rPr>
-                <w:sz w:val="18"/>
-              </w:rPr>
-              <w:t>允许原有大战场，也允许关闭 AI 的纯真人对战</w:t>
-            </w:r>
-          </w:p>
-        </w:tc>
-      </w:tr>
-      <w:tr>
-        <w:tc>
-          <w:tcPr>
-            <w:tcW w:type="dxa" w:w="4917"/>
-          </w:tcPr>
-          <w:p>
-            <w:pPr>
-              <w:spacing w:after="80"/>
-            </w:pPr>
-            <w:r>
-              <w:rPr>
-                <w:sz w:val="18"/>
-              </w:rPr>
-              <w:t>模式 票数 难度 击杀罚票</w:t>
-            </w:r>
-          </w:p>
-        </w:tc>
-        <w:tc>
-          <w:tcPr>
-            <w:tcW w:type="dxa" w:w="4917"/>
-          </w:tcPr>
-          <w:p>
-            <w:pPr>
-              <w:spacing w:after="80"/>
-            </w:pPr>
-            <w:r>
-              <w:rPr>
-                <w:sz w:val="18"/>
-              </w:rPr>
-              <w:t>传入真实 Battle 状态</w:t>
-            </w:r>
-          </w:p>
-        </w:tc>
-      </w:tr>
-      <w:tr>
-        <w:tc>
-          <w:tcPr>
-            <w:tcW w:type="dxa" w:w="4917"/>
-          </w:tcPr>
-          <w:p>
-            <w:pPr>
-              <w:spacing w:after="80"/>
-            </w:pPr>
-            <w:r>
-              <w:rPr>
-                <w:sz w:val="18"/>
-              </w:rPr>
-              <w:t>加入阵营策略</w:t>
-            </w:r>
-          </w:p>
-        </w:tc>
-        <w:tc>
-          <w:tcPr>
-            <w:tcW w:type="dxa" w:w="4917"/>
-          </w:tcPr>
-          <w:p>
-            <w:pPr>
-              <w:spacing w:after="80"/>
-            </w:pPr>
-            <w:r>
-              <w:rPr>
-                <w:sz w:val="18"/>
-              </w:rPr>
-              <w:t>己方、对方或交替分配</w:t>
-            </w:r>
-          </w:p>
-        </w:tc>
-      </w:tr>
-      <w:tr>
-        <w:tc>
-          <w:tcPr>
-            <w:tcW w:type="dxa" w:w="4917"/>
-          </w:tcPr>
-          <w:p>
-            <w:pPr>
-              <w:spacing w:after="80"/>
-            </w:pPr>
-            <w:r>
-              <w:rPr>
-                <w:sz w:val="18"/>
-              </w:rPr>
-              <w:t>房主阵营管理</w:t>
-            </w:r>
-          </w:p>
-        </w:tc>
-        <w:tc>
-          <w:tcPr>
-            <w:tcW w:type="dxa" w:w="4917"/>
-          </w:tcPr>
-          <w:p>
-            <w:pPr>
-              <w:spacing w:after="80"/>
-            </w:pPr>
-            <w:r>
-              <w:rPr>
-                <w:sz w:val="18"/>
-              </w:rPr>
-              <w:t>房主在暂停菜单调整加入者阵营；服务器验证房主身份</w:t>
-            </w:r>
-          </w:p>
-        </w:tc>
-      </w:tr>
-      <w:tr>
-        <w:tc>
-          <w:tcPr>
-            <w:tcW w:type="dxa" w:w="4917"/>
-          </w:tcPr>
-          <w:p>
-            <w:pPr>
-              <w:spacing w:after="80"/>
-            </w:pPr>
-            <w:r>
-              <w:rPr>
-                <w:sz w:val="18"/>
-              </w:rPr>
-              <w:t>人数上限</w:t>
-            </w:r>
-          </w:p>
-        </w:tc>
-        <w:tc>
-          <w:tcPr>
-            <w:tcW w:type="dxa" w:w="4917"/>
-          </w:tcPr>
-          <w:p>
-            <w:pPr>
-              <w:spacing w:after="80"/>
-            </w:pPr>
-            <w:r>
-              <w:rPr>
-                <w:sz w:val="18"/>
-              </w:rPr>
-              <w:t>包括房主最多八人，第九名实际拒绝</w:t>
-            </w:r>
-          </w:p>
-        </w:tc>
-      </w:tr>
-    </w:tbl>
-    <w:p/>
-    <w:p>
-      <w:r>
-        <w:t>房主令牌由服务器随机生成，仅房间创建者获得。非房主发送阵营变更请求无效。消息限制每帧大小与发送频率，控制输入校验数值和范围，超过 250 毫秒未收到新输入停止移动。</w:t>
-      </w:r>
-    </w:p>
-    <w:p>
-      <w:r>
-        <w:t>服务器 20Hz 运行共享模拟，客户端不独立推进另一场战争。每名真人拥有独立弹药、装备、复活与征用积分状态；射击、受击事件只给正确玩家。死亡和安全部署均由服务器复核。断线时 AI 开启则恢复 AI 接管，关闭 AI 则移除该真人单位。</w:t>
-      </w:r>
-    </w:p>
-    <w:p>
-      <w:r>
-        <w:t>此为局域网工具：没有公网匹配、自动发现、掉线重连、客户端预测或完整反作弊。房间内暂停只停止本人的操作，整个战局继续。当前 LAN 的跳跃与滑铲视觉表现也未达到单机完整程度。</w:t>
-      </w:r>
-    </w:p>
-    <w:p>
-      <w:pPr>
-        <w:pStyle w:val="Heading1"/>
-        <w:pageBreakBefore/>
-      </w:pPr>
-      <w:r>
-        <w:t>四人小队 双阵营与载具部署</w:t>
-      </w:r>
-    </w:p>
-    <w:p>
-      <w:r>
-        <w:t>小队最多四个成员，真人加入替换原队伍中可用 AI 单位，其余位置由 AI 填充。AI 关闭时只显示实际真人，不显示死亡的占位 AI。蓝方和红方均有对应基地、友军据点、队友、载具与装备作用阵营，允许房主移至对方实现 1v1。</w:t>
-      </w:r>
-    </w:p>
-    <w:p>
-      <w:r>
-        <w:t>小队部署只因实际近期射击/受伤、死亡或当前坐在车里而锁定，单纯进入警戒状态或附近有人不再直接禁止。部署界面显示状态，并在点击时重新验证，避免选择后目标开始交火却仍可复活。</w:t>
-      </w:r>
-    </w:p>
-    <w:p>
-      <w:r>
-        <w:t>己方据点即使正在被攻击也可选择，落点向外围约 42–82 米寻找可行位置；正常状态使用较近落点。系统检查地形、遮挡和危险状态，不直接把玩家放进敌军中心。基地与阵营判断不再固定为蓝方。</w:t>
-      </w:r>
-    </w:p>
-    <w:p>
-      <w:r>
-        <w:t>可部署到友军载具的实际空席：驾驶、副驾驶机枪或成员位；满员、击毁、空投未落地、近期交火的车不能部署。驾驶位若为另一玩家征用保留，也不能绕过保留规则。UI 按车辆与座位建立条目，服务器再次检查目标和空席，避免同时抢占。</w:t>
-      </w:r>
-    </w:p>
-    <w:p>
-      <w:r>
-        <w:t>暂停菜单增加脱离卡死：寻找最近可安全到达的友军据点或基地位置，20 秒冷却，不免费补血、补弹或返还票数。单机暂停后 Esc 返回战斗；Pointer Lock 的退出事件增加短暂保护，避免立即又暂停。</w:t>
-      </w:r>
-    </w:p>
-    <w:p>
-      <w:pPr>
-        <w:pStyle w:val="Heading1"/>
-        <w:pageBreakBefore/>
-      </w:pPr>
-      <w:r>
-        <w:t>方块人物 UI 音乐与积分</w:t>
-      </w:r>
-    </w:p>
-    <w:p>
-      <w:r>
-        <w:t>按用户最新要求，玩家与 AI 改为原创方块人物：立方头部、眼睛像素、方块躯干四肢、装备轮廓。蓝红衣服区分阵营，真人增加金色胸章。采用实例化绘制，运行时阵营变更能够更新颜色与标记；友军近距 IFF 仍受视线检查。</w:t>
-      </w:r>
-    </w:p>
-    <w:p>
-      <w:r>
-        <w:t>菜单使用实际 Three.js 操作者与武器预览；战斗 HUD 顶部票数和据点、左下地图和四人小队、右下弹药与装备、中央捕获百分比及积分提示。减少圆角亮面和装饰，避免装备栏与血量、票数与目标的叠压。</w:t>
-      </w:r>
-    </w:p>
-    <w:p>
-      <w:r>
-        <w:t>OST 混音增益提高到原来的 1.65 倍，新默认音乐音量为 0.76。只迁移旧默认值一次，保留用户主动设定与静音。战斗 duck、暂停 duck 和恢复继续平滑，不在死亡瞬间突然切换到开场曲；既有交叉淡化保留。</w:t>
-      </w:r>
-    </w:p>
-    <w:p>
-      <w:r>
-        <w:t>积分除击杀、助攻、占点、防守、载具击毁等已有机制外，补齐真实医疗、维修与小队部署奖励，联机奖励归属对应玩家。征用仍真实扣分、生成效果与车辆，不是菜单动画。</w:t>
-      </w:r>
-    </w:p>
-    <w:p>
-      <w:r>
-        <w:t>29 个采样音效在浏览器实际解码，十一首本地 MP3 播放进度与 cue 切换检查通过。技术测试不能替代耳机人工听感验收。CC0 音效可公开，用户音乐保持私人范围，来源与导入清单随公开源码保存。</w:t>
-      </w:r>
-    </w:p>
-    <w:p>
-      <w:pPr>
-        <w:pStyle w:val="Heading1"/>
-        <w:pageBreakBefore/>
-      </w:pPr>
-      <w:r>
-        <w:t>验证证据 与观察边界</w:t>
-      </w:r>
-    </w:p>
-    <w:tbl>
-      <w:tblPr>
-        <w:tblStyle w:val="TableGrid"/>
-        <w:tblW w:type="auto" w:w="0"/>
-        <w:tblLook w:firstColumn="1" w:firstRow="1" w:lastColumn="0" w:lastRow="0" w:noHBand="0" w:noVBand="1" w:val="04A0"/>
-      </w:tblPr>
-      <w:tblGrid>
-        <w:gridCol w:w="4917"/>
-        <w:gridCol w:w="4917"/>
-      </w:tblGrid>
-      <w:tr>
-        <w:tc>
-          <w:tcPr>
-            <w:tcW w:type="dxa" w:w="4917"/>
-          </w:tcPr>
-          <w:p>
-            <w:pPr>
-              <w:spacing w:after="80"/>
-            </w:pPr>
-            <w:r>
-              <w:rPr>
-                <w:sz w:val="18"/>
-              </w:rPr>
-              <w:t>检查</w:t>
-            </w:r>
-          </w:p>
-        </w:tc>
-        <w:tc>
-          <w:tcPr>
-            <w:tcW w:type="dxa" w:w="4917"/>
-          </w:tcPr>
-          <w:p>
-            <w:pPr>
-              <w:spacing w:after="80"/>
-            </w:pPr>
-            <w:r>
-              <w:rPr>
-                <w:sz w:val="18"/>
-              </w:rPr>
-              <w:t>结果</w:t>
-            </w:r>
-          </w:p>
-        </w:tc>
-      </w:tr>
-      <w:tr>
-        <w:tc>
-          <w:tcPr>
-            <w:tcW w:type="dxa" w:w="4917"/>
-          </w:tcPr>
-          <w:p>
-            <w:pPr>
-              <w:spacing w:after="80"/>
-            </w:pPr>
-            <w:r>
-              <w:rPr>
-                <w:sz w:val="18"/>
-              </w:rPr>
-              <w:t>TypeScript / 生产构建</w:t>
-            </w:r>
-          </w:p>
-        </w:tc>
-        <w:tc>
-          <w:tcPr>
-            <w:tcW w:type="dxa" w:w="4917"/>
-          </w:tcPr>
-          <w:p>
-            <w:pPr>
-              <w:spacing w:after="80"/>
-            </w:pPr>
-            <w:r>
-              <w:rPr>
-                <w:sz w:val="18"/>
-              </w:rPr>
-              <w:t>PASS；Three.js chunk 体积警告仍保留</w:t>
-            </w:r>
-          </w:p>
-        </w:tc>
-      </w:tr>
-      <w:tr>
-        <w:tc>
-          <w:tcPr>
-            <w:tcW w:type="dxa" w:w="4917"/>
-          </w:tcPr>
-          <w:p>
-            <w:pPr>
-              <w:spacing w:after="80"/>
-            </w:pPr>
-            <w:r>
-              <w:rPr>
-                <w:sz w:val="18"/>
-              </w:rPr>
-              <w:t>Vitest</w:t>
-            </w:r>
-          </w:p>
-        </w:tc>
-        <w:tc>
-          <w:tcPr>
-            <w:tcW w:type="dxa" w:w="4917"/>
-          </w:tcPr>
-          <w:p>
-            <w:pPr>
-              <w:spacing w:after="80"/>
-            </w:pPr>
-            <w:r>
-              <w:rPr>
-                <w:sz w:val="18"/>
-              </w:rPr>
-              <w:t>6 个文件，60 / 60 通过</w:t>
-            </w:r>
-          </w:p>
-        </w:tc>
-      </w:tr>
-      <w:tr>
-        <w:tc>
-          <w:tcPr>
-            <w:tcW w:type="dxa" w:w="4917"/>
-          </w:tcPr>
-          <w:p>
-            <w:pPr>
-              <w:spacing w:after="80"/>
-            </w:pPr>
-            <w:r>
-              <w:rPr>
-                <w:sz w:val="18"/>
-              </w:rPr>
-              <w:t>Chrome Playwright</w:t>
-            </w:r>
-          </w:p>
-        </w:tc>
-        <w:tc>
-          <w:tcPr>
-            <w:tcW w:type="dxa" w:w="4917"/>
-          </w:tcPr>
-          <w:p>
-            <w:pPr>
-              <w:spacing w:after="80"/>
-            </w:pPr>
-            <w:r>
-              <w:rPr>
-                <w:sz w:val="18"/>
-              </w:rPr>
-              <w:t>17 / 17 通过，含两个浏览器联机与实际座位部署</w:t>
-            </w:r>
-          </w:p>
-        </w:tc>
-      </w:tr>
-      <w:tr>
-        <w:tc>
-          <w:tcPr>
-            <w:tcW w:type="dxa" w:w="4917"/>
-          </w:tcPr>
-          <w:p>
-            <w:pPr>
-              <w:spacing w:after="80"/>
-            </w:pPr>
-            <w:r>
-              <w:rPr>
-                <w:sz w:val="18"/>
-              </w:rPr>
-              <w:t>LAN 真实客户端</w:t>
-            </w:r>
-          </w:p>
-        </w:tc>
-        <w:tc>
-          <w:tcPr>
-            <w:tcW w:type="dxa" w:w="4917"/>
-          </w:tcPr>
-          <w:p>
-            <w:pPr>
-              <w:spacing w:after="80"/>
-            </w:pPr>
-            <w:r>
-              <w:rPr>
-                <w:sz w:val="18"/>
-              </w:rPr>
-              <w:t>权威移动、独立弹药、超时停止、房主权限、AI-off 1v1、八人容量与断线通过</w:t>
-            </w:r>
-          </w:p>
-        </w:tc>
-      </w:tr>
-      <w:tr>
-        <w:tc>
-          <w:tcPr>
-            <w:tcW w:type="dxa" w:w="4917"/>
-          </w:tcPr>
-          <w:p>
-            <w:pPr>
-              <w:spacing w:after="80"/>
-            </w:pPr>
-            <w:r>
-              <w:rPr>
-                <w:sz w:val="18"/>
-              </w:rPr>
-              <w:t>核心模拟</w:t>
-            </w:r>
-          </w:p>
-        </w:tc>
-        <w:tc>
-          <w:tcPr>
-            <w:tcW w:type="dxa" w:w="4917"/>
-          </w:tcPr>
-          <w:p>
-            <w:pPr>
-              <w:spacing w:after="80"/>
-            </w:pPr>
-            <w:r>
-              <w:rPr>
-                <w:sz w:val="18"/>
-              </w:rPr>
-              <w:t>8 / 16 / 32 / 64 规模、32v32 默认完整战局通过</w:t>
-            </w:r>
-          </w:p>
-        </w:tc>
-      </w:tr>
-    </w:tbl>
-    <w:p/>
-    <w:p>
-      <w:r>
-        <w:t>默认征服：32v32、500票、玩家闲置；275.75 模拟秒，红方胜，蓝 0 : 红 363.89。占点变化 21、阵亡 317、复活 309、步兵射击 1405、载具射击 3553、车辆击毁/重生 30/27。</w:t>
-      </w:r>
-    </w:p>
-    <w:p>
-      <w:r>
-        <w:t>大事件 3 次，炮击落点 4；炮击、反攻、装甲突击三类均出现，反攻侧翼与装甲协同断言通过。导航失败 0。</w:t>
-      </w:r>
-    </w:p>
-    <w:p>
-      <w:r>
-        <w:t>前线推进 seed505：1559.125 模拟秒，红方防守胜，完成 3/5 区域、阵亡 769、射击 20507、导航失败 0。单种子结果验证流程，不证明战场平衡。</w:t>
-      </w:r>
-    </w:p>
-    <w:p>
-      <w:r>
-        <w:t>32v32 headless 短时八点采样：59.98–60.03 FPS，769 draw calls，DPR 1。没有完成八台实体电脑跨机压力测试或持续实玩 FPS 验收。</w:t>
-      </w:r>
-    </w:p>
-    <w:p>
-      <w:r>
-        <w:t>本轮 QA 实际纠正网络测试启动失败误返回成功、阵营硬编码、客户端弹药串用、房主权限与满房边界、旧部署断言、暂停事件重入、HUD 叠压与运行时方块阵营更新。最终原始输出见 docs/qa/check-010.txt、browser-010.txt、breakthrough-010.json 和 QA_RESULTS.json。</w:t>
-      </w:r>
-    </w:p>
-    <w:p>
-      <w:pPr>
-        <w:pStyle w:val="Heading1"/>
-        <w:pageBreakBefore/>
-      </w:pPr>
-      <w:r>
-        <w:t>实际截图与交付使用</w:t>
+        <w:t>界面截图 交付与维护</w:t>
       </w:r>
     </w:p>
     <w:p>
       <w:r>
         <w:drawing>
           <wp:inline xmlns:a="http://schemas.openxmlformats.org/drawingml/2006/main" xmlns:pic="http://schemas.openxmlformats.org/drawingml/2006/picture">
-            <wp:extent cx="5029200" cy="2828925"/>
+            <wp:extent cx="5760720" cy="3240405"/>
             <wp:docPr id="1" name="Picture 1"/>
             <wp:cNvGraphicFramePr>
               <a:graphicFrameLocks noChangeAspect="1"/>
@@ -1318,7 +137,7 @@
               <a:graphicData uri="http://schemas.openxmlformats.org/drawingml/2006/picture">
                 <pic:pic>
                   <pic:nvPicPr>
-                    <pic:cNvPr id="0" name="block-factions-010.png"/>
+                    <pic:cNvPr id="0" name="connection-settings-011.png"/>
                     <pic:cNvPicPr/>
                   </pic:nvPicPr>
                   <pic:blipFill>
@@ -1330,7 +149,7 @@
                   <pic:spPr>
                     <a:xfrm>
                       <a:off x="0" y="0"/>
-                      <a:ext cx="5029200" cy="2828925"/>
+                      <a:ext cx="5760720" cy="3240405"/>
                     </a:xfrm>
                     <a:prstGeom prst="rect"/>
                   </pic:spPr>
@@ -1343,76 +162,22 @@
     </w:p>
     <w:p>
       <w:r>
-        <w:t>浏览器实拍：蓝红方块外观与真人标记</w:t>
+        <w:t>实际浏览器截图：当前连接地址、房间码、可分享的服务器局域网地址。测试端口为 18788，实际默认端口仍是用户指定的 7878。</w:t>
       </w:r>
     </w:p>
     <w:p>
       <w:r>
-        <w:drawing>
-          <wp:inline xmlns:a="http://schemas.openxmlformats.org/drawingml/2006/main" xmlns:pic="http://schemas.openxmlformats.org/drawingml/2006/picture">
-            <wp:extent cx="5029200" cy="2828925"/>
-            <wp:docPr id="2" name="Picture 2"/>
-            <wp:cNvGraphicFramePr>
-              <a:graphicFrameLocks noChangeAspect="1"/>
-            </wp:cNvGraphicFramePr>
-            <a:graphic>
-              <a:graphicData uri="http://schemas.openxmlformats.org/drawingml/2006/picture">
-                <pic:pic>
-                  <pic:nvPicPr>
-                    <pic:cNvPr id="0" name="host-factions-010.png"/>
-                    <pic:cNvPicPr/>
-                  </pic:nvPicPr>
-                  <pic:blipFill>
-                    <a:blip r:embed="rId12"/>
-                    <a:stretch>
-                      <a:fillRect/>
-                    </a:stretch>
-                  </pic:blipFill>
-                  <pic:spPr>
-                    <a:xfrm>
-                      <a:off x="0" y="0"/>
-                      <a:ext cx="5029200" cy="2828925"/>
-                    </a:xfrm>
-                    <a:prstGeom prst="rect"/>
-                  </pic:spPr>
-                </pic:pic>
-              </a:graphicData>
-            </a:graphic>
-          </wp:inline>
-        </w:drawing>
+        <w:t>代码、README、PROGRESS、CHANGELOG、QA_REPORT、机器结果与本 DOCX 一起更新 Main。本机交付同步源码、构建与报告。私人完整 ZIP 包含用户音乐；公开源码 ZIP 不包含用户 MP3，并执行 ZIP 完整性和条目检查。</w:t>
       </w:r>
     </w:p>
     <w:p>
       <w:r>
-        <w:t>浏览器实拍：房主阵营管理与小队信息</w:t>
+        <w:t>本轮没有新增地图或改换人物风格。方块角色、机枪/装备模型、飞行/防空、四人小队、八人上限、AI-off 1v1、房主阵营管理和友军空座部署继续保留，相关浏览器与 LAN 回归通过。</w:t>
       </w:r>
     </w:p>
     <w:p>
       <w:r>
-        <w:t>单机：npm install 后 npm run dev。局域网：npm run lan，浏览器访问房主 IP:7878；房主先创建并设定房间，其他人输入房间码。已有构建时可使用 npm run lan:serve。验证：npm run check；浏览器验证 npm run test:browser，按本机 Chrome 路径设置 IRONFRONT_CHROME_PATH。</w:t>
-      </w:r>
-    </w:p>
-    <w:p>
-      <w:r>
-        <w:t>交付：私人完整 ZIP 含源码、dist 与十一首音乐；公开源码 ZIP 不含用户 MP3。README、PROGRESS、CHANGELOG、QA_REPORT 与本 DOCX 更新到 Main。更多截图及详细控制表在仓库 docs 和 README。当前限制为简化飞行、原创程序化资源、LAN 原型及无新增地图；参考出处见 REFERENCES_010.md。</w:t>
-      </w:r>
-    </w:p>
-    <w:p>
-      <w:pPr>
-        <w:pStyle w:val="Heading1"/>
-      </w:pPr>
-      <w:r>
-        <w:t>0.10.1 端口修复补充（2026-10-09）</w:t>
-      </w:r>
-    </w:p>
-    <w:p>
-      <w:r>
-        <w:t>按用户要求，默认 LAN 端口由 8787 改为 7878；服务器、客户端默认地址、UI 地址及错误提示、README 同步更新。补丁版本为 0.10.1。PORT 环境变量仍可覆盖，例如 PORT=7878 npm run lan。</w:t>
-      </w:r>
-    </w:p>
-    <w:p>
-      <w:r>
-        <w:t>验证：严格 TypeScript 与生产构建通过；实际启动服务器后 http://127.0.0.1:7878/api/status 返回版本 0.10.1。检查结束关闭服务。本补丁没有重跑上一版全部 60 项单位与 17 项浏览器测试。</w:t>
+        <w:t>后续若网络仍有明显回拉，应提供房主/加入者身份、单双人模式、帧率和连接延迟，以区分渲染性能、服务器计算和无线网络问题。本轮解决已观察的快照直接跳镜头与缺失加减速。</w:t>
       </w:r>
     </w:p>
     <w:sectPr>
@@ -1435,7 +200,7 @@
       <w:jc w:val="right"/>
     </w:pPr>
     <w:r>
-      <w:t xml:space="preserve">2026-10-08 | </w:t>
+      <w:t xml:space="preserve">2026-10-09 | </w:t>
     </w:r>
     <w:fldSimple w:instr="PAGE"/>
   </w:p>
@@ -1449,7 +214,7 @@
       <w:pStyle w:val="Header"/>
     </w:pPr>
     <w:r>
-      <w:t>PROJECT IRONFRONT 0.10.0  ·  开发与验证报告</w:t>
+      <w:t>PROJECT IRONFRONT 0.11.0 · 开发与验证报告</w:t>
     </w:r>
   </w:p>
 </w:hdr>
@@ -1819,12 +584,12 @@
     <w:qFormat/>
     <w:rsid w:val="00FC693F"/>
     <w:pPr>
-      <w:spacing w:after="160" w:line="269" w:lineRule="auto"/>
+      <w:spacing w:line="283" w:lineRule="auto" w:after="180"/>
     </w:pPr>
     <w:rPr>
       <w:rFonts w:ascii="Arial Unicode MS" w:hAnsi="Arial Unicode MS" w:eastAsia="Arial Unicode MS"/>
       <w:color w:val="000000"/>
-      <w:sz w:val="20"/>
+      <w:sz w:val="22"/>
     </w:rPr>
   </w:style>
   <w:style w:type="paragraph" w:styleId="Header">
@@ -1910,11 +675,11 @@
       <w:outlineLvl w:val="1"/>
     </w:pPr>
     <w:rPr>
-      <w:rFonts w:asciiTheme="majorHAnsi" w:eastAsiaTheme="majorEastAsia" w:hAnsiTheme="majorHAnsi" w:cstheme="majorBidi" w:ascii="Arial Unicode MS" w:hAnsi="Arial Unicode MS" w:eastAsia="Arial Unicode MS"/>
+      <w:rFonts w:asciiTheme="majorHAnsi" w:eastAsiaTheme="majorEastAsia" w:hAnsiTheme="majorHAnsi" w:cstheme="majorBidi"/>
       <w:b/>
       <w:bCs/>
-      <w:color w:val="000000"/>
-      <w:sz w:val="24"/>
+      <w:color w:val="4F81BD" w:themeColor="accent1"/>
+      <w:sz w:val="26"/>
       <w:szCs w:val="26"/>
     </w:rPr>
   </w:style>

</xml_diff>

<commit_message>
Release 0.12.0: aircraft gravity, held equipment and LAN muzzle fixes
</commit_message>
<xml_diff>
--- a/docs/DEVELOPMENT_REPORT.docx
+++ b/docs/DEVELOPMENT_REPORT.docx
@@ -7,34 +7,39 @@
         <w:pStyle w:val="Title"/>
       </w:pPr>
       <w:r>
-        <w:t>IRONFRONT 0.11.0</w:t>
+        <w:t>IRONFRONT 0.12.0</w:t>
         <w:br/>
-        <w:t>连接设置与步兵移动修复</w:t>
+        <w:t>飞行 装备 网络与枪口修复</w:t>
       </w:r>
     </w:p>
     <w:p>
       <w:r>
-        <w:t>本轮完成用户提出的三项实际修改：显示可分享的连接 IP、端口与房间码；恢复流畅步兵移动；清晰提供无需联机的单人游戏入口。继续现有项目，不替换征服、AI 小队或部署系统。</w:t>
+        <w:t>本轮落实四项用户问题：无人驾驶飞机不能悬空，装备按键只取出而非自动发射，同一局域网连接诊断与入房流程，枪线从可见枪口产生。继续原 IRONFRONT 项目，保留单人、征服、AI、小队和大战场事件。</w:t>
       </w:r>
     </w:p>
     <w:p>
       <w:r>
-        <w:t>开始时 Main 与本机均为 3e9b21ceb0c1068d2bb8625724edf27122c3b3ef、0.10.1，33 个源码和版本文件与 iCloud 交付目录一致。本轮新增连接信息和步兵预测模块，按规则升中间版本至 0.11.0，最终直接提交 Main。</w:t>
+        <w:t>基线与本机均为 Main 7af1154f15f0a5bfc488ec8aabff7e68b57e890e / 0.11.0，本机交付 34 个源码与版本文件一致。新增动力学和连接校验模块按规则升为 0.12.0，交付直接更新 Main。</w:t>
       </w:r>
     </w:p>
     <w:p>
       <w:r>
-        <w:t>问题根因：联机分支在 main.ts 提前返回，绕过原单机加减速、脚步、侧倾与跳跃流程。LanClient 每收到 20Hz 服务器快照就直接覆写玩家坐标，使摄像机只在快照到达时前进。服务器也直接以固定速度移动，缺少原流程加减速。</w:t>
+        <w:t>根因检查：空驾驶位分支直接 speed=0 后返回，飞机高度没有任何重力更新；G/X/Z/B 是立刻调用使用函数；LAN 开火未提供模型枪口；持久枪线留在世界坐标中，移动后与枪口分离；连接 HTTP 阶段没有超时、房间预检查和明确错误，默认地址也不能保留自定义网页端口。</w:t>
       </w:r>
     </w:p>
     <w:p>
       <w:r>
-        <w:t>修复：联机发送输入后继续使用原步兵每帧移动路径。客户端通过相同碰撞函数预测移动；服务器保留位置与游戏规则的最终决定权，并使用对应加减速参数。小幅误差经每帧指数平滑修正，大于三米、复活、死亡、阵营或座位变化直接采用权威位置并清空本地移动惯性。</w:t>
+        <w:t>飞行现在使用垂直速度、发动机动力及升力状态。直升机无人驾驶后旋翼动力逐渐衰减，重力使其下坠；喷气机以速度产生升力，失去驾驶员后保留前进惯性但逐渐下坠。有驾驶员的低速喷气机也不能当作直升机悬停。</w:t>
       </w:r>
     </w:p>
     <w:p>
       <w:r>
-        <w:t>新增 4 项单位回归：小幅修正不突然跳位、逐帧校正收敛、真实传送立即接收并重置控制、死亡不能当作普通走路插值。所有原有测试仍执行。当前不包含完整网络输入重放和车辆预测。</w:t>
+        <w:t>AI 和玩家共用同一物理推进。起降高度由速度积分，不再直接改变高度。下落撞地根据落地垂直速度受损，重撞会击毁；碰撞建筑也会造成损毁。空中空投状态仍按既有降落伞流程运行，不把正常空投误判成无人飞机坠机。</w:t>
+      </w:r>
+    </w:p>
+    <w:p>
+      <w:r>
+        <w:t>这是简化动力学，不是完整刚体、空气动力或轮胎求解器；未做玩家跳伞、失速气动、复杂飞机姿态和旋翼分区损伤。本轮明确修复实际悬空与惯性问题。</w:t>
       </w:r>
     </w:p>
     <w:p>
@@ -43,37 +48,37 @@
         <w:pageBreakBefore/>
       </w:pPr>
       <w:r>
-        <w:t>设置与单人 联机使用</w:t>
+        <w:t>装备即武器 点击与实际枪口</w:t>
       </w:r>
     </w:p>
     <w:p>
       <w:r>
-        <w:t>主菜单突出显示“单人游戏 / SOLO”，直接启动本机 AI 战场。不创建房间，不加入 WebSocket，也不要求另一个玩家。使用 npm run lan 提供的网页时同样可以选择单人。旧的 LAN 开房、加入、房主配置入口保留为可选项。</w:t>
+        <w:t>G/4 取出手雷或烟雾弹，X/3 取出兵种工具，Z/5 取出反装甲发射器，B/6 取出防空发射器。工程发射器受兵种限制。按键不扣数量、不治疗、不维修、不发射；左键执行真实使用，右键可调整发射器瞄准，1/2 收回并切到枪械。</w:t>
       </w:r>
     </w:p>
     <w:p>
       <w:r>
-        <w:t>联机后按 Esc，连接信息设置显示实际连接 IP:端口与六位房间码。房主还看到服务器本机非回环 IPv4 地址构成的可分享 URL。服务器从系统网卡读取地址，不把 0.0.0.0 当成朋友可访问地址。</w:t>
+        <w:t>装备使用后继续拿在手上，不再几百毫秒自动变回步枪。专用模型增加手部与袖子，发射器开镜时居中；HUD 提示当前拿着的装备、数量、使用按键。无弹药/冷却中的点击不会免费产生效果。</w:t>
       </w:r>
     </w:p>
     <w:p>
       <w:r>
-        <w:t>如果房主连接地址为 localhost，朋友访问栏仍提供实际网卡 IP。存在 VPN、Docker 或多个网卡时可能显示多个地址；应选择与朋友同一局域网的地址。房主创建房间后分享该 URL 与房间码。朋友只要浏览器，不用下载包或安装 Node。</w:t>
+        <w:t>QA 找到快速点击事件先于绘制帧结束，旧装备代码只检查 shooting，mouseup 后就忽略使用。现在和枪械一致保留 shotPending，并在每次点击重新设置半自动锁存，保证短点击和按住一次使用都正确。首次鼠标锁定也不再吞掉使用点击。</w:t>
       </w:r>
     </w:p>
     <w:p>
       <w:r>
-        <w:t>安装依赖：npm ci。单机开发：npm run dev；单人按钮进入。网页与联机服务：npm run lan，默认 http://localhost:7878。PORT 环境变量可覆盖默认端口。主机必须保持服务进程运行。</w:t>
+        <w:t>单机枪械实际射线仍使用 WeaponView 模型枪口世界坐标。联机每次控制传入模型相对玩家的枪口偏移，服务器检查有限值与距离后组合到权威位置，再进行命中。不会接受任意远距离枪口坐标。火箭/防空弹从专用发射器端点创建真实弹体。</w:t>
       </w:r>
     </w:p>
     <w:p>
       <w:r>
-        <w:t>单机 Esc 会暂停本机模拟；联机 Esc 只暂停自己的操作，其他人继续。暂停时发送停止输入，服务器防止旧移动操作一直持续。返回单人时关闭网络连接、清理房间标识。</w:t>
+        <w:t>第一人称示踪线缩短持续时间并逐帧更新可见枪口端点，避免人物移动或开镜后旧世界坐标起点悬在旁边。自己的车载机枪对应独立机枪模型，旁观者使用权威车载枪口；坦克炮弹仍从真实炮管末端飞行。</w:t>
       </w:r>
     </w:p>
     <w:p>
       <w:r>
-        <w:t>状态边界：LAN 服务器仍权威处理伤害、弹药、征用点、队伍、复活与座位检查。客户端预测不是修改服务器坐标权限。联机镜头跳跃只负责本地表现，滑铲与完整竖直物理同步仍待后续迭代。</w:t>
+        <w:t>联机入房先发送配装并等待服务器确认，再允许操作，修复刚进入时默认突击兵状态导致工程装备键被拒绝的问题。死亡、复活和切主副武器时清理所持装备。</w:t>
       </w:r>
     </w:p>
     <w:p>
@@ -82,37 +87,37 @@
         <w:pageBreakBefore/>
       </w:pPr>
       <w:r>
-        <w:t>实际验证与性能边界</w:t>
+        <w:t>同一局域网 连接与分享</w:t>
       </w:r>
     </w:p>
     <w:p>
       <w:r>
-        <w:t>严格 TypeScript、64 项单位测试（7 文件）、8/16/32/64 战局、默认 32v32 完整战局、真实 LAN 客户端测试、生产构建全部通过。浏览器继承旧功能并新增单人入口和连接信息/移动连续性检查，共 19 项全部通过。</w:t>
+        <w:t>用户确认故障发生在同一个局域网。服务器保持监听 0.0.0.0，但终端明确打印“本机 localhost”及“朋友访问”的实际网卡 IP。过滤 VPN/桥接/虚拟网卡，避免把监听地址或错误网卡当作分享地址。</w:t>
       </w:r>
     </w:p>
     <w:p>
       <w:r>
-        <w:t>联机走路实际浏览器样本：80 帧，停滞帧比例 0%，最大单帧位移 0.312 米。样本确认玩家不是只在 20Hz 快照时移动；不能据此保证所有真实网络延迟下都无抖动。</w:t>
+        <w:t>设置提供带 ?room=房间码 的完整链接。朋友打开后自动填写正确 IP、端口和房间码，再点击加入；非默认端口也保留。房主程序默认仍是用户指定的 7878。新网页遇到未重启的旧服务会明确拒绝版本不匹配，并提示停止旧进程。朋友不需要安装包或 Node。</w:t>
       </w:r>
     </w:p>
     <w:p>
       <w:r>
-        <w:t>默认征服：32v32、500票、玩家不操作，275.75模拟秒，红方胜，蓝0 : 红363.89。占点变化21，阵亡317，步兵射击1405，载具射击3553。三类大事件实际出现，反攻和装甲协同断言仍通过，导航失败0。</w:t>
+        <w:t>新增“测试连接”按钮检查 HTTP 状态。网络请求有 4.5 秒超时，WebSocket 有 7 秒超时；加入前通过房间接口检查是否存在、是否满员。HTTP、地址格式、错误房间码、WebSocket 失败分别提示具体阶段，失败不会一直停在连接中。</w:t>
       </w:r>
     </w:p>
     <w:p>
       <w:r>
-        <w:t>第一次浏览器运行强制了软件 SwiftShader，速度明显降低，死亡动画与空投测试因等待超时失败。停止后用本机正常 WebGL 重跑全部 19 项通过，未删掉断言或把失败写成 PASS。正常 headless 32v32 短时约 60 FPS，仅本机样本。</w:t>
+        <w:t>同时处理 HTTP/WS 同源协议、跨来源请求与私有网络预检。HTTPS 页面不能直接连接 HTTP 主机，会提示打开房主的 HTTP 网页。UI 阻止重复创建连接；关闭前尚未收到完整状态也会正确拒绝承诺，避免等待悬挂。</w:t>
       </w:r>
     </w:p>
     <w:p>
       <w:r>
-        <w:t>未完成跨电脑八人长期压力、Wi-Fi 丢包、复杂延迟和人工听感验收。Three.js 构建仍存在大于 500 kB 的 chunk 警告。真实录音与用户音乐混音机制保留；十一首商业音乐依旧不上传 GitHub。</w:t>
+        <w:t>本轮用测试环境实际非回环网卡 IP 10.100.113.195 完成 HTTP、WebSocket 与两个真实客户端；双浏览器进一步验证生产网页开房、分享链接加入。不是只有 localhost 的模拟检查。</w:t>
       </w:r>
     </w:p>
     <w:p>
       <w:r>
-        <w:t>原始证据保存 docs/qa/check-011.txt、browser-011.txt；机器结果 QA_RESULTS.json；连接设置截图 docs/screenshots/connection-settings-011.png。前一版前线推进结果为历史记录，本轮没有把未重跑的该独立检查当成新结果。</w:t>
+        <w:t>仍未直接操作用户两台实际电脑。因此若新“测试连接”仍失败，需根据提示核对主机新版服务、电脑与浏览器本地网络权限、Wi-Fi 客户端隔离。代码无法替用户赋予系统权限或改变路由器。不能把测试环境连通写成用户两台电脑已经连通。</w:t>
       </w:r>
     </w:p>
     <w:p>
@@ -121,14 +126,53 @@
         <w:pageBreakBefore/>
       </w:pPr>
       <w:r>
-        <w:t>界面截图 交付与维护</w:t>
+        <w:t>完整 QA 与交付</w:t>
+      </w:r>
+    </w:p>
+    <w:p>
+      <w:r>
+        <w:t>严格 TypeScript、70 项单位测试（8 文件）、8/16/32/64 战局、默认完整 32v32、真实网卡 IP LAN 与生产构建通过。最终稳定源码的 Chrome 浏览器 26 项全部通过，原死亡、空投、部署、座位与阵营检查继续保留。</w:t>
+      </w:r>
+    </w:p>
+    <w:p>
+      <w:r>
+        <w:t>默认32v32、500票：270.375模拟秒，red胜，占点变化31，阵亡349，步兵射击1053，载具射击3557。三类大事件均出现，导航失败0。</w:t>
+      </w:r>
+    </w:p>
+    <w:p>
+      <w:r>
+        <w:t>新增自动检查：无人直升机下坠与撞击销毁、空喷气机惯性、地面空飞机不升空、装备按键不消费和单机/联机点击消费、发射器模型端点、真实枪口偏移及单机/联机移动开镜中示踪线起点误差小于一毫米（且必须有射击样本）、正确端口分享、404房间诊断和不可达服务。</w:t>
+      </w:r>
+    </w:p>
+    <w:p>
+      <w:r>
+        <w:t>中间浏览器测试发现并修复快速点击、入房配装确认、延迟鼠标锁定关闭暂停菜单及低帧率枪线即时消失等边界；开发热更新也曾重载页面影响测试，最终冻结源码完整重跑。车辆开火原测试依赖短暂弹体恰好存在的时间窗口，改为记录真实shell开火事件；核心弹体位置与飞行断言仍保留。Three.js 大于500kB的构建警告保留，短时帧率不等于长期性能承诺。</w:t>
+      </w:r>
+    </w:p>
+    <w:p>
+      <w:r>
+        <w:t>证据为 QA_RESULTS.json、docs/qa/check-012.txt、browser-012.txt。README、PROGRESS、CHANGELOG、QA_REPORT 与本 DOCX 更新到 Main；本机源码及构建同步。私人 ZIP 含用户音乐，公开源码 ZIP 与 GitHub 不含用户 MP3。</w:t>
+      </w:r>
+    </w:p>
+    <w:p>
+      <w:r>
+        <w:t>使用：房主在现有游戏目录按 Ctrl+C 停止旧服务，再 npm run lan；本机打开 http://localhost:7878。创建房间后从 Esc 设置或终端分享实际地址；朋友无需启动自己的服务，打开分享链接并加入即可。主机与前端应都使用新版本。</w:t>
+      </w:r>
+    </w:p>
+    <w:p>
+      <w:pPr>
+        <w:pStyle w:val="Heading1"/>
+        <w:pageBreakBefore/>
+      </w:pPr>
+      <w:r>
+        <w:t>实际浏览器界面</w:t>
       </w:r>
     </w:p>
     <w:p>
       <w:r>
         <w:drawing>
           <wp:inline xmlns:a="http://schemas.openxmlformats.org/drawingml/2006/main" xmlns:pic="http://schemas.openxmlformats.org/drawingml/2006/picture">
-            <wp:extent cx="5760720" cy="3240405"/>
+            <wp:extent cx="5029200" cy="2828925"/>
             <wp:docPr id="1" name="Picture 1"/>
             <wp:cNvGraphicFramePr>
               <a:graphicFrameLocks noChangeAspect="1"/>
@@ -137,7 +181,7 @@
               <a:graphicData uri="http://schemas.openxmlformats.org/drawingml/2006/picture">
                 <pic:pic>
                   <pic:nvPicPr>
-                    <pic:cNvPr id="0" name="connection-settings-011.png"/>
+                    <pic:cNvPr id="0" name="equipment-held-012.png"/>
                     <pic:cNvPicPr/>
                   </pic:nvPicPr>
                   <pic:blipFill>
@@ -149,7 +193,7 @@
                   <pic:spPr>
                     <a:xfrm>
                       <a:off x="0" y="0"/>
-                      <a:ext cx="5760720" cy="3240405"/>
+                      <a:ext cx="5029200" cy="2828925"/>
                     </a:xfrm>
                     <a:prstGeom prst="rect"/>
                   </pic:spPr>
@@ -162,22 +206,48 @@
     </w:p>
     <w:p>
       <w:r>
-        <w:t>实际浏览器截图：当前连接地址、房间码、可分享的服务器局域网地址。测试端口为 18788，实际默认端口仍是用户指定的 7878。</w:t>
+        <w:t>装备保持拿在手上，按键仅取出、左键使用</w:t>
       </w:r>
     </w:p>
     <w:p>
       <w:r>
-        <w:t>代码、README、PROGRESS、CHANGELOG、QA_REPORT、机器结果与本 DOCX 一起更新 Main。本机交付同步源码、构建与报告。私人完整 ZIP 包含用户音乐；公开源码 ZIP 不包含用户 MP3，并执行 ZIP 完整性和条目检查。</w:t>
+        <w:drawing>
+          <wp:inline xmlns:a="http://schemas.openxmlformats.org/drawingml/2006/main" xmlns:pic="http://schemas.openxmlformats.org/drawingml/2006/picture">
+            <wp:extent cx="5029200" cy="2828925"/>
+            <wp:docPr id="2" name="Picture 2"/>
+            <wp:cNvGraphicFramePr>
+              <a:graphicFrameLocks noChangeAspect="1"/>
+            </wp:cNvGraphicFramePr>
+            <a:graphic>
+              <a:graphicData uri="http://schemas.openxmlformats.org/drawingml/2006/picture">
+                <pic:pic>
+                  <pic:nvPicPr>
+                    <pic:cNvPr id="0" name="lan-share-012.png"/>
+                    <pic:cNvPicPr/>
+                  </pic:nvPicPr>
+                  <pic:blipFill>
+                    <a:blip r:embed="rId12"/>
+                    <a:stretch>
+                      <a:fillRect/>
+                    </a:stretch>
+                  </pic:blipFill>
+                  <pic:spPr>
+                    <a:xfrm>
+                      <a:off x="0" y="0"/>
+                      <a:ext cx="5029200" cy="2828925"/>
+                    </a:xfrm>
+                    <a:prstGeom prst="rect"/>
+                  </pic:spPr>
+                </pic:pic>
+              </a:graphicData>
+            </a:graphic>
+          </wp:inline>
+        </w:drawing>
       </w:r>
     </w:p>
     <w:p>
       <w:r>
-        <w:t>本轮没有新增地图或改换人物风格。方块角色、机枪/装备模型、飞行/防空、四人小队、八人上限、AI-off 1v1、房主阵营管理和友军空座部署继续保留，相关浏览器与 LAN 回归通过。</w:t>
-      </w:r>
-    </w:p>
-    <w:p>
-      <w:r>
-        <w:t>后续若网络仍有明显回拉，应提供房主/加入者身份、单双人模式、帧率和连接延迟，以区分渲染性能、服务器计算和无线网络问题。本轮解决已观察的快照直接跳镜头与缺失加减速。</w:t>
+        <w:t>房主连接信息与带房间码的完整分享网址</w:t>
       </w:r>
     </w:p>
     <w:sectPr>
@@ -214,7 +284,7 @@
       <w:pStyle w:val="Header"/>
     </w:pPr>
     <w:r>
-      <w:t>PROJECT IRONFRONT 0.11.0 · 开发与验证报告</w:t>
+      <w:t>PROJECT IRONFRONT 0.12.0 · 实际开发与验证</w:t>
     </w:r>
   </w:p>
 </w:hdr>
@@ -584,7 +654,7 @@
     <w:qFormat/>
     <w:rsid w:val="00FC693F"/>
     <w:pPr>
-      <w:spacing w:line="283" w:lineRule="auto" w:after="180"/>
+      <w:spacing w:line="278" w:lineRule="auto" w:after="180"/>
     </w:pPr>
     <w:rPr>
       <w:rFonts w:ascii="Arial Unicode MS" w:hAnsi="Arial Unicode MS" w:eastAsia="Arial Unicode MS"/>

</xml_diff>

<commit_message>
Release 0.13.0: battle feedback, class preparation and combined arms balance
</commit_message>
<xml_diff>
--- a/docs/DEVELOPMENT_REPORT.docx
+++ b/docs/DEVELOPMENT_REPORT.docx
@@ -7,39 +7,39 @@
         <w:pStyle w:val="Title"/>
       </w:pPr>
       <w:r>
-        <w:t>IRONFRONT 0.12.0</w:t>
+        <w:t>IRONFRONT 0.13.0</w:t>
         <w:br/>
-        <w:t>飞行 装备 网络与枪口修复</w:t>
+        <w:t>战斗反馈 配装与战场平衡</w:t>
       </w:r>
     </w:p>
     <w:p>
       <w:r>
-        <w:t>本轮落实四项用户问题：无人驾驶飞机不能悬空，装备按键只取出而非自动发射，同一局域网连接诊断与入房流程，枪线从可见枪口产生。继续原 IRONFRONT 项目，保留单人、征服、AI、小队和大战场事件。</w:t>
+        <w:t>本轮在原IRONFRONT继续实际开发，重点落实用户提出的枪械命中反馈、难用的防空装备、过强及过度追逐玩家的AI、车辆数量和重生、不同弹药与炮塔动作，以及战斗准备、视角、入场和结算体验。代码、联机服务、构建、报告与下载包统一为0.13.0。</w:t>
       </w:r>
     </w:p>
     <w:p>
       <w:r>
-        <w:t>基线与本机均为 Main 7af1154f15f0a5bfc488ec8aabff7e68b57e890e / 0.11.0，本机交付 34 个源码与版本文件一致。新增动力学和连接校验模块按规则升为 0.12.0，交付直接更新 Main。</w:t>
+        <w:t>开始前核对远端Main和本机0.12.0均为1ed27ed626b1972f2468fa0a341bb4bbb1147c45，34个源码/版本文件一致。新增准备流程及平衡配置按中间位升级规则发布0.13.0，直接更新Main，不创建分支。</w:t>
       </w:r>
     </w:p>
     <w:p>
       <w:r>
-        <w:t>根因检查：空驾驶位分支直接 speed=0 后返回，飞机高度没有任何重力更新；G/X/Z/B 是立刻调用使用函数；LAN 开火未提供模型枪口；持久枪线留在世界坐标中，移动后与枪口分离；连接 HTTP 阶段没有超时、房间预检查和明确错误，默认地址也不能保留自定义网页端口。</w:t>
+        <w:t>检查发现AI步兵原来全用卡宾枪，所有炮弹共用速度105及重力9.8；默认14辆载具、15–40秒重生，使载具持续密集出现。防空只有成功/失败而没有目标和装填提示；主菜单和部署页的配装仍以长下拉表单呈现。此轮逐项改为真实状态和可操作界面。</w:t>
       </w:r>
     </w:p>
     <w:p>
       <w:r>
-        <w:t>飞行现在使用垂直速度、发动机动力及升力状态。直升机无人驾驶后旋翼动力逐渐衰减，重力使其下坠；喷气机以速度产生升力，失去驾驶员后保留前进惯性但逐渐下坠。有驾驶员的低速喷气机也不能当作直升机悬停。</w:t>
+        <w:t>射击反馈现在由权威伤害函数发出，数值是目标实际损失的HP，包括致命一击的剩余生命值，而非武器配置伤害。准星旁汇总数值，区分装甲和击杀/击毁，配合命中声、尘土及金属火花。重复伤害已死亡目标不会重复发奖或反馈。轻武器可对装甲产生很小伤害。</w:t>
       </w:r>
     </w:p>
     <w:p>
       <w:r>
-        <w:t>AI 和玩家共用同一物理推进。起降高度由速度积分，不再直接改变高度。下落撞地根据落地垂直速度受损，重撞会击毁；碰撞建筑也会造成损毁。空中空投状态仍按既有降落伞流程运行，不把正常空投误判成无人飞机坠机。</w:t>
+        <w:t>曳光线使用淡色短时分段显示和飞行亮点，单人/联机仍从模型枪口创建。第一人称起点跟随当前枪口，第三人称使用人物枪口；对方射击使用权威枪口。步枪与装备射线仍检查障碍，不能穿近墙。手枪滑套和栓动部件增加往复动作；原七种独立模型、开镜与换弹动作保留。</w:t>
       </w:r>
     </w:p>
     <w:p>
       <w:r>
-        <w:t>这是简化动力学，不是完整刚体、空气动力或轮胎求解器；未做玩家跳伞、失速气动、复杂飞机姿态和旋翼分区损伤。本轮明确修复实际悬空与惯性问题。</w:t>
+        <w:t>该伤害显示参考用户截图的准星数字，不新增每个敌人头顶的可穿墙生命条；未新增独立爆头倍率，命中确认与评分是实际伤害和死亡事件。</w:t>
       </w:r>
     </w:p>
     <w:p>
@@ -48,37 +48,37 @@
         <w:pageBreakBefore/>
       </w:pPr>
       <w:r>
-        <w:t>装备即武器 点击与实际枪口</w:t>
+        <w:t>独立战斗准备与联机启动</w:t>
       </w:r>
     </w:p>
     <w:p>
       <w:r>
-        <w:t>G/4 取出手雷或烟雾弹，X/3 取出兵种工具，Z/5 取出反装甲发射器，B/6 取出防空发射器。工程发射器受兵种限制。按键不扣数量、不治疗、不维修、不发射；左键执行真实使用，右键可调整发射器瞄准，1/2 收回并切到枪械。</w:t>
+        <w:t>主菜单保留战局、难度、人数、载具上限、音频和图形设置。点击单人或创建/加入房间后载入真实场景，再显示独立战斗准备页。页面用四个兵种卡片，点击主武器、副武器、投掷物图片进入对应候选图卡。兵种装备随兵种改变，配置自动保存。复活部署页也使用同一配装组件。</w:t>
       </w:r>
     </w:p>
     <w:p>
       <w:r>
-        <w:t>装备使用后继续拿在手上，不再几百毫秒自动变回步枪。专用模型增加手部与袖子，发射器开镜时居中；HUD 提示当前拿着的装备、数量、使用按键。无弹药/冷却中的点击不会免费产生效果。</w:t>
+        <w:t>单人完成准备后显示3秒任务倒计时，摄像机从较高位置下降到战场，再开放操作。准备期间不推进票数、AI、载具和战局时间。四兵种保留用户要求的突击、医疗、侦察与工程定义。</w:t>
       </w:r>
     </w:p>
     <w:p>
       <w:r>
-        <w:t>QA 找到快速点击事件先于绘制帧结束，旧装备代码只检查 shooting，mouseup 后就忽略使用。现在和枪械一致保留 shotPending，并在每次点击重新设置半自动锁存，保证短点击和按住一次使用都正确。首次鼠标锁定也不再吞掉使用点击。</w:t>
+        <w:t>LAN准备状态由服务器管理，房主与加入者分别提交配置和READY。当前所有人准备完成后房主START可用；服务器拒绝未准备时启动以及非房主启动。倒计时结束才推进权威模拟。修改配装取消READY，房主不能绕过仍在配装的玩家。</w:t>
       </w:r>
     </w:p>
     <w:p>
       <w:r>
-        <w:t>单机枪械实际射线仍使用 WeaponView 模型枪口世界坐标。联机每次控制传入模型相对玩家的枪口偏移，服务器检查有限值与距离后组合到权威位置，再进行命中。不会接受任意远距离枪口坐标。火箭/防空弹从专用发射器端点创建真实弹体。</w:t>
+        <w:t>房间启动后加入者先配装，期间不成为可被AI攻击的活动士兵；确认准备后服务器应用配置、出生保护和参与状态。倒计时期间拒绝新加入，以免新玩家绕过全员准备条件。UI仍支持主菜单返回、暂停、脱离卡死和阵营管理。</w:t>
       </w:r>
     </w:p>
     <w:p>
       <w:r>
-        <w:t>第一人称示踪线缩短持续时间并逐帧更新可见枪口端点，避免人物移动或开镜后旧世界坐标起点悬在旁边。自己的车载机枪对应独立机枪模型，旁观者使用权威车载枪口；坦克炮弹仍从真实炮管末端飞行。</w:t>
+        <w:t>入场是基于现有战场的实时镜头与任务字幕动画，不使用战地或三角洲的视频、商标和角色资源。结算显示动态镜头、胜败徽记、玩家成绩和四人小队卡片，再提供重开或返回菜单。</w:t>
       </w:r>
     </w:p>
     <w:p>
       <w:r>
-        <w:t>联机入房先发送配装并等待服务器确认，再允许操作，修复刚进入时默认突击兵状态导致工程装备键被拒绝的问题。死亡、复活和切主副武器时清理所持装备。</w:t>
+        <w:t>参考来源：EA官方 Loadout Creation and Weapon Classes，https://www.ea.com/games/battlefield/battlefield-6/news/loadout-creation-and-weapon-classes；Delta Force官方枪匠/配装介绍与用户提供截图。采用兵种与装备图片选择的交互结构，不宣称原版UI或资产复刻。</w:t>
       </w:r>
     </w:p>
     <w:p>
@@ -87,37 +87,37 @@
         <w:pageBreakBefore/>
       </w:pPr>
       <w:r>
-        <w:t>同一局域网 连接与分享</w:t>
+        <w:t>AI行为与装备可用性</w:t>
       </w:r>
     </w:p>
     <w:p>
       <w:r>
-        <w:t>用户确认故障发生在同一个局域网。服务器保持监听 0.0.0.0，但终端明确打印“本机 localhost”及“朋友访问”的实际网卡 IP。过滤 VPN/桥接/虚拟网卡，避免把监听地址或错误网卡当作分享地址。</w:t>
+        <w:t>默认难度降为新兵，第一次升级旧配置也迁移为新兵；玩家可之后选择普通/老兵。视觉反应时间由原0.8/0.5/0.32调整为1.15/0.8/0.45秒并叠加少量随机差异；散布扩大，伤害乘数降为0.4/0.55/0.7，短点射后停顿加长。车辆AI伤害也按0.45/0.65/0.85缩放。</w:t>
       </w:r>
     </w:p>
     <w:p>
       <w:r>
-        <w:t>设置提供带 ?room=房间码 的完整链接。朋友打开后自动填写正确 IP、端口和房间码，再点击加入；非默认端口也保留。房主程序默认仍是用户指定的 7878。新网页遇到未重启的旧服务会明确拒绝版本不匹配，并提示停止旧进程。朋友不需要安装包或 Node。</w:t>
+        <w:t>AI以小队目标和近处实际威胁为主，目标搜索减少对玩家的偏好，追踪范围随难度为80/95/112m；远离据点任务时只有近距离直接威胁继续作战。同时攻击玩家的步兵射手上限随难度为1/2/3。小队共享最后已知位置，遮挡后不会持续读取敌人的实时坐标。受压、低血量、撤退、掩体和听觉搜寻仍保留。</w:t>
       </w:r>
     </w:p>
     <w:p>
       <w:r>
-        <w:t>新增“测试连接”按钮检查 HTTP 状态。网络请求有 4.5 秒超时，WebSocket 有 7 秒超时；加入前通过房间接口检查是否存在、是否满员。HTTP、地址格式、错误房间码、WebSocket 失败分别提示具体阶段，失败不会一直停在连接中。</w:t>
+        <w:t>突击AI用卡宾枪并补充附近AI弹药，医疗AI用冲锋枪并治疗/救援，侦察AI用狙击枪并在受压时放烟，工程AI用机枪并修理、发射反载具火箭或对空制导弹。射击按所持枪的自动/半自动、弹匣、装填和伤害执行。装备动作有冷却，影响真实生命、弹药、烟幕视线和弹体。</w:t>
       </w:r>
     </w:p>
     <w:p>
       <w:r>
-        <w:t>同时处理 HTTP/WS 同源协议、跨来源请求与私有网络预检。HTTPS 页面不能直接连接 HTTP 主机，会提示打开房主的 HTTP 网页。UI 阻止重复创建连接；关闭前尚未收到完整状态也会正确拒绝承诺，避免等待悬挂。</w:t>
+        <w:t>防空发射器保持B/6取出、左键发射的装备武器流程。扩大捕获锥及450m范围，HUD明确显示未发现目标、捕获与距离、冷却装填、弹药耗尽。只锁定敌方空中载具，三维检查建筑遮挡。持续按住左键可在获得目标后发射，弹药和装填仍由权威逻辑约束。</w:t>
       </w:r>
     </w:p>
     <w:p>
       <w:r>
-        <w:t>本轮用测试环境实际非回环网卡 IP 10.100.113.195 完成 HTTP、WebSocket 与两个真实客户端；双浏览器进一步验证生产网页开房、分享链接加入。不是只有 localhost 的模拟检查。</w:t>
+        <w:t>工程维修工具按住左键重复修理附近受损己方车辆，有0.75秒间隔，工具本身不消耗一次性数量。其他装备仍按数量和有效目标消耗；医疗与维修无法无目标刷分。图标HUD显示G/X/Z/B及数字快捷键、数量和选中装备。</w:t>
       </w:r>
     </w:p>
     <w:p>
       <w:r>
-        <w:t>仍未直接操作用户两台实际电脑。因此若新“测试连接”仍失败，需根据提示核对主机新版服务、电脑与浏览器本地网络权限、Wi-Fi 客户端隔离。代码无法替用户赋予系统权限或改变路由器。不能把测试环境连通写成用户两台电脑已经连通。</w:t>
+        <w:t>AI仍是有冷却的规则式战术系统，不是完整人类操作模拟；防空是宽锥捕获与制导，未实现雷达建模、干扰弹和真实制导系统的全部细节。</w:t>
       </w:r>
     </w:p>
     <w:p>
@@ -126,37 +126,37 @@
         <w:pageBreakBefore/>
       </w:pPr>
       <w:r>
-        <w:t>完整 QA 与交付</w:t>
+        <w:t>载具规模与弹药差异</w:t>
       </w:r>
     </w:p>
     <w:p>
       <w:r>
-        <w:t>严格 TypeScript、70 项单位测试（8 文件）、8/16/32/64 战局、默认完整 32v32、真实网卡 IP LAN 与生产构建通过。最终稳定源码的 Chrome 浏览器 26 项全部通过，原死亡、空投、部署、座位与阵营检查继续保留。</w:t>
+        <w:t>全场载具上限在开局/建房设置为0–20，默认8辆。默认两军各4辆，包含步战车、侦察车、防空车和直升机；七种型号仍在目录中，其他型号可在空位时征用或通过更高上限出现。上限计入空投，不会出现飞机还在降落时继续无限召唤。</w:t>
       </w:r>
     </w:p>
     <w:p>
       <w:r>
-        <w:t>默认32v32、500票：270.375模拟秒，red胜，占点变化31，阵亡349，步兵射击1053，载具射击3557。三类大事件均出现，导航失败0。</w:t>
+        <w:t>达到上限时征用拒绝且不扣积分。基地重生也检查当前全场活动数量；征用载具占满容量时基地车辆继续等待。征用载具被击毁仍不免费重生。普通车辆重生90秒，侦察车70秒，运输车60秒，坦克120秒；装甲突击事件不再把击毁车辆的等待直接缩为5.5秒。</w:t>
       </w:r>
     </w:p>
     <w:p>
       <w:r>
-        <w:t>新增自动检查：无人直升机下坠与撞击销毁、空喷气机惯性、地面空飞机不升空、装备按键不消费和单机/联机点击消费、发射器模型端点、真实枪口偏移及单机/联机移动开镜中示踪线起点误差小于一毫米（且必须有射击样本）、正确端口分享、404房间诊断和不可达服务。</w:t>
+        <w:t>坦克APFSDS弹速420m/s，重力0.8，爆炸半径2.4m，破甲倍率1.25；步战车30mm HE为180m/s、重力4、半径4m、破甲0.7。坦克远距离近似直线，更适于装甲精确打击；步战车偏向较低破甲的区域高爆。防空35mm为280m/s、重力1.5，直升机70mm HE为115m/s、重力3、半径6m；喷气机25mm AP为330m/s、重力1。</w:t>
       </w:r>
     </w:p>
     <w:p>
       <w:r>
-        <w:t>中间浏览器测试发现并修复快速点击、入房配装确认、延迟鼠标锁定关闭暂停菜单及低帧率枪线即时消失等边界；开发热更新也曾重载页面影响测试，最终冻结源码完整重跑。车辆开火原测试依赖短暂弹体恰好存在的时间窗口，改为记录真实shell开火事件；核心弹体位置与飞行断言仍保留。Three.js 大于500kB的构建警告保留，短时帧率不等于长期性能承诺。</w:t>
+        <w:t>玩家和AI共用弹速、重力、飞行步进和撞击流程。炮管只按当前炮塔方向发射；坦克炮塔转动速率仍为0.85rad/s，不能瞬间转到屁股后发炮。AI不会在开火函数再次额外转动炮塔，防空AI按空中目标高度转动。机枪仍为轻武器，不与重炮共享伤害。</w:t>
       </w:r>
     </w:p>
     <w:p>
       <w:r>
-        <w:t>证据为 QA_RESULTS.json、docs/qa/check-012.txt、browser-012.txt。README、PROGRESS、CHANGELOG、QA_REPORT 与本 DOCX 更新到 Main；本机源码及构建同步。私人 ZIP 含用户音乐，公开源码 ZIP 与 GitHub 不含用户 MP3。</w:t>
+        <w:t>V自由切换步兵和载具视角，右键瞄准暂时回到瞄准视角。第三人称摄像机对建筑进行距离缩短，避免常见墙后镜头。既有座位、抢AI驾驶位、专属空投、己方空座部署、飞行重力和撞击损伤继续保留。</w:t>
       </w:r>
     </w:p>
     <w:p>
       <w:r>
-        <w:t>使用：房主在现有游戏目录按 Ctrl+C 停止旧服务，再 npm run lan；本机打开 http://localhost:7878。创建房间后从 Esc 设置或终端分享实际地址；朋友无需启动自己的服务，打开分享链接并加入即可。主机与前端应都使用新版本。</w:t>
+        <w:t>此处是游戏化的弹道和驾驶模型，不是专业装甲穿深、空气动力或刚体物理模拟。弹药名和参数为项目虚构配置。</w:t>
       </w:r>
     </w:p>
     <w:p>
@@ -165,14 +165,58 @@
         <w:pageBreakBefore/>
       </w:pPr>
       <w:r>
-        <w:t>实际浏览器界面</w:t>
+        <w:t>完整验证与使用说明</w:t>
+      </w:r>
+    </w:p>
+    <w:p>
+      <w:r>
+        <w:t>最终严格TS、79项单元测试、29项Chrome浏览器、8/16/32/64战局、LAN真实HTTP/WS与生产构建通过。默认500票32v32完成于488.875模拟秒，red胜；占点变化25，阵亡364，步兵射击2059，载具射击2746，炮击落点8，导航失败0。三类大事件和装甲协同仍通过。</w:t>
+      </w:r>
+    </w:p>
+    <w:p>
+      <w:r>
+        <w:t>新单元覆盖0/8辆全场上限、平衡阵营、空投占位/不扣积分/基地等待、长重生、弹道差异、致命实际伤害只确认一次、轻武器装甲伤害、AI四枪与治疗维修、防空目标类型与捕获锥。原部署、座位、飞行、装备和烟幕测试保留。旧全车型测试显式选20辆上限，IFV破甲测试按照HE伤害改变射击次数，没有删除毁伤和重生断言。</w:t>
+      </w:r>
+    </w:p>
+    <w:p>
+      <w:r>
+        <w:t>浏览器新检查配装只在入场后出现、无下拉配装、四兵种/图片选择、准备时模拟冻结、配置保存和应用、全员准备门槛、倒计时、图标HUD、防空提示、第一/第三人称、伤害数值、小队结算及视角动画。单人AI医疗救援后退出死亡界面也通过实际浏览器回归。原26项均重跑，含真实IP生产网页分享加入、连续移动、移动开镜枪口、死亡镜头、空投、驾驶和阵营管理。</w:t>
+      </w:r>
+    </w:p>
+    <w:p>
+      <w:r>
+        <w:t>中间QA发现旧生产构建与新服务版本不一致、切枪后的读取需要等待绘制帧，以及新AI弹道使默认战局在第三大事件之前结束；分别更新构建、修正测试时序、调整大事件间隔至18–30秒。最后以稳定源码全量复验。Three.js大chunk警告保留，短时帧率仅为样本。</w:t>
+      </w:r>
+    </w:p>
+    <w:p>
+      <w:r>
+        <w:t>实际网络验证使用测试环境网卡10.100.113.195，不等于已直接验收用户两台电脑。房主Ctrl+C停旧服务，再npm run lan，默认端口7878；朋友打开完整分享链接、点击加入、完成配装并READY。房主等全员READY后START。前端和服务都需0.13版。</w:t>
+      </w:r>
+    </w:p>
+    <w:p>
+      <w:r>
+        <w:t>飞行与炮弹仍为简化动力学；命中数字在准星附近汇总，不是每个目标头顶浮动条，也未新增独立头部伤害倍率。防空是宽锥目标捕获后制导，没有真实雷达、干扰弹或锁定音阶。AI装备为规则式有冷却的战术动作，不是完整人类操作模拟。入场/结算采用现有场景与模型的实时镜头和CSS动画，不含新的电影级角色动作或固定翼编队视频。局域网未直接在用户两台电脑验收，不支持公网匹配和重连续局。短时headless帧率不能作为所有设备长期FPS承诺。</w:t>
+      </w:r>
+    </w:p>
+    <w:p>
+      <w:r>
+        <w:t>用户11首音乐仅留在本机与私人完整ZIP，公开GitHub/源码ZIP不含MP3。README、PROGRESS、CHANGELOG、QA_REPORT、QA_RESULTS、DOCX和测试证据更新Main。本机源码及dist按交付同步，ZIP完整性与SHA256单独验证。</w:t>
+      </w:r>
+    </w:p>
+    <w:p>
+      <w:pPr>
+        <w:pStyle w:val="Heading1"/>
+        <w:pageBreakBefore/>
+      </w:pPr>
+      <w:r>
+        <w:t>实际准备与战斗界面</w:t>
       </w:r>
     </w:p>
     <w:p>
       <w:r>
         <w:drawing>
           <wp:inline xmlns:a="http://schemas.openxmlformats.org/drawingml/2006/main" xmlns:pic="http://schemas.openxmlformats.org/drawingml/2006/picture">
-            <wp:extent cx="5029200" cy="2828925"/>
+            <wp:extent cx="5394960" cy="3034665"/>
             <wp:docPr id="1" name="Picture 1"/>
             <wp:cNvGraphicFramePr>
               <a:graphicFrameLocks noChangeAspect="1"/>
@@ -181,7 +225,7 @@
               <a:graphicData uri="http://schemas.openxmlformats.org/drawingml/2006/picture">
                 <pic:pic>
                   <pic:nvPicPr>
-                    <pic:cNvPr id="0" name="equipment-held-012.png"/>
+                    <pic:cNvPr id="0" name="preparation-013.png"/>
                     <pic:cNvPicPr/>
                   </pic:nvPicPr>
                   <pic:blipFill>
@@ -193,7 +237,7 @@
                   <pic:spPr>
                     <a:xfrm>
                       <a:off x="0" y="0"/>
-                      <a:ext cx="5029200" cy="2828925"/>
+                      <a:ext cx="5394960" cy="3034665"/>
                     </a:xfrm>
                     <a:prstGeom prst="rect"/>
                   </pic:spPr>
@@ -206,14 +250,14 @@
     </w:p>
     <w:p>
       <w:r>
-        <w:t>装备保持拿在手上，按键仅取出、左键使用</w:t>
+        <w:t>载入后的四兵种图片配装</w:t>
       </w:r>
     </w:p>
     <w:p>
       <w:r>
         <w:drawing>
           <wp:inline xmlns:a="http://schemas.openxmlformats.org/drawingml/2006/main" xmlns:pic="http://schemas.openxmlformats.org/drawingml/2006/picture">
-            <wp:extent cx="5029200" cy="2828925"/>
+            <wp:extent cx="5394960" cy="3034665"/>
             <wp:docPr id="2" name="Picture 2"/>
             <wp:cNvGraphicFramePr>
               <a:graphicFrameLocks noChangeAspect="1"/>
@@ -222,7 +266,7 @@
               <a:graphicData uri="http://schemas.openxmlformats.org/drawingml/2006/picture">
                 <pic:pic>
                   <pic:nvPicPr>
-                    <pic:cNvPr id="0" name="lan-share-012.png"/>
+                    <pic:cNvPr id="0" name="hit-feedback-013.png"/>
                     <pic:cNvPicPr/>
                   </pic:nvPicPr>
                   <pic:blipFill>
@@ -234,7 +278,7 @@
                   <pic:spPr>
                     <a:xfrm>
                       <a:off x="0" y="0"/>
-                      <a:ext cx="5029200" cy="2828925"/>
+                      <a:ext cx="5394960" cy="3034665"/>
                     </a:xfrm>
                     <a:prstGeom prst="rect"/>
                   </pic:spPr>
@@ -247,14 +291,105 @@
     </w:p>
     <w:p>
       <w:r>
-        <w:t>房主连接信息与带房间码的完整分享网址</w:t>
+        <w:t>实际伤害确认与图标装备HUD</w:t>
+      </w:r>
+    </w:p>
+    <w:p>
+      <w:pPr>
+        <w:pStyle w:val="Heading1"/>
+        <w:pageBreakBefore/>
+      </w:pPr>
+      <w:r>
+        <w:t>实际入场与结算界面</w:t>
+      </w:r>
+    </w:p>
+    <w:p>
+      <w:r>
+        <w:drawing>
+          <wp:inline xmlns:a="http://schemas.openxmlformats.org/drawingml/2006/main" xmlns:pic="http://schemas.openxmlformats.org/drawingml/2006/picture">
+            <wp:extent cx="5394960" cy="3034665"/>
+            <wp:docPr id="3" name="Picture 3"/>
+            <wp:cNvGraphicFramePr>
+              <a:graphicFrameLocks noChangeAspect="1"/>
+            </wp:cNvGraphicFramePr>
+            <a:graphic>
+              <a:graphicData uri="http://schemas.openxmlformats.org/drawingml/2006/picture">
+                <pic:pic>
+                  <pic:nvPicPr>
+                    <pic:cNvPr id="0" name="entry-013.png"/>
+                    <pic:cNvPicPr/>
+                  </pic:nvPicPr>
+                  <pic:blipFill>
+                    <a:blip r:embed="rId13"/>
+                    <a:stretch>
+                      <a:fillRect/>
+                    </a:stretch>
+                  </pic:blipFill>
+                  <pic:spPr>
+                    <a:xfrm>
+                      <a:off x="0" y="0"/>
+                      <a:ext cx="5394960" cy="3034665"/>
+                    </a:xfrm>
+                    <a:prstGeom prst="rect"/>
+                  </pic:spPr>
+                </pic:pic>
+              </a:graphicData>
+            </a:graphic>
+          </wp:inline>
+        </w:drawing>
+      </w:r>
+    </w:p>
+    <w:p>
+      <w:r>
+        <w:t>战局启动倒计时与实景镜头</w:t>
+      </w:r>
+    </w:p>
+    <w:p>
+      <w:r>
+        <w:drawing>
+          <wp:inline xmlns:a="http://schemas.openxmlformats.org/drawingml/2006/main" xmlns:pic="http://schemas.openxmlformats.org/drawingml/2006/picture">
+            <wp:extent cx="5394960" cy="3034665"/>
+            <wp:docPr id="4" name="Picture 4"/>
+            <wp:cNvGraphicFramePr>
+              <a:graphicFrameLocks noChangeAspect="1"/>
+            </wp:cNvGraphicFramePr>
+            <a:graphic>
+              <a:graphicData uri="http://schemas.openxmlformats.org/drawingml/2006/picture">
+                <pic:pic>
+                  <pic:nvPicPr>
+                    <pic:cNvPr id="0" name="result-013.png"/>
+                    <pic:cNvPicPr/>
+                  </pic:nvPicPr>
+                  <pic:blipFill>
+                    <a:blip r:embed="rId14"/>
+                    <a:stretch>
+                      <a:fillRect/>
+                    </a:stretch>
+                  </pic:blipFill>
+                  <pic:spPr>
+                    <a:xfrm>
+                      <a:off x="0" y="0"/>
+                      <a:ext cx="5394960" cy="3034665"/>
+                    </a:xfrm>
+                    <a:prstGeom prst="rect"/>
+                  </pic:spPr>
+                </pic:pic>
+              </a:graphicData>
+            </a:graphic>
+          </wp:inline>
+        </w:drawing>
+      </w:r>
+    </w:p>
+    <w:p>
+      <w:r>
+        <w:t>胜败徽记和小队成绩动画</w:t>
       </w:r>
     </w:p>
     <w:sectPr>
       <w:headerReference w:type="default" r:id="rId9"/>
       <w:footerReference w:type="default" r:id="rId10"/>
       <w:pgSz w:w="11909" w:h="16834"/>
-      <w:pgMar w:top="1008" w:right="1037" w:bottom="1008" w:left="1037" w:header="720" w:footer="720" w:gutter="0"/>
+      <w:pgMar w:top="936" w:right="1008" w:bottom="936" w:left="1008" w:header="720" w:footer="720" w:gutter="0"/>
       <w:cols w:space="720"/>
       <w:docGrid w:linePitch="360"/>
     </w:sectPr>
@@ -270,7 +405,7 @@
       <w:jc w:val="right"/>
     </w:pPr>
     <w:r>
-      <w:t xml:space="preserve">2026-10-09 | </w:t>
+      <w:t xml:space="preserve">2026-10-09  </w:t>
     </w:r>
     <w:fldSimple w:instr="PAGE"/>
   </w:p>
@@ -284,7 +419,7 @@
       <w:pStyle w:val="Header"/>
     </w:pPr>
     <w:r>
-      <w:t>PROJECT IRONFRONT 0.12.0 · 实际开发与验证</w:t>
+      <w:t>PROJECT IRONFRONT 0.13.0 开发与验证</w:t>
     </w:r>
   </w:p>
 </w:hdr>
@@ -654,7 +789,7 @@
     <w:qFormat/>
     <w:rsid w:val="00FC693F"/>
     <w:pPr>
-      <w:spacing w:line="278" w:lineRule="auto" w:after="180"/>
+      <w:spacing w:line="271" w:lineRule="auto" w:after="160"/>
     </w:pPr>
     <w:rPr>
       <w:rFonts w:ascii="Arial Unicode MS" w:hAnsi="Arial Unicode MS" w:eastAsia="Arial Unicode MS"/>

</xml_diff>

<commit_message>
feat: release 0.14.0 rescue, tactical squads and vehicle arsenal
</commit_message>
<xml_diff>
--- a/docs/DEVELOPMENT_REPORT.docx
+++ b/docs/DEVELOPMENT_REPORT.docx
@@ -7,39 +7,39 @@
         <w:pStyle w:val="Title"/>
       </w:pPr>
       <w:r>
-        <w:t>IRONFRONT 0.13.0</w:t>
+        <w:t>IRONFRONT 0.14.0</w:t>
         <w:br/>
-        <w:t>战斗反馈 配装与战场平衡</w:t>
+        <w:t>投掷 救援与载具战术</w:t>
       </w:r>
     </w:p>
     <w:p>
       <w:r>
-        <w:t>本轮在原IRONFRONT继续实际开发，重点落实用户提出的枪械命中反馈、难用的防空装备、过强及过度追逐玩家的AI、车辆数量和重生、不同弹药与炮塔动作，以及战斗准备、视角、入场和结算体验。代码、联机服务、构建、报告与下载包统一为0.13.0。</w:t>
+        <w:t>本轮继续现有源码，重点修复无法投出的手雷与烟雾弹、全场限车影响基地驾驶、地图标记叠放、AI不攻击及随机走动，增加30秒濒死和救援、地面弹药箱、空中跳伞、双武器制导与干扰、弹药改装和实际炮管/落点提示。保持原单人及8人局域网、四兵种图片配装、征服与前线、大事件、枪口射线和音频系统。</w:t>
       </w:r>
     </w:p>
     <w:p>
       <w:r>
-        <w:t>开始前核对远端Main和本机0.12.0均为1ed27ed626b1972f2468fa0a341bb4bbb1147c45，34个源码/版本文件一致。新增准备流程及平衡配置按中间位升级规则发布0.13.0，直接更新Main，不创建分支。</w:t>
+        <w:t>任务开始核对远端Main和本机0.13.0均为9b71aeb06c8ab9eb5a819009261d8da38c2e7e9f，36个源码及版本文件逐字节一致。在原项目直接修改Main，新增模块按用户版本规则升级中间位到0.14.0。没有另起游戏项目或新分支。</w:t>
       </w:r>
     </w:p>
     <w:p>
       <w:r>
-        <w:t>检查发现AI步兵原来全用卡宾枪，所有炮弹共用速度105及重力9.8；默认14辆载具、15–40秒重生，使载具持续密集出现。防空只有成功/失败而没有目标和装填提示；主菜单和部署页的配装仍以长下拉表单呈现。此轮逐项改为真实状态和可操作界面。</w:t>
+        <w:t>检查发现旧手雷立即在远点产生伤害，没有飞行物；弹药装备立即补弹，没有地面箱；车辆上限参与基地重生和征用；载具被毁把乘员推出而非阵亡；空中下车直接落地。AI在远离任务时仅处理近处威胁，目标反复变化会重置反应计时，表现为不射击。逐项以真实状态、动作和权威联机数据修改。</w:t>
       </w:r>
     </w:p>
     <w:p>
       <w:r>
-        <w:t>射击反馈现在由权威伤害函数发出，数值是目标实际损失的HP，包括致命一击的剩余生命值，而非武器配置伤害。准星旁汇总数值，区分装甲和击杀/击毁，配合命中声、尘土及金属火花。重复伤害已死亡目标不会重复发奖或反馈。轻武器可对装甲产生很小伤害。</w:t>
+        <w:t>最终严格TypeScript、91项单元、33项Chrome浏览器、8/16/32/64自动战局、非回环IP HTTP/WebSocket和生产Vite构建通过。详细机器可读结果在QA_RESULTS.json，完整输出在docs/qa/check-014.txt与browser-014.txt。Three.js大chunk警告保留。</w:t>
       </w:r>
     </w:p>
     <w:p>
       <w:r>
-        <w:t>曳光线使用淡色短时分段显示和飞行亮点，单人/联机仍从模型枪口创建。第一人称起点跟随当前枪口，第三人称使用人物枪口；对方射击使用权威枪口。步枪与装备射线仍检查障碍，不能穿近墙。手枪滑套和栓动部件增加往复动作；原七种独立模型、开镜与换弹动作保留。</w:t>
+        <w:t>本轮美术按用户提供的方块人物方向制作原创比例、像素脸、头发和胡须。阵营蓝红服装、真人识别胸章、独立枪械与装备保留。没有搬用Steve模型、战地商业资源或视频。</w:t>
       </w:r>
     </w:p>
     <w:p>
       <w:r>
-        <w:t>该伤害显示参考用户截图的准星数字，不新增每个敌人头顶的可穿墙生命条；未新增独立爆头倍率，命中确认与评分是实际伤害和死亡事件。</w:t>
+        <w:t>交付分为私人完整ZIP与公开源码ZIP。用户11首配乐仅本机与私人包；公开Main包含代码、可分发音效、导入清单、报告与QA截图，不上传用户MP3。</w:t>
       </w:r>
     </w:p>
     <w:p>
@@ -48,37 +48,37 @@
         <w:pageBreakBefore/>
       </w:pPr>
       <w:r>
-        <w:t>独立战斗准备与联机启动</w:t>
+        <w:t>投掷物 地面补给与恢复</w:t>
       </w:r>
     </w:p>
     <w:p>
       <w:r>
-        <w:t>主菜单保留战局、难度、人数、载具上限、音频和图形设置。点击单人或创建/加入房间后载入真实场景，再显示独立战斗准备页。页面用四个兵种卡片，点击主武器、副武器、投掷物图片进入对应候选图卡。兵种装备随兵种改变，配置自动保存。复活部署页也使用同一配装组件。</w:t>
+        <w:t>G或4先取出当前配装的手雷/烟雾弹，左键才使用。取出不消耗数量，投出后扣一次，取消正在进行的换弹以免动作冲突。第一人称手臂和装备向前甩出，世界中有独立可见弹体和旋转。单人及LAN使用同一权威状态，不只是屏幕特效。</w:t>
       </w:r>
     </w:p>
     <w:p>
       <w:r>
-        <w:t>单人完成准备后显示3秒任务倒计时，摄像机从较高位置下降到战场，再开放操作。准备期间不推进票数、AI、载具和战局时间。四兵种保留用户要求的突击、医疗、侦察与工程定义。</w:t>
+        <w:t>弹体初速度由瞄准方向产生，基础22m/s并叠加向上5m/s，重力9.81；墙壁反弹、落地反弹，2.4秒后爆炸或起烟。手雷按真实三维爆炸位置和遮挡造成伤害，烟雾弹落点产生16秒烟幕，AI视线和目标捕获受实际烟幕影响。投出动画与旋转模型由thrown事件和grenades数组同步。</w:t>
       </w:r>
     </w:p>
     <w:p>
       <w:r>
-        <w:t>LAN准备状态由服务器管理，房主与加入者分别提交配置和READY。当前所有人准备完成后房主START可用；服务器拒绝未准备时启动以及非房主启动。倒计时结束才推进权威模拟。修改配装取消READY，房主不能绕过仍在配装的玩家。</w:t>
+        <w:t>突击兵X/3是放箱装备：左键在地面放一个有外壳和金属带的实体弹药箱。附近7m内己方步兵自动补充枪械弹药，敌人无效且隔墙不补。玩家补储备弹，AI补弹匣；不直接把手中弹匣填满，也不无限补充投掷物和制导弹。</w:t>
       </w:r>
     </w:p>
     <w:p>
       <w:r>
-        <w:t>房间启动后加入者先配装，期间不成为可被AI攻击的活动士兵；确认准备后服务器应用配置、出生保护和参与状态。倒计时期间拒绝新加入，以免新玩家绕过全员准备条件。UI仍支持主菜单返回、暂停、脱离卡死和阵营管理。</w:t>
+        <w:t>每位放置者最多两箱，10秒冷却；再放第3箱自动移除最早箱。普通箱180秒过期，运输车X放置箱60秒过期并受相同归属上限。HUD显示已放/2。AI突击兵在需要补弹的友军附近放箱，服务器给全部LAN客户同步位置、归属和有效期。</w:t>
       </w:r>
     </w:p>
     <w:p>
       <w:r>
-        <w:t>入场是基于现有战场的实时镜头与任务字幕动画，不使用战地或三角洲的视频、商标和角色资源。结算显示动态镜头、胜败徽记、玩家成绩和四人小队卡片，再提供重开或返回菜单。</w:t>
+        <w:t>步兵受伤或开火都会把脱战时间设为当前时间加8秒；到期后25HP/s恢复，封顶100。投掷也重置脱战，车内不回血。濒死不按普通回血救活，只能由医疗救援。</w:t>
       </w:r>
     </w:p>
     <w:p>
       <w:r>
-        <w:t>参考来源：EA官方 Loadout Creation and Weapon Classes，https://www.ea.com/games/battlefield/battlefield-6/news/loadout-creation-and-weapon-classes；Delta Force官方枪匠/配装介绍与用户提供截图。采用兵种与装备图片选择的交互结构，不宣称原版UI或资产复刻。</w:t>
+        <w:t>保持装备按键取出、左键使用、1/2回枪的流程。工程工具、防空与反装甲、医疗、侦察装备仍按目标、距离、冷却和数量执行；烟幕不允许视觉透视。</w:t>
       </w:r>
     </w:p>
     <w:p>
@@ -87,37 +87,37 @@
         <w:pageBreakBefore/>
       </w:pPr>
       <w:r>
-        <w:t>AI行为与装备可用性</w:t>
+        <w:t>濒死 救援与死亡部署</w:t>
       </w:r>
     </w:p>
     <w:p>
       <w:r>
-        <w:t>默认难度降为新兵，第一次升级旧配置也迁移为新兵；玩家可之后选择普通/老兵。视觉反应时间由原0.8/0.5/0.32调整为1.15/0.8/0.45秒并叠加少量随机差异；散布扩大，伤害乘数降为0.4/0.55/0.7，短点射后停顿加长。车辆AI伤害也按0.45/0.65/0.85缩放。</w:t>
+        <w:t>步兵受到致命伤后进入DOWNED：HP0、失去正常行走与射击、30秒倒计时，低位倾斜倒地镜头，H或按钮呼叫救援。此时还不记录最终阵亡、不发最终击杀积分、不扣最终死亡票，也不能提前部署。命中反馈区分击倒和载具击毁。</w:t>
       </w:r>
     </w:p>
     <w:p>
       <w:r>
-        <w:t>AI以小队目标和近处实际威胁为主，目标搜索减少对玩家的偏好，追踪范围随难度为80/95/112m；远离据点任务时只有近距离直接威胁继续作战。同时攻击玩家的步兵射手上限随难度为1/2/3。小队共享最后已知位置，遮挡后不会持续读取敌人的实时坐标。受压、低血量、撤退、掩体和听觉搜寻仍保留。</w:t>
+        <w:t>附近同阵营医疗AI优先选择真人伤员，通常60m内寻找救援路径，呼叫后扩大到100m。按8.6m/s接近，在3m内救起，55HP和短出生保护；手持医疗装备的玩家同样可救援。救起后自动关闭倒地界面并恢复镜头/操作，不保留死亡HUD。</w:t>
       </w:r>
     </w:p>
     <w:p>
       <w:r>
-        <w:t>突击AI用卡宾枪并补充附近AI弹药，医疗AI用冲锋枪并治疗/救援，侦察AI用狙击枪并在受压时放烟，工程AI用机枪并修理、发射反载具火箭或对空制导弹。射击按所持枪的自动/半自动、弹匣、装填和伤害执行。装备动作有冷却，影响真实生命、弹药、烟幕视线和弹体。</w:t>
+        <w:t>长按空格或界面按钮把倒计时下降速度提高约13倍，约2.3秒放弃；松开恢复普通速度。倒计时到0只执行一次最终死亡，之后倒地/升空镜头返回部署图。30秒未救援也执行同一流程。LAN通过输入giveUp与rescue动作管理，不由客户自己改生命状态。</w:t>
       </w:r>
     </w:p>
     <w:p>
       <w:r>
-        <w:t>防空发射器保持B/6取出、左键发射的装备武器流程。扩大捕获锥及450m范围，HUD明确显示未发现目标、捕获与距离、冷却装填、弹药耗尽。只锁定敌方空中载具，三维检查建筑遮挡。持续按住左键可在获得目标后发射，弹药和装填仍由权威逻辑约束。</w:t>
+        <w:t>脱离卡死按照本轮明确要求改为直接死亡，20秒按钮冷却，并进入死亡镜头和部署图；不再免费移动到附近安全地形。载具炸毁时全部乘员直接阵亡，不留在残骸里，也不进入可救援状态。</w:t>
       </w:r>
     </w:p>
     <w:p>
       <w:r>
-        <w:t>工程维修工具按住左键重复修理附近受损己方车辆，有0.75秒间隔，工具本身不消耗一次性数量。其他装备仍按数量和有效目标消耗；医疗与维修无法无目标刷分。图标HUD显示G/X/Z/B及数字快捷键、数量和选中装备。</w:t>
+        <w:t>地图真人显示选项为关闭、仅同阵营、全部玩家，主菜单和Esc设置可保存；自己的箭头总保留。全部只放宽真人标记，AI敌人仍遵守侦察/可见情报。真人使用较大的白边符号；己方空座车辆仍可部署，满员/交火/已毁/未落地不允许。</w:t>
       </w:r>
     </w:p>
     <w:p>
       <w:r>
-        <w:t>AI仍是有冷却的规则式战术系统，不是完整人类操作模拟；防空是宽锥捕获与制导，未实现雷达建模、干扰弹和真实制导系统的全部细节。</w:t>
+        <w:t>小队路线只显示自己阵营，修复红方也显示蓝方路线的信息泄漏。部署地图删除V编号和HQ大字，使用基地、旗帜、小队和车型图标。同车座位合并为地图图标，列表保留明确座位名字。密集基地按实际矩形宽高加8px间距避让，图标适当偏移，不把视觉图标位置当物理出生坐标。</w:t>
       </w:r>
     </w:p>
     <w:p>
@@ -126,37 +126,37 @@
         <w:pageBreakBefore/>
       </w:pPr>
       <w:r>
-        <w:t>载具规模与弹药差异</w:t>
+        <w:t>载具武器 改装与干扰</w:t>
       </w:r>
     </w:p>
     <w:p>
       <w:r>
-        <w:t>全场载具上限在开局/建房设置为0–20，默认8辆。默认两军各4辆，包含步战车、侦察车、防空车和直升机；七种型号仍在目录中，其他型号可在空位时征用或通过更高上限出现。上限计入空投，不会出现飞机还在降落时继续无限召唤。</w:t>
+        <w:t>移除全场限车设置与逻辑，基地两队各7辆全部可用，征用不再被全球数量配额拒绝。仍保留征用点费用、支援冷却和落地碰撞避让；征用车辆毁坏不免费重生。运输60秒、侦察70秒、普通90秒、坦克120秒的基地重生节奏保留，事件不跳过等待。</w:t>
       </w:r>
     </w:p>
     <w:p>
       <w:r>
-        <w:t>达到上限时征用拒绝且不扣积分。基地重生也检查当前全场活动数量；征用载具占满容量时基地车辆继续等待。征用载具被击毁仍不免费重生。普通车辆重生90秒，侦察车70秒，运输车60秒，坦克120秒；装甲突击事件不再把击毁车辆的等待直接缩为5.5秒。</w:t>
+        <w:t>驾驶员同轴机枪跟随主炮，有独立模型与炮口，不共用机枪座转向。正常炮塔高度恢复2.1m，残骸才降低。驾驶员1/2切双武器：坦克与步战车为主炮和同轴机枪；防空车为对空炮和对空制导；直升机与喷气机为原主武器与制导弹。侦察車保留单机枪，运输车驾驶员无武器、机枪座独立。乘员不能凭准星方向从车尾开炮，炮弹起点和方向仍来自当前实际炮管。</w:t>
       </w:r>
     </w:p>
     <w:p>
       <w:r>
-        <w:t>坦克APFSDS弹速420m/s，重力0.8，爆炸半径2.4m，破甲倍率1.25；步战车30mm HE为180m/s、重力4、半径4m、破甲0.7。坦克远距离近似直线，更适于装甲精确打击；步战车偏向较低破甲的区域高爆。防空35mm为280m/s、重力1.5，直升机70mm HE为115m/s、重力3、半径6m；喷气机25mm AP为330m/s、重力1。</w:t>
+        <w:t>Esc设置中支持坦克、IFV、AA和飞机选择穿甲/高爆弹药档；高爆扩大爆炸范围、降低对装甲倍率及基础伤害。侦察和运输车不能加主炮。原车型弹速和重力保持差异，例如坦克420m/s及低重力，IFV180m/s区域高爆，直升机115m/s火箭；改装不是完整附件树。</w:t>
       </w:r>
     </w:p>
     <w:p>
       <w:r>
-        <w:t>玩家和AI共用弹速、重力、飞行步进和撞击流程。炮管只按当前炮塔方向发射；坦克炮塔转动速率仍为0.85rad/s，不能瞬间转到屁股后发炮。AI不会在开火函数再次额外转动炮塔，防空AI按空中目标高度转动。机枪仍为轻武器，不与重炮共享伤害。</w:t>
+        <w:t>制导捕获范围650m，持续瞄准约1.5秒后锁定；要求敌车存活、未被干扰，三维检查建筑和烟幕。AA只锁空中敌车，飞机可锁空中/地面敌车。目标被锁定时出现警告和警报声；导弹7秒冷却、145m/s跟踪，保持实际飞行及命中过程。</w:t>
       </w:r>
     </w:p>
     <w:p>
       <w:r>
-        <w:t>V自由切换步兵和载具视角，右键瞄准暂时回到瞄准视角。第三人称摄像机对建筑进行距离缩短，避免常见墙后镜头。既有座位、抢AI驾驶位、专属空投、己方空座部署、飞行重力和撞击损伤继续保留。</w:t>
+        <w:t>X特色功能：飞机热诱弹，坦克/IFV/AA防护烟幕，侦察车12秒扫描，运输车放补给箱。干扰持续5秒、冷却24秒，比导弹长；期间无法锁定，并解除已发射弹的跟踪。弹体脱锁后继续飞行，不能保证近距离干扰必躲开。干扰过期后重新累计锁定。AI驾驶员也对锁定警告释放防护。</w:t>
       </w:r>
     </w:p>
     <w:p>
       <w:r>
-        <w:t>此处是游戏化的弹道和驾驶模型，不是专业装甲穿深、空气动力或刚体物理模拟。弹药名和参数为项目虚构配置。</w:t>
+        <w:t>坦克炮塔略加快到1.2rad/s，其余主炮1.9rad/s。准星显示请求方向，新增空心圈表示实际炮管方向、虚线圈表示当前非制导弹道预计落点；屏外和镜头后的点隐藏。预测不是命中承诺，移动目标与制导转向会改变结果。</w:t>
       </w:r>
     </w:p>
     <w:p>
@@ -165,42 +165,37 @@
         <w:pageBreakBefore/>
       </w:pPr>
       <w:r>
-        <w:t>完整验证与使用说明</w:t>
+        <w:t>爆炸 跳伞与AI小队</w:t>
       </w:r>
     </w:p>
     <w:p>
       <w:r>
-        <w:t>最终严格TS、79项单元测试、29项Chrome浏览器、8/16/32/64战局、LAN真实HTTP/WS与生产构建通过。默认500票32v32完成于488.875模拟秒，red胜；占点变化25，阵亡364，步兵射击2059，载具射击2746，炮击落点8，导航失败0。三类大事件和装甲协同仍通过。</w:t>
+        <w:t>车辆HP归零立即触发爆炸、禁用座位和移动，杀死所有乘员并清空座位。可见模型变焦黑、压扁倾斜、炮塔和炮管损坏并冒烟；12秒后隐藏，之后等基地重生窗口，征用残骸不重生。不会继续用正常可驾驶车辆外观显示尸体。</w:t>
       </w:r>
     </w:p>
     <w:p>
       <w:r>
-        <w:t>新单元覆盖0/8辆全场上限、平衡阵营、空投占位/不扣积分/基地等待、长重生、弹道差异、致命实际伤害只确认一次、轻武器装甲伤害、AI四枪与治疗维修、防空目标类型与捕获锥。原部署、座位、飞行、装备和烟幕测试保留。旧全车型测试显式选20辆上限，IFV破甲测试按照HE伤害改变射击次数，没有删除毁伤和重生断言。</w:t>
+        <w:t>按要求删除所有载具坠落/撞地掉血。无人直升机旋翼动力衰减并下坠，无人喷气机保留惯性、失速后下落；它们不会因为无驾驶而永远悬空。碰墙处理停住/避障仍有，非完整刚体碰撞系统。</w:t>
       </w:r>
     </w:p>
     <w:p>
       <w:r>
-        <w:t>浏览器新检查配装只在入场后出现、无下拉配装、四兵种/图片选择、准备时模拟冻结、配置保存和应用、全员准备门槛、倒计时、图标HUD、防空提示、第一/第三人称、伤害数值、小队结算及视角动画。单人AI医疗救援后退出死亡界面也通过实际浏览器回归。原26项均重跑，含真实IP生产网页分享加入、连续移动、移动开镜枪口、死亡镜头、空投、驾驶和阵营管理。</w:t>
+        <w:t>飞行类载具手动下车时继承真实高度，打开原创半球伞衣和绳索模型，人物以5m/s下降到地面；不瞬间传送。地面不能隔很高的高度进入空中飞机。载具被毁则直接死亡，不自动替乘员打开救命伞。</w:t>
       </w:r>
     </w:p>
     <w:p>
       <w:r>
-        <w:t>中间QA发现旧生产构建与新服务版本不一致、切枪后的读取需要等待绘制帧，以及新AI弹道使默认战局在第三大事件之前结束；分别更新构建、修正测试时序、调整大事件间隔至18–30秒。最后以稳定源码全量复验。Three.js大chunk警告保留，短时帧率仅为样本。</w:t>
+        <w:t>四人小队分配突击、医疗、侦察与工程，保留不同枪械和职责。任务选择增加原目标稳定偏好，减小随机扰动；目标/战术没变化不重选接近点。狙击手优选85m、机枪45m、冲锋22m、其他35m交战距离，压制和分批推进周期交替，侧翼有更大横移。掩体、退却、局部兵力、视觉听觉与共享最后已知情报保留。</w:t>
       </w:r>
     </w:p>
     <w:p>
       <w:r>
-        <w:t>实际网络验证使用测试环境网卡10.100.113.195，不等于已直接验收用户两台电脑。房主Ctrl+C停旧服务，再npm run lan，默认端口7878；朋友打开完整分享链接、点击加入、完成配装并READY。房主等全员READY后START。前端和服务都需0.13版。</w:t>
+        <w:t>修复远离小队目标时不射击已看见敌人，并保持仍可见的敌人作为当前目标，避免每次思考重置反应计时。正常8.6m/s、紧急13.7m/s与玩家一致，不再各自使用更高速度。医疗路径救援在装备冷却之外持续执行。AI仍受反应、散布、压制和难度限制，不瞬间锁头。</w:t>
       </w:r>
     </w:p>
     <w:p>
       <w:r>
-        <w:t>飞行与炮弹仍为简化动力学；命中数字在准星附近汇总，不是每个目标头顶浮动条，也未新增独立头部伤害倍率。防空是宽锥目标捕获后制导，没有真实雷达、干扰弹或锁定音阶。AI装备为规则式有冷却的战术动作，不是完整人类操作模拟。入场/结算采用现有场景与模型的实时镜头和CSS动画，不含新的电影级角色动作或固定翼编队视频。局域网未直接在用户两台电脑验收，不支持公网匹配和重连续局。短时headless帧率不能作为所有设备长期FPS承诺。</w:t>
-      </w:r>
-    </w:p>
-    <w:p>
-      <w:r>
-        <w:t>用户11首音乐仅留在本机与私人完整ZIP，公开GitHub/源码ZIP不含MP3。README、PROGRESS、CHANGELOG、QA_REPORT、QA_RESULTS、DOCX和测试证据更新Main。本机源码及dist按交付同步，ZIP完整性与SHA256单独验证。</w:t>
+        <w:t>驾驶必须有实际AI/真人占驾驶位；接管AI驾驶权仍令其下车。AI坦克保持较远支援距离，AA倾向己方点与空中威胁，车辆靠近任务范围停下；锁定警报触发特色防护。AI改进是规则系统的真实动作，不宣称达到商业游戏同等水平。</w:t>
       </w:r>
     </w:p>
     <w:p>
@@ -209,7 +204,51 @@
         <w:pageBreakBefore/>
       </w:pPr>
       <w:r>
-        <w:t>实际准备与战斗界面</w:t>
+        <w:t>最终QA 运行与限制</w:t>
+      </w:r>
+    </w:p>
+    <w:p>
+      <w:r>
+        <w:t>91/91单元、33/33Chrome及Strict TS、自动战局、LAN、build通过。默认500票32v32持续466.5模拟秒，red胜，蓝0.0:红227.3；占点21次、阵亡51、步兵射击2590、载具射击1608、击毁车辆23。三类事件共8次，炮击落点8，导航失败0，反攻及装甲协同通过。</w:t>
+      </w:r>
+    </w:p>
+    <w:p>
+      <w:r>
+        <w:t>新12项单元覆盖引信/烟幕/地面箱/两箱替换/30秒濒死/长按放弃/实际寻路救援/四座死亡/跳伞/回血重置/锁定干扰重锁/弹药差异和AI攻击速度。原79项按新需求调整明确改变的旧期望后全部保留。浏览器新增投掷实体、倒地按钮与镜头、地图无重叠、双武器及真实制导发射/干扰、两客户端弹体和箱归属；原29项全量回归，包括红方路线精确断言。地图阵营修正后重跑本轮4项，随后同轴与炮塔高度修正后再次重跑91逻辑和33浏览器。</w:t>
+      </w:r>
+    </w:p>
+    <w:p>
+      <w:r>
+        <w:t>中间检查发现斜向图标仍重叠，改为实际矩形避让；救起后新增回血使HP高于55，断言改为至少55。源码热更新曾中断两联机页面，固定源码后的完整检查通过。导弹测试原本可能空数组通过，补强为先确认真实发射带目标的弹，再测干扰。测试目标有真实飞行动作，发射检查在同一原子时刻定位。</w:t>
+      </w:r>
+    </w:p>
+    <w:p>
+      <w:r>
+        <w:t>重复READY提交在已开战阶段不再绕过死亡重新出生。平衡改变后短局可能在炮击打完前结束，事件间隔改15–22秒、首事件46–55秒；默认完整战局确实出现三类事件和全部炮击落点。</w:t>
+      </w:r>
+    </w:p>
+    <w:p>
+      <w:r>
+        <w:t>LAN验证使用测试环境网卡10.100.113.195和两Chrome页面，含八人上限、阵营及准备门槛。短时headless32v32 59.99–60.02FPS，773draw calls，不代表用户硬件长期性能。</w:t>
+      </w:r>
+    </w:p>
+    <w:p>
+      <w:r>
+        <w:t>房主停旧进程后npm run lan，端口7878。朋友用分享链接加入、配装、READY，房主全员准备后START；朋友不需要包。只玩单人则点击SOLO。G取出后左键投掷，H救援、长按空格放弃；载具1/2武器、X特色装备，Esc弹药档和地图真人显示。</w:t>
+      </w:r>
+    </w:p>
+    <w:p>
+      <w:r>
+        <w:t>飞行和炮弹是简化动力学，锁定为视线/距离/锥形规则，非完整雷达热源模拟；导弹脱锁后继续弹道飞行，不保证避弹必成功。AI为规则与路径驱动的四人战术系统，不能称为COD或战地原版AI。改装目前只有适配车型的穿甲/高爆和内置第二武器，没有完整附件树。预测落点针对非制导弹道，制导轨迹受移动目标影响。方块角色与实时入场/结算镜头不是AAA模型或电影动画。尚未直接在用户两台真实电脑验收LAN，也未验证跨公网或断线续局。短时headless帧率不是长期性能承诺。</w:t>
+      </w:r>
+    </w:p>
+    <w:p>
+      <w:pPr>
+        <w:pStyle w:val="Heading1"/>
+        <w:pageBreakBefore/>
+      </w:pPr>
+      <w:r>
+        <w:t>实际浏览器截图</w:t>
       </w:r>
     </w:p>
     <w:p>
@@ -225,7 +264,7 @@
               <a:graphicData uri="http://schemas.openxmlformats.org/drawingml/2006/picture">
                 <pic:pic>
                   <pic:nvPicPr>
-                    <pic:cNvPr id="0" name="preparation-013.png"/>
+                    <pic:cNvPr id="0" name="downed-014.png"/>
                     <pic:cNvPicPr/>
                   </pic:nvPicPr>
                   <pic:blipFill>
@@ -250,7 +289,7 @@
     </w:p>
     <w:p>
       <w:r>
-        <w:t>载入后的四兵种图片配装</w:t>
+        <w:t>30秒濒死、呼叫与放弃救援</w:t>
       </w:r>
     </w:p>
     <w:p>
@@ -266,7 +305,7 @@
               <a:graphicData uri="http://schemas.openxmlformats.org/drawingml/2006/picture">
                 <pic:pic>
                   <pic:nvPicPr>
-                    <pic:cNvPr id="0" name="hit-feedback-013.png"/>
+                    <pic:cNvPr id="0" name="deployment-icons-014.png"/>
                     <pic:cNvPicPr/>
                   </pic:nvPicPr>
                   <pic:blipFill>
@@ -291,7 +330,7 @@
     </w:p>
     <w:p>
       <w:r>
-        <w:t>实际伤害确认与图标装备HUD</w:t>
+        <w:t>部署地图小图标与避让</w:t>
       </w:r>
     </w:p>
     <w:p>
@@ -300,7 +339,7 @@
         <w:pageBreakBefore/>
       </w:pPr>
       <w:r>
-        <w:t>实际入场与结算界面</w:t>
+        <w:t>实际模型与载具界面</w:t>
       </w:r>
     </w:p>
     <w:p>
@@ -316,7 +355,7 @@
               <a:graphicData uri="http://schemas.openxmlformats.org/drawingml/2006/picture">
                 <pic:pic>
                   <pic:nvPicPr>
-                    <pic:cNvPr id="0" name="entry-013.png"/>
+                    <pic:cNvPr id="0" name="preparation-014.png"/>
                     <pic:cNvPicPr/>
                   </pic:nvPicPr>
                   <pic:blipFill>
@@ -341,7 +380,7 @@
     </w:p>
     <w:p>
       <w:r>
-        <w:t>战局启动倒计时与实景镜头</w:t>
+        <w:t>原创方块人物及四兵种图片配装</w:t>
       </w:r>
     </w:p>
     <w:p>
@@ -357,7 +396,7 @@
               <a:graphicData uri="http://schemas.openxmlformats.org/drawingml/2006/picture">
                 <pic:pic>
                   <pic:nvPicPr>
-                    <pic:cNvPr id="0" name="result-013.png"/>
+                    <pic:cNvPr id="0" name="vehicle-lock-014.png"/>
                     <pic:cNvPicPr/>
                   </pic:nvPicPr>
                   <pic:blipFill>
@@ -382,7 +421,7 @@
     </w:p>
     <w:p>
       <w:r>
-        <w:t>胜败徽记和小队成绩动画</w:t>
+        <w:t>第二武器、炮管与落点及装备状态</w:t>
       </w:r>
     </w:p>
     <w:sectPr>
@@ -419,7 +458,7 @@
       <w:pStyle w:val="Header"/>
     </w:pPr>
     <w:r>
-      <w:t>PROJECT IRONFRONT 0.13.0 开发与验证</w:t>
+      <w:t>PROJECT IRONFRONT 0.14.0 开发与验证</w:t>
     </w:r>
   </w:p>
 </w:hdr>
@@ -789,7 +828,7 @@
     <w:qFormat/>
     <w:rsid w:val="00FC693F"/>
     <w:pPr>
-      <w:spacing w:line="271" w:lineRule="auto" w:after="160"/>
+      <w:spacing w:line="269" w:lineRule="auto" w:after="160"/>
     </w:pPr>
     <w:rPr>
       <w:rFonts w:ascii="Arial Unicode MS" w:hAnsi="Arial Unicode MS" w:eastAsia="Arial Unicode MS"/>

</xml_diff>

<commit_message>
feat: 0.15 observed battlefield command and distinct vehicle maneuvering
</commit_message>
<xml_diff>
--- a/docs/DEVELOPMENT_REPORT.docx
+++ b/docs/DEVELOPMENT_REPORT.docx
@@ -7,39 +7,29 @@
         <w:pStyle w:val="Title"/>
       </w:pPr>
       <w:r>
-        <w:t>IRONFRONT 0.14.0</w:t>
+        <w:t>IRONFRONT 0.15.0</w:t>
         <w:br/>
-        <w:t>投掷 救援与载具战术</w:t>
+        <w:t>指挥情报与载具机动开发报告</w:t>
       </w:r>
     </w:p>
     <w:p>
       <w:r>
-        <w:t>本轮继续现有源码，重点修复无法投出的手雷与烟雾弹、全场限车影响基地驾驶、地图标记叠放、AI不攻击及随机走动，增加30秒濒死和救援、地面弹药箱、空中跳伞、双武器制导与干扰、弹药改装和实际炮管/落点提示。保持原单人及8人局域网、四兵种图片配装、征服与前线、大事件、枪口射线和音频系统。</w:t>
+        <w:t>本轮在原IRONFRONT代码上增加受观测情报限制的双方指挥官、小队局部自主决策、可忽略的玩家建议，拆分喷气机和直升机操控，增加两阶段导弹警报、有限寻的与机动脱离、双座摩托车和车体导航。结论基于代码、自动战局、实际Chrome画面和LAN权威服务验证。</w:t>
       </w:r>
     </w:p>
     <w:p>
       <w:r>
-        <w:t>任务开始核对远端Main和本机0.13.0均为9b71aeb06c8ab9eb5a819009261d8da38c2e7e9f，36个源码及版本文件逐字节一致。在原项目直接修改Main，新增模块按用户版本规则升级中间位到0.14.0。没有另起游戏项目或新分支。</w:t>
+        <w:t>任务开始fetch并核对Main与origin/main均为6f2c23d41f07ae4c07c4340e758c22cd12c3f61a；本机0.10至0.14五个历史目录当时都已同步0.14源码，逐字节检查没有差异。保留现有Conquest/前线、枪械、装备、救援、部署、音乐与最多八真人局域网，不另起分支或重做项目。按新功能规则升级到0.15.0。</w:t>
       </w:r>
     </w:p>
     <w:p>
       <w:r>
-        <w:t>检查发现旧手雷立即在远点产生伤害，没有飞行物；弹药装备立即补弹，没有地面箱；车辆上限参与基地重生和征用；载具被毁把乘员推出而非阵亡；空中下车直接落地。AI在远离任务时仅处理近处威胁，目标反复变化会重置反应计时，表现为不射击。逐项以真实状态、动作和权威联机数据修改。</w:t>
+        <w:t>先审计并完成情报层，再接入指挥和领队。原93项检查在情报阶段通过；之后每批改动执行Strict TS、单元或实际逻辑模拟，解决发现的回归，再进行完整浏览器检查。</w:t>
       </w:r>
     </w:p>
     <w:p>
       <w:r>
-        <w:t>最终严格TypeScript、91项单元、33项Chrome浏览器、8/16/32/64自动战局、非回环IP HTTP/WebSocket和生产Vite构建通过。详细机器可读结果在QA_RESULTS.json，完整输出在docs/qa/check-014.txt与browser-014.txt。Three.js大chunk警告保留。</w:t>
-      </w:r>
-    </w:p>
-    <w:p>
-      <w:r>
-        <w:t>本轮美术按用户提供的方块人物方向制作原创比例、像素脸、头发和胡须。阵营蓝红服装、真人识别胸章、独立枪械与装备保留。没有搬用Steve模型、战地商业资源或视频。</w:t>
-      </w:r>
-    </w:p>
-    <w:p>
-      <w:r>
-        <w:t>交付分为私人完整ZIP与公开源码ZIP。用户11首配乐仅本机与私人包；公开Main包含代码、可分发音效、导入清单、报告与QA截图，不上传用户MP3。</w:t>
+        <w:t>新增功能使用本地确定性游戏规则，不调用LLM或外部AI服务。公开代码、CC0音效、导入清单和本报告上传Main；十一首用户音乐只留本机和私人完整包。</w:t>
       </w:r>
     </w:p>
     <w:p>
@@ -48,37 +38,32 @@
         <w:pageBreakBefore/>
       </w:pPr>
       <w:r>
-        <w:t>投掷物 地面补给与恢复</w:t>
+        <w:t>情报边界与全局指挥</w:t>
       </w:r>
     </w:p>
     <w:p>
       <w:r>
-        <w:t>G或4先取出当前配装的手雷/烟雾弹，左键才使用。取出不消耗数量，投出后扣一次，取消正在进行的换弹以免动作冲突。第一人称手臂和装备向前甩出，世界中有独立可见弹体和旋转。单人及LAN使用同一权威状态，不只是屏幕特效。</w:t>
+        <w:t>原assignSquads通过localStrength读取敌军真实位置，最后已知目标分支还会读取消失目标的当前位置。现在Intelligence收到的报告包含来源、队伍小队、对象或区域、复制后的近似位置、时间、类别和置信度；Commander接口只接受地图点位、报告、友军小队摘要和票数，不能访问Battle或敌军实体。</w:t>
       </w:r>
     </w:p>
     <w:p>
       <w:r>
-        <w:t>弹体初速度由瞄准方向产生，基础22m/s并叠加向上5m/s，重力9.81；墙壁反弹、落地反弹，2.4秒后爆炸或起烟。手雷按真实三维爆炸位置和遮挡造成伤害，烟雾弹落点产生16秒烟幕，AI视线和目标捕获受实际烟幕影响。投出动画与旋转模型由thrown事件和grenades数组同步。</w:t>
+        <w:t>视觉报告24秒过期，声音8秒，据点60秒，置信度线性下降。当前、近期、最后已知状态分开；离开视线没有新观测就不更新坐标。同一来源类别对象每秒最多一份，报告最多192份，发送门控最多768项并清理旧项。烟幕和建筑仍是真实遮挡。</w:t>
       </w:r>
     </w:p>
     <w:p>
       <w:r>
-        <w:t>突击兵X/3是放箱装备：左键在地面放一个有外壳和金属带的实体弹药箱。附近7m内己方步兵自动补充枪械弹药，敌人无效且隔墙不补。玩家补储备弹，AI补弹匣；不直接把手中弹匣填满，也不无限补充投掷物和制导弹。</w:t>
+        <w:t>每方一名Commander，根据已报告据点状态、未知程度、敌方活动估计、友军健康、距离、票数、已有任务拥挤与路线失败评分，生成夺取、防守、增援、侦察与集结任务。12秒承诺窗口与原目标偏好减少任务摇摆，受压或失败允许提前变化。战略思考Easy6秒、Normal4秒、Hard3秒，大事件继续推动真实单位。</w:t>
       </w:r>
     </w:p>
     <w:p>
       <w:r>
-        <w:t>每位放置者最多两箱，10秒冷却；再放第3箱自动移除最早箱。普通箱180秒过期，运输车X放置箱60秒过期并受相同归属上限。HUD显示已放/2。AI突击兵在需要补弹的友军附近放箱，服务器给全部LAN客户同步位置、归属和有效期。</w:t>
+        <w:t>事件目标也改用友方报告估计；没有将真实敌军兵力藏进大事件助手后再反向泄漏给指挥。阵营票数和地图几何是公共游戏状态，兵员、车辆与其健康摘要只来自友军。</w:t>
       </w:r>
     </w:p>
     <w:p>
       <w:r>
-        <w:t>步兵受伤或开火都会把脱战时间设为当前时间加8秒；到期后25HP/s恢复，封顶100。投掷也重置脱战，车内不回血。濒死不按普通回血救活，只能由医疗救援。</w:t>
-      </w:r>
-    </w:p>
-    <w:p>
-      <w:r>
-        <w:t>保持装备按键取出、左键使用、1/2回枪的流程。工程工具、防空与反装甲、医疗、侦察装备仍按目标、距离、冷却和数量执行；烟幕不允许视觉透视。</w:t>
+        <w:t>起初守点评分过高，小规模测试没有交火；调整后真实单位推进、射击、占领和结算均完成。不是用随机无线电对白代表指挥行为。</w:t>
       </w:r>
     </w:p>
     <w:p>
@@ -87,37 +72,32 @@
         <w:pageBreakBefore/>
       </w:pPr>
       <w:r>
-        <w:t>濒死 救援与死亡部署</w:t>
+        <w:t>小队执行与玩家协作</w:t>
       </w:r>
     </w:p>
     <w:p>
       <w:r>
-        <w:t>步兵受到致命伤后进入DOWNED：HP0、失去正常行走与射击、30秒倒计时，低位倾斜倒地镜头，H或按钮呼叫救援。此时还不记录最终阵亡、不发最终击杀积分、不扣最终死亡票，也不能提前部署。命中反馈区分击倒和载具击毁。</w:t>
+        <w:t>SquadLeader每秒检查友方成员健康、距离、已目击目标和车辆占位，形成集结、移动、交战、驻守、占领、重整或撤退状态。成员保持侧向间距和交错跟随点；领队等待落后队员最多10秒，之后继续任务，避免一名复活队员阻止整队。</w:t>
       </w:r>
     </w:p>
     <w:p>
       <w:r>
-        <w:t>附近同阵营医疗AI优先选择真人伤员，通常60m内寻找救援路径，呼叫后扩大到100m。按8.6m/s接近，在3m内救起，55HP和短出生保护；手持医疗装备的玩家同样可救援。救起后自动关闭倒地界面并恢复镜头/操作，不保留死亡HUD。</w:t>
+        <w:t>真实交战时使用小队周期分批停下掩护与移动，侦察兵保留较远的射击距离；低生命、压制和明显的可见兵力劣势使个体找掩体或撤离。敌方局部兵力只计算可见敌人。掩体有5秒占用保留，死亡或过期释放，防止同一小队挤到一个点。</w:t>
       </w:r>
     </w:p>
     <w:p>
       <w:r>
-        <w:t>长按空格或界面按钮把倒计时下降速度提高约13倍，约2.3秒放弃；松开恢复普通速度。倒计时到0只执行一次最终死亡，之后倒地/升空镜头返回部署图。30秒未救援也执行同一流程。LAN通过输入giveUp与rescue动作管理，不由客户自己改生命状态。</w:t>
+        <w:t>医疗寻路靠近倒地友军、工程维修与反装甲、突击补给箱、侦察烟雾均仍改变真实状态。导航失败报告回到指挥官，下一轮可换目标。待命、移动、开火、救援与路线恢复沿用原权威Battle更新。</w:t>
       </w:r>
     </w:p>
     <w:p>
       <w:r>
-        <w:t>脱离卡死按照本轮明确要求改为直接死亡，20秒按钮冷却，并进入死亡镜头和部署图；不再免费移动到附近安全地形。载具炸毁时全部乘员直接阵亡，不留在残骸里，也不进入可救援状态。</w:t>
+        <w:t>HUD显示指挥建议的目标与原因。J接受后小队AI使用该任务；K忽略45秒内不会重复弹出同一建议。接受或忽略都不改变玩家位置、视角和武器。局域网动作由房主校验，只把对应真人阵营与小队的建议发给该客户端。</w:t>
       </w:r>
     </w:p>
     <w:p>
       <w:r>
-        <w:t>地图真人显示选项为关闭、仅同阵营、全部玩家，主菜单和Esc设置可保存；自己的箭头总保留。全部只放宽真人标记，AI敌人仍遵守侦察/可见情报。真人使用较大的白边符号；己方空座车辆仍可部署，满员/交火/已毁/未落地不允许。</w:t>
-      </w:r>
-    </w:p>
-    <w:p>
-      <w:r>
-        <w:t>小队路线只显示自己阵营，修复红方也显示蓝方路线的信息泄漏。部署地图删除V编号和HQ大字，使用基地、旗帜、小队和车型图标。同车座位合并为地图图标，列表保留明确座位名字。密集基地按实际矩形宽高加8px间距避让，图标适当偏移，不把视觉图标位置当物理出生坐标。</w:t>
+        <w:t>完整的战略护送、预备队和补给调度尚未完成，当前医疗/补给/维修是个体行为，不能等同于那些高级战略任务。可点击个人目标覆盖、重新请求建议、完整通道预约也列为后续模块。</w:t>
       </w:r>
     </w:p>
     <w:p>
@@ -126,37 +106,32 @@
         <w:pageBreakBefore/>
       </w:pPr>
       <w:r>
-        <w:t>载具武器 改装与干扰</w:t>
+        <w:t>飞行差异与导弹反馈</w:t>
       </w:r>
     </w:p>
     <w:p>
       <w:r>
-        <w:t>移除全场限车设置与逻辑，基地两队各7辆全部可用，征用不再被全球数量配额拒绝。仍保留征用点费用、支援冷却和落地碰撞避让；征用车辆毁坏不免费重生。运输60秒、侦察70秒、普通90秒、坦克120秒的基地重生节奏保留，事件不跳过等待。</w:t>
+        <w:t>喷气机W/S调节目标推力，A/D控制坡度并产生持续转弯，鼠标控制俯仰与小幅航向辅助。正常速度目标29至75m/s，Shift加力92m/s，Ctrl空气刹车32m/s。没有倒车或静止悬停；升降由机头俯仰与速度决定。</w:t>
       </w:r>
     </w:p>
     <w:p>
       <w:r>
-        <w:t>驾驶员同轴机枪跟随主炮，有独立模型与炮口，不共用机枪座转向。正常炮塔高度恢复2.1m，残骸才降低。驾驶员1/2切双武器：坦克与步战车为主炮和同轴机枪；防空车为对空炮和对空制导；直升机与喷气机为原主武器与制导弹。侦察車保留单机枪，运输车驾驶员无武器、机枪座独立。乘员不能凭准星方向从车尾开炮，炮弹起点和方向仍来自当前实际炮管。</w:t>
+        <w:t>直升机W/S前进倒退，A/D实际侧移，鼠标控制机头方向，空格上升与Ctrl下降；松开升降后趋于悬停，Shift加速48m/s。旋翼动力、机体倾斜和无驾驶重力下落保留。两类HUD分别显示空速高度坡度或高度升降率，底部操作提示不同。</w:t>
       </w:r>
     </w:p>
     <w:p>
       <w:r>
-        <w:t>Esc设置中支持坦克、IFV、AA和飞机选择穿甲/高爆弹药档；高爆扩大爆炸范围、降低对装甲倍率及基础伤害。侦察和运输车不能加主炮。原车型弹速和重力保持差异，例如坦克420m/s及低重力，IFV180m/s区域高爆，直升机115m/s火箭；改装不是完整附件树。</w:t>
+        <w:t>捕获阶段目标显示正在被锁定和较慢警报；导弹发射后目标显示导弹来袭、闪烁背景和较快音调。车辆导弹和步兵防空的观察/发射均通知目标。X热诱弹在捕获阶段清除发射方锁定进度，来袭阶段删除弹体引导目标。保护5秒，冷却24秒，弹体不会凭空消失。</w:t>
       </w:r>
     </w:p>
     <w:p>
       <w:r>
-        <w:t>制导捕获范围650m，持续瞄准约1.5秒后锁定；要求敌车存活、未被干扰，三维检查建筑和烟幕。AA只锁空中敌车，飞机可锁空中/地面敌车。目标被锁定时出现警告和警报声；导弹7秒冷却、145m/s跟踪，保持实际飞行及命中过程。</w:t>
+        <w:t>导弹最大转向1.25rad/s，寻的锥约77度，失去目标后的弹继续惯性飞行。高速横向机动能让目标离开寻的锥，是真实位置与角速度的结果，不能保证每次规避成功。自动测试实发导弹追击喷气机，机动中丢失引导且飞机未受伤、未使用热诱弹。</w:t>
       </w:r>
     </w:p>
     <w:p>
       <w:r>
-        <w:t>X特色功能：飞机热诱弹，坦克/IFV/AA防护烟幕，侦察车12秒扫描，运输车放补给箱。干扰持续5秒、冷却24秒，比导弹长；期间无法锁定，并解除已发射弹的跟踪。弹体脱锁后继续飞行，不能保证近距离干扰必躲开。干扰过期后重新累计锁定。AI驾驶员也对锁定警告释放防护。</w:t>
-      </w:r>
-    </w:p>
-    <w:p>
-      <w:r>
-        <w:t>坦克炮塔略加快到1.2rad/s，其余主炮1.9rad/s。准星显示请求方向，新增空心圈表示实际炮管方向、虚线圈表示当前非制导弹道预计落点；屏外和镜头后的点隐藏。预测不是命中承诺，移动目标与制导转向会改变结果。</w:t>
+        <w:t>本轮是街机飞行模型，不是完整刚体空气动力学。继续保留无坠落伤害、空中下车降落伞、炮管真实方向、独立弹药和两种武器。</w:t>
       </w:r>
     </w:p>
     <w:p>
@@ -165,37 +140,27 @@
         <w:pageBreakBefore/>
       </w:pPr>
       <w:r>
-        <w:t>爆炸 跳伞与AI小队</w:t>
+        <w:t>车辆导航与摩托车</w:t>
       </w:r>
     </w:p>
     <w:p>
       <w:r>
-        <w:t>车辆HP归零立即触发爆炸、禁用座位和移动，杀死所有乘员并清空座位。可见模型变焦黑、压扁倾斜、炮塔和炮管损坏并冒烟；12秒后隐藏，之后等基地重生窗口，征用残骸不重生。不会继续用正常可驾驶车辆外观显示尸体。</w:t>
+        <w:t>原车辆使用步兵同一寻路图，网格最近点可能在墙另一侧。现在按车型半径生成通行图并检查扫掠体积，起点终点选择能实际连通的可见网格节点，边和简化段均校验。找不到路返回失败，不伪造直达路径。</w:t>
       </w:r>
     </w:p>
     <w:p>
       <w:r>
-        <w:t>按要求删除所有载具坠落/撞地掉血。无人直升机旋翼动力衰减并下坠，无人喷气机保留惯性、失速后下落；它们不会因为无驾驶而永远悬空。碰墙处理停住/避障仍有，非完整刚体碰撞系统。</w:t>
+        <w:t>控制器每帧连续处理加减速与有限转向，弯道减速并避让其他车辆；重新寻路有间隔，不每帧重新A星。路线失败通过驾驶员所属小队报告。未用瞬移掩盖导航问题。完整道路车道、转弯半径最优路径与分阶段倒车控制仍可继续优化。</w:t>
       </w:r>
     </w:p>
     <w:p>
       <w:r>
-        <w:t>飞行类载具手动下车时继承真实高度，打开原创半球伞衣和绳索模型，人物以5m/s下降到地面；不瞬间传送。地面不能隔很高的高度进入空中飞机。载具被毁则直接死亡，不自动替乘员打开救命伞。</w:t>
+        <w:t>运输车让附近同小队成员进入真实空座，抵达目标附近AI实际下车并继续任务，暂时禁止立即回车。真人座位不会被强迫下车，玩家接管AI驾驶仍令AI安全退出。装甲推进测试要求存活且有真实AI驾驶员的坦克或步战车与步兵共同执行，不能让无人车靠driver字符串自动移动。</w:t>
       </w:r>
     </w:p>
     <w:p>
       <w:r>
-        <w:t>四人小队分配突击、医疗、侦察与工程，保留不同枪械和职责。任务选择增加原目标稳定偏好，减小随机扰动；目标/战术没变化不重选接近点。狙击手优选85m、机枪45m、冲锋22m、其他35m交战距离，压制和分批推进周期交替，侧翼有更大横移。掩体、退却、局部兵力、视觉听觉与共享最后已知情报保留。</w:t>
-      </w:r>
-    </w:p>
-    <w:p>
-      <w:r>
-        <w:t>修复远离小队目标时不射击已看见敌人，并保持仍可见的敌人作为当前目标，避免每次思考重置反应计时。正常8.6m/s、紧急13.7m/s与玩家一致，不再各自使用更高速度。医疗路径救援在装备冷却之外持续执行。AI仍受反应、散布、压制和难度限制，不瞬间锁头。</w:t>
-      </w:r>
-    </w:p>
-    <w:p>
-      <w:r>
-        <w:t>驾驶必须有实际AI/真人占驾驶位；接管AI驾驶权仍令其下车。AI坦克保持较远支援距离，AA倾向己方点与空中威胁，车辆靠近任务范围停下；锁定警报触发特色防护。AI改进是规则系统的真实动作，不宣称达到商业游戏同等水平。</w:t>
+        <w:t>M2 COURIER为双座无武装摩托车，有独立双轮、车架、座垫、把手和灯模型。85HP，33m/s最高速，19m/s²加速和0.85m车体半径。双方基地各一辆并加入Q支援：70RP、25秒冷却、8秒专属空投；两个座位都没有虚构机枪。原七车型ID与停车位置保持，摩托车追加。</w:t>
       </w:r>
     </w:p>
     <w:p>
@@ -204,42 +169,37 @@
         <w:pageBreakBefore/>
       </w:pPr>
       <w:r>
-        <w:t>最终QA 运行与限制</w:t>
+        <w:t>最终验证与交付</w:t>
       </w:r>
     </w:p>
     <w:p>
       <w:r>
-        <w:t>91/91单元、33/33Chrome及Strict TS、自动战局、LAN、build通过。默认500票32v32持续466.5模拟秒，red胜，蓝0.0:红227.3；占点21次、阵亡51、步兵射击2590、载具射击1608、击毁车辆23。三类事件共8次，炮击落点8，导航失败0，反攻及装甲协同通过。</w:t>
+        <w:t>Strict TS、106项单元、36项Chrome浏览器、LAN和生产build通过。默认32v32/500票实际模拟305秒，red获胜，据点变化14，步兵射击1444，阵亡26，载具射击1068，导航失败1。三类大事件及反攻、真实有人装甲推进回归通过。</w:t>
       </w:r>
     </w:p>
     <w:p>
       <w:r>
-        <w:t>新12项单元覆盖引信/烟幕/地面箱/两箱替换/30秒濒死/长按放弃/实际寻路救援/四座死亡/跳伞/回血重置/锁定干扰重锁/弹药差异和AI攻击速度。原79项按新需求调整明确改变的旧期望后全部保留。浏览器新增投掷实体、倒地按钮与镜头、地图无重叠、双武器及真实制导发射/干扰、两客户端弹体和箱归属；原29项全量回归，包括红方路线精确断言。地图阵营修正后重跑本轮4项，随后同轴与炮塔高度修正后再次重跑91逻辑和33浏览器。</w:t>
+        <w:t>20分钟加速场景使用99999票保持运行到1200秒：据点变化23、射击10960、阵亡46；重复座位0，报告峰值63，弹体峰值8，导航失败0，实际执行9.70秒。检查有限坐标、队伍任务、事件参与和有界集合；未垃圾回收前堆变化不作为无泄漏结论。另一次保留Battle对象的强制GC采样从初始4.53MiB到5分钟6.96MiB、10分钟6.96MiB、15分钟6.86MiB、20分钟6.91MiB，初始化后保持稳定；仅证明本种子的观测结果。</w:t>
       </w:r>
     </w:p>
     <w:p>
       <w:r>
-        <w:t>中间检查发现斜向图标仍重叠，改为实际矩形避让；救起后新增回血使HP高于55，断言改为至少55。源码热更新曾中断两联机页面，固定源码后的完整检查通过。导弹测试原本可能空数组通过，补强为先确认真实发射带目标的弹，再测干扰。测试目标有真实飞行动作，发射检查在同一原子时刻定位。</w:t>
+        <w:t>新增测试覆盖遮挡无视觉报告、最后已知位置冻结、衰减过期、任务分布与承诺、路线失败重新分配、建议接受忽略、飞机机动、两阶段警告、热诱弹解除、导弹有限转向、摩托车型、车体通行、真实运输下车以及无传送失败报告。旧测试中的车辆数量从14改16、支援项11改12，符合真实新对象。</w:t>
       </w:r>
     </w:p>
     <w:p>
       <w:r>
-        <w:t>重复READY提交在已开战阶段不再绕过死亡重新出生。平衡改变后短局可能在炮击打完前结束，事件间隔改15–22秒、首事件46–55秒；默认完整战局确实出现三类事件和全部炮击落点。</w:t>
+        <w:t>非回环网卡10.100.113.195的HTTP/WebSocket、最多8人、主机权限和两Chrome共享状态通过。短headless32v32采样59.98至60.01FPS，782绘制调用，不代表用户电脑长期FPS或跨用户电脑联机已确认。</w:t>
       </w:r>
     </w:p>
     <w:p>
       <w:r>
-        <w:t>LAN验证使用测试环境网卡10.100.113.195和两Chrome页面，含八人上限、阵营及准备门槛。短时headless32v32 59.99–60.02FPS，773draw calls，不代表用户硬件长期性能。</w:t>
+        <w:t>房主Ctrl+C停止旧服务，0.15目录运行npm run lan，端口仍7878；朋友打开分享IP链接与房间码加入，无需下载游戏包。单人依旧可独立开始。生成CRC验证的私人完整与公开源码ZIP，SHA256清单，源码及构建同步本机并更新Main。</w:t>
       </w:r>
     </w:p>
     <w:p>
       <w:r>
-        <w:t>房主停旧进程后npm run lan，端口7878。朋友用分享链接加入、配装、READY，房主全员准备后START；朋友不需要包。只玩单人则点击SOLO。G取出后左键投掷，H救援、长按空格放弃；载具1/2武器、X特色装备，Esc弹药档和地图真人显示。</w:t>
-      </w:r>
-    </w:p>
-    <w:p>
-      <w:r>
-        <w:t>飞行和炮弹是简化动力学，锁定为视线/距离/锥形规则，非完整雷达热源模拟；导弹脱锁后继续弹道飞行，不保证避弹必成功。AI为规则与路径驱动的四人战术系统，不能称为COD或战地原版AI。改装目前只有适配车型的穿甲/高爆和内置第二武器，没有完整附件树。预测落点针对非制导弹道，制导轨迹受移动目标影响。方块角色与实时入场/结算镜头不是AAA模型或电影动画。尚未直接在用户两台真实电脑验收LAN，也未验证跨公网或断线续局。短时headless帧率不是长期性能承诺。</w:t>
+        <w:t>仍使用原创规则驱动AI和轻量运动模型，未达到商业游戏NPC/刚体飞行模拟的复杂度。完整RESUPPLY、ESCORT、RESERVE等战略任务、自动召集远处运输乘员、全道路车道和转弯半径规划、可点击个人任务覆盖与“换一个建议”按钮尚未完成；医疗/维修/补给是实际个体行为，不能视作这些战略模块已经实现。指挥官未知信息会导致不理想分配，属于可见的限制。浏览器FPS仅短时headless采样，不代表用户硬件长期性能；本环境两个浏览器/LAN IP验证不等于用户两台电脑已实测。大于500kB的Three.js分块警告保留。</w:t>
       </w:r>
     </w:p>
     <w:p>
@@ -248,7 +208,7 @@
         <w:pageBreakBefore/>
       </w:pPr>
       <w:r>
-        <w:t>实际浏览器截图</w:t>
+        <w:t>实际浏览器画面</w:t>
       </w:r>
     </w:p>
     <w:p>
@@ -264,7 +224,98 @@
               <a:graphicData uri="http://schemas.openxmlformats.org/drawingml/2006/picture">
                 <pic:pic>
                   <pic:nvPicPr>
-                    <pic:cNvPr id="0" name="downed-014.png"/>
+                    <pic:cNvPr id="0" name="commander-015.png"/>
+                    <pic:cNvPicPr/>
+                  </pic:nvPicPr>
+                  <pic:blipFill>
+                    <a:blip r:embed="rId9"/>
+                    <a:stretch>
+                      <a:fillRect/>
+                    </a:stretch>
+                  </pic:blipFill>
+                  <pic:spPr>
+                    <a:xfrm>
+                      <a:off x="0" y="0"/>
+                      <a:ext cx="5394960" cy="3034665"/>
+                    </a:xfrm>
+                    <a:prstGeom prst="rect"/>
+                  </pic:spPr>
+                </pic:pic>
+              </a:graphicData>
+            </a:graphic>
+          </wp:inline>
+        </w:drawing>
+      </w:r>
+    </w:p>
+    <w:p>
+      <w:r>
+        <w:t>指挥建议已接受并由小队执行</w:t>
+      </w:r>
+    </w:p>
+    <w:p>
+      <w:r>
+        <w:drawing>
+          <wp:inline xmlns:a="http://schemas.openxmlformats.org/drawingml/2006/main" xmlns:pic="http://schemas.openxmlformats.org/drawingml/2006/picture">
+            <wp:extent cx="5394960" cy="3034665"/>
+            <wp:docPr id="2" name="Picture 2"/>
+            <wp:cNvGraphicFramePr>
+              <a:graphicFrameLocks noChangeAspect="1"/>
+            </wp:cNvGraphicFramePr>
+            <a:graphic>
+              <a:graphicData uri="http://schemas.openxmlformats.org/drawingml/2006/picture">
+                <pic:pic>
+                  <pic:nvPicPr>
+                    <pic:cNvPr id="0" name="jet-warning-015.png"/>
+                    <pic:cNvPicPr/>
+                  </pic:nvPicPr>
+                  <pic:blipFill>
+                    <a:blip r:embed="rId10"/>
+                    <a:stretch>
+                      <a:fillRect/>
+                    </a:stretch>
+                  </pic:blipFill>
+                  <pic:spPr>
+                    <a:xfrm>
+                      <a:off x="0" y="0"/>
+                      <a:ext cx="5394960" cy="3034665"/>
+                    </a:xfrm>
+                    <a:prstGeom prst="rect"/>
+                  </pic:spPr>
+                </pic:pic>
+              </a:graphicData>
+            </a:graphic>
+          </wp:inline>
+        </w:drawing>
+      </w:r>
+    </w:p>
+    <w:p>
+      <w:r>
+        <w:t>喷气机坡度空速与导弹来袭HUD</w:t>
+      </w:r>
+    </w:p>
+    <w:p>
+      <w:pPr>
+        <w:pStyle w:val="Heading1"/>
+        <w:pageBreakBefore/>
+      </w:pPr>
+      <w:r>
+        <w:t>直升机与轻型运输画面</w:t>
+      </w:r>
+    </w:p>
+    <w:p>
+      <w:r>
+        <w:drawing>
+          <wp:inline xmlns:a="http://schemas.openxmlformats.org/drawingml/2006/main" xmlns:pic="http://schemas.openxmlformats.org/drawingml/2006/picture">
+            <wp:extent cx="5394960" cy="3034665"/>
+            <wp:docPr id="3" name="Picture 3"/>
+            <wp:cNvGraphicFramePr>
+              <a:graphicFrameLocks noChangeAspect="1"/>
+            </wp:cNvGraphicFramePr>
+            <a:graphic>
+              <a:graphicData uri="http://schemas.openxmlformats.org/drawingml/2006/picture">
+                <pic:pic>
+                  <pic:nvPicPr>
+                    <pic:cNvPr id="0" name="heli-hud-015.png"/>
                     <pic:cNvPicPr/>
                   </pic:nvPicPr>
                   <pic:blipFill>
@@ -289,7 +340,7 @@
     </w:p>
     <w:p>
       <w:r>
-        <w:t>30秒濒死、呼叫与放弃救援</w:t>
+        <w:t>直升机升降侧移专用操作提示</w:t>
       </w:r>
     </w:p>
     <w:p>
@@ -297,7 +348,7 @@
         <w:drawing>
           <wp:inline xmlns:a="http://schemas.openxmlformats.org/drawingml/2006/main" xmlns:pic="http://schemas.openxmlformats.org/drawingml/2006/picture">
             <wp:extent cx="5394960" cy="3034665"/>
-            <wp:docPr id="2" name="Picture 2"/>
+            <wp:docPr id="4" name="Picture 4"/>
             <wp:cNvGraphicFramePr>
               <a:graphicFrameLocks noChangeAspect="1"/>
             </wp:cNvGraphicFramePr>
@@ -305,7 +356,7 @@
               <a:graphicData uri="http://schemas.openxmlformats.org/drawingml/2006/picture">
                 <pic:pic>
                   <pic:nvPicPr>
-                    <pic:cNvPr id="0" name="deployment-icons-014.png"/>
+                    <pic:cNvPr id="0" name="motorcycle-015.png"/>
                     <pic:cNvPicPr/>
                   </pic:nvPicPr>
                   <pic:blipFill>
@@ -330,103 +381,10 @@
     </w:p>
     <w:p>
       <w:r>
-        <w:t>部署地图小图标与避让</w:t>
-      </w:r>
-    </w:p>
-    <w:p>
-      <w:pPr>
-        <w:pStyle w:val="Heading1"/>
-        <w:pageBreakBefore/>
-      </w:pPr>
-      <w:r>
-        <w:t>实际模型与载具界面</w:t>
-      </w:r>
-    </w:p>
-    <w:p>
-      <w:r>
-        <w:drawing>
-          <wp:inline xmlns:a="http://schemas.openxmlformats.org/drawingml/2006/main" xmlns:pic="http://schemas.openxmlformats.org/drawingml/2006/picture">
-            <wp:extent cx="5394960" cy="3034665"/>
-            <wp:docPr id="3" name="Picture 3"/>
-            <wp:cNvGraphicFramePr>
-              <a:graphicFrameLocks noChangeAspect="1"/>
-            </wp:cNvGraphicFramePr>
-            <a:graphic>
-              <a:graphicData uri="http://schemas.openxmlformats.org/drawingml/2006/picture">
-                <pic:pic>
-                  <pic:nvPicPr>
-                    <pic:cNvPr id="0" name="preparation-014.png"/>
-                    <pic:cNvPicPr/>
-                  </pic:nvPicPr>
-                  <pic:blipFill>
-                    <a:blip r:embed="rId13"/>
-                    <a:stretch>
-                      <a:fillRect/>
-                    </a:stretch>
-                  </pic:blipFill>
-                  <pic:spPr>
-                    <a:xfrm>
-                      <a:off x="0" y="0"/>
-                      <a:ext cx="5394960" cy="3034665"/>
-                    </a:xfrm>
-                    <a:prstGeom prst="rect"/>
-                  </pic:spPr>
-                </pic:pic>
-              </a:graphicData>
-            </a:graphic>
-          </wp:inline>
-        </w:drawing>
-      </w:r>
-    </w:p>
-    <w:p>
-      <w:r>
-        <w:t>原创方块人物及四兵种图片配装</w:t>
-      </w:r>
-    </w:p>
-    <w:p>
-      <w:r>
-        <w:drawing>
-          <wp:inline xmlns:a="http://schemas.openxmlformats.org/drawingml/2006/main" xmlns:pic="http://schemas.openxmlformats.org/drawingml/2006/picture">
-            <wp:extent cx="5394960" cy="3034665"/>
-            <wp:docPr id="4" name="Picture 4"/>
-            <wp:cNvGraphicFramePr>
-              <a:graphicFrameLocks noChangeAspect="1"/>
-            </wp:cNvGraphicFramePr>
-            <a:graphic>
-              <a:graphicData uri="http://schemas.openxmlformats.org/drawingml/2006/picture">
-                <pic:pic>
-                  <pic:nvPicPr>
-                    <pic:cNvPr id="0" name="vehicle-lock-014.png"/>
-                    <pic:cNvPicPr/>
-                  </pic:nvPicPr>
-                  <pic:blipFill>
-                    <a:blip r:embed="rId14"/>
-                    <a:stretch>
-                      <a:fillRect/>
-                    </a:stretch>
-                  </pic:blipFill>
-                  <pic:spPr>
-                    <a:xfrm>
-                      <a:off x="0" y="0"/>
-                      <a:ext cx="5394960" cy="3034665"/>
-                    </a:xfrm>
-                    <a:prstGeom prst="rect"/>
-                  </pic:spPr>
-                </pic:pic>
-              </a:graphicData>
-            </a:graphic>
-          </wp:inline>
-        </w:drawing>
-      </w:r>
-    </w:p>
-    <w:p>
-      <w:r>
-        <w:t>第二武器、炮管与落点及装备状态</w:t>
+        <w:t>双座无武装摩托车与独立模型</w:t>
       </w:r>
     </w:p>
     <w:sectPr>
-      <w:headerReference w:type="default" r:id="rId9"/>
-      <w:footerReference w:type="default" r:id="rId10"/>
       <w:pgSz w:w="11909" w:h="16834"/>
       <w:pgMar w:top="936" w:right="1008" w:bottom="936" w:left="1008" w:header="720" w:footer="720" w:gutter="0"/>
       <w:cols w:space="720"/>
@@ -434,34 +392,6 @@
     </w:sectPr>
   </w:body>
 </w:document>
-</file>
-
-<file path=word/footer1.xml><?xml version="1.0" encoding="utf-8"?>
-<w:ftr xmlns:m="http://schemas.openxmlformats.org/officeDocument/2006/math" xmlns:mc="http://schemas.openxmlformats.org/markup-compatibility/2006" xmlns:mo="http://schemas.microsoft.com/office/mac/office/2008/main" xmlns:mv="urn:schemas-microsoft-com:mac:vml" xmlns:o="urn:schemas-microsoft-com:office:office" xmlns:r="http://schemas.openxmlformats.org/officeDocument/2006/relationships" xmlns:v="urn:schemas-microsoft-com:vml" xmlns:w10="urn:schemas-microsoft-com:office:word" xmlns:w14="http://schemas.microsoft.com/office/word/2010/wordml" xmlns:w="http://schemas.openxmlformats.org/wordprocessingml/2006/main" xmlns:wne="http://schemas.microsoft.com/office/word/2006/wordml" xmlns:wp14="http://schemas.microsoft.com/office/word/2010/wordprocessingDrawing" xmlns:wp="http://schemas.openxmlformats.org/drawingml/2006/wordprocessingDrawing" xmlns:wpc="http://schemas.microsoft.com/office/word/2010/wordprocessingCanvas" xmlns:wpg="http://schemas.microsoft.com/office/word/2010/wordprocessingGroup" xmlns:wpi="http://schemas.microsoft.com/office/word/2010/wordprocessingInk" xmlns:wps="http://schemas.microsoft.com/office/word/2010/wordprocessingShape" mc:Ignorable="w14 wp14">
-  <w:p>
-    <w:pPr>
-      <w:pStyle w:val="Footer"/>
-      <w:jc w:val="right"/>
-    </w:pPr>
-    <w:r>
-      <w:t xml:space="preserve">2026-10-09  </w:t>
-    </w:r>
-    <w:fldSimple w:instr="PAGE"/>
-  </w:p>
-</w:ftr>
-</file>
-
-<file path=word/header1.xml><?xml version="1.0" encoding="utf-8"?>
-<w:hdr xmlns:m="http://schemas.openxmlformats.org/officeDocument/2006/math" xmlns:mc="http://schemas.openxmlformats.org/markup-compatibility/2006" xmlns:mo="http://schemas.microsoft.com/office/mac/office/2008/main" xmlns:mv="urn:schemas-microsoft-com:mac:vml" xmlns:o="urn:schemas-microsoft-com:office:office" xmlns:r="http://schemas.openxmlformats.org/officeDocument/2006/relationships" xmlns:v="urn:schemas-microsoft-com:vml" xmlns:w10="urn:schemas-microsoft-com:office:word" xmlns:w14="http://schemas.microsoft.com/office/word/2010/wordml" xmlns:w="http://schemas.openxmlformats.org/wordprocessingml/2006/main" xmlns:wne="http://schemas.microsoft.com/office/word/2006/wordml" xmlns:wp14="http://schemas.microsoft.com/office/word/2010/wordprocessingDrawing" xmlns:wp="http://schemas.openxmlformats.org/drawingml/2006/wordprocessingDrawing" xmlns:wpc="http://schemas.microsoft.com/office/word/2010/wordprocessingCanvas" xmlns:wpg="http://schemas.microsoft.com/office/word/2010/wordprocessingGroup" xmlns:wpi="http://schemas.microsoft.com/office/word/2010/wordprocessingInk" xmlns:wps="http://schemas.microsoft.com/office/word/2010/wordprocessingShape" mc:Ignorable="w14 wp14">
-  <w:p>
-    <w:pPr>
-      <w:pStyle w:val="Header"/>
-    </w:pPr>
-    <w:r>
-      <w:t>PROJECT IRONFRONT 0.14.0 开发与验证</w:t>
-    </w:r>
-  </w:p>
-</w:hdr>
 </file>
 
 <file path=word/numbering.xml><?xml version="1.0" encoding="utf-8"?>
@@ -828,7 +758,7 @@
     <w:qFormat/>
     <w:rsid w:val="00FC693F"/>
     <w:pPr>
-      <w:spacing w:line="269" w:lineRule="auto" w:after="160"/>
+      <w:spacing w:line="264" w:lineRule="auto" w:after="160"/>
     </w:pPr>
     <w:rPr>
       <w:rFonts w:ascii="Arial Unicode MS" w:hAnsi="Arial Unicode MS" w:eastAsia="Arial Unicode MS"/>

</xml_diff>

<commit_message>
feat: 0.16 distinct vehicle interiors and stronger combat feedback
</commit_message>
<xml_diff>
--- a/docs/DEVELOPMENT_REPORT.docx
+++ b/docs/DEVELOPMENT_REPORT.docx
@@ -7,215 +7,134 @@
         <w:pStyle w:val="Title"/>
       </w:pPr>
       <w:r>
-        <w:t>IRONFRONT 0.15.0</w:t>
+        <w:t>IRONFRONT 0.16.0</w:t>
         <w:br/>
-        <w:t>指挥情报与载具机动开发报告</w:t>
+        <w:t>驾驶舱与载具反馈开发报告</w:t>
       </w:r>
     </w:p>
     <w:p>
       <w:r>
-        <w:t>本轮在原IRONFRONT代码上增加受观测情报限制的双方指挥官、小队局部自主决策、可忽略的玩家建议，拆分喷气机和直升机操控，增加两阶段导弹警报、有限寻的与机动脱离、双座摩托车和车体导航。结论基于代码、自动战局、实际Chrome画面和LAN权威服务验证。</w:t>
-      </w:r>
-    </w:p>
-    <w:p>
-      <w:r>
-        <w:t>任务开始fetch并核对Main与origin/main均为6f2c23d41f07ae4c07c4340e758c22cd12c3f61a；本机0.10至0.14五个历史目录当时都已同步0.14源码，逐字节检查没有差异。保留现有Conquest/前线、枪械、装备、救援、部署、音乐与最多八真人局域网，不另起分支或重做项目。按新功能规则升级到0.15.0。</w:t>
-      </w:r>
-    </w:p>
-    <w:p>
-      <w:r>
-        <w:t>先审计并完成情报层，再接入指挥和领队。原93项检查在情报阶段通过；之后每批改动执行Strict TS、单元或实际逻辑模拟，解决发现的回归，再进行完整浏览器检查。</w:t>
-      </w:r>
-    </w:p>
-    <w:p>
-      <w:r>
-        <w:t>新增功能使用本地确定性游戏规则，不调用LLM或外部AI服务。公开代码、CC0音效、导入清单和本报告上传Main；十一首用户音乐只留本机和私人完整包。</w:t>
+        <w:t>本报告涵盖八类载具第一人称、座位切换、摩托车驾驶及骑乘表现，以及导弹警报与装甲受击修复。实际代码已实现并完成完整回归检查；本轮重点是让驾驶视角具有车型特征，并清楚告知乘员威胁和受击。</w:t>
       </w:r>
     </w:p>
     <w:p>
       <w:pPr>
         <w:pStyle w:val="Heading1"/>
-        <w:pageBreakBefore/>
       </w:pPr>
       <w:r>
-        <w:t>情报边界与全局指挥</w:t>
+        <w:t>基线与版本</w:t>
       </w:r>
     </w:p>
     <w:p>
       <w:r>
-        <w:t>原assignSquads通过localStrength读取敌军真实位置，最后已知目标分支还会读取消失目标的当前位置。现在Intelligence收到的报告包含来源、队伍小队、对象或区域、复制后的近似位置、时间、类别和置信度；Commander接口只接受地图点位、报告、友军小队摘要和票数，不能访问Battle或敌军实体。</w:t>
-      </w:r>
-    </w:p>
-    <w:p>
-      <w:r>
-        <w:t>视觉报告24秒过期，声音8秒，据点60秒，置信度线性下降。当前、近期、最后已知状态分开；离开视线没有新观测就不更新坐标。同一来源类别对象每秒最多一份，报告最多192份，发送门控最多768项并清理旧项。烟幕和建筑仍是真实遮挡。</w:t>
-      </w:r>
-    </w:p>
-    <w:p>
-      <w:r>
-        <w:t>每方一名Commander，根据已报告据点状态、未知程度、敌方活动估计、友军健康、距离、票数、已有任务拥挤与路线失败评分，生成夺取、防守、增援、侦察与集结任务。12秒承诺窗口与原目标偏好减少任务摇摆，受压或失败允许提前变化。战略思考Easy6秒、Normal4秒、Hard3秒，大事件继续推动真实单位。</w:t>
-      </w:r>
-    </w:p>
-    <w:p>
-      <w:r>
-        <w:t>事件目标也改用友方报告估计；没有将真实敌军兵力藏进大事件助手后再反向泄漏给指挥。阵营票数和地图几何是公共游戏状态，兵员、车辆与其健康摘要只来自友军。</w:t>
-      </w:r>
-    </w:p>
-    <w:p>
-      <w:r>
-        <w:t>起初守点评分过高，小规模测试没有交火；调整后真实单位推进、射击、占领和结算均完成。不是用随机无线电对白代表指挥行为。</w:t>
+        <w:t>任务开始fetch核对干净main与origin/main均为11f20f1766441e8a7adfbd040fcaffe39bad27ec。六个原本机目录与0.15.0源码及构建逐字节相同。先完成0.15.1反馈修复，之后用户追加驾驶舱要求，合并为新增功能版0.16.0，直接更新main，不另建分支。局域网前端与房主均需更新到0.16。</w:t>
       </w:r>
     </w:p>
     <w:p>
       <w:pPr>
         <w:pStyle w:val="Heading1"/>
-        <w:pageBreakBefore/>
       </w:pPr>
       <w:r>
-        <w:t>小队执行与玩家协作</w:t>
+        <w:t>实现与效果</w:t>
       </w:r>
     </w:p>
     <w:p>
       <w:r>
-        <w:t>SquadLeader每秒检查友方成员健康、距离、已目击目标和车辆占位，形成集结、移动、交战、驻守、占领、重整或撤退状态。成员保持侧向间距和交错跟随点；领队等待落后队员最多10秒，之后继续任务，避免一名复活队员阻止整队。</w:t>
+        <w:t>新增独立VehicleInterior渲染模块。八种驾驶位使用按车型创建的原创低多边形几何，而不是共用EquipmentView通用驾驶台。摩托车有油箱、把手、后视镜、仪表、握把和手臂；把手随实际转向变化，行驶产生轻微振动。第三人称中真实座位乘员显示骑乘姿势，空座不凭空显示乘员。</w:t>
       </w:r>
     </w:p>
     <w:p>
       <w:r>
-        <w:t>真实交战时使用小队周期分批停下掩护与移动，侦察兵保留较远的射击距离；低生命、压制和明显的可见兵力劣势使个体找掩体或撤离。敌方局部兵力只计算可见敌人。掩体有5秒占用保留，死亡或过期释放，防止同一小队挤到一个点。</w:t>
+        <w:t>坦克采用厚装甲观察窗口、侧架、控制握把及仪表。步战车使用较宽观察窗口、双显示器与操纵杆；防空车提供更高窗口、双雷达显示器与控制杆。侦察车采用开放车架，运兵车有挡风框、车顶、方向盘和附加显示器。喷气机是弧形单座舱框与飞行仪表；直升机是宽风挡、中间舱柱、双显示器、操纵杆及总距杆。</w:t>
       </w:r>
     </w:p>
     <w:p>
       <w:r>
-        <w:t>医疗寻路靠近倒地友军、工程维修与反装甲、突击补给箱、侦察烟雾均仍改变真实状态。导航失败报告回到指挥官，下一轮可换目标。待命、移动、开火、救援与路线恢复沿用原权威Battle更新。</w:t>
+        <w:t>驾驶位、机枪位和乘员位按实际座位渲染。乘员位显示座椅、扶手及后排结构，不显示假方向盘；机枪位继续使用独立机枪模型。V切换第一与第三人称；右键瞄具模式临时隐藏驾驶舱以保留射界，松开恢复。下车、死亡、入场和结算隐藏驾驶舱。</w:t>
       </w:r>
     </w:p>
     <w:p>
       <w:r>
-        <w:t>HUD显示指挥建议的目标与原因。J接受后小队AI使用该任务；K忽略45秒内不会重复弹出同一建议。接受或忽略都不改变玩家位置、视角和武器。局域网动作由房主校验，只把对应真人阵营与小队的建议发给该客户端。</w:t>
+        <w:t>镜头按车型及座位使用不同高度和侧向、前后偏移。仪表以真实速度、装甲血量和飞行高度更新，每0.15秒绘制一次；模型构造后重复使用，驾驶舱只渲染当前车型/座位。使用原有Three.js材质和原创几何，不增加外部资产依赖。</w:t>
       </w:r>
     </w:p>
     <w:p>
       <w:r>
-        <w:t>完整的战略护送、预备队和补给调度尚未完成，当前医疗/补给/维修是个体行为，不能等同于那些高级战略任务。可点击个人目标覆盖、重新请求建议、完整通道预约也列为后续模块。</w:t>
+        <w:t>同时包含0.15.1反馈修复：导弹来袭独立显示32至52px红色大字、脉冲边框、X干扰提示和更响的急促警报，正在锁定用黄色提示。警报只在状态变化时更新DOM。装甲受击加入短促撞击音、边缘闪光、位置震动、方向提示与装甲伤害数字，强度随伤害变化并设上限，快速衰减。其他车辆中弹不触发玩家自己的受击反馈。</w:t>
+      </w:r>
+    </w:p>
+    <w:p>
+      <w:r>
+        <w:br w:type="page"/>
       </w:r>
     </w:p>
     <w:p>
       <w:pPr>
         <w:pStyle w:val="Heading1"/>
-        <w:pageBreakBefore/>
       </w:pPr>
       <w:r>
-        <w:t>飞行差异与导弹反馈</w:t>
+        <w:t>实际验证</w:t>
       </w:r>
     </w:p>
     <w:p>
       <w:r>
-        <w:t>喷气机W/S调节目标推力，A/D控制坡度并产生持续转弯，鼠标控制俯仰与小幅航向辅助。正常速度目标29至75m/s，Shift加力92m/s，Ctrl空气刹车32m/s。没有倒车或静止悬停；升降由机头俯仰与速度决定。</w:t>
+        <w:t>Strict TypeScript、106项单元测试、38项Chrome浏览器测试、8/16/32/64自动战局、默认32v32/500票、LAN与生产构建全部通过。新增驾驶舱测试逐一登上八种车辆、核对实际可见模型、检查摩托车加速与把手转向、切换V和F1/F2/F3座位、下车清除；警报测试验证字号至少32px、真正的60点装甲损伤、衰减及干扰清除。</w:t>
       </w:r>
     </w:p>
     <w:p>
       <w:r>
-        <w:t>直升机W/S前进倒退，A/D实际侧移，鼠标控制机头方向，空格上升与Ctrl下降；松开升降后趋于悬停，Shift加速48m/s。旋翼动力、机体倾斜和无驾驶重力下落保留。两类HUD分别显示空速高度坡度或高度升降率，底部操作提示不同。</w:t>
+        <w:t>真实战局伤害、热诱弹、枪口弹道、占点、死亡救援与LAN权威状态保持原有规则。本轮没有调整武器伤害或AI强度。摄像机位置改变后重新执行所有检查。</w:t>
       </w:r>
     </w:p>
     <w:p>
       <w:r>
-        <w:t>捕获阶段目标显示正在被锁定和较慢警报；导弹发射后目标显示导弹来袭、闪烁背景和较快音调。车辆导弹和步兵防空的观察/发射均通知目标。X热诱弹在捕获阶段清除发射方锁定进度，来袭阶段删除弹体引导目标。保护5秒，冷却24秒，弹体不会凭空消失。</w:t>
-      </w:r>
-    </w:p>
-    <w:p>
-      <w:r>
-        <w:t>导弹最大转向1.25rad/s，寻的锥约77度，失去目标后的弹继续惯性飞行。高速横向机动能让目标离开寻的锥，是真实位置与角速度的结果，不能保证每次规避成功。自动测试实发导弹追击喷气机，机动中丢失引导且飞机未受伤、未使用热诱弹。</w:t>
-      </w:r>
-    </w:p>
-    <w:p>
-      <w:r>
-        <w:t>本轮是街机飞行模型，不是完整刚体空气动力学。继续保留无坠落伤害、空中下车降落伞、炮管真实方向、独立弹药和两种武器。</w:t>
+        <w:t>测试中发现并修复警报每帧替换DOM的问题；旧测试定位变化以及换座后渲染等待问题也记录在QA报告，最终38项通过。日志、截图和源码一并交付。</w:t>
       </w:r>
     </w:p>
     <w:p>
       <w:pPr>
         <w:pStyle w:val="Heading1"/>
-        <w:pageBreakBefore/>
       </w:pPr>
       <w:r>
-        <w:t>车辆导航与摩托车</w:t>
+        <w:t>可见限制</w:t>
       </w:r>
     </w:p>
     <w:p>
       <w:r>
-        <w:t>原车辆使用步兵同一寻路图，网格最近点可能在墙另一侧。现在按车型半径生成通行图并检查扫掠体积，起点终点选择能实际连通的可见网格节点，边和简化段均校验。找不到路返回失败，不伪造直达路径。</w:t>
-      </w:r>
-    </w:p>
-    <w:p>
-      <w:r>
-        <w:t>控制器每帧连续处理加减速与有限转向，弯道减速并避让其他车辆；重新寻路有间隔，不每帧重新A星。路线失败通过驾驶员所属小队报告。未用瞬移掩盖导航问题。完整道路车道、转弯半径最优路径与分阶段倒车控制仍可继续优化。</w:t>
-      </w:r>
-    </w:p>
-    <w:p>
-      <w:r>
-        <w:t>运输车让附近同小队成员进入真实空座，抵达目标附近AI实际下车并继续任务，暂时禁止立即回车。真人座位不会被强迫下车，玩家接管AI驾驶仍令AI安全退出。装甲推进测试要求存活且有真实AI驾驶员的坦克或步战车与步兵共同执行，不能让无人车靠driver字符串自动移动。</w:t>
-      </w:r>
-    </w:p>
-    <w:p>
-      <w:r>
-        <w:t>M2 COURIER为双座无武装摩托车，有独立双轮、车架、座垫、把手和灯模型。85HP，33m/s最高速，19m/s²加速和0.85m车体半径。双方基地各一辆并加入Q支援：70RP、25秒冷却、8秒专属空投；两个座位都没有虚构机枪。原七车型ID与停车位置保持，摩托车追加。</w:t>
+        <w:t>本轮是原创低多边形座舱与骑乘表现，不等同于完整真实车辆内饰或商业游戏材质质量。镜头旁的座舱模型不是碰撞物理结构；右键继续使用已有缩放瞄具。未加入镜面实时反射、全身驾驶IK、可点击舱内按钮或完整自由头部观察。两浏览器LAN验证不等于两台用户电脑已实测；主观音量与驾驶手感仍需要实际试玩。未重跑0.15.0的20分钟AI长测，历史结果保留。Three.js大于500kB的分块警告保留。</w:t>
       </w:r>
     </w:p>
     <w:p>
       <w:pPr>
         <w:pStyle w:val="Heading1"/>
-        <w:pageBreakBefore/>
       </w:pPr>
       <w:r>
-        <w:t>最终验证与交付</w:t>
+        <w:t>本机与仓库交付</w:t>
       </w:r>
     </w:p>
     <w:p>
       <w:r>
-        <w:t>Strict TS、106项单元、36项Chrome浏览器、LAN和生产build通过。默认32v32/500票实际模拟305秒，red获胜，据点变化14，步兵射击1444，阵亡26，载具射击1068，导航失败1。三类大事件及反攻、真实有人装甲推进回归通过。</w:t>
+        <w:t>源码、QA报告、公开源码ZIP和本DOCX更新到GitHub main。十一首用户音乐只保留本机和私人完整ZIP，不公开上传。所有本机历史启动目录同步源码和dist，保留node_modules和私人音乐。房主Ctrl+C停止旧服务，在0.16目录运行npm run lan，端口7878；朋友刷新共享IP网页和房间码，不需要下载完整包。单人入口仍独立可用。</w:t>
       </w:r>
     </w:p>
     <w:p>
       <w:r>
-        <w:t>20分钟加速场景使用99999票保持运行到1200秒：据点变化23、射击10960、阵亡46；重复座位0，报告峰值63，弹体峰值8，导航失败0，实际执行9.70秒。检查有限坐标、队伍任务、事件参与和有界集合；未垃圾回收前堆变化不作为无泄漏结论。另一次保留Battle对象的强制GC采样从初始4.53MiB到5分钟6.96MiB、10分钟6.96MiB、15分钟6.86MiB、20分钟6.91MiB，初始化后保持稳定；仅证明本种子的观测结果。</w:t>
-      </w:r>
-    </w:p>
-    <w:p>
-      <w:r>
-        <w:t>新增测试覆盖遮挡无视觉报告、最后已知位置冻结、衰减过期、任务分布与承诺、路线失败重新分配、建议接受忽略、飞机机动、两阶段警告、热诱弹解除、导弹有限转向、摩托车型、车体通行、真实运输下车以及无传送失败报告。旧测试中的车辆数量从14改16、支援项11改12，符合真实新对象。</w:t>
-      </w:r>
-    </w:p>
-    <w:p>
-      <w:r>
-        <w:t>非回环网卡10.100.113.195的HTTP/WebSocket、最多8人、主机权限和两Chrome共享状态通过。短headless32v32采样59.98至60.01FPS，782绘制调用，不代表用户电脑长期FPS或跨用户电脑联机已确认。</w:t>
-      </w:r>
-    </w:p>
-    <w:p>
-      <w:r>
-        <w:t>房主Ctrl+C停止旧服务，0.15目录运行npm run lan，端口仍7878；朋友打开分享IP链接与房间码加入，无需下载游戏包。单人依旧可独立开始。生成CRC验证的私人完整与公开源码ZIP，SHA256清单，源码及构建同步本机并更新Main。</w:t>
-      </w:r>
-    </w:p>
-    <w:p>
-      <w:r>
-        <w:t>仍使用原创规则驱动AI和轻量运动模型，未达到商业游戏NPC/刚体飞行模拟的复杂度。完整RESUPPLY、ESCORT、RESERVE等战略任务、自动召集远处运输乘员、全道路车道和转弯半径规划、可点击个人任务覆盖与“换一个建议”按钮尚未完成；医疗/维修/补给是实际个体行为，不能视作这些战略模块已经实现。指挥官未知信息会导致不理想分配，属于可见的限制。浏览器FPS仅短时headless采样，不代表用户硬件长期性能；本环境两个浏览器/LAN IP验证不等于用户两台电脑已实测。大于500kB的Three.js分块警告保留。</w:t>
+        <w:br w:type="page"/>
       </w:r>
     </w:p>
     <w:p>
       <w:pPr>
         <w:pStyle w:val="Heading1"/>
-        <w:pageBreakBefore/>
       </w:pPr>
       <w:r>
-        <w:t>实际浏览器画面</w:t>
+        <w:t>实际Chrome画面 1</w:t>
       </w:r>
     </w:p>
     <w:p>
       <w:r>
         <w:drawing>
           <wp:inline xmlns:a="http://schemas.openxmlformats.org/drawingml/2006/main" xmlns:pic="http://schemas.openxmlformats.org/drawingml/2006/picture">
-            <wp:extent cx="5394960" cy="3034665"/>
+            <wp:extent cx="5577840" cy="3137535"/>
             <wp:docPr id="1" name="Picture 1"/>
             <wp:cNvGraphicFramePr>
               <a:graphicFrameLocks noChangeAspect="1"/>
@@ -224,7 +143,7 @@
               <a:graphicData uri="http://schemas.openxmlformats.org/drawingml/2006/picture">
                 <pic:pic>
                   <pic:nvPicPr>
-                    <pic:cNvPr id="0" name="commander-015.png"/>
+                    <pic:cNvPr id="0" name="interior-motorcycle-016.png"/>
                     <pic:cNvPicPr/>
                   </pic:nvPicPr>
                   <pic:blipFill>
@@ -236,7 +155,7 @@
                   <pic:spPr>
                     <a:xfrm>
                       <a:off x="0" y="0"/>
-                      <a:ext cx="5394960" cy="3034665"/>
+                      <a:ext cx="5577840" cy="3137535"/>
                     </a:xfrm>
                     <a:prstGeom prst="rect"/>
                   </pic:spPr>
@@ -249,14 +168,14 @@
     </w:p>
     <w:p>
       <w:r>
-        <w:t>指挥建议已接受并由小队执行</w:t>
+        <w:t>摩托车把手与仪表</w:t>
       </w:r>
     </w:p>
     <w:p>
       <w:r>
         <w:drawing>
           <wp:inline xmlns:a="http://schemas.openxmlformats.org/drawingml/2006/main" xmlns:pic="http://schemas.openxmlformats.org/drawingml/2006/picture">
-            <wp:extent cx="5394960" cy="3034665"/>
+            <wp:extent cx="5577840" cy="3137535"/>
             <wp:docPr id="2" name="Picture 2"/>
             <wp:cNvGraphicFramePr>
               <a:graphicFrameLocks noChangeAspect="1"/>
@@ -265,7 +184,7 @@
               <a:graphicData uri="http://schemas.openxmlformats.org/drawingml/2006/picture">
                 <pic:pic>
                   <pic:nvPicPr>
-                    <pic:cNvPr id="0" name="jet-warning-015.png"/>
+                    <pic:cNvPr id="0" name="interior-tank-016.png"/>
                     <pic:cNvPicPr/>
                   </pic:nvPicPr>
                   <pic:blipFill>
@@ -277,7 +196,7 @@
                   <pic:spPr>
                     <a:xfrm>
                       <a:off x="0" y="0"/>
-                      <a:ext cx="5394960" cy="3034665"/>
+                      <a:ext cx="5577840" cy="3137535"/>
                     </a:xfrm>
                     <a:prstGeom prst="rect"/>
                   </pic:spPr>
@@ -290,23 +209,27 @@
     </w:p>
     <w:p>
       <w:r>
-        <w:t>喷气机坡度空速与导弹来袭HUD</w:t>
+        <w:t>坦克装甲观察窗</w:t>
+      </w:r>
+    </w:p>
+    <w:p>
+      <w:r>
+        <w:br w:type="page"/>
       </w:r>
     </w:p>
     <w:p>
       <w:pPr>
         <w:pStyle w:val="Heading1"/>
-        <w:pageBreakBefore/>
       </w:pPr>
       <w:r>
-        <w:t>直升机与轻型运输画面</w:t>
+        <w:t>实际Chrome画面 2</w:t>
       </w:r>
     </w:p>
     <w:p>
       <w:r>
         <w:drawing>
           <wp:inline xmlns:a="http://schemas.openxmlformats.org/drawingml/2006/main" xmlns:pic="http://schemas.openxmlformats.org/drawingml/2006/picture">
-            <wp:extent cx="5394960" cy="3034665"/>
+            <wp:extent cx="5577840" cy="3137535"/>
             <wp:docPr id="3" name="Picture 3"/>
             <wp:cNvGraphicFramePr>
               <a:graphicFrameLocks noChangeAspect="1"/>
@@ -315,7 +238,7 @@
               <a:graphicData uri="http://schemas.openxmlformats.org/drawingml/2006/picture">
                 <pic:pic>
                   <pic:nvPicPr>
-                    <pic:cNvPr id="0" name="heli-hud-015.png"/>
+                    <pic:cNvPr id="0" name="interior-scout-016.png"/>
                     <pic:cNvPicPr/>
                   </pic:nvPicPr>
                   <pic:blipFill>
@@ -327,7 +250,7 @@
                   <pic:spPr>
                     <a:xfrm>
                       <a:off x="0" y="0"/>
-                      <a:ext cx="5394960" cy="3034665"/>
+                      <a:ext cx="5577840" cy="3137535"/>
                     </a:xfrm>
                     <a:prstGeom prst="rect"/>
                   </pic:spPr>
@@ -340,14 +263,14 @@
     </w:p>
     <w:p>
       <w:r>
-        <w:t>直升机升降侧移专用操作提示</w:t>
+        <w:t>侦察车开放车架</w:t>
       </w:r>
     </w:p>
     <w:p>
       <w:r>
         <w:drawing>
           <wp:inline xmlns:a="http://schemas.openxmlformats.org/drawingml/2006/main" xmlns:pic="http://schemas.openxmlformats.org/drawingml/2006/picture">
-            <wp:extent cx="5394960" cy="3034665"/>
+            <wp:extent cx="5577840" cy="3137535"/>
             <wp:docPr id="4" name="Picture 4"/>
             <wp:cNvGraphicFramePr>
               <a:graphicFrameLocks noChangeAspect="1"/>
@@ -356,7 +279,7 @@
               <a:graphicData uri="http://schemas.openxmlformats.org/drawingml/2006/picture">
                 <pic:pic>
                   <pic:nvPicPr>
-                    <pic:cNvPr id="0" name="motorcycle-015.png"/>
+                    <pic:cNvPr id="0" name="interior-transport-016.png"/>
                     <pic:cNvPicPr/>
                   </pic:nvPicPr>
                   <pic:blipFill>
@@ -368,7 +291,7 @@
                   <pic:spPr>
                     <a:xfrm>
                       <a:off x="0" y="0"/>
-                      <a:ext cx="5394960" cy="3034665"/>
+                      <a:ext cx="5577840" cy="3137535"/>
                     </a:xfrm>
                     <a:prstGeom prst="rect"/>
                   </pic:spPr>
@@ -381,12 +304,297 @@
     </w:p>
     <w:p>
       <w:r>
-        <w:t>双座无武装摩托车与独立模型</w:t>
+        <w:t>运兵车挡风框和驾驶台</w:t>
+      </w:r>
+    </w:p>
+    <w:p>
+      <w:r>
+        <w:br w:type="page"/>
+      </w:r>
+    </w:p>
+    <w:p>
+      <w:pPr>
+        <w:pStyle w:val="Heading1"/>
+      </w:pPr>
+      <w:r>
+        <w:t>实际Chrome画面 3</w:t>
+      </w:r>
+    </w:p>
+    <w:p>
+      <w:r>
+        <w:drawing>
+          <wp:inline xmlns:a="http://schemas.openxmlformats.org/drawingml/2006/main" xmlns:pic="http://schemas.openxmlformats.org/drawingml/2006/picture">
+            <wp:extent cx="5577840" cy="3137535"/>
+            <wp:docPr id="5" name="Picture 5"/>
+            <wp:cNvGraphicFramePr>
+              <a:graphicFrameLocks noChangeAspect="1"/>
+            </wp:cNvGraphicFramePr>
+            <a:graphic>
+              <a:graphicData uri="http://schemas.openxmlformats.org/drawingml/2006/picture">
+                <pic:pic>
+                  <pic:nvPicPr>
+                    <pic:cNvPr id="0" name="interior-ifv-016.png"/>
+                    <pic:cNvPicPr/>
+                  </pic:nvPicPr>
+                  <pic:blipFill>
+                    <a:blip r:embed="rId13"/>
+                    <a:stretch>
+                      <a:fillRect/>
+                    </a:stretch>
+                  </pic:blipFill>
+                  <pic:spPr>
+                    <a:xfrm>
+                      <a:off x="0" y="0"/>
+                      <a:ext cx="5577840" cy="3137535"/>
+                    </a:xfrm>
+                    <a:prstGeom prst="rect"/>
+                  </pic:spPr>
+                </pic:pic>
+              </a:graphicData>
+            </a:graphic>
+          </wp:inline>
+        </w:drawing>
+      </w:r>
+    </w:p>
+    <w:p>
+      <w:r>
+        <w:t>步战车双显示器</w:t>
+      </w:r>
+    </w:p>
+    <w:p>
+      <w:r>
+        <w:drawing>
+          <wp:inline xmlns:a="http://schemas.openxmlformats.org/drawingml/2006/main" xmlns:pic="http://schemas.openxmlformats.org/drawingml/2006/picture">
+            <wp:extent cx="5577840" cy="3137535"/>
+            <wp:docPr id="6" name="Picture 6"/>
+            <wp:cNvGraphicFramePr>
+              <a:graphicFrameLocks noChangeAspect="1"/>
+            </wp:cNvGraphicFramePr>
+            <a:graphic>
+              <a:graphicData uri="http://schemas.openxmlformats.org/drawingml/2006/picture">
+                <pic:pic>
+                  <pic:nvPicPr>
+                    <pic:cNvPr id="0" name="interior-aa-016.png"/>
+                    <pic:cNvPicPr/>
+                  </pic:nvPicPr>
+                  <pic:blipFill>
+                    <a:blip r:embed="rId14"/>
+                    <a:stretch>
+                      <a:fillRect/>
+                    </a:stretch>
+                  </pic:blipFill>
+                  <pic:spPr>
+                    <a:xfrm>
+                      <a:off x="0" y="0"/>
+                      <a:ext cx="5577840" cy="3137535"/>
+                    </a:xfrm>
+                    <a:prstGeom prst="rect"/>
+                  </pic:spPr>
+                </pic:pic>
+              </a:graphicData>
+            </a:graphic>
+          </wp:inline>
+        </w:drawing>
+      </w:r>
+    </w:p>
+    <w:p>
+      <w:r>
+        <w:t>防空车雷达驾驶台</w:t>
+      </w:r>
+    </w:p>
+    <w:p>
+      <w:r>
+        <w:br w:type="page"/>
+      </w:r>
+    </w:p>
+    <w:p>
+      <w:pPr>
+        <w:pStyle w:val="Heading1"/>
+      </w:pPr>
+      <w:r>
+        <w:t>实际Chrome画面 4</w:t>
+      </w:r>
+    </w:p>
+    <w:p>
+      <w:r>
+        <w:drawing>
+          <wp:inline xmlns:a="http://schemas.openxmlformats.org/drawingml/2006/main" xmlns:pic="http://schemas.openxmlformats.org/drawingml/2006/picture">
+            <wp:extent cx="5577840" cy="3137535"/>
+            <wp:docPr id="7" name="Picture 7"/>
+            <wp:cNvGraphicFramePr>
+              <a:graphicFrameLocks noChangeAspect="1"/>
+            </wp:cNvGraphicFramePr>
+            <a:graphic>
+              <a:graphicData uri="http://schemas.openxmlformats.org/drawingml/2006/picture">
+                <pic:pic>
+                  <pic:nvPicPr>
+                    <pic:cNvPr id="0" name="interior-jet-016.png"/>
+                    <pic:cNvPicPr/>
+                  </pic:nvPicPr>
+                  <pic:blipFill>
+                    <a:blip r:embed="rId15"/>
+                    <a:stretch>
+                      <a:fillRect/>
+                    </a:stretch>
+                  </pic:blipFill>
+                  <pic:spPr>
+                    <a:xfrm>
+                      <a:off x="0" y="0"/>
+                      <a:ext cx="5577840" cy="3137535"/>
+                    </a:xfrm>
+                    <a:prstGeom prst="rect"/>
+                  </pic:spPr>
+                </pic:pic>
+              </a:graphicData>
+            </a:graphic>
+          </wp:inline>
+        </w:drawing>
+      </w:r>
+    </w:p>
+    <w:p>
+      <w:r>
+        <w:t>喷气机弧形舱框</w:t>
+      </w:r>
+    </w:p>
+    <w:p>
+      <w:r>
+        <w:drawing>
+          <wp:inline xmlns:a="http://schemas.openxmlformats.org/drawingml/2006/main" xmlns:pic="http://schemas.openxmlformats.org/drawingml/2006/picture">
+            <wp:extent cx="5577840" cy="3137535"/>
+            <wp:docPr id="8" name="Picture 8"/>
+            <wp:cNvGraphicFramePr>
+              <a:graphicFrameLocks noChangeAspect="1"/>
+            </wp:cNvGraphicFramePr>
+            <a:graphic>
+              <a:graphicData uri="http://schemas.openxmlformats.org/drawingml/2006/picture">
+                <pic:pic>
+                  <pic:nvPicPr>
+                    <pic:cNvPr id="0" name="interior-helicopter-016.png"/>
+                    <pic:cNvPicPr/>
+                  </pic:nvPicPr>
+                  <pic:blipFill>
+                    <a:blip r:embed="rId16"/>
+                    <a:stretch>
+                      <a:fillRect/>
+                    </a:stretch>
+                  </pic:blipFill>
+                  <pic:spPr>
+                    <a:xfrm>
+                      <a:off x="0" y="0"/>
+                      <a:ext cx="5577840" cy="3137535"/>
+                    </a:xfrm>
+                    <a:prstGeom prst="rect"/>
+                  </pic:spPr>
+                </pic:pic>
+              </a:graphicData>
+            </a:graphic>
+          </wp:inline>
+        </w:drawing>
+      </w:r>
+    </w:p>
+    <w:p>
+      <w:r>
+        <w:t>直升机宽风挡与飞行仪表</w:t>
+      </w:r>
+    </w:p>
+    <w:p>
+      <w:r>
+        <w:br w:type="page"/>
+      </w:r>
+    </w:p>
+    <w:p>
+      <w:pPr>
+        <w:pStyle w:val="Heading1"/>
+      </w:pPr>
+      <w:r>
+        <w:t>实际Chrome画面 5</w:t>
+      </w:r>
+    </w:p>
+    <w:p>
+      <w:r>
+        <w:drawing>
+          <wp:inline xmlns:a="http://schemas.openxmlformats.org/drawingml/2006/main" xmlns:pic="http://schemas.openxmlformats.org/drawingml/2006/picture">
+            <wp:extent cx="5577840" cy="3137535"/>
+            <wp:docPr id="9" name="Picture 9"/>
+            <wp:cNvGraphicFramePr>
+              <a:graphicFrameLocks noChangeAspect="1"/>
+            </wp:cNvGraphicFramePr>
+            <a:graphic>
+              <a:graphicData uri="http://schemas.openxmlformats.org/drawingml/2006/picture">
+                <pic:pic>
+                  <pic:nvPicPr>
+                    <pic:cNvPr id="0" name="missile-alert-0151.png"/>
+                    <pic:cNvPicPr/>
+                  </pic:nvPicPr>
+                  <pic:blipFill>
+                    <a:blip r:embed="rId17"/>
+                    <a:stretch>
+                      <a:fillRect/>
+                    </a:stretch>
+                  </pic:blipFill>
+                  <pic:spPr>
+                    <a:xfrm>
+                      <a:off x="0" y="0"/>
+                      <a:ext cx="5577840" cy="3137535"/>
+                    </a:xfrm>
+                    <a:prstGeom prst="rect"/>
+                  </pic:spPr>
+                </pic:pic>
+              </a:graphicData>
+            </a:graphic>
+          </wp:inline>
+        </w:drawing>
+      </w:r>
+    </w:p>
+    <w:p>
+      <w:r>
+        <w:t>放大的导弹来袭警报</w:t>
+      </w:r>
+    </w:p>
+    <w:p>
+      <w:r>
+        <w:drawing>
+          <wp:inline xmlns:a="http://schemas.openxmlformats.org/drawingml/2006/main" xmlns:pic="http://schemas.openxmlformats.org/drawingml/2006/picture">
+            <wp:extent cx="5577840" cy="3137535"/>
+            <wp:docPr id="10" name="Picture 10"/>
+            <wp:cNvGraphicFramePr>
+              <a:graphicFrameLocks noChangeAspect="1"/>
+            </wp:cNvGraphicFramePr>
+            <a:graphic>
+              <a:graphicData uri="http://schemas.openxmlformats.org/drawingml/2006/picture">
+                <pic:pic>
+                  <pic:nvPicPr>
+                    <pic:cNvPr id="0" name="armor-hit-0151.png"/>
+                    <pic:cNvPicPr/>
+                  </pic:nvPicPr>
+                  <pic:blipFill>
+                    <a:blip r:embed="rId18"/>
+                    <a:stretch>
+                      <a:fillRect/>
+                    </a:stretch>
+                  </pic:blipFill>
+                  <pic:spPr>
+                    <a:xfrm>
+                      <a:off x="0" y="0"/>
+                      <a:ext cx="5577840" cy="3137535"/>
+                    </a:xfrm>
+                    <a:prstGeom prst="rect"/>
+                  </pic:spPr>
+                </pic:pic>
+              </a:graphicData>
+            </a:graphic>
+          </wp:inline>
+        </w:drawing>
+      </w:r>
+    </w:p>
+    <w:p>
+      <w:r>
+        <w:t>装甲受击闪光与方向反馈</w:t>
       </w:r>
     </w:p>
     <w:sectPr>
-      <w:pgSz w:w="11909" w:h="16834"/>
-      <w:pgMar w:top="936" w:right="1008" w:bottom="936" w:left="1008" w:header="720" w:footer="720" w:gutter="0"/>
+      <w:pgSz w:w="12240" w:h="15840"/>
+      <w:pgMar w:top="864" w:right="1800" w:bottom="864" w:left="1800" w:header="720" w:footer="720" w:gutter="0"/>
       <w:cols w:space="720"/>
       <w:docGrid w:linePitch="360"/>
     </w:sectPr>
@@ -757,13 +965,10 @@
     <w:name w:val="Normal"/>
     <w:qFormat/>
     <w:rsid w:val="00FC693F"/>
-    <w:pPr>
-      <w:spacing w:line="264" w:lineRule="auto" w:after="160"/>
-    </w:pPr>
     <w:rPr>
-      <w:rFonts w:ascii="Arial Unicode MS" w:hAnsi="Arial Unicode MS" w:eastAsia="Arial Unicode MS"/>
+      <w:rFonts w:ascii="Noto Sans CJK SC" w:hAnsi="Noto Sans CJK SC" w:eastAsia="Noto Sans CJK SC"/>
       <w:color w:val="000000"/>
-      <w:sz w:val="22"/>
+      <w:sz w:val="21"/>
     </w:rPr>
   </w:style>
   <w:style w:type="paragraph" w:styleId="Header">
@@ -825,11 +1030,11 @@
       <w:outlineLvl w:val="0"/>
     </w:pPr>
     <w:rPr>
-      <w:rFonts w:asciiTheme="majorHAnsi" w:eastAsiaTheme="majorEastAsia" w:hAnsiTheme="majorHAnsi" w:cstheme="majorBidi" w:ascii="Arial Unicode MS" w:hAnsi="Arial Unicode MS" w:eastAsia="Arial Unicode MS"/>
+      <w:rFonts w:asciiTheme="majorHAnsi" w:eastAsiaTheme="majorEastAsia" w:hAnsiTheme="majorHAnsi" w:cstheme="majorBidi" w:ascii="Noto Sans CJK SC" w:hAnsi="Noto Sans CJK SC" w:eastAsia="Noto Sans CJK SC"/>
       <w:b/>
       <w:bCs/>
       <w:color w:val="000000"/>
-      <w:sz w:val="36"/>
+      <w:sz w:val="34"/>
       <w:szCs w:val="28"/>
     </w:rPr>
   </w:style>
@@ -1111,11 +1316,11 @@
       <w:contextualSpacing/>
     </w:pPr>
     <w:rPr>
-      <w:rFonts w:asciiTheme="majorHAnsi" w:eastAsiaTheme="majorEastAsia" w:hAnsiTheme="majorHAnsi" w:cstheme="majorBidi" w:ascii="Arial Unicode MS" w:hAnsi="Arial Unicode MS" w:eastAsia="Arial Unicode MS"/>
+      <w:rFonts w:asciiTheme="majorHAnsi" w:eastAsiaTheme="majorEastAsia" w:hAnsiTheme="majorHAnsi" w:cstheme="majorBidi" w:ascii="Noto Sans CJK SC" w:hAnsi="Noto Sans CJK SC" w:eastAsia="Noto Sans CJK SC"/>
       <w:color w:val="000000"/>
       <w:spacing w:val="5"/>
       <w:kern w:val="28"/>
-      <w:sz w:val="48"/>
+      <w:sz w:val="44"/>
       <w:szCs w:val="52"/>
     </w:rPr>
   </w:style>
@@ -1591,6 +1796,9 @@
     <w:qFormat/>
     <w:rsid w:val="00FC693F"/>
     <w:pPr>
+      <w:pBdr>
+        <w:bottom w:val="single" w:sz="4" w:space="4" w:color="4F81BD" w:themeColor="accent1"/>
+      </w:pBdr>
       <w:spacing w:before="200" w:after="280"/>
       <w:ind w:left="936" w:right="936"/>
     </w:pPr>

</xml_diff>